<commit_message>
R8: ejaan Amerika (gaya IEEE) dan status template
- Ejaan Britania -> Amerika di seluruh prosa naskah (organized, randomized,
  artifact, behavior, summarizes, ...). Kutipan Lee et al. dikembalikan ke
  ejaan aslinya ("characterizing").
- outline.md: R8 selesai; R3 lanjutan ditunda sampai jurnal target dipilih
  (dospem meminta draf dulu, belum ada template).
</commit_message>
<xml_diff>
--- a/docs/paper/manuscript-draft.docx
+++ b/docs/paper/manuscript-draft.docx
@@ -20,7 +20,7 @@
           <w:i/>
           <w:iCs/>
         </w:rPr>
-        <w:t xml:space="preserve">Working draft for internal review — generated 2026-10-02 from commit c13bd75.</w:t>
+        <w:t xml:space="preserve">Working draft for internal review — generated 2026-10-02 from commit 1689f41.</w:t>
       </w:r>
     </w:p>
     <w:p>
@@ -752,7 +752,7 @@
         <w:t xml:space="preserve"> </w:t>
       </w:r>
       <w:r>
-        <w:t xml:space="preserve">artefacts are released with the paper.</w:t>
+        <w:t xml:space="preserve">artifacts are released with the paper.</w:t>
       </w:r>
     </w:p>
     <w:p>
@@ -761,7 +761,7 @@
         <w:jc w:val="both"/>
       </w:pPr>
       <w:r>
-        <w:t xml:space="preserve">The paper is organised as follows. Section 2 reviews related work. Sections 3</w:t>
+        <w:t xml:space="preserve">The paper is organized as follows. Section 2 reviews related work. Sections 3</w:t>
       </w:r>
       <w:r>
         <w:t xml:space="preserve"> </w:t>
@@ -1013,7 +1013,7 @@
         <w:t xml:space="preserve"> </w:t>
       </w:r>
       <w:r>
-        <w:t xml:space="preserve">and Willett [9] derive a hierarchical form of exchangeability for data organised</w:t>
+        <w:t xml:space="preserve">and Willett [9] derive a hierarchical form of exchangeability for data organized</w:t>
       </w:r>
       <w:r>
         <w:t xml:space="preserve"> </w:t>
@@ -1668,7 +1668,7 @@
           <w:i/>
           <w:iCs/>
         </w:rPr>
-        <w:t xml:space="preserve">characterising the</w:t>
+        <w:t xml:space="preserve">characterizing the</w:t>
       </w:r>
       <w:r>
         <w:rPr>
@@ -1739,7 +1739,7 @@
         <w:jc w:val="both"/>
       </w:pPr>
       <w:r>
-        <w:t xml:space="preserve">Papadopoulos [20] reviews conformal methods for multi-label learning and organises</w:t>
+        <w:t xml:space="preserve">Papadopoulos [20] reviews conformal methods for multi-label learning and organizes</w:t>
       </w:r>
       <w:r>
         <w:t xml:space="preserve"> </w:t>
@@ -1968,7 +1968,7 @@
         <w:t xml:space="preserve"> </w:t>
       </w:r>
       <w:r>
-        <w:t xml:space="preserve">landmark localisation [29] and multi-label diagnosis coding [7]. Conformal risk</w:t>
+        <w:t xml:space="preserve">landmark localization [29] and multi-label diagnosis coding [7]. Conformal risk</w:t>
       </w:r>
       <w:r>
         <w:t xml:space="preserve"> </w:t>
@@ -3272,7 +3272,7 @@
         <w:jc w:val="both"/>
       </w:pPr>
       <w:r>
-        <w:t xml:space="preserve">PTB-XL organises diagnoses as a three-level tree: 5 diagnostic superclasses, 23 subclasses, and 44 diagnostic SCP statements. A recording may carry several labels simultaneously, so the target is a</w:t>
+        <w:t xml:space="preserve">PTB-XL organizes diagnoses as a three-level tree: 5 diagnostic superclasses, 23 subclasses, and 44 diagnostic SCP statements. A recording may carry several labels simultaneously, so the target is a</w:t>
       </w:r>
       <w:r>
         <w:t xml:space="preserve"> </w:t>
@@ -8062,7 +8062,7 @@
         <w:t xml:space="preserve"> </w:t>
       </w:r>
       <w:r>
-        <w:t xml:space="preserve">means is established practice in cluster-randomised trials [33], [34]. We use both</w:t>
+        <w:t xml:space="preserve">means is established practice in cluster-randomized trials [33], [34]. We use both</w:t>
       </w:r>
       <w:r>
         <w:t xml:space="preserve"> </w:t>
@@ -8083,7 +8083,7 @@
         <w:t xml:space="preserve"> </w:t>
       </w:r>
       <w:r>
-        <w:t xml:space="preserve">In a cluster-randomised trial, equal weighting is an analyst’s choice and is known</w:t>
+        <w:t xml:space="preserve">In a cluster-randomized trial, equal weighting is an analyst’s choice and is known</w:t>
       </w:r>
       <w:r>
         <w:t xml:space="preserve"> </w:t>
@@ -8590,13 +8590,13 @@
       </w:r>
     </w:p>
     <w:bookmarkEnd w:id="25"/>
-    <w:bookmarkStart w:id="26" w:name="the-axis-used-to-organise-results"/>
+    <w:bookmarkStart w:id="26" w:name="the-axis-used-to-organize-results"/>
     <w:p>
       <w:pPr>
         <w:pStyle w:val="Heading3"/>
       </w:pPr>
       <w:r>
-        <w:t xml:space="preserve">5.1.4 The axis used to organise results</w:t>
+        <w:t xml:space="preserve">5.1.4 The axis used to organize results</w:t>
       </w:r>
     </w:p>
     <w:p>
@@ -10267,7 +10267,7 @@
         <w:jc w:val="both"/>
       </w:pPr>
       <w:r>
-        <w:t xml:space="preserve">Fig. 1 summarises the protocol. All three diagnostics are computed from metadata</w:t>
+        <w:t xml:space="preserve">Fig. 1 summarizes the protocol. All three diagnostics are computed from metadata</w:t>
       </w:r>
       <w:r>
         <w:t xml:space="preserve"> </w:t>
@@ -10291,13 +10291,13 @@
         <w:t xml:space="preserve"> </w:t>
       </w:r>
       <w:r>
-        <w:t xml:space="preserve">splits per configuration. To rule out the objection that calibration behaviour is</w:t>
-      </w:r>
-      <w:r>
-        <w:t xml:space="preserve"> </w:t>
-      </w:r>
-      <w:r>
-        <w:t xml:space="preserve">an artefact of a weak model, every audit is repeated on three backbones spanning a</w:t>
+        <w:t xml:space="preserve">splits per configuration. To rule out the objection that calibration behavior is</w:t>
+      </w:r>
+      <w:r>
+        <w:t xml:space="preserve"> </w:t>
+      </w:r>
+      <w:r>
+        <w:t xml:space="preserve">an artifact of a weak model, every audit is repeated on three backbones spanning a</w:t>
       </w:r>
       <w:r>
         <w:t xml:space="preserve"> </w:t>
@@ -12803,7 +12803,7 @@
         <w:jc w:val="both"/>
       </w:pPr>
       <w:r>
-        <w:t xml:space="preserve">The procedures are summarised in Table IV. Every resampling step operates on</w:t>
+        <w:t xml:space="preserve">The procedures are summarized in Table IV. Every resampling step operates on</w:t>
       </w:r>
       <w:r>
         <w:t xml:space="preserve"> </w:t>
@@ -12815,7 +12815,7 @@
         <w:t xml:space="preserve"> </w:t>
       </w:r>
       <w:r>
-        <w:t xml:space="preserve">otherwise would reproduce the error this paper analyses.</w:t>
+        <w:t xml:space="preserve">otherwise would reproduce the error this paper analyzes.</w:t>
       </w:r>
     </w:p>
     <w:p>
@@ -13172,7 +13172,7 @@
         <w:t xml:space="preserve"> </w:t>
       </w:r>
       <w:r>
-        <w:t xml:space="preserve">JSON artefact under</w:t>
+        <w:t xml:space="preserve">JSON artifact under</w:t>
       </w:r>
       <w:r>
         <w:t xml:space="preserve"> </w:t>
@@ -17884,7 +17884,7 @@
         <w:t xml:space="preserve"> </w:t>
       </w:r>
       <w:r>
-        <w:t xml:space="preserve">randomised record membership) with block-size balance (balanced vs. imbalanced),</w:t>
+        <w:t xml:space="preserve">randomized record membership) with block-size balance (balanced vs. imbalanced),</w:t>
       </w:r>
       <w:r>
         <w:t xml:space="preserve"> </w:t>
@@ -20846,7 +20846,7 @@
         <w:t xml:space="preserve"> </w:t>
       </w:r>
       <w:r>
-        <w:t xml:space="preserve">patients. Group-conditional conformal prediction has been proposed to equalise</w:t>
+        <w:t xml:space="preserve">patients. Group-conditional conformal prediction has been proposed to equalize</w:t>
       </w:r>
       <w:r>
         <w:t xml:space="preserve"> </w:t>
@@ -21195,7 +21195,7 @@
         </m:r>
       </m:oMath>
       <w:r>
-        <w:t xml:space="preserve">; it was an artefact of label-quality</w:t>
+        <w:t xml:space="preserve">; it was an artifact of label-quality</w:t>
       </w:r>
       <w:r>
         <w:t xml:space="preserve"> </w:t>
@@ -21569,7 +21569,7 @@
         <w:t xml:space="preserve"> </w:t>
       </w:r>
       <w:r>
-        <w:t xml:space="preserve">multi-centre cohorts.</w:t>
+        <w:t xml:space="preserve">multi-center cohorts.</w:t>
       </w:r>
     </w:p>
     <w:p>
@@ -22293,7 +22293,7 @@
         <w:jc w:val="both"/>
       </w:pPr>
       <w:r>
-        <w:t xml:space="preserve">Our reading of the MIT-BIH evidence changed three times before stabilising</w:t>
+        <w:t xml:space="preserve">Our reading of the MIT-BIH evidence changed three times before stabilizing</w:t>
       </w:r>
       <w:r>
         <w:t xml:space="preserve"> </w:t>
@@ -22651,7 +22651,7 @@
         <w:t xml:space="preserve"> </w:t>
       </w:r>
       <w:r>
-        <w:t xml:space="preserve">criterion that had favoured our hypothesis; the Holm correction, which the frozen</w:t>
+        <w:t xml:space="preserve">criterion that had favored our hypothesis; the Holm correction, which the frozen</w:t>
       </w:r>
       <w:r>
         <w:t xml:space="preserve"> </w:t>

</xml_diff>

<commit_message>
Naskah v6: dua gambar baru (skema join, atribusi defisit)
- Fig. 1 (baru, s3.3): skema Proposisi 2 pada delapan rekaman HIPOTETIS
  (diberi label demikian di keterangan): 5 blok pasien + 3 blok perangkat
  -> join 2 blok. Menjelaskan mekanisme keruntuhan PTB-XL di s5.1.
- Fig. 6 (baru, s5.3): (a) efek faktorial 2x2 klaster/ketimpangan/interaksi
  dengan 95% bootstrap CI dari factorial_mitdb.json; (b) selisih B12-B1 asli
  vs. permutasi (rentang 2,5-97,5% antar-split, sesuai cara d_ci dihitung di
  control_permutation_mitdb.py) dengan porsi mekanis 107/81/83%.
  Sebelumnya bukti inti klaim 2 dan 3 hanya berupa teks.
- Gambar lain dinomori ulang sesuai urutan kemunculan (Fig. 2-8) dan berkasnya
  diganti nama fig{n}_*.png; builder menentukan lebar dari nama, bukan nomor.
- Setiap gambar baru didahului kalimat yang menyebut dan menjelaskannya.

Audit 351fe87 -> v6: tidak ada angka/sitasi/persamaan yang berubah; 47/47
sitasi; 21 halaman Word (+1 karena dua gambar).
</commit_message>
<xml_diff>
--- a/docs/paper/manuscript-draft.docx
+++ b/docs/paper/manuscript-draft.docx
@@ -20,7 +20,7 @@
           <w:i/>
           <w:iCs/>
         </w:rPr>
-        <w:t xml:space="preserve">Working draft for internal review — generated 2026-10-02 from commit 2bbdbec.</w:t>
+        <w:t xml:space="preserve">Working draft for internal review — generated 2026-10-02 from commit 351fe87.</w:t>
       </w:r>
     </w:p>
     <w:p>
@@ -1218,7 +1218,7 @@
     </w:p>
     <w:bookmarkEnd w:id="11"/>
     <w:bookmarkEnd w:id="12"/>
-    <w:bookmarkStart w:id="17" w:name="problem-formulation-and-hcp-feasibility"/>
+    <w:bookmarkStart w:id="20" w:name="problem-formulation-and-hcp-feasibility"/>
     <w:p>
       <w:pPr>
         <w:pStyle w:val="Heading1"/>
@@ -4890,7 +4890,7 @@
       </w:r>
     </w:p>
     <w:bookmarkEnd w:id="14"/>
-    <w:bookmarkStart w:id="15" w:name="crossed-dependence-sources"/>
+    <w:bookmarkStart w:id="18" w:name="crossed-dependence-sources"/>
     <w:p>
       <w:pPr>
         <w:pStyle w:val="Heading2"/>
@@ -5659,7 +5659,76 @@
         <w:t xml:space="preserve"> </w:t>
       </w:r>
       <w:r>
-        <w:t xml:space="preserve">calibration is what matters here.</w:t>
+        <w:t xml:space="preserve">calibration is what matters here. Fig. 1 illustrates it on eight hypothetical</w:t>
+      </w:r>
+      <w:r>
+        <w:t xml:space="preserve"> </w:t>
+      </w:r>
+      <w:r>
+        <w:t xml:space="preserve">records: five patient blocks and three device blocks, each fine on its own,</w:t>
+      </w:r>
+      <w:r>
+        <w:t xml:space="preserve"> </w:t>
+      </w:r>
+      <w:r>
+        <w:t xml:space="preserve">leave only two blocks once both sources must be respected.</w:t>
+      </w:r>
+    </w:p>
+    <w:p>
+      <w:pPr>
+        <w:pStyle w:val="CaptionedFigure"/>
+        <w:jc w:val="both"/>
+      </w:pPr>
+      <w:r>
+        <w:drawing>
+          <wp:inline>
+            <wp:extent cx="3108960" cy="1073695"/>
+            <wp:effectExtent b="0" l="0" r="0" t="0"/>
+            <wp:docPr descr="Fig. 1. Schematic of Proposition 2 on eight hypothetical records (circles). Solid arcs link records of the same patient and dashed arcs records of the same device. A grouping sufficient for both sources must keep every linked pair in one block, so the finest such grouping is the join, the connected components (shaded). On PTB-XL the same mechanism collapses four declared sources to a single block (§5.1)." title="" id="16" name="Picture"/>
+            <a:graphic>
+              <a:graphicData uri="http://schemas.openxmlformats.org/drawingml/2006/picture">
+                <pic:pic>
+                  <pic:nvPicPr>
+                    <pic:cNvPr descr="figures/fig1_join_schematic.png" id="17" name="Picture"/>
+                    <pic:cNvPicPr>
+                      <a:picLocks noChangeArrowheads="1" noChangeAspect="1"/>
+                    </pic:cNvPicPr>
+                  </pic:nvPicPr>
+                  <pic:blipFill>
+                    <a:blip r:embed="rId15"/>
+                    <a:stretch>
+                      <a:fillRect/>
+                    </a:stretch>
+                  </pic:blipFill>
+                  <pic:spPr bwMode="auto">
+                    <a:xfrm>
+                      <a:off x="0" y="0"/>
+                      <a:ext cx="3108960" cy="1073695"/>
+                    </a:xfrm>
+                    <a:prstGeom prst="rect">
+                      <a:avLst/>
+                    </a:prstGeom>
+                    <a:noFill/>
+                    <a:ln w="9525">
+                      <a:noFill/>
+                      <a:headEnd/>
+                      <a:tailEnd/>
+                    </a:ln>
+                  </pic:spPr>
+                </pic:pic>
+              </a:graphicData>
+            </a:graphic>
+          </wp:inline>
+        </w:drawing>
+      </w:r>
+    </w:p>
+    <w:p>
+      <w:pPr>
+        <w:pStyle w:val="ImageCaption"/>
+        <w:jc w:val="both"/>
+      </w:pPr>
+      <w:r>
+        <w:t xml:space="preserve">Fig. 1. Schematic of Proposition 2 on eight hypothetical records (circles). Solid arcs link records of the same patient and dashed arcs records of the same device. A grouping sufficient for both sources must keep every linked pair in one block, so the finest such grouping is the join, the connected components (shaded). On PTB-XL the same mechanism collapses four declared sources to a single block (§5.1).</w:t>
       </w:r>
     </w:p>
     <w:p>
@@ -6158,8 +6227,8 @@
         <w:t xml:space="preserve">set, never as a property of a dataset.</w:t>
       </w:r>
     </w:p>
-    <w:bookmarkEnd w:id="15"/>
-    <w:bookmarkStart w:id="16" w:name="label-conditional-feasibility"/>
+    <w:bookmarkEnd w:id="18"/>
+    <w:bookmarkStart w:id="19" w:name="label-conditional-feasibility"/>
     <w:p>
       <w:pPr>
         <w:pStyle w:val="Heading2"/>
@@ -7264,9 +7333,9 @@
         <w:t xml:space="preserve">.</w:t>
       </w:r>
     </w:p>
-    <w:bookmarkEnd w:id="16"/>
-    <w:bookmarkEnd w:id="17"/>
-    <w:bookmarkStart w:id="26" w:name="audit-design"/>
+    <w:bookmarkEnd w:id="19"/>
+    <w:bookmarkEnd w:id="20"/>
+    <w:bookmarkStart w:id="29" w:name="audit-design"/>
     <w:p>
       <w:pPr>
         <w:pStyle w:val="Heading1"/>
@@ -7413,7 +7482,7 @@
         <w:t xml:space="preserve"> </w:t>
       </w:r>
       <w:r>
-        <w:t xml:space="preserve">in it. Fig. 1 summarizes the protocol, separating the four</w:t>
+        <w:t xml:space="preserve">in it. Fig. 2 summarizes the protocol, separating the four</w:t>
       </w:r>
       <w:r>
         <w:t xml:space="preserve"> </w:t>
@@ -7432,18 +7501,18 @@
           <wp:inline>
             <wp:extent cx="5334000" cy="1397151"/>
             <wp:effectExtent b="0" l="0" r="0" t="0"/>
-            <wp:docPr descr="Fig. 1. Audit protocol. The first four steps use metadata only and return verdicts that are exact given the declared dependence sources, before any patient is enrolled or any model trained; the last two require conformity scores from a trained model." title="" id="19" name="Picture"/>
+            <wp:docPr descr="Fig. 2. Audit protocol. The first four steps use metadata only and return verdicts that are exact given the declared dependence sources, before any patient is enrolled or any model trained; the last two require conformity scores from a trained model." title="" id="22" name="Picture"/>
             <a:graphic>
               <a:graphicData uri="http://schemas.openxmlformats.org/drawingml/2006/picture">
                 <pic:pic>
                   <pic:nvPicPr>
-                    <pic:cNvPr descr="figures/fig1_audit_workflow.png" id="20" name="Picture"/>
+                    <pic:cNvPr descr="figures/fig2_audit_workflow.png" id="23" name="Picture"/>
                     <pic:cNvPicPr>
                       <a:picLocks noChangeArrowheads="1" noChangeAspect="1"/>
                     </pic:cNvPicPr>
                   </pic:nvPicPr>
                   <pic:blipFill>
-                    <a:blip r:embed="rId18"/>
+                    <a:blip r:embed="rId21"/>
                     <a:stretch>
                       <a:fillRect/>
                     </a:stretch>
@@ -7476,10 +7545,10 @@
         <w:jc w:val="both"/>
       </w:pPr>
       <w:r>
-        <w:t xml:space="preserve">Fig. 1. Audit protocol. The first four steps use metadata only and return verdicts that are exact given the declared dependence sources, before any patient is enrolled or any model trained; the last two require conformity scores from a trained model.</w:t>
+        <w:t xml:space="preserve">Fig. 2. Audit protocol. The first four steps use metadata only and return verdicts that are exact given the declared dependence sources, before any patient is enrolled or any model trained; the last two require conformity scores from a trained model.</w:t>
       </w:r>
     </w:p>
-    <w:bookmarkStart w:id="21" w:name="datasets-and-dependence-structures"/>
+    <w:bookmarkStart w:id="24" w:name="datasets-and-dependence-structures"/>
     <w:p>
       <w:pPr>
         <w:pStyle w:val="Heading2"/>
@@ -8801,8 +8870,8 @@
         <w:t xml:space="preserve">training.</w:t>
       </w:r>
     </w:p>
-    <w:bookmarkEnd w:id="21"/>
-    <w:bookmarkStart w:id="22" w:name="calibration-and-evaluation-protocol"/>
+    <w:bookmarkEnd w:id="24"/>
+    <w:bookmarkStart w:id="25" w:name="calibration-and-evaluation-protocol"/>
     <w:p>
       <w:pPr>
         <w:pStyle w:val="Heading2"/>
@@ -8889,8 +8958,8 @@
         <w:t xml:space="preserve">at the record level into calibration and evaluation, repeated 200–400 times.</w:t>
       </w:r>
     </w:p>
-    <w:bookmarkEnd w:id="22"/>
-    <w:bookmarkStart w:id="23" w:name="models-and-conformity-scores"/>
+    <w:bookmarkEnd w:id="25"/>
+    <w:bookmarkStart w:id="26" w:name="models-and-conformity-scores"/>
     <w:p>
       <w:pPr>
         <w:pStyle w:val="Heading2"/>
@@ -9141,8 +9210,8 @@
         <w:t xml:space="preserve">maximum over true labels, which reduces to scalar HCP (§3.4).</w:t>
       </w:r>
     </w:p>
-    <w:bookmarkEnd w:id="23"/>
-    <w:bookmarkStart w:id="24" w:name="statistical-analysis"/>
+    <w:bookmarkEnd w:id="26"/>
+    <w:bookmarkStart w:id="27" w:name="statistical-analysis"/>
     <w:p>
       <w:pPr>
         <w:pStyle w:val="Heading2"/>
@@ -9507,8 +9576,8 @@
         </w:tc>
       </w:tr>
     </w:tbl>
-    <w:bookmarkEnd w:id="24"/>
-    <w:bookmarkStart w:id="25" w:name="reproducibility"/>
+    <w:bookmarkEnd w:id="27"/>
+    <w:bookmarkStart w:id="28" w:name="reproducibility"/>
     <w:p>
       <w:pPr>
         <w:pStyle w:val="Heading2"/>
@@ -9559,9 +9628,9 @@
         <w:t xml:space="preserve">leave a partial cache.</w:t>
       </w:r>
     </w:p>
-    <w:bookmarkEnd w:id="25"/>
-    <w:bookmarkEnd w:id="26"/>
-    <w:bookmarkStart w:id="47" w:name="results"/>
+    <w:bookmarkEnd w:id="28"/>
+    <w:bookmarkEnd w:id="29"/>
+    <w:bookmarkStart w:id="53" w:name="results"/>
     <w:p>
       <w:pPr>
         <w:pStyle w:val="Heading1"/>
@@ -9662,7 +9731,7 @@
         <w:t xml:space="preserve">.</w:t>
       </w:r>
     </w:p>
-    <w:bookmarkStart w:id="33" w:name="X703171b6c9ef8344f5ae4ef526c91a89ce0ec43"/>
+    <w:bookmarkStart w:id="36" w:name="X703171b6c9ef8344f5ae4ef526c91a89ce0ec43"/>
     <w:p>
       <w:pPr>
         <w:pStyle w:val="Heading2"/>
@@ -10743,7 +10812,7 @@
         <w:t xml:space="preserve"> </w:t>
       </w:r>
       <w:r>
-        <w:t xml:space="preserve">from a different collection regime. Fig. 2 places these groupings, the joins</w:t>
+        <w:t xml:space="preserve">from a different collection regime. Fig. 3 places these groupings, the joins</w:t>
       </w:r>
       <w:r>
         <w:t xml:space="preserve"> </w:t>
@@ -10779,18 +10848,18 @@
           <wp:inline>
             <wp:extent cx="3108960" cy="2176272"/>
             <wp:effectExtent b="0" l="0" r="0" t="0"/>
-            <wp:docPr descr="Fig. 2. Feasibility frontier \alpha_{\min}=1/(K_1+1). Each marker is a calibration grouping on PTB-XL fold 9 (circles: single dependence source; squares: join of sources) or the MIT-BIH record partition (diamond). Values in parentheses are K_1. A grouping supports a guarantee at level \alpha only if its marker lies below the corresponding dotted line." title="" id="28" name="Picture"/>
+            <wp:docPr descr="Fig. 3. Feasibility frontier \alpha_{\min}=1/(K_1+1). Each marker is a calibration grouping on PTB-XL fold 9 (circles: single dependence source; squares: join of sources) or the MIT-BIH record partition (diamond). Values in parentheses are K_1. A grouping supports a guarantee at level \alpha only if its marker lies below the corresponding dotted line." title="" id="31" name="Picture"/>
             <a:graphic>
               <a:graphicData uri="http://schemas.openxmlformats.org/drawingml/2006/picture">
                 <pic:pic>
                   <pic:nvPicPr>
-                    <pic:cNvPr descr="figures/fig2_feasibility_frontier.png" id="29" name="Picture"/>
+                    <pic:cNvPr descr="figures/fig3_feasibility_frontier.png" id="32" name="Picture"/>
                     <pic:cNvPicPr>
                       <a:picLocks noChangeArrowheads="1" noChangeAspect="1"/>
                     </pic:cNvPicPr>
                   </pic:nvPicPr>
                   <pic:blipFill>
-                    <a:blip r:embed="rId27"/>
+                    <a:blip r:embed="rId30"/>
                     <a:stretch>
                       <a:fillRect/>
                     </a:stretch>
@@ -10823,7 +10892,7 @@
         <w:jc w:val="both"/>
       </w:pPr>
       <w:r>
-        <w:t xml:space="preserve">Fig. 2. Feasibility frontier</w:t>
+        <w:t xml:space="preserve">Fig. 3. Feasibility frontier</w:t>
       </w:r>
       <w:r>
         <w:t xml:space="preserve"> </w:t>
@@ -11919,7 +11988,7 @@
         </m:r>
       </m:oMath>
       <w:r>
-        <w:t xml:space="preserve">). Fig. 3 resolves the</w:t>
+        <w:t xml:space="preserve">). Fig. 4 resolves the</w:t>
       </w:r>
       <w:r>
         <w:t xml:space="preserve"> </w:t>
@@ -11987,18 +12056,18 @@
           <wp:inline>
             <wp:extent cx="5334000" cy="1604287"/>
             <wp:effectExtent b="0" l="0" r="0" t="0"/>
-            <wp:docPr descr="Fig. 3. Calibration blocks carrying each label, by level of the PTB-XL hierarchy (fold 9, patient blocks; log scale). Dashed and dotted lines mark the minimum number of blocks for a finite per-label threshold at \alpha=0.05 and \alpha=0.10. Dark bars meet the \alpha=0.05 requirement, light bars only the \alpha=0.10 requirement, and orange bars neither." title="" id="31" name="Picture"/>
+            <wp:docPr descr="Fig. 4. Calibration blocks carrying each label, by level of the PTB-XL hierarchy (fold 9, patient blocks; log scale). Dashed and dotted lines mark the minimum number of blocks for a finite per-label threshold at \alpha=0.05 and \alpha=0.10. Dark bars meet the \alpha=0.05 requirement, light bars only the \alpha=0.10 requirement, and orange bars neither." title="" id="34" name="Picture"/>
             <a:graphic>
               <a:graphicData uri="http://schemas.openxmlformats.org/drawingml/2006/picture">
                 <pic:pic>
                   <pic:nvPicPr>
-                    <pic:cNvPr descr="figures/fig3_label_feasibility.png" id="32" name="Picture"/>
+                    <pic:cNvPr descr="figures/fig4_label_feasibility.png" id="35" name="Picture"/>
                     <pic:cNvPicPr>
                       <a:picLocks noChangeArrowheads="1" noChangeAspect="1"/>
                     </pic:cNvPicPr>
                   </pic:nvPicPr>
                   <pic:blipFill>
-                    <a:blip r:embed="rId30"/>
+                    <a:blip r:embed="rId33"/>
                     <a:stretch>
                       <a:fillRect/>
                     </a:stretch>
@@ -12031,7 +12100,7 @@
         <w:jc w:val="both"/>
       </w:pPr>
       <w:r>
-        <w:t xml:space="preserve">Fig. 3. Calibration blocks carrying each label, by level of the PTB-XL hierarchy (fold 9, patient blocks; log scale). Dashed and dotted lines mark the minimum number of blocks for a finite per-label threshold at</w:t>
+        <w:t xml:space="preserve">Fig. 4. Calibration blocks carrying each label, by level of the PTB-XL hierarchy (fold 9, patient blocks; log scale). Dashed and dotted lines mark the minimum number of blocks for a finite per-label threshold at</w:t>
       </w:r>
       <w:r>
         <w:t xml:space="preserve"> </w:t>
@@ -12123,8 +12192,8 @@
         <w:t xml:space="preserve">requirement, and orange bars neither.</w:t>
       </w:r>
     </w:p>
-    <w:bookmarkEnd w:id="33"/>
-    <w:bookmarkStart w:id="37" w:name="coverage-under-block-dependence"/>
+    <w:bookmarkEnd w:id="36"/>
+    <w:bookmarkStart w:id="40" w:name="coverage-under-block-dependence"/>
     <w:p>
       <w:pPr>
         <w:pStyle w:val="Heading2"/>
@@ -13251,7 +13320,7 @@
         <w:t xml:space="preserve"> </w:t>
       </w:r>
       <w:r>
-        <w:t xml:space="preserve">its perfect coverage is abstention. Fig. 4 shows both</w:t>
+        <w:t xml:space="preserve">its perfect coverage is abstention. Fig. 5 shows both</w:t>
       </w:r>
       <w:r>
         <w:t xml:space="preserve"> </w:t>
@@ -13302,18 +13371,18 @@
           <wp:inline>
             <wp:extent cx="5334000" cy="1679032"/>
             <wp:effectExtent b="0" l="0" r="0" t="0"/>
-            <wp:docPr descr="Fig. 4. Coverage minus nominal 1-\alpha for split conformal (B1, mean with 2.5–97.5% range across 200 block-level splits) and HCP (B12, mean), primary backbone. Shaded MIT-BIH levels lie below \alpha_{\min}=1/12, where HCP returns every label. Note the different vertical scales." title="" id="35" name="Picture"/>
+            <wp:docPr descr="Fig. 5. Coverage minus nominal 1-\alpha for split conformal (B1, mean with 2.5–97.5% range across 200 block-level splits) and HCP (B12, mean), primary backbone. Shaded MIT-BIH levels lie below \alpha_{\min}=1/12, where HCP returns every label. Note the different vertical scales." title="" id="38" name="Picture"/>
             <a:graphic>
               <a:graphicData uri="http://schemas.openxmlformats.org/drawingml/2006/picture">
                 <pic:pic>
                   <pic:nvPicPr>
-                    <pic:cNvPr descr="figures/fig4_coverage.png" id="36" name="Picture"/>
+                    <pic:cNvPr descr="figures/fig5_coverage.png" id="39" name="Picture"/>
                     <pic:cNvPicPr>
                       <a:picLocks noChangeArrowheads="1" noChangeAspect="1"/>
                     </pic:cNvPicPr>
                   </pic:nvPicPr>
                   <pic:blipFill>
-                    <a:blip r:embed="rId34"/>
+                    <a:blip r:embed="rId37"/>
                     <a:stretch>
                       <a:fillRect/>
                     </a:stretch>
@@ -13346,7 +13415,7 @@
         <w:jc w:val="both"/>
       </w:pPr>
       <w:r>
-        <w:t xml:space="preserve">Fig. 4. Coverage minus nominal</w:t>
+        <w:t xml:space="preserve">Fig. 5. Coverage minus nominal</w:t>
       </w:r>
       <w:r>
         <w:t xml:space="preserve"> </w:t>
@@ -13413,8 +13482,8 @@
         <w:t xml:space="preserve">, where HCP returns every label. Note the different vertical scales.</w:t>
       </w:r>
     </w:p>
-    <w:bookmarkEnd w:id="37"/>
-    <w:bookmarkStart w:id="38" w:name="X971afb3920367740875daf59080031d77744c88"/>
+    <w:bookmarkEnd w:id="40"/>
+    <w:bookmarkStart w:id="44" w:name="X971afb3920367740875daf59080031d77744c88"/>
     <w:p>
       <w:pPr>
         <w:pStyle w:val="Heading2"/>
@@ -14338,11 +14407,80 @@
         <w:t xml:space="preserve"> </w:t>
       </w:r>
       <w:r>
-        <w:t xml:space="preserve">the deficit.</w:t>
+        <w:t xml:space="preserve">the deficit. Fig. 6 sets the two controls side by side: in panel (a) only the</w:t>
+      </w:r>
+      <w:r>
+        <w:t xml:space="preserve"> </w:t>
+      </w:r>
+      <w:r>
+        <w:t xml:space="preserve">clustering effect excludes zero, and in panel (b) the B12−B1 gap keeps nearly</w:t>
+      </w:r>
+      <w:r>
+        <w:t xml:space="preserve"> </w:t>
+      </w:r>
+      <w:r>
+        <w:t xml:space="preserve">its full size once dependence is permuted away.</w:t>
       </w:r>
     </w:p>
-    <w:bookmarkEnd w:id="38"/>
-    <w:bookmarkStart w:id="42" w:name="the-deficit-tracks-the-design-effect"/>
+    <w:p>
+      <w:pPr>
+        <w:pStyle w:val="CaptionedFigure"/>
+        <w:jc w:val="both"/>
+      </w:pPr>
+      <w:r>
+        <w:drawing>
+          <wp:inline>
+            <wp:extent cx="5334000" cy="1559365"/>
+            <wp:effectExtent b="0" l="0" r="0" t="0"/>
+            <wp:docPr descr="Fig. 6. Attribution of the MIT-BIH deficit, primary backbone. (a) Effects of clustering, block-size imbalance and their interaction on B1 coverage in the 2×2 factorial design (95% bootstrap CI; open markers include zero). (b) B12−B1 coverage gap on the original data and after permuting beats between records (bars: mean; whiskers: 2.5–97.5% range across splits). Percentages give the mechanical share, the permuted gap as a fraction of the original." title="" id="42" name="Picture"/>
+            <a:graphic>
+              <a:graphicData uri="http://schemas.openxmlformats.org/drawingml/2006/picture">
+                <pic:pic>
+                  <pic:nvPicPr>
+                    <pic:cNvPr descr="figures/fig6_attribution.png" id="43" name="Picture"/>
+                    <pic:cNvPicPr>
+                      <a:picLocks noChangeArrowheads="1" noChangeAspect="1"/>
+                    </pic:cNvPicPr>
+                  </pic:nvPicPr>
+                  <pic:blipFill>
+                    <a:blip r:embed="rId41"/>
+                    <a:stretch>
+                      <a:fillRect/>
+                    </a:stretch>
+                  </pic:blipFill>
+                  <pic:spPr bwMode="auto">
+                    <a:xfrm>
+                      <a:off x="0" y="0"/>
+                      <a:ext cx="5334000" cy="1559365"/>
+                    </a:xfrm>
+                    <a:prstGeom prst="rect">
+                      <a:avLst/>
+                    </a:prstGeom>
+                    <a:noFill/>
+                    <a:ln w="9525">
+                      <a:noFill/>
+                      <a:headEnd/>
+                      <a:tailEnd/>
+                    </a:ln>
+                  </pic:spPr>
+                </pic:pic>
+              </a:graphicData>
+            </a:graphic>
+          </wp:inline>
+        </w:drawing>
+      </w:r>
+    </w:p>
+    <w:p>
+      <w:pPr>
+        <w:pStyle w:val="ImageCaption"/>
+        <w:jc w:val="both"/>
+      </w:pPr>
+      <w:r>
+        <w:t xml:space="preserve">Fig. 6. Attribution of the MIT-BIH deficit, primary backbone. (a) Effects of clustering, block-size imbalance and their interaction on B1 coverage in the 2×2 factorial design (95% bootstrap CI; open markers include zero). (b) B12−B1 coverage gap on the original data and after permuting beats between records (bars: mean; whiskers: 2.5–97.5% range across splits). Percentages give the mechanical share, the permuted gap as a fraction of the original.</w:t>
+      </w:r>
+    </w:p>
+    <w:bookmarkEnd w:id="44"/>
+    <w:bookmarkStart w:id="48" w:name="the-deficit-tracks-the-design-effect"/>
     <w:p>
       <w:pPr>
         <w:pStyle w:val="Heading2"/>
@@ -15139,7 +15277,7 @@
         <w:t xml:space="preserve"> </w:t>
       </w:r>
       <w:r>
-        <w:t xml:space="preserve">for an exceedance-specific design effect. Fig. 5 plots the deficit against DEff:</w:t>
+        <w:t xml:space="preserve">for an exceedance-specific design effect. Fig. 7 plots the deficit against DEff:</w:t>
       </w:r>
       <w:r>
         <w:t xml:space="preserve"> </w:t>
@@ -15176,18 +15314,18 @@
           <wp:inline>
             <wp:extent cx="3108960" cy="2277948"/>
             <wp:effectExtent b="0" l="0" r="0" t="0"/>
-            <wp:docPr descr="Fig. 5. B1 coverage deficit against the design effect. MIT-BIH points (blue) are obtained by randomly reassigning a growing fraction of beats to other records at a fixed block size; PTB-XL (orange) is the observed patient partition with 95% CI. The annotation gives the Spearman correlation over the 12 points at \alpha=0.10, 0.15, 0.20." title="" id="40" name="Picture"/>
+            <wp:docPr descr="Fig. 7. B1 coverage deficit against the design effect. MIT-BIH points (blue) are obtained by randomly reassigning a growing fraction of beats to other records at a fixed block size; PTB-XL (orange) is the observed patient partition with 95% CI. The annotation gives the Spearman correlation over the 12 points at \alpha=0.10, 0.15, 0.20." title="" id="46" name="Picture"/>
             <a:graphic>
               <a:graphicData uri="http://schemas.openxmlformats.org/drawingml/2006/picture">
                 <pic:pic>
                   <pic:nvPicPr>
-                    <pic:cNvPr descr="figures/fig5_dose_response.png" id="41" name="Picture"/>
+                    <pic:cNvPr descr="figures/fig7_dose_response.png" id="47" name="Picture"/>
                     <pic:cNvPicPr>
                       <a:picLocks noChangeArrowheads="1" noChangeAspect="1"/>
                     </pic:cNvPicPr>
                   </pic:nvPicPr>
                   <pic:blipFill>
-                    <a:blip r:embed="rId39"/>
+                    <a:blip r:embed="rId45"/>
                     <a:stretch>
                       <a:fillRect/>
                     </a:stretch>
@@ -15220,7 +15358,7 @@
         <w:jc w:val="both"/>
       </w:pPr>
       <w:r>
-        <w:t xml:space="preserve">Fig. 5. B1 coverage deficit against the design effect. MIT-BIH points (blue) are obtained by randomly reassigning a growing fraction of beats to other records at a fixed block size; PTB-XL (orange) is the observed patient partition with 95% CI. The annotation gives the Spearman correlation over the 12 points at</w:t>
+        <w:t xml:space="preserve">Fig. 7. B1 coverage deficit against the design effect. MIT-BIH points (blue) are obtained by randomly reassigning a growing fraction of beats to other records at a fixed block size; PTB-XL (orange) is the observed patient partition with 95% CI. The annotation gives the Spearman correlation over the 12 points at</w:t>
       </w:r>
       <w:r>
         <w:t xml:space="preserve"> </w:t>
@@ -15261,8 +15399,8 @@
         <w:t xml:space="preserve">.</w:t>
       </w:r>
     </w:p>
-    <w:bookmarkEnd w:id="42"/>
-    <w:bookmarkStart w:id="46" w:name="robustness-to-backbone-and-checkpoint"/>
+    <w:bookmarkEnd w:id="48"/>
+    <w:bookmarkStart w:id="52" w:name="robustness-to-backbone-and-checkpoint"/>
     <w:p>
       <w:pPr>
         <w:pStyle w:val="Heading2"/>
@@ -15878,7 +16016,7 @@
         <w:t xml:space="preserve"> </w:t>
       </w:r>
       <w:r>
-        <w:t xml:space="preserve">was 75–110% across the three backbones. Fig. 6 shows the per-backbone deficits</w:t>
+        <w:t xml:space="preserve">was 75–110% across the three backbones. Fig. 8 shows the per-backbone deficits</w:t>
       </w:r>
       <w:r>
         <w:t xml:space="preserve"> </w:t>
@@ -15903,18 +16041,18 @@
           <wp:inline>
             <wp:extent cx="3108960" cy="1962112"/>
             <wp:effectExtent b="0" l="0" r="0" t="0"/>
-            <wp:docPr descr="Fig. 6. MIT-BIH B1 coverage deficit against the matched permutation null, by backbone and \alpha (point estimate and 95% bootstrap CI). Open markers denote intervals that include zero." title="" id="44" name="Picture"/>
+            <wp:docPr descr="Fig. 8. MIT-BIH B1 coverage deficit against the matched permutation null, by backbone and \alpha (point estimate and 95% bootstrap CI). Open markers denote intervals that include zero." title="" id="50" name="Picture"/>
             <a:graphic>
               <a:graphicData uri="http://schemas.openxmlformats.org/drawingml/2006/picture">
                 <pic:pic>
                   <pic:nvPicPr>
-                    <pic:cNvPr descr="figures/fig6_backbone_permutation.png" id="45" name="Picture"/>
+                    <pic:cNvPr descr="figures/fig8_backbone_permutation.png" id="51" name="Picture"/>
                     <pic:cNvPicPr>
                       <a:picLocks noChangeArrowheads="1" noChangeAspect="1"/>
                     </pic:cNvPicPr>
                   </pic:nvPicPr>
                   <pic:blipFill>
-                    <a:blip r:embed="rId43"/>
+                    <a:blip r:embed="rId49"/>
                     <a:stretch>
                       <a:fillRect/>
                     </a:stretch>
@@ -15947,7 +16085,7 @@
         <w:jc w:val="both"/>
       </w:pPr>
       <w:r>
-        <w:t xml:space="preserve">Fig. 6. MIT-BIH B1 coverage deficit against the matched permutation null, by backbone and</w:t>
+        <w:t xml:space="preserve">Fig. 8. MIT-BIH B1 coverage deficit against the matched permutation null, by backbone and</w:t>
       </w:r>
       <w:r>
         <w:t xml:space="preserve"> </w:t>
@@ -16068,9 +16206,9 @@
         <w:t xml:space="preserve">magnitude between backbones.</w:t>
       </w:r>
     </w:p>
-    <w:bookmarkEnd w:id="46"/>
-    <w:bookmarkEnd w:id="47"/>
-    <w:bookmarkStart w:id="52" w:name="discussion"/>
+    <w:bookmarkEnd w:id="52"/>
+    <w:bookmarkEnd w:id="53"/>
+    <w:bookmarkStart w:id="58" w:name="discussion"/>
     <w:p>
       <w:pPr>
         <w:pStyle w:val="Heading1"/>
@@ -16079,7 +16217,7 @@
         <w:t xml:space="preserve">6. Discussion</w:t>
       </w:r>
     </w:p>
-    <w:bookmarkStart w:id="48" w:name="main-findings"/>
+    <w:bookmarkStart w:id="54" w:name="main-findings"/>
     <w:p>
       <w:pPr>
         <w:pStyle w:val="Heading2"/>
@@ -16396,8 +16534,8 @@
         <w:t xml:space="preserve">size for thresholds under clustering is derived in [40].</w:t>
       </w:r>
     </w:p>
-    <w:bookmarkEnd w:id="48"/>
-    <w:bookmarkStart w:id="49" w:name="X2082e78ae0f4c77c313456103384ade8026f359"/>
+    <w:bookmarkEnd w:id="54"/>
+    <w:bookmarkStart w:id="55" w:name="X2082e78ae0f4c77c313456103384ade8026f359"/>
     <w:p>
       <w:pPr>
         <w:pStyle w:val="Heading2"/>
@@ -16591,7 +16729,7 @@
         <w:t xml:space="preserve"> </w:t>
       </w:r>
       <w:r>
-        <w:t xml:space="preserve">by returning every label (Fig. 4). A claim that a hierarchical method improves</w:t>
+        <w:t xml:space="preserve">by returning every label (Fig. 5). A claim that a hierarchical method improves</w:t>
       </w:r>
       <w:r>
         <w:t xml:space="preserve"> </w:t>
@@ -16612,8 +16750,8 @@
         <w:t xml:space="preserve">with set size, since abstention is the cheapest way to cover.</w:t>
       </w:r>
     </w:p>
-    <w:bookmarkEnd w:id="49"/>
-    <w:bookmarkStart w:id="50" w:name="implications-and-relation-to-prior-work"/>
+    <w:bookmarkEnd w:id="55"/>
+    <w:bookmarkStart w:id="56" w:name="implications-and-relation-to-prior-work"/>
     <w:p>
       <w:pPr>
         <w:pStyle w:val="Heading2"/>
@@ -17021,8 +17159,8 @@
         <w:t xml:space="preserve">counterparts face the same boundary is left open.</w:t>
       </w:r>
     </w:p>
-    <w:bookmarkEnd w:id="50"/>
-    <w:bookmarkStart w:id="51" w:name="limitations-and-threats-to-validity"/>
+    <w:bookmarkEnd w:id="56"/>
+    <w:bookmarkStart w:id="57" w:name="limitations-and-threats-to-validity"/>
     <w:p>
       <w:pPr>
         <w:pStyle w:val="Heading2"/>
@@ -18008,9 +18146,9 @@
         <w:t xml:space="preserve">deviation log accompanies the protocol.</w:t>
       </w:r>
     </w:p>
-    <w:bookmarkEnd w:id="51"/>
-    <w:bookmarkEnd w:id="52"/>
-    <w:bookmarkStart w:id="53" w:name="conclusion"/>
+    <w:bookmarkEnd w:id="57"/>
+    <w:bookmarkEnd w:id="58"/>
+    <w:bookmarkStart w:id="59" w:name="conclusion"/>
     <w:p>
       <w:pPr>
         <w:pStyle w:val="Heading1"/>
@@ -18100,8 +18238,8 @@
         <w:t xml:space="preserve">other block-level procedures share the same boundary remains open.</w:t>
       </w:r>
     </w:p>
-    <w:bookmarkEnd w:id="53"/>
-    <w:bookmarkStart w:id="57" w:name="appendix-a.-supplementary-derivations"/>
+    <w:bookmarkEnd w:id="59"/>
+    <w:bookmarkStart w:id="63" w:name="appendix-a.-supplementary-derivations"/>
     <w:p>
       <w:pPr>
         <w:pStyle w:val="Heading1"/>
@@ -18110,7 +18248,7 @@
         <w:t xml:space="preserve">Appendix A. Supplementary Derivations</w:t>
       </w:r>
     </w:p>
-    <w:bookmarkStart w:id="54" w:name="a.1-the-boundary-case-of-proposition-1"/>
+    <w:bookmarkStart w:id="60" w:name="a.1-the-boundary-case-of-proposition-1"/>
     <w:p>
       <w:pPr>
         <w:pStyle w:val="Heading2"/>
@@ -18402,8 +18540,8 @@
         <w:t xml:space="preserve">.</w:t>
       </w:r>
     </w:p>
-    <w:bookmarkEnd w:id="54"/>
-    <w:bookmarkStart w:id="55" w:name="a.2-variance-under-compound-symmetry"/>
+    <w:bookmarkEnd w:id="60"/>
+    <w:bookmarkStart w:id="61" w:name="a.2-variance-under-compound-symmetry"/>
     <w:p>
       <w:pPr>
         <w:pStyle w:val="Heading2"/>
@@ -18891,8 +19029,8 @@
         <w:t xml:space="preserve">no claim outside (A).</w:t>
       </w:r>
     </w:p>
-    <w:bookmarkEnd w:id="55"/>
-    <w:bookmarkStart w:id="56" w:name="X7762396f0ee7e442bd161c48a219bce8dfbbc32"/>
+    <w:bookmarkEnd w:id="61"/>
+    <w:bookmarkStart w:id="62" w:name="X7762396f0ee7e442bd161c48a219bce8dfbbc32"/>
     <w:p>
       <w:pPr>
         <w:pStyle w:val="Heading2"/>
@@ -19332,9 +19470,9 @@
         <w:t xml:space="preserve">.</w:t>
       </w:r>
     </w:p>
-    <w:bookmarkEnd w:id="56"/>
-    <w:bookmarkEnd w:id="57"/>
-    <w:bookmarkStart w:id="58" w:name="X06db9a02045705c8b7d21c68ec78218971b4832"/>
+    <w:bookmarkEnd w:id="62"/>
+    <w:bookmarkEnd w:id="63"/>
+    <w:bookmarkStart w:id="64" w:name="X06db9a02045705c8b7d21c68ec78218971b4832"/>
     <w:p>
       <w:pPr>
         <w:pStyle w:val="Heading1"/>
@@ -19701,8 +19839,8 @@
         </w:tc>
       </w:tr>
     </w:tbl>
-    <w:bookmarkEnd w:id="58"/>
-    <w:bookmarkStart w:id="59" w:name="references"/>
+    <w:bookmarkEnd w:id="64"/>
+    <w:bookmarkStart w:id="65" w:name="references"/>
     <w:p>
       <w:pPr>
         <w:pStyle w:val="Heading1"/>
@@ -21409,7 +21547,7 @@
         <w:t>T. Bender et al., “Analysis of a Deep Learning Model for 12-Lead ECG Classification Reveals Learned Features Similar to Diagnostic Criteria,” IEEE J. Biomed. Health Inform., vol. 28, no. 4, pp. 1848–1859, Apr. 2024, doi: 10.1109/jbhi.2023.3271858.</w:t>
       </w:r>
     </w:p>
-    <w:bookmarkEnd w:id="59"/>
+    <w:bookmarkEnd w:id="65"/>
     <w:sectPr>
       <w:footnotePr>
         <w:numRestart w:val="eachSect"/>

</xml_diff>

<commit_message>
Fig. 1 = alur audit dua tahap (didesain ulang, di s1); skema join menjadi Fig. 2
Alur baru memuat masukan (tiga dataset, sumber D), tahap 1 metadata-saja (RQ1: observability, join, kelayakan, level label -> putusan s5.1) dan tahap 2 berbasis skor (RQ2: kalibrasi B1 vs B12, null permutasi + faktorial, dose-response, ketidakpastian split vs subjek, robustness -> temuan s5.2-5.5), dengan panah 'feasible alpha only'. Gambar lama memuat teks yang keluar kotak dan belum mencakup jackknife/faktorial/robustness. s4 kini merujuk Fig. 1; 23 halaman.
</commit_message>
<xml_diff>
--- a/docs/paper/manuscript-draft.docx
+++ b/docs/paper/manuscript-draft.docx
@@ -20,7 +20,7 @@
           <w:i/>
           <w:iCs/>
         </w:rPr>
-        <w:t xml:space="preserve">Working draft for internal review — generated 2026-10-03 from commit b5904a5.</w:t>
+        <w:t xml:space="preserve">Working draft for internal review — generated 2026-10-03 from commit 647a1e5.</w:t>
       </w:r>
     </w:p>
     <w:p>
@@ -186,7 +186,7 @@
         <w:t xml:space="preserve">Conformal prediction, electrocardiography, uncertainty quantification, hierarchical data, exchangeability, calibration, study design.</w:t>
       </w:r>
     </w:p>
-    <w:bookmarkStart w:id="9" w:name="introduction"/>
+    <w:bookmarkStart w:id="12" w:name="introduction"/>
     <w:p>
       <w:pPr>
         <w:pStyle w:val="Heading1"/>
@@ -787,23 +787,109 @@
         <w:t xml:space="preserve"> </w:t>
       </w:r>
       <w:r>
-        <w:t xml:space="preserve">deviation log are released with the paper. Section 2 situates the audit in</w:t>
-      </w:r>
-      <w:r>
-        <w:t xml:space="preserve"> </w:t>
-      </w:r>
-      <w:r>
-        <w:t xml:space="preserve">prior work, Section 3 derives the feasibility conditions, Section 4 sets out the</w:t>
-      </w:r>
-      <w:r>
-        <w:t xml:space="preserve"> </w:t>
-      </w:r>
-      <w:r>
-        <w:t xml:space="preserve">design, and Sections 5 and 6 present and discuss the findings.</w:t>
+        <w:t xml:space="preserve">deviation log are released with the paper. Fig. 1 summarizes the audit: a first</w:t>
+      </w:r>
+      <w:r>
+        <w:t xml:space="preserve"> </w:t>
+      </w:r>
+      <w:r>
+        <w:t xml:space="preserve">stage that answers RQ1 from metadata alone, and a second stage that answers RQ2</w:t>
+      </w:r>
+      <w:r>
+        <w:t xml:space="preserve"> </w:t>
+      </w:r>
+      <w:r>
+        <w:t xml:space="preserve">from the conformity scores of three backbones, together with the sections that</w:t>
+      </w:r>
+      <w:r>
+        <w:t xml:space="preserve"> </w:t>
+      </w:r>
+      <w:r>
+        <w:t xml:space="preserve">report each step. Section 2 situates the audit in prior work, Section 3 derives</w:t>
+      </w:r>
+      <w:r>
+        <w:t xml:space="preserve"> </w:t>
+      </w:r>
+      <w:r>
+        <w:t xml:space="preserve">the feasibility conditions, Section 4 sets out the design, and Sections 5 and 6</w:t>
+      </w:r>
+      <w:r>
+        <w:t xml:space="preserve"> </w:t>
+      </w:r>
+      <w:r>
+        <w:t xml:space="preserve">present and discuss the findings.</w:t>
       </w:r>
     </w:p>
-    <w:bookmarkEnd w:id="9"/>
-    <w:bookmarkStart w:id="12" w:name="related-work"/>
+    <w:p>
+      <w:pPr>
+        <w:pStyle w:val="CaptionedFigure"/>
+        <w:jc w:val="both"/>
+      </w:pPr>
+      <w:r>
+        <w:drawing>
+          <wp:inline>
+            <wp:extent cx="5334000" cy="2059127"/>
+            <wp:effectExtent b="0" l="0" r="0" t="0"/>
+            <wp:docPr descr="Fig. 1. Audit workflow. Stage 1 (blue) uses metadata only and returns verdicts that are exact given the declared dependence sources D, before any model is trained (RQ1; §3, §5.1). Stage 2 (orange) uses conformity scores from three backbones, at feasible levels only, to compare naive split conformal (B1) with HCP (B12), attribute the B1 deficit to dependence, relate it to the design effect, separate split-level from subject-level uncertainty and check robustness (RQ2; §5.2–§5.5)." title="" id="10" name="Picture"/>
+            <a:graphic>
+              <a:graphicData uri="http://schemas.openxmlformats.org/drawingml/2006/picture">
+                <pic:pic>
+                  <pic:nvPicPr>
+                    <pic:cNvPr descr="figures/fig1_audit_workflow.png" id="11" name="Picture"/>
+                    <pic:cNvPicPr>
+                      <a:picLocks noChangeArrowheads="1" noChangeAspect="1"/>
+                    </pic:cNvPicPr>
+                  </pic:nvPicPr>
+                  <pic:blipFill>
+                    <a:blip r:embed="rId9"/>
+                    <a:stretch>
+                      <a:fillRect/>
+                    </a:stretch>
+                  </pic:blipFill>
+                  <pic:spPr bwMode="auto">
+                    <a:xfrm>
+                      <a:off x="0" y="0"/>
+                      <a:ext cx="5334000" cy="2059127"/>
+                    </a:xfrm>
+                    <a:prstGeom prst="rect">
+                      <a:avLst/>
+                    </a:prstGeom>
+                    <a:noFill/>
+                    <a:ln w="9525">
+                      <a:noFill/>
+                      <a:headEnd/>
+                      <a:tailEnd/>
+                    </a:ln>
+                  </pic:spPr>
+                </pic:pic>
+              </a:graphicData>
+            </a:graphic>
+          </wp:inline>
+        </w:drawing>
+      </w:r>
+    </w:p>
+    <w:p>
+      <w:pPr>
+        <w:pStyle w:val="ImageCaption"/>
+        <w:jc w:val="both"/>
+      </w:pPr>
+      <w:r>
+        <w:t xml:space="preserve">Fig. 1. Audit workflow. Stage 1 (blue) uses metadata only and returns verdicts that are exact given the declared dependence sources</w:t>
+      </w:r>
+      <w:r>
+        <w:t xml:space="preserve"> </w:t>
+      </w:r>
+      <m:oMath>
+        <m:r>
+          <m:t>D</m:t>
+        </m:r>
+      </m:oMath>
+      <w:r>
+        <w:t xml:space="preserve">, before any model is trained (RQ1; §3, §5.1). Stage 2 (orange) uses conformity scores from three backbones, at feasible levels only, to compare naive split conformal (B1) with HCP (B12), attribute the B1 deficit to dependence, relate it to the design effect, separate split-level from subject-level uncertainty and check robustness (RQ2; §5.2–§5.5).</w:t>
+      </w:r>
+    </w:p>
+    <w:bookmarkEnd w:id="12"/>
+    <w:bookmarkStart w:id="15" w:name="related-work"/>
     <w:p>
       <w:pPr>
         <w:pStyle w:val="Heading1"/>
@@ -812,7 +898,7 @@
         <w:t xml:space="preserve">2. Related Work</w:t>
       </w:r>
     </w:p>
-    <w:bookmarkStart w:id="10" w:name="X82604ee80040ca60fd96cad68dfd92d7ce32f61"/>
+    <w:bookmarkStart w:id="13" w:name="X82604ee80040ca60fd96cad68dfd92d7ce32f61"/>
     <w:p>
       <w:pPr>
         <w:pStyle w:val="Heading2"/>
@@ -1015,8 +1101,8 @@
         <w:t xml:space="preserve">what happens on clinical data when it does.</w:t>
       </w:r>
     </w:p>
-    <w:bookmarkEnd w:id="10"/>
-    <w:bookmarkStart w:id="11" w:name="Xde641f5d420a891fdb073e7aa4fa0944e53f724"/>
+    <w:bookmarkEnd w:id="13"/>
+    <w:bookmarkStart w:id="14" w:name="Xde641f5d420a891fdb073e7aa4fa0944e53f724"/>
     <w:p>
       <w:pPr>
         <w:pStyle w:val="Heading2"/>
@@ -1275,9 +1361,9 @@
         <w:t xml:space="preserve">procedure.</w:t>
       </w:r>
     </w:p>
-    <w:bookmarkEnd w:id="11"/>
-    <w:bookmarkEnd w:id="12"/>
-    <w:bookmarkStart w:id="20" w:name="problem-formulation-and-hcp-feasibility"/>
+    <w:bookmarkEnd w:id="14"/>
+    <w:bookmarkEnd w:id="15"/>
+    <w:bookmarkStart w:id="23" w:name="problem-formulation-and-hcp-feasibility"/>
     <w:p>
       <w:pPr>
         <w:pStyle w:val="Heading1"/>
@@ -1313,7 +1399,7 @@
         <w:t xml:space="preserve">distinct from findings.</w:t>
       </w:r>
     </w:p>
-    <w:bookmarkStart w:id="13" w:name="hierarchical-calibration"/>
+    <w:bookmarkStart w:id="16" w:name="hierarchical-calibration"/>
     <w:p>
       <w:pPr>
         <w:pStyle w:val="Heading2"/>
@@ -2567,8 +2653,8 @@
         </m:oMath>
       </m:oMathPara>
     </w:p>
-    <w:bookmarkEnd w:id="13"/>
-    <w:bookmarkStart w:id="14" w:name="finite-threshold-feasibility"/>
+    <w:bookmarkEnd w:id="16"/>
+    <w:bookmarkStart w:id="17" w:name="finite-threshold-feasibility"/>
     <w:p>
       <w:pPr>
         <w:pStyle w:val="Heading2"/>
@@ -4862,8 +4948,8 @@
         <w:t xml:space="preserve">correction now used in the conformal literature targets the wrong quantity [40].</w:t>
       </w:r>
     </w:p>
-    <w:bookmarkEnd w:id="14"/>
-    <w:bookmarkStart w:id="18" w:name="crossed-dependence-sources"/>
+    <w:bookmarkEnd w:id="17"/>
+    <w:bookmarkStart w:id="21" w:name="crossed-dependence-sources"/>
     <w:p>
       <w:pPr>
         <w:pStyle w:val="Heading2"/>
@@ -5638,7 +5724,7 @@
         <w:t xml:space="preserve"> </w:t>
       </w:r>
       <w:r>
-        <w:t xml:space="preserve">implication for calibration. Fig. 1 illustrates it with eight hypothetical</w:t>
+        <w:t xml:space="preserve">implication for calibration. Fig. 2 illustrates it with eight hypothetical</w:t>
       </w:r>
       <w:r>
         <w:t xml:space="preserve"> </w:t>
@@ -5663,18 +5749,18 @@
           <wp:inline>
             <wp:extent cx="3108960" cy="1073695"/>
             <wp:effectExtent b="0" l="0" r="0" t="0"/>
-            <wp:docPr descr="Fig. 1. Schematic of Proposition 2 on eight hypothetical records (circles). Solid arcs link records of the same patient and dashed arcs records of the same device. A grouping sufficient for both sources must keep every linked pair in one block, so the finest such grouping is the join, the connected components (shaded). On PTB-XL the same mechanism collapses four declared sources to a single block (§5.1)." title="" id="16" name="Picture"/>
+            <wp:docPr descr="Fig. 2. Schematic of Proposition 2 on eight hypothetical records (circles). Solid arcs link records of the same patient and dashed arcs records of the same device. A grouping sufficient for both sources must keep every linked pair in one block, so the finest such grouping is the join, the connected components (shaded). On PTB-XL the same mechanism collapses four declared sources to a single block (§5.1)." title="" id="19" name="Picture"/>
             <a:graphic>
               <a:graphicData uri="http://schemas.openxmlformats.org/drawingml/2006/picture">
                 <pic:pic>
                   <pic:nvPicPr>
-                    <pic:cNvPr descr="figures/fig1_join_schematic.png" id="17" name="Picture"/>
+                    <pic:cNvPr descr="figures/fig2_join_schematic.png" id="20" name="Picture"/>
                     <pic:cNvPicPr>
                       <a:picLocks noChangeArrowheads="1" noChangeAspect="1"/>
                     </pic:cNvPicPr>
                   </pic:nvPicPr>
                   <pic:blipFill>
-                    <a:blip r:embed="rId15"/>
+                    <a:blip r:embed="rId18"/>
                     <a:stretch>
                       <a:fillRect/>
                     </a:stretch>
@@ -5707,7 +5793,7 @@
         <w:jc w:val="both"/>
       </w:pPr>
       <w:r>
-        <w:t xml:space="preserve">Fig. 1. Schematic of Proposition 2 on eight hypothetical records (circles). Solid arcs link records of the same patient and dashed arcs records of the same device. A grouping sufficient for both sources must keep every linked pair in one block, so the finest such grouping is the join, the connected components (shaded). On PTB-XL the same mechanism collapses four declared sources to a single block (§5.1).</w:t>
+        <w:t xml:space="preserve">Fig. 2. Schematic of Proposition 2 on eight hypothetical records (circles). Solid arcs link records of the same patient and dashed arcs records of the same device. A grouping sufficient for both sources must keep every linked pair in one block, so the finest such grouping is the join, the connected components (shaded). On PTB-XL the same mechanism collapses four declared sources to a single block (§5.1).</w:t>
       </w:r>
     </w:p>
     <w:p>
@@ -6206,8 +6292,8 @@
         <w:t xml:space="preserve">property of the data.</w:t>
       </w:r>
     </w:p>
-    <w:bookmarkEnd w:id="18"/>
-    <w:bookmarkStart w:id="19" w:name="label-conditional-feasibility"/>
+    <w:bookmarkEnd w:id="21"/>
+    <w:bookmarkStart w:id="22" w:name="label-conditional-feasibility"/>
     <w:p>
       <w:pPr>
         <w:pStyle w:val="Heading2"/>
@@ -7303,8 +7389,8 @@
         <w:t xml:space="preserve">.</w:t>
       </w:r>
     </w:p>
-    <w:bookmarkEnd w:id="19"/>
-    <w:bookmarkEnd w:id="20"/>
+    <w:bookmarkEnd w:id="22"/>
+    <w:bookmarkEnd w:id="23"/>
     <w:bookmarkStart w:id="29" w:name="audit-design"/>
     <w:p>
       <w:pPr>
@@ -7446,70 +7532,19 @@
         <w:t xml:space="preserve"> </w:t>
       </w:r>
       <w:r>
-        <w:t xml:space="preserve">in it. Fig. 2 outlines the protocol and</w:t>
-      </w:r>
-      <w:r>
-        <w:t xml:space="preserve"> </w:t>
-      </w:r>
-      <w:r>
-        <w:t xml:space="preserve">marks which four steps need only metadata and which two need conformity scores.</w:t>
-      </w:r>
-    </w:p>
-    <w:p>
-      <w:pPr>
-        <w:pStyle w:val="CaptionedFigure"/>
-        <w:jc w:val="both"/>
-      </w:pPr>
-      <w:r>
-        <w:drawing>
-          <wp:inline>
-            <wp:extent cx="5334000" cy="1397151"/>
-            <wp:effectExtent b="0" l="0" r="0" t="0"/>
-            <wp:docPr descr="Fig. 2. Audit protocol. The first four steps use metadata only and return verdicts that are exact given the declared dependence sources, before any patient is enrolled or any model trained; the last two require conformity scores from a trained model." title="" id="22" name="Picture"/>
-            <a:graphic>
-              <a:graphicData uri="http://schemas.openxmlformats.org/drawingml/2006/picture">
-                <pic:pic>
-                  <pic:nvPicPr>
-                    <pic:cNvPr descr="figures/fig2_audit_workflow.png" id="23" name="Picture"/>
-                    <pic:cNvPicPr>
-                      <a:picLocks noChangeArrowheads="1" noChangeAspect="1"/>
-                    </pic:cNvPicPr>
-                  </pic:nvPicPr>
-                  <pic:blipFill>
-                    <a:blip r:embed="rId21"/>
-                    <a:stretch>
-                      <a:fillRect/>
-                    </a:stretch>
-                  </pic:blipFill>
-                  <pic:spPr bwMode="auto">
-                    <a:xfrm>
-                      <a:off x="0" y="0"/>
-                      <a:ext cx="5334000" cy="1397151"/>
-                    </a:xfrm>
-                    <a:prstGeom prst="rect">
-                      <a:avLst/>
-                    </a:prstGeom>
-                    <a:noFill/>
-                    <a:ln w="9525">
-                      <a:noFill/>
-                      <a:headEnd/>
-                      <a:tailEnd/>
-                    </a:ln>
-                  </pic:spPr>
-                </pic:pic>
-              </a:graphicData>
-            </a:graphic>
-          </wp:inline>
-        </w:drawing>
-      </w:r>
-    </w:p>
-    <w:p>
-      <w:pPr>
-        <w:pStyle w:val="ImageCaption"/>
-        <w:jc w:val="both"/>
-      </w:pPr>
-      <w:r>
-        <w:t xml:space="preserve">Fig. 2. Audit protocol. The first four steps use metadata only and return verdicts that are exact given the declared dependence sources, before any patient is enrolled or any model trained; the last two require conformity scores from a trained model.</w:t>
+        <w:t xml:space="preserve">in it. Fig. 1 (§1) shows how the two</w:t>
+      </w:r>
+      <w:r>
+        <w:t xml:space="preserve"> </w:t>
+      </w:r>
+      <w:r>
+        <w:t xml:space="preserve">stages connect: only levels found feasible in the first are audited in the</w:t>
+      </w:r>
+      <w:r>
+        <w:t xml:space="preserve"> </w:t>
+      </w:r>
+      <w:r>
+        <w:t xml:space="preserve">second.</w:t>
       </w:r>
     </w:p>
     <w:bookmarkStart w:id="24" w:name="datasets-and-dependence-structures"/>

</xml_diff>

<commit_message>
Fig. 1: gaya panel-alur (mengikuti referensi) dengan palet lembut
Tiga kolom panel berbingkai: sumber data -> tahap 1 (langkah bernomor, chevron) | kalibrasi (hub + satelit) -> atribusi (hub + empat analisis) | ketidakpastian & robustness (siklus per backbone dan alpha) -> temuan per subbab. Judul pil, kotak krem, banner keluaran merah muda, hub hijau mint; header biru = tahap 1, peach = tahap 2. Narasi Fig. 1 dipindah ke paragraf RQ agar gambar tidak menyisakan setengah halaman kosong; tetap 23 halaman.
</commit_message>
<xml_diff>
--- a/docs/paper/manuscript-draft.docx
+++ b/docs/paper/manuscript-draft.docx
@@ -20,7 +20,7 @@
           <w:i/>
           <w:iCs/>
         </w:rPr>
-        <w:t xml:space="preserve">Working draft for internal review — generated 2026-10-03 from commit 647a1e5.</w:t>
+        <w:t xml:space="preserve">Working draft for internal review — generated 2026-10-03 from commit 8852d79.</w:t>
       </w:r>
     </w:p>
     <w:p>
@@ -560,264 +560,25 @@
         <w:t xml:space="preserve"> </w:t>
       </w:r>
       <w:r>
-        <w:t xml:space="preserve">and through what mechanism (RQ2)? We introduce no new conformal procedure. The</w:t>
-      </w:r>
-      <w:r>
-        <w:t xml:space="preserve"> </w:t>
-      </w:r>
-      <w:r>
-        <w:t xml:space="preserve">audit contributes the following.</w:t>
-      </w:r>
-    </w:p>
-    <w:p>
-      <w:pPr>
-        <w:pStyle w:val="Compact"/>
-        <w:numPr>
-          <w:ilvl w:val="0"/>
-          <w:numId w:val="1001"/>
-        </w:numPr>
-      </w:pPr>
-      <w:r>
-        <w:t xml:space="preserve">A metadata-only feasibility audit (RQ1; §3, §5.1). The HCP bound, combined</w:t>
-      </w:r>
-      <w:r>
-        <w:t xml:space="preserve"> </w:t>
-      </w:r>
-      <w:r>
-        <w:t xml:space="preserve">with the join of the declared dependence sources, returns exact verdicts from</w:t>
-      </w:r>
-      <w:r>
-        <w:t xml:space="preserve"> </w:t>
-      </w:r>
-      <w:r>
-        <w:t xml:space="preserve">metadata or planned enrollment counts, before any model is trained. With all</w:t>
-      </w:r>
-      <w:r>
-        <w:t xml:space="preserve"> </w:t>
-      </w:r>
-      <w:r>
-        <w:t xml:space="preserve">four documented PTB-XL sources declared, every admissible calibration grouping</w:t>
-      </w:r>
-      <w:r>
-        <w:t xml:space="preserve"> </w:t>
-      </w:r>
-      <w:r>
-        <w:t xml:space="preserve">reduces to one block; with patient blocking alone, 24 of 44 SCP diagnostic</w:t>
-      </w:r>
-      <w:r>
-        <w:t xml:space="preserve"> </w:t>
-      </w:r>
-      <w:r>
-        <w:t xml:space="preserve">statements lack a finite per-label threshold at</w:t>
-      </w:r>
-      <w:r>
-        <w:t xml:space="preserve"> </w:t>
-      </w:r>
-      <m:oMath>
-        <m:r>
-          <m:t>α</m:t>
-        </m:r>
-        <m:r>
-          <m:rPr>
-            <m:sty m:val="p"/>
-          </m:rPr>
-          <m:t>=</m:t>
-        </m:r>
-        <m:r>
-          <m:t>0.05</m:t>
-        </m:r>
-      </m:oMath>
-      <w:r>
-        <w:t xml:space="preserve">; and dividing the</w:t>
-      </w:r>
-      <w:r>
-        <w:t xml:space="preserve"> </w:t>
-      </w:r>
-      <w:r>
-        <w:t xml:space="preserve">22 MIT-BIH evaluation subjects evenly between calibration and test rules out a</w:t>
-      </w:r>
-      <w:r>
-        <w:t xml:space="preserve"> </w:t>
-      </w:r>
-      <w:r>
-        <w:t xml:space="preserve">subject-level guarantee at the 95% level.</w:t>
-      </w:r>
-    </w:p>
-    <w:p>
-      <w:pPr>
-        <w:pStyle w:val="Compact"/>
-        <w:numPr>
-          <w:ilvl w:val="0"/>
-          <w:numId w:val="1001"/>
-        </w:numPr>
-      </w:pPr>
-      <w:r>
-        <w:t xml:space="preserve">Attribution of under-coverage to dependence acting through repetition</w:t>
-      </w:r>
-      <w:r>
-        <w:t xml:space="preserve"> </w:t>
-      </w:r>
-      <w:r>
-        <w:t xml:space="preserve">(RQ2; §5.2–§5.4). On the 22 MIT-BIH evaluation subjects, naive split conformal</w:t>
-      </w:r>
-      <w:r>
-        <w:t xml:space="preserve"> </w:t>
-      </w:r>
-      <w:r>
-        <w:t xml:space="preserve">covers less than a matched permutation null in every backbone and level, a</w:t>
-      </w:r>
-      <w:r>
-        <w:t xml:space="preserve"> </w:t>
-      </w:r>
-      <w:r>
-        <w:t xml:space="preserve">factorial design attributes the shortfall mainly to clustering, with block-size</w:t>
-      </w:r>
-      <w:r>
-        <w:t xml:space="preserve"> </w:t>
-      </w:r>
-      <w:r>
-        <w:t xml:space="preserve">imbalance acting through it, and a controlled dose–response experiment shows it</w:t>
-      </w:r>
-      <w:r>
-        <w:t xml:space="preserve"> </w:t>
-      </w:r>
-      <w:r>
-        <w:t xml:space="preserve">increasing with the design effect. PTB-XL, despite substantial within-patient</w:t>
-      </w:r>
-      <w:r>
-        <w:t xml:space="preserve"> </w:t>
-      </w:r>
-      <w:r>
-        <w:t xml:space="preserve">correlation, sits near zero, as the design effect predicts. With only 22</w:t>
-      </w:r>
-      <w:r>
-        <w:t xml:space="preserve"> </w:t>
-      </w:r>
-      <w:r>
-        <w:t xml:space="preserve">subjects, however, the deficit is not resolved at the level of subjects, which</w:t>
-      </w:r>
-      <w:r>
-        <w:t xml:space="preserve"> </w:t>
-      </w:r>
-      <w:r>
-        <w:t xml:space="preserve">we report as a limit of the evidence that mirrors the limit on the guarantee.</w:t>
-      </w:r>
-    </w:p>
-    <w:p>
-      <w:pPr>
-        <w:pStyle w:val="Compact"/>
-        <w:numPr>
-          <w:ilvl w:val="0"/>
-          <w:numId w:val="1001"/>
-        </w:numPr>
-      </w:pPr>
-      <w:r>
-        <w:t xml:space="preserve">Two cautions for evaluating conformal methods on clustered data (§5.3,</w:t>
-      </w:r>
-      <w:r>
-        <w:t xml:space="preserve"> </w:t>
-      </w:r>
-      <w:r>
-        <w:t xml:space="preserve">§6.2). Between 75% and 110% of the apparent gain of HCP over naive split</w:t>
-      </w:r>
-      <w:r>
-        <w:t xml:space="preserve"> </w:t>
-      </w:r>
-      <w:r>
-        <w:t xml:space="preserve">conformal survives when within-block dependence is permuted away, so the gain</w:t>
-      </w:r>
-      <w:r>
-        <w:t xml:space="preserve"> </w:t>
-      </w:r>
-      <w:r>
-        <w:t xml:space="preserve">is largely mechanical. And intervals from repeated random splits of a fixed set</w:t>
-      </w:r>
-      <w:r>
-        <w:t xml:space="preserve"> </w:t>
-      </w:r>
-      <w:r>
-        <w:t xml:space="preserve">of subjects describe the split procedure rather than the population: on</w:t>
-      </w:r>
-      <w:r>
-        <w:t xml:space="preserve"> </w:t>
-      </w:r>
-      <w:r>
-        <w:t xml:space="preserve">MIT-BIH they exclude zero where a jackknife over subjects does not. We</w:t>
-      </w:r>
-      <w:r>
-        <w:t xml:space="preserve"> </w:t>
-      </w:r>
-      <w:r>
-        <w:t xml:space="preserve">recommend matched permutation nulls, joint reporting of set size, and</w:t>
-      </w:r>
-      <w:r>
-        <w:t xml:space="preserve"> </w:t>
-      </w:r>
-      <w:r>
-        <w:t xml:space="preserve">resampling of subjects whenever a population claim is intended.</w:t>
-      </w:r>
-    </w:p>
-    <w:p>
-      <w:pPr>
-        <w:pStyle w:val="FirstParagraph"/>
-        <w:jc w:val="both"/>
-      </w:pPr>
-      <w:r>
-        <w:t xml:space="preserve">The direction of every finding is checked across three backbones whose parameter</w:t>
-      </w:r>
-      <w:r>
-        <w:t xml:space="preserve"> </w:t>
-      </w:r>
-      <w:r>
-        <w:t xml:space="preserve">counts differ by more than a hundredfold and across two checkpoints. Resampling</w:t>
-      </w:r>
-      <w:r>
-        <w:t xml:space="preserve"> </w:t>
-      </w:r>
-      <w:r>
-        <w:t xml:space="preserve">is always performed over blocks, the held-out PTB-XL fold has never been</w:t>
-      </w:r>
-      <w:r>
-        <w:t xml:space="preserve"> </w:t>
-      </w:r>
-      <w:r>
-        <w:t xml:space="preserve">inspected, and the code, per-result artifacts, analysis protocol and its</w:t>
-      </w:r>
-      <w:r>
-        <w:t xml:space="preserve"> </w:t>
-      </w:r>
-      <w:r>
-        <w:t xml:space="preserve">deviation log are released with the paper. Fig. 1 summarizes the audit: a first</w:t>
-      </w:r>
-      <w:r>
-        <w:t xml:space="preserve"> </w:t>
-      </w:r>
-      <w:r>
-        <w:t xml:space="preserve">stage that answers RQ1 from metadata alone, and a second stage that answers RQ2</w:t>
-      </w:r>
-      <w:r>
-        <w:t xml:space="preserve"> </w:t>
-      </w:r>
-      <w:r>
-        <w:t xml:space="preserve">from the conformity scores of three backbones, together with the sections that</w:t>
-      </w:r>
-      <w:r>
-        <w:t xml:space="preserve"> </w:t>
-      </w:r>
-      <w:r>
-        <w:t xml:space="preserve">report each step. Section 2 situates the audit in prior work, Section 3 derives</w:t>
-      </w:r>
-      <w:r>
-        <w:t xml:space="preserve"> </w:t>
-      </w:r>
-      <w:r>
-        <w:t xml:space="preserve">the feasibility conditions, Section 4 sets out the design, and Sections 5 and 6</w:t>
-      </w:r>
-      <w:r>
-        <w:t xml:space="preserve"> </w:t>
-      </w:r>
-      <w:r>
-        <w:t xml:space="preserve">present and discuss the findings.</w:t>
+        <w:t xml:space="preserve">and through what mechanism (RQ2)? Fig. 1 summarizes the audit: a first stage</w:t>
+      </w:r>
+      <w:r>
+        <w:t xml:space="preserve"> </w:t>
+      </w:r>
+      <w:r>
+        <w:t xml:space="preserve">that answers RQ1 from metadata alone, and a second stage that answers RQ2 from</w:t>
+      </w:r>
+      <w:r>
+        <w:t xml:space="preserve"> </w:t>
+      </w:r>
+      <w:r>
+        <w:t xml:space="preserve">the conformity scores of three backbones, together with the sections that</w:t>
+      </w:r>
+      <w:r>
+        <w:t xml:space="preserve"> </w:t>
+      </w:r>
+      <w:r>
+        <w:t xml:space="preserve">report each step.</w:t>
       </w:r>
     </w:p>
     <w:p>
@@ -828,9 +589,9 @@
       <w:r>
         <w:drawing>
           <wp:inline>
-            <wp:extent cx="5334000" cy="2059127"/>
+            <wp:extent cx="5334000" cy="3745353"/>
             <wp:effectExtent b="0" l="0" r="0" t="0"/>
-            <wp:docPr descr="Fig. 1. Audit workflow. Stage 1 (blue) uses metadata only and returns verdicts that are exact given the declared dependence sources D, before any model is trained (RQ1; §3, §5.1). Stage 2 (orange) uses conformity scores from three backbones, at feasible levels only, to compare naive split conformal (B1) with HCP (B12), attribute the B1 deficit to dependence, relate it to the design effect, separate split-level from subject-level uncertainty and check robustness (RQ2; §5.2–§5.5)." title="" id="10" name="Picture"/>
+            <wp:docPr descr="Fig. 1. Audit workflow. Stage 1 (blue header) uses metadata only and returns verdicts that are exact given the declared dependence sources D, before any model is trained (RQ1; §3, §5.1). Stage 2 (orange headers) uses conformity scores from three backbones, at feasible levels only, to compare naive split conformal (B1) with HCP (B12), attribute the B1 deficit to dependence, relate it to the design effect, separate split-level from subject-level uncertainty and check robustness (RQ2; §5.2–§5.5)." title="" id="10" name="Picture"/>
             <a:graphic>
               <a:graphicData uri="http://schemas.openxmlformats.org/drawingml/2006/picture">
                 <pic:pic>
@@ -849,7 +610,7 @@
                   <pic:spPr bwMode="auto">
                     <a:xfrm>
                       <a:off x="0" y="0"/>
-                      <a:ext cx="5334000" cy="2059127"/>
+                      <a:ext cx="5334000" cy="3745353"/>
                     </a:xfrm>
                     <a:prstGeom prst="rect">
                       <a:avLst/>
@@ -874,7 +635,7 @@
         <w:jc w:val="both"/>
       </w:pPr>
       <w:r>
-        <w:t xml:space="preserve">Fig. 1. Audit workflow. Stage 1 (blue) uses metadata only and returns verdicts that are exact given the declared dependence sources</w:t>
+        <w:t xml:space="preserve">Fig. 1. Audit workflow. Stage 1 (blue header) uses metadata only and returns verdicts that are exact given the declared dependence sources</w:t>
       </w:r>
       <w:r>
         <w:t xml:space="preserve"> </w:t>
@@ -885,7 +646,248 @@
         </m:r>
       </m:oMath>
       <w:r>
-        <w:t xml:space="preserve">, before any model is trained (RQ1; §3, §5.1). Stage 2 (orange) uses conformity scores from three backbones, at feasible levels only, to compare naive split conformal (B1) with HCP (B12), attribute the B1 deficit to dependence, relate it to the design effect, separate split-level from subject-level uncertainty and check robustness (RQ2; §5.2–§5.5).</w:t>
+        <w:t xml:space="preserve">, before any model is trained (RQ1; §3, §5.1). Stage 2 (orange headers) uses conformity scores from three backbones, at feasible levels only, to compare naive split conformal (B1) with HCP (B12), attribute the B1 deficit to dependence, relate it to the design effect, separate split-level from subject-level uncertainty and check robustness (RQ2; §5.2–§5.5).</w:t>
+      </w:r>
+    </w:p>
+    <w:p>
+      <w:pPr>
+        <w:pStyle w:val="BodyText"/>
+      </w:pPr>
+      <w:r>
+        <w:t xml:space="preserve">We introduce no new conformal procedure. The audit contributes the following.</w:t>
+      </w:r>
+    </w:p>
+    <w:p>
+      <w:pPr>
+        <w:pStyle w:val="Compact"/>
+        <w:numPr>
+          <w:ilvl w:val="0"/>
+          <w:numId w:val="1001"/>
+        </w:numPr>
+      </w:pPr>
+      <w:r>
+        <w:t xml:space="preserve">A metadata-only feasibility audit (RQ1; §3, §5.1). The HCP bound, combined</w:t>
+      </w:r>
+      <w:r>
+        <w:t xml:space="preserve"> </w:t>
+      </w:r>
+      <w:r>
+        <w:t xml:space="preserve">with the join of the declared dependence sources, returns exact verdicts from</w:t>
+      </w:r>
+      <w:r>
+        <w:t xml:space="preserve"> </w:t>
+      </w:r>
+      <w:r>
+        <w:t xml:space="preserve">metadata or planned enrollment counts, before any model is trained. With all</w:t>
+      </w:r>
+      <w:r>
+        <w:t xml:space="preserve"> </w:t>
+      </w:r>
+      <w:r>
+        <w:t xml:space="preserve">four documented PTB-XL sources declared, every admissible calibration grouping</w:t>
+      </w:r>
+      <w:r>
+        <w:t xml:space="preserve"> </w:t>
+      </w:r>
+      <w:r>
+        <w:t xml:space="preserve">reduces to one block; with patient blocking alone, 24 of 44 SCP diagnostic</w:t>
+      </w:r>
+      <w:r>
+        <w:t xml:space="preserve"> </w:t>
+      </w:r>
+      <w:r>
+        <w:t xml:space="preserve">statements lack a finite per-label threshold at</w:t>
+      </w:r>
+      <w:r>
+        <w:t xml:space="preserve"> </w:t>
+      </w:r>
+      <m:oMath>
+        <m:r>
+          <m:t>α</m:t>
+        </m:r>
+        <m:r>
+          <m:rPr>
+            <m:sty m:val="p"/>
+          </m:rPr>
+          <m:t>=</m:t>
+        </m:r>
+        <m:r>
+          <m:t>0.05</m:t>
+        </m:r>
+      </m:oMath>
+      <w:r>
+        <w:t xml:space="preserve">; and dividing the</w:t>
+      </w:r>
+      <w:r>
+        <w:t xml:space="preserve"> </w:t>
+      </w:r>
+      <w:r>
+        <w:t xml:space="preserve">22 MIT-BIH evaluation subjects evenly between calibration and test rules out a</w:t>
+      </w:r>
+      <w:r>
+        <w:t xml:space="preserve"> </w:t>
+      </w:r>
+      <w:r>
+        <w:t xml:space="preserve">subject-level guarantee at the 95% level.</w:t>
+      </w:r>
+    </w:p>
+    <w:p>
+      <w:pPr>
+        <w:pStyle w:val="Compact"/>
+        <w:numPr>
+          <w:ilvl w:val="0"/>
+          <w:numId w:val="1001"/>
+        </w:numPr>
+      </w:pPr>
+      <w:r>
+        <w:t xml:space="preserve">Attribution of under-coverage to dependence acting through repetition</w:t>
+      </w:r>
+      <w:r>
+        <w:t xml:space="preserve"> </w:t>
+      </w:r>
+      <w:r>
+        <w:t xml:space="preserve">(RQ2; §5.2–§5.4). On the 22 MIT-BIH evaluation subjects, naive split conformal</w:t>
+      </w:r>
+      <w:r>
+        <w:t xml:space="preserve"> </w:t>
+      </w:r>
+      <w:r>
+        <w:t xml:space="preserve">covers less than a matched permutation null in every backbone and level, a</w:t>
+      </w:r>
+      <w:r>
+        <w:t xml:space="preserve"> </w:t>
+      </w:r>
+      <w:r>
+        <w:t xml:space="preserve">factorial design attributes the shortfall mainly to clustering, with block-size</w:t>
+      </w:r>
+      <w:r>
+        <w:t xml:space="preserve"> </w:t>
+      </w:r>
+      <w:r>
+        <w:t xml:space="preserve">imbalance acting through it, and a controlled dose–response experiment shows it</w:t>
+      </w:r>
+      <w:r>
+        <w:t xml:space="preserve"> </w:t>
+      </w:r>
+      <w:r>
+        <w:t xml:space="preserve">increasing with the design effect. PTB-XL, despite substantial within-patient</w:t>
+      </w:r>
+      <w:r>
+        <w:t xml:space="preserve"> </w:t>
+      </w:r>
+      <w:r>
+        <w:t xml:space="preserve">correlation, sits near zero, as the design effect predicts. With only 22</w:t>
+      </w:r>
+      <w:r>
+        <w:t xml:space="preserve"> </w:t>
+      </w:r>
+      <w:r>
+        <w:t xml:space="preserve">subjects, however, the deficit is not resolved at the level of subjects, which</w:t>
+      </w:r>
+      <w:r>
+        <w:t xml:space="preserve"> </w:t>
+      </w:r>
+      <w:r>
+        <w:t xml:space="preserve">we report as a limit of the evidence that mirrors the limit on the guarantee.</w:t>
+      </w:r>
+    </w:p>
+    <w:p>
+      <w:pPr>
+        <w:pStyle w:val="Compact"/>
+        <w:numPr>
+          <w:ilvl w:val="0"/>
+          <w:numId w:val="1001"/>
+        </w:numPr>
+      </w:pPr>
+      <w:r>
+        <w:t xml:space="preserve">Two cautions for evaluating conformal methods on clustered data (§5.3,</w:t>
+      </w:r>
+      <w:r>
+        <w:t xml:space="preserve"> </w:t>
+      </w:r>
+      <w:r>
+        <w:t xml:space="preserve">§6.2). Between 75% and 110% of the apparent gain of HCP over naive split</w:t>
+      </w:r>
+      <w:r>
+        <w:t xml:space="preserve"> </w:t>
+      </w:r>
+      <w:r>
+        <w:t xml:space="preserve">conformal survives when within-block dependence is permuted away, so the gain</w:t>
+      </w:r>
+      <w:r>
+        <w:t xml:space="preserve"> </w:t>
+      </w:r>
+      <w:r>
+        <w:t xml:space="preserve">is largely mechanical. And intervals from repeated random splits of a fixed set</w:t>
+      </w:r>
+      <w:r>
+        <w:t xml:space="preserve"> </w:t>
+      </w:r>
+      <w:r>
+        <w:t xml:space="preserve">of subjects describe the split procedure rather than the population: on</w:t>
+      </w:r>
+      <w:r>
+        <w:t xml:space="preserve"> </w:t>
+      </w:r>
+      <w:r>
+        <w:t xml:space="preserve">MIT-BIH they exclude zero where a jackknife over subjects does not. We</w:t>
+      </w:r>
+      <w:r>
+        <w:t xml:space="preserve"> </w:t>
+      </w:r>
+      <w:r>
+        <w:t xml:space="preserve">recommend matched permutation nulls, joint reporting of set size, and</w:t>
+      </w:r>
+      <w:r>
+        <w:t xml:space="preserve"> </w:t>
+      </w:r>
+      <w:r>
+        <w:t xml:space="preserve">resampling of subjects whenever a population claim is intended.</w:t>
+      </w:r>
+    </w:p>
+    <w:p>
+      <w:pPr>
+        <w:pStyle w:val="FirstParagraph"/>
+        <w:jc w:val="both"/>
+      </w:pPr>
+      <w:r>
+        <w:t xml:space="preserve">The direction of every finding is checked across three backbones whose parameter</w:t>
+      </w:r>
+      <w:r>
+        <w:t xml:space="preserve"> </w:t>
+      </w:r>
+      <w:r>
+        <w:t xml:space="preserve">counts differ by more than a hundredfold and across two checkpoints. Resampling</w:t>
+      </w:r>
+      <w:r>
+        <w:t xml:space="preserve"> </w:t>
+      </w:r>
+      <w:r>
+        <w:t xml:space="preserve">is always performed over blocks, the held-out PTB-XL fold has never been</w:t>
+      </w:r>
+      <w:r>
+        <w:t xml:space="preserve"> </w:t>
+      </w:r>
+      <w:r>
+        <w:t xml:space="preserve">inspected, and the code, per-result artifacts, analysis protocol and its</w:t>
+      </w:r>
+      <w:r>
+        <w:t xml:space="preserve"> </w:t>
+      </w:r>
+      <w:r>
+        <w:t xml:space="preserve">deviation log are released with the paper. Section 2 situates the audit in prior</w:t>
+      </w:r>
+      <w:r>
+        <w:t xml:space="preserve"> </w:t>
+      </w:r>
+      <w:r>
+        <w:t xml:space="preserve">work, Section 3 derives the feasibility conditions, Section 4 sets out the</w:t>
+      </w:r>
+      <w:r>
+        <w:t xml:space="preserve"> </w:t>
+      </w:r>
+      <w:r>
+        <w:t xml:space="preserve">design, and Sections 5 and 6 present and discuss the findings.</w:t>
       </w:r>
     </w:p>
     <w:bookmarkEnd w:id="12"/>

</xml_diff>

<commit_message>
Bangun ulang manuscript-draft.docx (nomor persamaan urut, alasan backbone s4.3)
</commit_message>
<xml_diff>
--- a/docs/paper/manuscript-draft.docx
+++ b/docs/paper/manuscript-draft.docx
@@ -20,7 +20,7 @@
           <w:i/>
           <w:iCs/>
         </w:rPr>
-        <w:t xml:space="preserve">Working draft for internal review — generated 2026-10-03 from commit 8852d79.</w:t>
+        <w:t xml:space="preserve">Working draft for internal review — generated 2026-10-03 from commit 1fc1c60.</w:t>
       </w:r>
     </w:p>
     <w:p>
@@ -4673,7 +4673,7 @@
               <m:nor/>
               <m:sty m:val="p"/>
             </m:rPr>
-            <m:t>(6)</m:t>
+            <m:t>(4)</m:t>
           </m:r>
         </m:oMath>
       </m:oMathPara>
@@ -6482,7 +6482,7 @@
               <m:nor/>
               <m:sty m:val="p"/>
             </m:rPr>
-            <m:t>(4)</m:t>
+            <m:t>(5)</m:t>
           </m:r>
         </m:oMath>
       </m:oMathPara>
@@ -6813,7 +6813,7 @@
               <m:nor/>
               <m:sty m:val="p"/>
             </m:rPr>
-            <m:t>(5)</m:t>
+            <m:t>(6)</m:t>
           </m:r>
         </m:oMath>
       </m:oMathPara>
@@ -8293,7 +8293,7 @@
         <w:t xml:space="preserve"> </w:t>
       </w:r>
       <w:r>
-        <w:t xml:space="preserve">diagnostic superclass would be covered trivially under (4), so instead of</w:t>
+        <w:t xml:space="preserve">diagnostic superclass would be covered trivially under (5), so instead of</w:t>
       </w:r>
       <w:r>
         <w:t xml:space="preserve"> </w:t>
@@ -8856,7 +8856,7 @@
         <w:t xml:space="preserve"> </w:t>
       </w:r>
       <w:r>
-        <w:t xml:space="preserve">(§5.3). On PTB-XL the coverage reported is superset coverage (4), obtained from</w:t>
+        <w:t xml:space="preserve">(§5.3). On PTB-XL the coverage reported is superset coverage (5), obtained from</w:t>
       </w:r>
       <w:r>
         <w:t xml:space="preserve"> </w:t>
@@ -8997,13 +8997,31 @@
         <w:t xml:space="preserve"> </w:t>
       </w:r>
       <w:r>
-        <w:t xml:space="preserve">MIT-BIH, an accuracy of 0.8690 with balanced accuracy 0.3748 and macro-F1 0.3144;</w:t>
-      </w:r>
-      <w:r>
-        <w:t xml:space="preserve"> </w:t>
-      </w:r>
-      <w:r>
-        <w:t xml:space="preserve">its weakness on minority classes enlarges sets but leaves coverage intact.</w:t>
+        <w:t xml:space="preserve">MIT-BIH, an accuracy of 0.8690 with balanced accuracy 0.3748 and macro-F1 0.3144.</w:t>
+      </w:r>
+      <w:r>
+        <w:t xml:space="preserve"> </w:t>
+      </w:r>
+      <w:r>
+        <w:t xml:space="preserve">The backbones were not tuned for discrimination, by design: conformal validity</w:t>
+      </w:r>
+      <w:r>
+        <w:t xml:space="preserve"> </w:t>
+      </w:r>
+      <w:r>
+        <w:t xml:space="preserve">holds for any score function fixed before calibration, so a weak minority-class</w:t>
+      </w:r>
+      <w:r>
+        <w:t xml:space="preserve"> </w:t>
+      </w:r>
+      <w:r>
+        <w:t xml:space="preserve">score enlarges prediction sets without affecting the coverage being audited, and</w:t>
+      </w:r>
+      <w:r>
+        <w:t xml:space="preserve"> </w:t>
+      </w:r>
+      <w:r>
+        <w:t xml:space="preserve">the three backbones serve to show that no conclusion hinges on one score.</w:t>
       </w:r>
       <w:r>
         <w:t xml:space="preserve"> </w:t>
@@ -9580,7 +9598,7 @@
         <w:t xml:space="preserve"> </w:t>
       </w:r>
       <w:r>
-        <w:t xml:space="preserve">scores (on PTB-XL, the superset score of (4)); the indicator version uses the</w:t>
+        <w:t xml:space="preserve">scores (on PTB-XL, the superset score of (5)); the indicator version uses the</w:t>
       </w:r>
       <w:r>
         <w:t xml:space="preserve"> </w:t>
@@ -15498,7 +15516,7 @@
         <w:t xml:space="preserve"> </w:t>
       </w:r>
       <w:r>
-        <w:t xml:space="preserve">pooled design effect in (6), which grows with</w:t>
+        <w:t xml:space="preserve">pooled design effect in (4), which grows with</w:t>
       </w:r>
       <w:r>
         <w:t xml:space="preserve"> </w:t>
@@ -19103,7 +19121,7 @@
         <w:t xml:space="preserve"> </w:t>
       </w:r>
       <w:r>
-        <w:t xml:space="preserve">The variance of §3.2 and the design effects (6) depend on</w:t>
+        <w:t xml:space="preserve">The variance of §3.2 and the design effects (4) depend on</w:t>
       </w:r>
       <w:r>
         <w:t xml:space="preserve"> </w:t>
@@ -20573,7 +20591,7 @@
         <w:t xml:space="preserve"> </w:t>
       </w:r>
       <w:r>
-        <w:t xml:space="preserve">PTB-XL the two design effects of (6) differ by a factor of 15.7 at the site</w:t>
+        <w:t xml:space="preserve">PTB-XL the two design effects of (4) differ by a factor of 15.7 at the site</w:t>
       </w:r>
       <w:r>
         <w:t xml:space="preserve"> </w:t>

</xml_diff>

<commit_message>
Target AIIM (Elsevier): Highlights, Keywords, deklarasi, tabel Arab, nomor baris
Highlights 5 butir (<=85 karakter, semua klaim dari Abstract/s5). Index Terms -> Keywords (7). Placeholder CRediT, competing interest, funding, dan deklarasi AI generatif (kalimat standar Elsevier) untuk diisi penulis. Builder: Table 1..n (bukan TABLE I), keterangan tabel sentence case rata kiri, nomor baris berkelanjutan untuk reviewer. Guide for Authors AIIM belum terverifikasi (situs memblokir akses otomatis).
</commit_message>
<xml_diff>
--- a/docs/paper/manuscript-draft.docx
+++ b/docs/paper/manuscript-draft.docx
@@ -20,173 +20,211 @@
           <w:i/>
           <w:iCs/>
         </w:rPr>
-        <w:t xml:space="preserve">Working draft for internal review — generated 2026-10-03 from commit 1fc1c60.</w:t>
+        <w:t xml:space="preserve">Working draft for internal review — generated 2026-10-03 from commit a407735.</w:t>
+      </w:r>
+    </w:p>
+    <w:bookmarkStart w:id="9" w:name="highlights"/>
+    <w:p>
+      <w:pPr>
+        <w:pStyle w:val="Heading1"/>
+      </w:pPr>
+      <w:r>
+        <w:t xml:space="preserve">Highlights</w:t>
       </w:r>
     </w:p>
     <w:p>
       <w:pPr>
+        <w:pStyle w:val="Compact"/>
+        <w:numPr>
+          <w:ilvl w:val="0"/>
+          <w:numId w:val="1001"/>
+        </w:numPr>
+      </w:pPr>
+      <w:r>
+        <w:t xml:space="preserve">Metadata alone decide whether block-level conformal coverage can be guaranteed</w:t>
+      </w:r>
+    </w:p>
+    <w:p>
+      <w:pPr>
+        <w:pStyle w:val="Compact"/>
+        <w:numPr>
+          <w:ilvl w:val="0"/>
+          <w:numId w:val="1001"/>
+        </w:numPr>
+      </w:pPr>
+      <w:r>
+        <w:t xml:space="preserve">All four declared PTB-XL dependence sources leave one admissible calibration block</w:t>
+      </w:r>
+    </w:p>
+    <w:p>
+      <w:pPr>
+        <w:pStyle w:val="Compact"/>
+        <w:numPr>
+          <w:ilvl w:val="0"/>
+          <w:numId w:val="1001"/>
+        </w:numPr>
+      </w:pPr>
+      <w:r>
+        <w:t xml:space="preserve">Under patient blocks, 24 of 44 PTB-XL statements lack a finite threshold at 5% error</w:t>
+      </w:r>
+    </w:p>
+    <w:p>
+      <w:pPr>
+        <w:pStyle w:val="Compact"/>
+        <w:numPr>
+          <w:ilvl w:val="0"/>
+          <w:numId w:val="1001"/>
+        </w:numPr>
+      </w:pPr>
+      <w:r>
+        <w:t xml:space="preserve">Most of the apparent coverage gain of HCP over split conformal is mechanical</w:t>
+      </w:r>
+    </w:p>
+    <w:p>
+      <w:pPr>
+        <w:pStyle w:val="Compact"/>
+        <w:numPr>
+          <w:ilvl w:val="0"/>
+          <w:numId w:val="1001"/>
+        </w:numPr>
+      </w:pPr>
+      <w:r>
+        <w:t xml:space="preserve">Repeated splits of fixed subjects yield split-level, not population-level, intervals</w:t>
+      </w:r>
+    </w:p>
+    <w:bookmarkEnd w:id="9"/>
+    <w:bookmarkStart w:id="10" w:name="abstract"/>
+    <w:p>
+      <w:pPr>
+        <w:pStyle w:val="Heading1"/>
+      </w:pPr>
+      <w:r>
+        <w:t xml:space="preserve">Abstract</w:t>
+      </w:r>
+    </w:p>
+    <w:p>
+      <w:pPr>
+        <w:pStyle w:val="FirstParagraph"/>
+        <w:jc w:val="both"/>
+      </w:pPr>
+      <w:r>
+        <w:t xml:space="preserve">Conformal prediction guarantees finite-sample coverage only when calibration and test data are exchangeable, a condition that repeated recordings, segments and beats from the same patient violate. Hierarchical conformal prediction (HCP) recovers the guarantee by calibrating over blocks, yet its threshold exists only for target error rates of at least</w:t>
+      </w:r>
+      <w:r>
+        <w:t xml:space="preserve"> </w:t>
+      </w:r>
+      <m:oMath>
+        <m:r>
+          <m:t>1</m:t>
+        </m:r>
+        <m:r>
+          <m:rPr>
+            <m:sty m:val="p"/>
+          </m:rPr>
+          <m:t>/</m:t>
+        </m:r>
+        <m:r>
+          <m:rPr>
+            <m:sty m:val="p"/>
+          </m:rPr>
+          <m:t>(</m:t>
+        </m:r>
+        <m:sSub>
+          <m:e>
+            <m:r>
+              <m:t>K</m:t>
+            </m:r>
+          </m:e>
+          <m:sub>
+            <m:r>
+              <m:t>1</m:t>
+            </m:r>
+          </m:sub>
+        </m:sSub>
+        <m:r>
+          <m:rPr>
+            <m:sty m:val="p"/>
+          </m:rPr>
+          <m:t>+</m:t>
+        </m:r>
+        <m:r>
+          <m:t>1</m:t>
+        </m:r>
+        <m:r>
+          <m:rPr>
+            <m:sty m:val="p"/>
+          </m:rPr>
+          <m:t>)</m:t>
+        </m:r>
+      </m:oMath>
+      <w:r>
+        <w:t xml:space="preserve">, with</w:t>
+      </w:r>
+      <w:r>
+        <w:t xml:space="preserve"> </w:t>
+      </w:r>
+      <m:oMath>
+        <m:sSub>
+          <m:e>
+            <m:r>
+              <m:t>K</m:t>
+            </m:r>
+          </m:e>
+          <m:sub>
+            <m:r>
+              <m:t>1</m:t>
+            </m:r>
+          </m:sub>
+        </m:sSub>
+      </m:oMath>
+      <w:r>
+        <w:t xml:space="preserve"> </w:t>
+      </w:r>
+      <w:r>
+        <w:t xml:space="preserve">the number of calibration blocks. We audit three public electrocardiogram resources to ask whether this guarantee can be enforced and whether ignoring blocks costs coverage. From metadata alone, declaring the four documented dependence sources of PTB-XL leaves a single admissible calibration block, and under patient blocking 24 of 44 diagnostic statements have no finite per-label threshold at</w:t>
+      </w:r>
+      <w:r>
+        <w:t xml:space="preserve"> </w:t>
+      </w:r>
+      <m:oMath>
+        <m:r>
+          <m:t>α</m:t>
+        </m:r>
+        <m:r>
+          <m:rPr>
+            <m:sty m:val="p"/>
+          </m:rPr>
+          <m:t>=</m:t>
+        </m:r>
+        <m:r>
+          <m:t>0.05</m:t>
+        </m:r>
+      </m:oMath>
+      <w:r>
+        <w:t xml:space="preserve">. Across repeated splits of the 22 MIT-BIH evaluation subjects, naive split conformal covers 1.5–2.4 percentage points less than a matched permutation null; a factorial design attributes the shortfall mainly to clustering, and a controlled dose–response experiment shows it growing with the design effect (rank correlation 0.80–0.85 over 12 configurations, 11 of them synthetic). A jackknife over subjects, however, cannot resolve the sign of this deficit: the scarcity of blocks that limits the guarantee also limits the evidence. PTB-XL shows no deficit despite a within-patient correlation of 0.35, consistent with most of its patients contributing one recording. The apparent advantage of HCP over naive calibration is largely mechanical, retaining 75–110% of its size once dependence is removed. Blocks, not records, should be counted, and subjects, not splits, resampled, before claims about distribution-free coverage are made on clinical data.</w:t>
+      </w:r>
+    </w:p>
+    <w:p>
+      <w:pPr>
         <w:pStyle w:val="BodyText"/>
-        <w:jc w:val="both"/>
+        <w:jc w:val="left"/>
       </w:pPr>
       <w:r>
         <w:rPr>
           <w:b/>
           <w:bCs/>
-          <w:sz w:val="19"/>
         </w:rPr>
-        <w:t xml:space="preserve">Abstract—</w:t>
-      </w:r>
-      <w:r>
-        <w:rPr>
-          <w:b/>
-          <w:sz w:val="19"/>
-        </w:rPr>
-        <w:t xml:space="preserve">Conformal prediction guarantees finite-sample coverage only when calibration and test data are exchangeable, a condition that repeated recordings, segments and beats from the same patient violate. Hierarchical conformal prediction (HCP) recovers the guarantee by calibrating over blocks, yet its threshold exists only for target error rates of at least</w:t>
-      </w:r>
-      <w:r>
-        <w:rPr>
-          <w:b/>
-          <w:sz w:val="19"/>
-        </w:rPr>
-        <w:t xml:space="preserve"> </w:t>
-      </w:r>
-      <m:oMath>
-        <m:r>
-          <m:t>1</m:t>
-        </m:r>
-        <m:r>
-          <m:rPr>
-            <m:sty m:val="p"/>
-          </m:rPr>
-          <m:t>/</m:t>
-        </m:r>
-        <m:r>
-          <m:rPr>
-            <m:sty m:val="p"/>
-          </m:rPr>
-          <m:t>(</m:t>
-        </m:r>
-        <m:sSub>
-          <m:e>
-            <m:r>
-              <m:t>K</m:t>
-            </m:r>
-          </m:e>
-          <m:sub>
-            <m:r>
-              <m:t>1</m:t>
-            </m:r>
-          </m:sub>
-        </m:sSub>
-        <m:r>
-          <m:rPr>
-            <m:sty m:val="p"/>
-          </m:rPr>
-          <m:t>+</m:t>
-        </m:r>
-        <m:r>
-          <m:t>1</m:t>
-        </m:r>
-        <m:r>
-          <m:rPr>
-            <m:sty m:val="p"/>
-          </m:rPr>
-          <m:t>)</m:t>
-        </m:r>
-      </m:oMath>
-      <w:r>
-        <w:rPr>
-          <w:b/>
-          <w:sz w:val="19"/>
-        </w:rPr>
-        <w:t xml:space="preserve">, with</w:t>
-      </w:r>
-      <w:r>
-        <w:rPr>
-          <w:b/>
-          <w:sz w:val="19"/>
-        </w:rPr>
-        <w:t xml:space="preserve"> </w:t>
-      </w:r>
-      <m:oMath>
-        <m:sSub>
-          <m:e>
-            <m:r>
-              <m:t>K</m:t>
-            </m:r>
-          </m:e>
-          <m:sub>
-            <m:r>
-              <m:t>1</m:t>
-            </m:r>
-          </m:sub>
-        </m:sSub>
-      </m:oMath>
-      <w:r>
-        <w:rPr>
-          <w:b/>
-          <w:sz w:val="19"/>
-        </w:rPr>
-        <w:t xml:space="preserve"> </w:t>
-      </w:r>
-      <w:r>
-        <w:rPr>
-          <w:b/>
-          <w:sz w:val="19"/>
-        </w:rPr>
-        <w:t xml:space="preserve">the number of calibration blocks. We audit three public electrocardiogram resources to ask whether this guarantee can be enforced and whether ignoring blocks costs coverage. From metadata alone, declaring the four documented dependence sources of PTB-XL leaves a single admissible calibration block, and under patient blocking 24 of 44 diagnostic statements have no finite per-label threshold at</w:t>
-      </w:r>
-      <w:r>
-        <w:rPr>
-          <w:b/>
-          <w:sz w:val="19"/>
-        </w:rPr>
-        <w:t xml:space="preserve"> </w:t>
-      </w:r>
-      <m:oMath>
-        <m:r>
-          <m:t>α</m:t>
-        </m:r>
-        <m:r>
-          <m:rPr>
-            <m:sty m:val="p"/>
-          </m:rPr>
-          <m:t>=</m:t>
-        </m:r>
-        <m:r>
-          <m:t>0.05</m:t>
-        </m:r>
-      </m:oMath>
-      <w:r>
-        <w:rPr>
-          <w:b/>
-          <w:sz w:val="19"/>
-        </w:rPr>
-        <w:t xml:space="preserve">. Across repeated splits of the 22 MIT-BIH evaluation subjects, naive split conformal covers 1.5–2.4 percentage points less than a matched permutation null; a factorial design attributes the shortfall mainly to clustering, and a controlled dose–response experiment shows it growing with the design effect (rank correlation 0.80–0.85 over 12 configurations, 11 of them synthetic). A jackknife over subjects, however, cannot resolve the sign of this deficit: the scarcity of blocks that limits the guarantee also limits the evidence. PTB-XL shows no deficit despite a within-patient correlation of 0.35, consistent with most of its patients contributing one recording. The apparent advantage of HCP over naive calibration is largely mechanical, retaining 75–110% of its size once dependence is removed. Blocks, not records, should be counted, and subjects, not splits, resampled, before claims about distribution-free coverage are made on clinical data.</w:t>
+        <w:t xml:space="preserve">Keywords:</w:t>
+      </w:r>
+      <w:r>
+        <w:t xml:space="preserve"> </w:t>
+      </w:r>
+      <w:r>
+        <w:t xml:space="preserve">Conformal prediction; electrocardiography; uncertainty quantification; hierarchical data; exchangeability; calibration; study design</w:t>
       </w:r>
     </w:p>
-    <w:p>
-      <w:pPr>
-        <w:pStyle w:val="BodyText"/>
-        <w:jc w:val="both"/>
-      </w:pPr>
-      <w:r>
-        <w:rPr>
-          <w:b/>
-          <w:bCs/>
-          <w:sz w:val="19"/>
-        </w:rPr>
-        <w:t xml:space="preserve">Index Terms—</w:t>
-      </w:r>
-      <w:r>
-        <w:rPr>
-          <w:b/>
-          <w:sz w:val="19"/>
-        </w:rPr>
-        <w:t xml:space="preserve">Conformal prediction, electrocardiography, uncertainty quantification, hierarchical data, exchangeability, calibration, study design.</w:t>
-      </w:r>
-    </w:p>
-    <w:bookmarkStart w:id="12" w:name="introduction"/>
+    <w:bookmarkEnd w:id="10"/>
+    <w:bookmarkStart w:id="14" w:name="introduction"/>
     <w:p>
       <w:pPr>
         <w:pStyle w:val="Heading1"/>
@@ -591,18 +629,18 @@
           <wp:inline>
             <wp:extent cx="5334000" cy="3745353"/>
             <wp:effectExtent b="0" l="0" r="0" t="0"/>
-            <wp:docPr descr="Fig. 1. Audit workflow. Stage 1 (blue header) uses metadata only and returns verdicts that are exact given the declared dependence sources D, before any model is trained (RQ1; §3, §5.1). Stage 2 (orange headers) uses conformity scores from three backbones, at feasible levels only, to compare naive split conformal (B1) with HCP (B12), attribute the B1 deficit to dependence, relate it to the design effect, separate split-level from subject-level uncertainty and check robustness (RQ2; §5.2–§5.5)." title="" id="10" name="Picture"/>
+            <wp:docPr descr="Fig. 1. Audit workflow. Stage 1 (blue header) uses metadata only and returns verdicts that are exact given the declared dependence sources D, before any model is trained (RQ1; §3, §5.1). Stage 2 (orange headers) uses conformity scores from three backbones, at feasible levels only, to compare naive split conformal (B1) with HCP (B12), attribute the B1 deficit to dependence, relate it to the design effect, separate split-level from subject-level uncertainty and check robustness (RQ2; §5.2–§5.5)." title="" id="12" name="Picture"/>
             <a:graphic>
               <a:graphicData uri="http://schemas.openxmlformats.org/drawingml/2006/picture">
                 <pic:pic>
                   <pic:nvPicPr>
-                    <pic:cNvPr descr="figures/fig1_audit_workflow.png" id="11" name="Picture"/>
+                    <pic:cNvPr descr="figures/fig1_audit_workflow.png" id="13" name="Picture"/>
                     <pic:cNvPicPr>
                       <a:picLocks noChangeArrowheads="1" noChangeAspect="1"/>
                     </pic:cNvPicPr>
                   </pic:nvPicPr>
                   <pic:blipFill>
-                    <a:blip r:embed="rId9"/>
+                    <a:blip r:embed="rId11"/>
                     <a:stretch>
                       <a:fillRect/>
                     </a:stretch>
@@ -662,7 +700,7 @@
         <w:pStyle w:val="Compact"/>
         <w:numPr>
           <w:ilvl w:val="0"/>
-          <w:numId w:val="1001"/>
+          <w:numId w:val="1002"/>
         </w:numPr>
       </w:pPr>
       <w:r>
@@ -736,7 +774,7 @@
         <w:pStyle w:val="Compact"/>
         <w:numPr>
           <w:ilvl w:val="0"/>
-          <w:numId w:val="1001"/>
+          <w:numId w:val="1002"/>
         </w:numPr>
       </w:pPr>
       <w:r>
@@ -796,7 +834,7 @@
         <w:pStyle w:val="Compact"/>
         <w:numPr>
           <w:ilvl w:val="0"/>
-          <w:numId w:val="1001"/>
+          <w:numId w:val="1002"/>
         </w:numPr>
       </w:pPr>
       <w:r>
@@ -890,8 +928,8 @@
         <w:t xml:space="preserve">design, and Sections 5 and 6 present and discuss the findings.</w:t>
       </w:r>
     </w:p>
-    <w:bookmarkEnd w:id="12"/>
-    <w:bookmarkStart w:id="15" w:name="related-work"/>
+    <w:bookmarkEnd w:id="14"/>
+    <w:bookmarkStart w:id="17" w:name="related-work"/>
     <w:p>
       <w:pPr>
         <w:pStyle w:val="Heading1"/>
@@ -900,7 +938,7 @@
         <w:t xml:space="preserve">2. Related Work</w:t>
       </w:r>
     </w:p>
-    <w:bookmarkStart w:id="13" w:name="X82604ee80040ca60fd96cad68dfd92d7ce32f61"/>
+    <w:bookmarkStart w:id="15" w:name="X82604ee80040ca60fd96cad68dfd92d7ce32f61"/>
     <w:p>
       <w:pPr>
         <w:pStyle w:val="Heading2"/>
@@ -1103,8 +1141,8 @@
         <w:t xml:space="preserve">what happens on clinical data when it does.</w:t>
       </w:r>
     </w:p>
-    <w:bookmarkEnd w:id="13"/>
-    <w:bookmarkStart w:id="14" w:name="Xde641f5d420a891fdb073e7aa4fa0944e53f724"/>
+    <w:bookmarkEnd w:id="15"/>
+    <w:bookmarkStart w:id="16" w:name="Xde641f5d420a891fdb073e7aa4fa0944e53f724"/>
     <w:p>
       <w:pPr>
         <w:pStyle w:val="Heading2"/>
@@ -1363,9 +1401,9 @@
         <w:t xml:space="preserve">procedure.</w:t>
       </w:r>
     </w:p>
-    <w:bookmarkEnd w:id="14"/>
-    <w:bookmarkEnd w:id="15"/>
-    <w:bookmarkStart w:id="23" w:name="problem-formulation-and-hcp-feasibility"/>
+    <w:bookmarkEnd w:id="16"/>
+    <w:bookmarkEnd w:id="17"/>
+    <w:bookmarkStart w:id="25" w:name="problem-formulation-and-hcp-feasibility"/>
     <w:p>
       <w:pPr>
         <w:pStyle w:val="Heading1"/>
@@ -1401,7 +1439,7 @@
         <w:t xml:space="preserve">distinct from findings.</w:t>
       </w:r>
     </w:p>
-    <w:bookmarkStart w:id="16" w:name="hierarchical-calibration"/>
+    <w:bookmarkStart w:id="18" w:name="hierarchical-calibration"/>
     <w:p>
       <w:pPr>
         <w:pStyle w:val="Heading2"/>
@@ -2655,8 +2693,8 @@
         </m:oMath>
       </m:oMathPara>
     </w:p>
-    <w:bookmarkEnd w:id="16"/>
-    <w:bookmarkStart w:id="17" w:name="finite-threshold-feasibility"/>
+    <w:bookmarkEnd w:id="18"/>
+    <w:bookmarkStart w:id="19" w:name="finite-threshold-feasibility"/>
     <w:p>
       <w:pPr>
         <w:pStyle w:val="Heading2"/>
@@ -4950,8 +4988,8 @@
         <w:t xml:space="preserve">correction now used in the conformal literature targets the wrong quantity [40].</w:t>
       </w:r>
     </w:p>
-    <w:bookmarkEnd w:id="17"/>
-    <w:bookmarkStart w:id="21" w:name="crossed-dependence-sources"/>
+    <w:bookmarkEnd w:id="19"/>
+    <w:bookmarkStart w:id="23" w:name="crossed-dependence-sources"/>
     <w:p>
       <w:pPr>
         <w:pStyle w:val="Heading2"/>
@@ -5751,18 +5789,18 @@
           <wp:inline>
             <wp:extent cx="3108960" cy="1073695"/>
             <wp:effectExtent b="0" l="0" r="0" t="0"/>
-            <wp:docPr descr="Fig. 2. Schematic of Proposition 2 on eight hypothetical records (circles). Solid arcs link records of the same patient and dashed arcs records of the same device. A grouping sufficient for both sources must keep every linked pair in one block, so the finest such grouping is the join, the connected components (shaded). On PTB-XL the same mechanism collapses four declared sources to a single block (§5.1)." title="" id="19" name="Picture"/>
+            <wp:docPr descr="Fig. 2. Schematic of Proposition 2 on eight hypothetical records (circles). Solid arcs link records of the same patient and dashed arcs records of the same device. A grouping sufficient for both sources must keep every linked pair in one block, so the finest such grouping is the join, the connected components (shaded). On PTB-XL the same mechanism collapses four declared sources to a single block (§5.1)." title="" id="21" name="Picture"/>
             <a:graphic>
               <a:graphicData uri="http://schemas.openxmlformats.org/drawingml/2006/picture">
                 <pic:pic>
                   <pic:nvPicPr>
-                    <pic:cNvPr descr="figures/fig2_join_schematic.png" id="20" name="Picture"/>
+                    <pic:cNvPr descr="figures/fig2_join_schematic.png" id="22" name="Picture"/>
                     <pic:cNvPicPr>
                       <a:picLocks noChangeArrowheads="1" noChangeAspect="1"/>
                     </pic:cNvPicPr>
                   </pic:nvPicPr>
                   <pic:blipFill>
-                    <a:blip r:embed="rId18"/>
+                    <a:blip r:embed="rId20"/>
                     <a:stretch>
                       <a:fillRect/>
                     </a:stretch>
@@ -6294,8 +6332,8 @@
         <w:t xml:space="preserve">property of the data.</w:t>
       </w:r>
     </w:p>
-    <w:bookmarkEnd w:id="21"/>
-    <w:bookmarkStart w:id="22" w:name="label-conditional-feasibility"/>
+    <w:bookmarkEnd w:id="23"/>
+    <w:bookmarkStart w:id="24" w:name="label-conditional-feasibility"/>
     <w:p>
       <w:pPr>
         <w:pStyle w:val="Heading2"/>
@@ -7391,9 +7429,9 @@
         <w:t xml:space="preserve">.</w:t>
       </w:r>
     </w:p>
-    <w:bookmarkEnd w:id="22"/>
-    <w:bookmarkEnd w:id="23"/>
-    <w:bookmarkStart w:id="29" w:name="audit-design"/>
+    <w:bookmarkEnd w:id="24"/>
+    <w:bookmarkEnd w:id="25"/>
+    <w:bookmarkStart w:id="31" w:name="audit-design"/>
     <w:p>
       <w:pPr>
         <w:pStyle w:val="Heading1"/>
@@ -7549,7 +7587,7 @@
         <w:t xml:space="preserve">second.</w:t>
       </w:r>
     </w:p>
-    <w:bookmarkStart w:id="24" w:name="datasets-and-dependence-structures"/>
+    <w:bookmarkStart w:id="26" w:name="datasets-and-dependence-structures"/>
     <w:p>
       <w:pPr>
         <w:pStyle w:val="Heading2"/>
@@ -7570,7 +7608,7 @@
         <w:t xml:space="preserve"> </w:t>
       </w:r>
       <w:r>
-        <w:t xml:space="preserve">another. Table I states the purpose of each and, for the two primary datasets,</w:t>
+        <w:t xml:space="preserve">another. Table 1 states the purpose of each and, for the two primary datasets,</w:t>
       </w:r>
       <w:r>
         <w:t xml:space="preserve"> </w:t>
@@ -7584,23 +7622,21 @@
         <w:pStyle w:val="BodyText"/>
         <w:keepNext/>
         <w:spacing w:before="160"/>
-        <w:jc w:val="center"/>
-      </w:pPr>
-      <w:r/>
+        <w:jc w:val="left"/>
+      </w:pPr>
+      <w:r/>
+      <w:r>
+        <w:rPr>
+          <w:b/>
+          <w:sz w:val="18"/>
+        </w:rPr>
+        <w:t xml:space="preserve">Table 1. </w:t>
+      </w:r>
       <w:r>
         <w:rPr>
           <w:sz w:val="18"/>
         </w:rPr>
-        <w:t>TABLE I</w:t>
-      </w:r>
-      <w:r>
-        <w:br/>
-      </w:r>
-      <w:r>
-        <w:rPr>
-          <w:sz w:val="16"/>
-        </w:rPr>
-        <w:t>ROLES AND BLOCK GEOMETRY OF THE THREE DATASETS.</w:t>
+        <w:t>Roles and block geometry of the three datasets.</w:t>
       </w:r>
     </w:p>
     <w:tbl>
@@ -8135,7 +8171,7 @@
         <w:t xml:space="preserve"> </w:t>
       </w:r>
       <w:r>
-        <w:t xml:space="preserve">in Table I is a structural property of the data.</w:t>
+        <w:t xml:space="preserve">in Table 1 is a structural property of the data.</w:t>
       </w:r>
       <w:r>
         <w:t xml:space="preserve"> </w:t>
@@ -8702,8 +8738,8 @@
         <w:t xml:space="preserve">becomes an assumption that authors must state.</w:t>
       </w:r>
     </w:p>
-    <w:bookmarkEnd w:id="24"/>
-    <w:bookmarkStart w:id="25" w:name="calibration-and-evaluation-protocol"/>
+    <w:bookmarkEnd w:id="26"/>
+    <w:bookmarkStart w:id="27" w:name="calibration-and-evaluation-protocol"/>
     <w:p>
       <w:pPr>
         <w:pStyle w:val="Heading2"/>
@@ -8865,8 +8901,8 @@
         <w:t xml:space="preserve">the maximum score over the true labels.</w:t>
       </w:r>
     </w:p>
-    <w:bookmarkEnd w:id="25"/>
-    <w:bookmarkStart w:id="26" w:name="models-and-conformity-scores"/>
+    <w:bookmarkEnd w:id="27"/>
+    <w:bookmarkStart w:id="28" w:name="models-and-conformity-scores"/>
     <w:p>
       <w:pPr>
         <w:pStyle w:val="Heading2"/>
@@ -9183,8 +9219,8 @@
         <w:t xml:space="preserve">to scalar HCP (§3.4).</w:t>
       </w:r>
     </w:p>
-    <w:bookmarkEnd w:id="26"/>
-    <w:bookmarkStart w:id="27" w:name="statistical-analysis"/>
+    <w:bookmarkEnd w:id="28"/>
+    <w:bookmarkStart w:id="29" w:name="statistical-analysis"/>
     <w:p>
       <w:pPr>
         <w:pStyle w:val="Heading2"/>
@@ -9659,7 +9695,7 @@
         <w:t xml:space="preserve"> </w:t>
       </w:r>
       <w:r>
-        <w:t xml:space="preserve">procedure used for each reported quantity is listed in Table II.</w:t>
+        <w:t xml:space="preserve">procedure used for each reported quantity is listed in Table 2.</w:t>
       </w:r>
     </w:p>
     <w:p>
@@ -9667,23 +9703,21 @@
         <w:pStyle w:val="BodyText"/>
         <w:keepNext/>
         <w:spacing w:before="160"/>
-        <w:jc w:val="center"/>
-      </w:pPr>
-      <w:r/>
+        <w:jc w:val="left"/>
+      </w:pPr>
+      <w:r/>
+      <w:r>
+        <w:rPr>
+          <w:b/>
+          <w:sz w:val="18"/>
+        </w:rPr>
+        <w:t xml:space="preserve">Table 2. </w:t>
+      </w:r>
       <w:r>
         <w:rPr>
           <w:sz w:val="18"/>
         </w:rPr>
-        <w:t>TABLE II</w:t>
-      </w:r>
-      <w:r>
-        <w:br/>
-      </w:r>
-      <w:r>
-        <w:rPr>
-          <w:sz w:val="16"/>
-        </w:rPr>
-        <w:t>STATISTICAL PROCEDURES.</w:t>
+        <w:t>Statistical procedures.</w:t>
       </w:r>
     </w:p>
     <w:tbl>
@@ -10075,8 +10109,8 @@
         </w:tc>
       </w:tr>
     </w:tbl>
-    <w:bookmarkEnd w:id="27"/>
-    <w:bookmarkStart w:id="28" w:name="reproducibility"/>
+    <w:bookmarkEnd w:id="29"/>
+    <w:bookmarkStart w:id="30" w:name="reproducibility"/>
     <w:p>
       <w:pPr>
         <w:pStyle w:val="Heading2"/>
@@ -10136,9 +10170,9 @@
         <w:t xml:space="preserve">a partial cache behind.</w:t>
       </w:r>
     </w:p>
-    <w:bookmarkEnd w:id="28"/>
-    <w:bookmarkEnd w:id="29"/>
-    <w:bookmarkStart w:id="53" w:name="results"/>
+    <w:bookmarkEnd w:id="30"/>
+    <w:bookmarkEnd w:id="31"/>
+    <w:bookmarkStart w:id="55" w:name="results"/>
     <w:p>
       <w:pPr>
         <w:pStyle w:val="Heading1"/>
@@ -10239,7 +10273,7 @@
         <w:t xml:space="preserve">.</w:t>
       </w:r>
     </w:p>
-    <w:bookmarkStart w:id="36" w:name="X703171b6c9ef8344f5ae4ef526c91a89ce0ec43"/>
+    <w:bookmarkStart w:id="38" w:name="X703171b6c9ef8344f5ae4ef526c91a89ce0ec43"/>
     <w:p>
       <w:pPr>
         <w:pStyle w:val="Heading2"/>
@@ -10287,7 +10321,7 @@
         <w:t xml:space="preserve"> </w:t>
       </w:r>
       <w:r>
-        <w:t xml:space="preserve">restricts the range of admissible levels. For every grouping, Table III gives the</w:t>
+        <w:t xml:space="preserve">restricts the range of admissible levels. For every grouping, Table 3 gives the</w:t>
       </w:r>
       <w:r>
         <w:t xml:space="preserve"> </w:t>
@@ -10333,23 +10367,21 @@
         <w:pStyle w:val="BodyText"/>
         <w:keepNext/>
         <w:spacing w:before="160"/>
-        <w:jc w:val="center"/>
-      </w:pPr>
-      <w:r/>
+        <w:jc w:val="left"/>
+      </w:pPr>
+      <w:r/>
+      <w:r>
+        <w:rPr>
+          <w:b/>
+          <w:sz w:val="18"/>
+        </w:rPr>
+        <w:t xml:space="preserve">Table 3. </w:t>
+      </w:r>
       <w:r>
         <w:rPr>
           <w:sz w:val="18"/>
         </w:rPr>
-        <w:t>TABLE III</w:t>
-      </w:r>
-      <w:r>
-        <w:br/>
-      </w:r>
-      <w:r>
-        <w:rPr>
-          <w:sz w:val="16"/>
-        </w:rPr>
-        <w:t>FEASIBILITY OF HCP ON PTB-XL FOLD 9 BY GROUPING.</w:t>
+        <w:t>Feasibility of HCP on PTB-XL fold 9 by grouping.</w:t>
       </w:r>
     </w:p>
     <w:tbl>
@@ -11372,18 +11404,18 @@
           <wp:inline>
             <wp:extent cx="3108960" cy="2176272"/>
             <wp:effectExtent b="0" l="0" r="0" t="0"/>
-            <wp:docPr descr="Fig. 3. Feasibility frontier \alpha_{\min}=1/(K_1+1). Each marker is a calibration grouping on PTB-XL fold 9 (circles: single dependence source; squares: join of sources) or the MIT-BIH record partition (diamond). Values in parentheses are K_1. A grouping supports a guarantee at level \alpha only if its marker lies below the corresponding dotted line." title="" id="31" name="Picture"/>
+            <wp:docPr descr="Fig. 3. Feasibility frontier \alpha_{\min}=1/(K_1+1). Each marker is a calibration grouping on PTB-XL fold 9 (circles: single dependence source; squares: join of sources) or the MIT-BIH record partition (diamond). Values in parentheses are K_1. A grouping supports a guarantee at level \alpha only if its marker lies below the corresponding dotted line." title="" id="33" name="Picture"/>
             <a:graphic>
               <a:graphicData uri="http://schemas.openxmlformats.org/drawingml/2006/picture">
                 <pic:pic>
                   <pic:nvPicPr>
-                    <pic:cNvPr descr="figures/fig3_feasibility_frontier.png" id="32" name="Picture"/>
+                    <pic:cNvPr descr="figures/fig3_feasibility_frontier.png" id="34" name="Picture"/>
                     <pic:cNvPicPr>
                       <a:picLocks noChangeArrowheads="1" noChangeAspect="1"/>
                     </pic:cNvPicPr>
                   </pic:nvPicPr>
                   <pic:blipFill>
-                    <a:blip r:embed="rId30"/>
+                    <a:blip r:embed="rId32"/>
                     <a:stretch>
                       <a:fillRect/>
                     </a:stretch>
@@ -11874,7 +11906,7 @@
         </m:r>
       </m:oMath>
       <w:r>
-        <w:t xml:space="preserve">. Table IV tallies the failing labels at each level of the</w:t>
+        <w:t xml:space="preserve">. Table 4 tallies the failing labels at each level of the</w:t>
       </w:r>
       <w:r>
         <w:t xml:space="preserve"> </w:t>
@@ -11888,23 +11920,21 @@
         <w:pStyle w:val="BodyText"/>
         <w:keepNext/>
         <w:spacing w:before="160"/>
-        <w:jc w:val="center"/>
-      </w:pPr>
-      <w:r/>
+        <w:jc w:val="left"/>
+      </w:pPr>
+      <w:r/>
+      <w:r>
+        <w:rPr>
+          <w:b/>
+          <w:sz w:val="18"/>
+        </w:rPr>
+        <w:t xml:space="preserve">Table 4. </w:t>
+      </w:r>
       <w:r>
         <w:rPr>
           <w:sz w:val="18"/>
         </w:rPr>
-        <w:t>TABLE IV</w:t>
-      </w:r>
-      <w:r>
-        <w:br/>
-      </w:r>
-      <w:r>
-        <w:rPr>
-          <w:sz w:val="16"/>
-        </w:rPr>
-        <w:t>LABELS FAILING THE NECESSARY CONDITION OF PROPOSITION 3, PTB-XL FOLD 9, PATIENT BLOCKS.</w:t>
+        <w:t>Labels failing the necessary condition of Proposition 3, PTB-XL fold 9, patient blocks.</w:t>
       </w:r>
     </w:p>
     <w:tbl>
@@ -12534,7 +12564,7 @@
         <w:t xml:space="preserve"> </w:t>
       </w:r>
       <w:r>
-        <w:t xml:space="preserve">counts of Table IV down label by label and marks the minimum number of blocks</w:t>
+        <w:t xml:space="preserve">counts of Table 4 down label by label and marks the minimum number of blocks</w:t>
       </w:r>
       <w:r>
         <w:t xml:space="preserve"> </w:t>
@@ -12596,18 +12626,18 @@
           <wp:inline>
             <wp:extent cx="5334000" cy="1604287"/>
             <wp:effectExtent b="0" l="0" r="0" t="0"/>
-            <wp:docPr descr="Fig. 4. Calibration blocks carrying each label, by level of the PTB-XL hierarchy (fold 9, patient blocks; log scale). Dashed and dotted lines mark the minimum number of blocks for a finite per-label threshold at \alpha=0.05 and \alpha=0.10. Dark bars meet the \alpha=0.05 requirement, light bars only the \alpha=0.10 requirement, and orange bars neither." title="" id="34" name="Picture"/>
+            <wp:docPr descr="Fig. 4. Calibration blocks carrying each label, by level of the PTB-XL hierarchy (fold 9, patient blocks; log scale). Dashed and dotted lines mark the minimum number of blocks for a finite per-label threshold at \alpha=0.05 and \alpha=0.10. Dark bars meet the \alpha=0.05 requirement, light bars only the \alpha=0.10 requirement, and orange bars neither." title="" id="36" name="Picture"/>
             <a:graphic>
               <a:graphicData uri="http://schemas.openxmlformats.org/drawingml/2006/picture">
                 <pic:pic>
                   <pic:nvPicPr>
-                    <pic:cNvPr descr="figures/fig4_label_feasibility.png" id="35" name="Picture"/>
+                    <pic:cNvPr descr="figures/fig4_label_feasibility.png" id="37" name="Picture"/>
                     <pic:cNvPicPr>
                       <a:picLocks noChangeArrowheads="1" noChangeAspect="1"/>
                     </pic:cNvPicPr>
                   </pic:nvPicPr>
                   <pic:blipFill>
-                    <a:blip r:embed="rId33"/>
+                    <a:blip r:embed="rId35"/>
                     <a:stretch>
                       <a:fillRect/>
                     </a:stretch>
@@ -12732,8 +12762,8 @@
         <w:t xml:space="preserve">requirement, and orange bars neither.</w:t>
       </w:r>
     </w:p>
-    <w:bookmarkEnd w:id="36"/>
-    <w:bookmarkStart w:id="40" w:name="coverage-under-block-dependence"/>
+    <w:bookmarkEnd w:id="38"/>
+    <w:bookmarkStart w:id="42" w:name="coverage-under-block-dependence"/>
     <w:p>
       <w:pPr>
         <w:pStyle w:val="Heading2"/>
@@ -12783,7 +12813,7 @@
         <w:t xml:space="preserve"> </w:t>
       </w:r>
       <w:r>
-        <w:t xml:space="preserve">exceeds the nominal value. Table V lists coverage and set size for both</w:t>
+        <w:t xml:space="preserve">exceeds the nominal value. Table 5 lists coverage and set size for both</w:t>
       </w:r>
       <w:r>
         <w:t xml:space="preserve"> </w:t>
@@ -12797,23 +12827,21 @@
         <w:pStyle w:val="BodyText"/>
         <w:keepNext/>
         <w:spacing w:before="160"/>
-        <w:jc w:val="center"/>
-      </w:pPr>
-      <w:r/>
+        <w:jc w:val="left"/>
+      </w:pPr>
+      <w:r/>
+      <w:r>
+        <w:rPr>
+          <w:b/>
+          <w:sz w:val="18"/>
+        </w:rPr>
+        <w:t xml:space="preserve">Table 5. </w:t>
+      </w:r>
       <w:r>
         <w:rPr>
           <w:sz w:val="18"/>
         </w:rPr>
-        <w:t>TABLE V</w:t>
-      </w:r>
-      <w:r>
-        <w:br/>
-      </w:r>
-      <w:r>
-        <w:rPr>
-          <w:sz w:val="16"/>
-        </w:rPr>
-        <w:t>COVERAGE (MEAN OVER SPLITS, WITH 2.5–97.5% RANGE ACROSS SPLITS) AND MEAN SET SIZE.</w:t>
+        <w:t>Coverage (mean over splits, with 2.5–97.5% range across splits) and mean set size.</w:t>
       </w:r>
     </w:p>
     <w:tbl>
@@ -13903,18 +13931,18 @@
           <wp:inline>
             <wp:extent cx="5334000" cy="1679032"/>
             <wp:effectExtent b="0" l="0" r="0" t="0"/>
-            <wp:docPr descr="Fig. 5. Coverage minus nominal 1-\alpha for split conformal (B1, mean with 2.5–97.5% range across 200 block-level splits) and HCP (B12, mean), primary backbone. Shaded MIT-BIH levels lie below \alpha_{\min}=1/12, where HCP returns every label. Note the different vertical scales." title="" id="38" name="Picture"/>
+            <wp:docPr descr="Fig. 5. Coverage minus nominal 1-\alpha for split conformal (B1, mean with 2.5–97.5% range across 200 block-level splits) and HCP (B12, mean), primary backbone. Shaded MIT-BIH levels lie below \alpha_{\min}=1/12, where HCP returns every label. Note the different vertical scales." title="" id="40" name="Picture"/>
             <a:graphic>
               <a:graphicData uri="http://schemas.openxmlformats.org/drawingml/2006/picture">
                 <pic:pic>
                   <pic:nvPicPr>
-                    <pic:cNvPr descr="figures/fig5_coverage.png" id="39" name="Picture"/>
+                    <pic:cNvPr descr="figures/fig5_coverage.png" id="41" name="Picture"/>
                     <pic:cNvPicPr>
                       <a:picLocks noChangeArrowheads="1" noChangeAspect="1"/>
                     </pic:cNvPicPr>
                   </pic:nvPicPr>
                   <pic:blipFill>
-                    <a:blip r:embed="rId37"/>
+                    <a:blip r:embed="rId39"/>
                     <a:stretch>
                       <a:fillRect/>
                     </a:stretch>
@@ -14014,8 +14042,8 @@
         <w:t xml:space="preserve">, where HCP returns every label. Note the different vertical scales.</w:t>
       </w:r>
     </w:p>
-    <w:bookmarkEnd w:id="40"/>
-    <w:bookmarkStart w:id="44" w:name="X971afb3920367740875daf59080031d77744c88"/>
+    <w:bookmarkEnd w:id="42"/>
+    <w:bookmarkStart w:id="46" w:name="X971afb3920367740875daf59080031d77744c88"/>
     <w:p>
       <w:pPr>
         <w:pStyle w:val="Heading2"/>
@@ -14093,7 +14121,7 @@
         <w:t xml:space="preserve"> </w:t>
       </w:r>
       <w:r>
-        <w:t xml:space="preserve">ICC drops from 0.519 to 0.000. Table VI reports the B1 deficit relative to this</w:t>
+        <w:t xml:space="preserve">ICC drops from 0.519 to 0.000. Table 6 reports the B1 deficit relative to this</w:t>
       </w:r>
       <w:r>
         <w:t xml:space="preserve"> </w:t>
@@ -14192,23 +14220,21 @@
         <w:pStyle w:val="BodyText"/>
         <w:keepNext/>
         <w:spacing w:before="160"/>
-        <w:jc w:val="center"/>
-      </w:pPr>
-      <w:r/>
+        <w:jc w:val="left"/>
+      </w:pPr>
+      <w:r/>
+      <w:r>
+        <w:rPr>
+          <w:b/>
+          <w:sz w:val="18"/>
+        </w:rPr>
+        <w:t xml:space="preserve">Table 6. </w:t>
+      </w:r>
       <w:r>
         <w:rPr>
           <w:sz w:val="18"/>
         </w:rPr>
-        <w:t>TABLE VI</w:t>
-      </w:r>
-      <w:r>
-        <w:br/>
-      </w:r>
-      <w:r>
-        <w:rPr>
-          <w:sz w:val="16"/>
-        </w:rPr>
-        <w:t>MIT-BIH: B1 DEFICIT AGAINST THE PERMUTATION NULL, PP. MONTE CARLO INTERVAL: PERCENTILE BOOTSTRAP OVER 200 PAIRED SPLITS OF THE 22 DS2 RECORDS, CONDITIONAL ON THOSE RECORDS. RECORD LEVEL: LEAVE-ONE-RECORD-OUT JACKKNIFE (500 PAIRED SPLITS AND A NEW PERMUTATION PER REPLICATE), 95% T INTERVAL WITH 21 DF AND HOLM-ADJUSTED ONE-SIDED P.</w:t>
+        <w:t>MIT-BIH: B1 deficit against the permutation null, pp. Monte Carlo interval: percentile bootstrap over 200 paired splits of the 22 DS2 records, conditional on those records. Record level: leave-one-record-out jackknife (500 paired splits and a new permutation per replicate), 95% t interval with 21 df and Holm-adjusted one-sided p.</w:t>
       </w:r>
     </w:p>
     <w:tbl>
@@ -15596,7 +15622,7 @@
         <w:t xml:space="preserve"> </w:t>
       </w:r>
       <w:r>
-        <w:t xml:space="preserve">own; it amplifies the effect of clustering. Like those of Table VI, these</w:t>
+        <w:t xml:space="preserve">own; it amplifies the effect of clustering. Like those of Table 6, these</w:t>
       </w:r>
       <w:r>
         <w:t xml:space="preserve"> </w:t>
@@ -15633,18 +15659,18 @@
           <wp:inline>
             <wp:extent cx="5334000" cy="1559365"/>
             <wp:effectExtent b="0" l="0" r="0" t="0"/>
-            <wp:docPr descr="Fig. 6. Attribution of the MIT-BIH deficit, primary backbone. (a) Effects of clustering, block-size imbalance and their interaction on B1 coverage in the 2×2 factorial design (Monte Carlo 95% interval over 400 splits; open markers include zero). (b) B12−B1 coverage gap on the original data and after permuting beats between records (bars: mean; whiskers: 2.5–97.5% range across splits). Percentages give the mechanical share, the permuted gap as a fraction of the original." title="" id="42" name="Picture"/>
+            <wp:docPr descr="Fig. 6. Attribution of the MIT-BIH deficit, primary backbone. (a) Effects of clustering, block-size imbalance and their interaction on B1 coverage in the 2×2 factorial design (Monte Carlo 95% interval over 400 splits; open markers include zero). (b) B12−B1 coverage gap on the original data and after permuting beats between records (bars: mean; whiskers: 2.5–97.5% range across splits). Percentages give the mechanical share, the permuted gap as a fraction of the original." title="" id="44" name="Picture"/>
             <a:graphic>
               <a:graphicData uri="http://schemas.openxmlformats.org/drawingml/2006/picture">
                 <pic:pic>
                   <pic:nvPicPr>
-                    <pic:cNvPr descr="figures/fig6_attribution.png" id="43" name="Picture"/>
+                    <pic:cNvPr descr="figures/fig6_attribution.png" id="45" name="Picture"/>
                     <pic:cNvPicPr>
                       <a:picLocks noChangeArrowheads="1" noChangeAspect="1"/>
                     </pic:cNvPicPr>
                   </pic:nvPicPr>
                   <pic:blipFill>
-                    <a:blip r:embed="rId41"/>
+                    <a:blip r:embed="rId43"/>
                     <a:stretch>
                       <a:fillRect/>
                     </a:stretch>
@@ -15680,8 +15706,8 @@
         <w:t xml:space="preserve">Fig. 6. Attribution of the MIT-BIH deficit, primary backbone. (a) Effects of clustering, block-size imbalance and their interaction on B1 coverage in the 2×2 factorial design (Monte Carlo 95% interval over 400 splits; open markers include zero). (b) B12−B1 coverage gap on the original data and after permuting beats between records (bars: mean; whiskers: 2.5–97.5% range across splits). Percentages give the mechanical share, the permuted gap as a fraction of the original.</w:t>
       </w:r>
     </w:p>
-    <w:bookmarkEnd w:id="44"/>
-    <w:bookmarkStart w:id="48" w:name="the-deficit-tracks-the-design-effect"/>
+    <w:bookmarkEnd w:id="46"/>
+    <w:bookmarkStart w:id="50" w:name="the-deficit-tracks-the-design-effect"/>
     <w:p>
       <w:pPr>
         <w:pStyle w:val="Heading2"/>
@@ -15887,7 +15913,7 @@
         <w:t xml:space="preserve"> </w:t>
       </w:r>
       <w:r>
-        <w:t xml:space="preserve">inference. Table VII reports the correlations on three dependence axes, and</w:t>
+        <w:t xml:space="preserve">inference. Table 7 reports the correlations on three dependence axes, and</w:t>
       </w:r>
       <w:r>
         <w:t xml:space="preserve"> </w:t>
@@ -15901,23 +15927,21 @@
         <w:pStyle w:val="BodyText"/>
         <w:keepNext/>
         <w:spacing w:before="160"/>
-        <w:jc w:val="center"/>
-      </w:pPr>
-      <w:r/>
+        <w:jc w:val="left"/>
+      </w:pPr>
+      <w:r/>
+      <w:r>
+        <w:rPr>
+          <w:b/>
+          <w:sz w:val="18"/>
+        </w:rPr>
+        <w:t xml:space="preserve">Table 7. </w:t>
+      </w:r>
       <w:r>
         <w:rPr>
           <w:sz w:val="18"/>
         </w:rPr>
-        <w:t>TABLE VII</w:t>
-      </w:r>
-      <w:r>
-        <w:br/>
-      </w:r>
-      <w:r>
-        <w:rPr>
-          <w:sz w:val="16"/>
-        </w:rPr>
-        <w:t>SPEARMAN CORRELATION BETWEEN DEPENDENCE AND COVERAGE DEFICIT (P-VALUES TREAT POINTS AS INDEPENDENT AND ARE SHOWN FOR COMPLETENESS).</w:t>
+        <w:t>Spearman correlation between dependence and coverage deficit (p-values treat points as independent and are shown for completeness).</w:t>
       </w:r>
     </w:p>
     <w:tbl>
@@ -16572,18 +16596,18 @@
           <wp:inline>
             <wp:extent cx="3108960" cy="2277948"/>
             <wp:effectExtent b="0" l="0" r="0" t="0"/>
-            <wp:docPr descr="Fig. 7. B1 coverage deficit against the design effect. MIT-BIH points (blue) are obtained by randomly reassigning a growing fraction of beats to other records, with calibration records subsampled to a common size; PTB-XL (orange) is the observed patient partition with its Monte Carlo 95% interval. The annotation gives the Spearman correlation over the 12 points at \alpha=0.10, 0.15, 0.20." title="" id="46" name="Picture"/>
+            <wp:docPr descr="Fig. 7. B1 coverage deficit against the design effect. MIT-BIH points (blue) are obtained by randomly reassigning a growing fraction of beats to other records, with calibration records subsampled to a common size; PTB-XL (orange) is the observed patient partition with its Monte Carlo 95% interval. The annotation gives the Spearman correlation over the 12 points at \alpha=0.10, 0.15, 0.20." title="" id="48" name="Picture"/>
             <a:graphic>
               <a:graphicData uri="http://schemas.openxmlformats.org/drawingml/2006/picture">
                 <pic:pic>
                   <pic:nvPicPr>
-                    <pic:cNvPr descr="figures/fig7_dose_response.png" id="47" name="Picture"/>
+                    <pic:cNvPr descr="figures/fig7_dose_response.png" id="49" name="Picture"/>
                     <pic:cNvPicPr>
                       <a:picLocks noChangeArrowheads="1" noChangeAspect="1"/>
                     </pic:cNvPicPr>
                   </pic:nvPicPr>
                   <pic:blipFill>
-                    <a:blip r:embed="rId45"/>
+                    <a:blip r:embed="rId47"/>
                     <a:stretch>
                       <a:fillRect/>
                     </a:stretch>
@@ -16657,8 +16681,8 @@
         <w:t xml:space="preserve">.</w:t>
       </w:r>
     </w:p>
-    <w:bookmarkEnd w:id="48"/>
-    <w:bookmarkStart w:id="52" w:name="robustness-to-backbone-and-checkpoint"/>
+    <w:bookmarkEnd w:id="50"/>
+    <w:bookmarkStart w:id="54" w:name="robustness-to-backbone-and-checkpoint"/>
     <w:p>
       <w:pPr>
         <w:pStyle w:val="Heading2"/>
@@ -16745,7 +16769,7 @@
         <w:t xml:space="preserve"> </w:t>
       </w:r>
       <w:r>
-        <w:t xml:space="preserve">dataset. Table VIII sets out the discrimination of all three backbones.</w:t>
+        <w:t xml:space="preserve">dataset. Table 8 sets out the discrimination of all three backbones.</w:t>
       </w:r>
     </w:p>
     <w:p>
@@ -16753,23 +16777,21 @@
         <w:pStyle w:val="BodyText"/>
         <w:keepNext/>
         <w:spacing w:before="160"/>
-        <w:jc w:val="center"/>
-      </w:pPr>
-      <w:r/>
+        <w:jc w:val="left"/>
+      </w:pPr>
+      <w:r/>
+      <w:r>
+        <w:rPr>
+          <w:b/>
+          <w:sz w:val="18"/>
+        </w:rPr>
+        <w:t xml:space="preserve">Table 8. </w:t>
+      </w:r>
       <w:r>
         <w:rPr>
           <w:sz w:val="18"/>
         </w:rPr>
-        <w:t>TABLE VIII</w:t>
-      </w:r>
-      <w:r>
-        <w:br/>
-      </w:r>
-      <w:r>
-        <w:rPr>
-          <w:sz w:val="16"/>
-        </w:rPr>
-        <w:t>DISCRIMINATION BY BACKBONE.</w:t>
+        <w:t>Discrimination by backbone.</w:t>
       </w:r>
     </w:p>
     <w:tbl>
@@ -17166,7 +17188,7 @@
         <w:t xml:space="preserve"> </w:t>
       </w:r>
       <w:r>
-        <w:t xml:space="preserve">cells (Table VI). Its</w:t>
+        <w:t xml:space="preserve">cells (Table 6). Its</w:t>
       </w:r>
       <w:r>
         <w:t xml:space="preserve"> </w:t>
@@ -17340,7 +17362,7 @@
         <w:t xml:space="preserve"> </w:t>
       </w:r>
       <w:r>
-        <w:t xml:space="preserve">(a) sets the Monte Carlo intervals of Table VI against the record-level</w:t>
+        <w:t xml:space="preserve">(a) sets the Monte Carlo intervals of Table 6 against the record-level</w:t>
       </w:r>
       <w:r>
         <w:t xml:space="preserve"> </w:t>
@@ -17371,18 +17393,18 @@
           <wp:inline>
             <wp:extent cx="5334000" cy="1775293"/>
             <wp:effectExtent b="0" l="0" r="0" t="0"/>
-            <wp:docPr descr="Fig. 8. Robustness of the audit. (a) MIT-BIH B1 coverage deficit against the matched permutation null, by backbone and \alpha: point estimate with Monte Carlo 95% interval over 200 splits of the 22 DS2 records (open markers include zero), and record-level 95% CI from the leave-one-record-out jackknife (light bars). (b) B1 coverage minus nominal under best-validation (horizontal) and last-epoch (vertical) weights for the two residual networks, 16 backbone×dataset×\alpha cells; shaded quadrants mark agreement in sign and the dotted line marks equality." title="" id="50" name="Picture"/>
+            <wp:docPr descr="Fig. 8. Robustness of the audit. (a) MIT-BIH B1 coverage deficit against the matched permutation null, by backbone and \alpha: point estimate with Monte Carlo 95% interval over 200 splits of the 22 DS2 records (open markers include zero), and record-level 95% CI from the leave-one-record-out jackknife (light bars). (b) B1 coverage minus nominal under best-validation (horizontal) and last-epoch (vertical) weights for the two residual networks, 16 backbone×dataset×\alpha cells; shaded quadrants mark agreement in sign and the dotted line marks equality." title="" id="52" name="Picture"/>
             <a:graphic>
               <a:graphicData uri="http://schemas.openxmlformats.org/drawingml/2006/picture">
                 <pic:pic>
                   <pic:nvPicPr>
-                    <pic:cNvPr descr="figures/fig8_robustness.png" id="51" name="Picture"/>
+                    <pic:cNvPr descr="figures/fig8_robustness.png" id="53" name="Picture"/>
                     <pic:cNvPicPr>
                       <a:picLocks noChangeArrowheads="1" noChangeAspect="1"/>
                     </pic:cNvPicPr>
                   </pic:nvPicPr>
                   <pic:blipFill>
-                    <a:blip r:embed="rId49"/>
+                    <a:blip r:embed="rId51"/>
                     <a:stretch>
                       <a:fillRect/>
                     </a:stretch>
@@ -17440,9 +17462,9 @@
         <w:t xml:space="preserve">cells; shaded quadrants mark agreement in sign and the dotted line marks equality.</w:t>
       </w:r>
     </w:p>
-    <w:bookmarkEnd w:id="52"/>
-    <w:bookmarkEnd w:id="53"/>
-    <w:bookmarkStart w:id="58" w:name="discussion"/>
+    <w:bookmarkEnd w:id="54"/>
+    <w:bookmarkEnd w:id="55"/>
+    <w:bookmarkStart w:id="60" w:name="discussion"/>
     <w:p>
       <w:pPr>
         <w:pStyle w:val="Heading1"/>
@@ -17451,7 +17473,7 @@
         <w:t xml:space="preserve">6. Discussion</w:t>
       </w:r>
     </w:p>
-    <w:bookmarkStart w:id="54" w:name="main-findings"/>
+    <w:bookmarkStart w:id="56" w:name="main-findings"/>
     <w:p>
       <w:pPr>
         <w:pStyle w:val="Heading2"/>
@@ -17801,8 +17823,8 @@
         <w:t xml:space="preserve">coverage loss.</w:t>
       </w:r>
     </w:p>
-    <w:bookmarkEnd w:id="54"/>
-    <w:bookmarkStart w:id="55" w:name="X10a21a4c9ffce0be86017eff986db914a5bca64"/>
+    <w:bookmarkEnd w:id="56"/>
+    <w:bookmarkStart w:id="57" w:name="X10a21a4c9ffce0be86017eff986db914a5bca64"/>
     <w:p>
       <w:pPr>
         <w:pStyle w:val="Heading2"/>
@@ -18071,7 +18093,7 @@
         <w:t xml:space="preserve"> </w:t>
       </w:r>
       <w:r>
-        <w:t xml:space="preserve">cells of Table VI, whereas the jackknife over the same 22 subjects includes zero</w:t>
+        <w:t xml:space="preserve">cells of Table 6, whereas the jackknife over the same 22 subjects includes zero</w:t>
       </w:r>
       <w:r>
         <w:t xml:space="preserve"> </w:t>
@@ -18092,8 +18114,8 @@
         <w:t xml:space="preserve">that the sign of a coverage gap is not yet known.</w:t>
       </w:r>
     </w:p>
-    <w:bookmarkEnd w:id="55"/>
-    <w:bookmarkStart w:id="56" w:name="implications-and-relation-to-prior-work"/>
+    <w:bookmarkEnd w:id="57"/>
+    <w:bookmarkStart w:id="58" w:name="implications-and-relation-to-prior-work"/>
     <w:p>
       <w:pPr>
         <w:pStyle w:val="Heading2"/>
@@ -18122,7 +18144,7 @@
         <w:pStyle w:val="Compact"/>
         <w:numPr>
           <w:ilvl w:val="0"/>
-          <w:numId w:val="1002"/>
+          <w:numId w:val="1003"/>
         </w:numPr>
       </w:pPr>
       <w:r>
@@ -18152,7 +18174,7 @@
         <w:pStyle w:val="Compact"/>
         <w:numPr>
           <w:ilvl w:val="0"/>
-          <w:numId w:val="1002"/>
+          <w:numId w:val="1003"/>
         </w:numPr>
       </w:pPr>
       <w:r>
@@ -18211,7 +18233,7 @@
         <w:pStyle w:val="Compact"/>
         <w:numPr>
           <w:ilvl w:val="0"/>
-          <w:numId w:val="1002"/>
+          <w:numId w:val="1003"/>
         </w:numPr>
       </w:pPr>
       <w:r>
@@ -18293,7 +18315,7 @@
         <w:pStyle w:val="Compact"/>
         <w:numPr>
           <w:ilvl w:val="0"/>
-          <w:numId w:val="1002"/>
+          <w:numId w:val="1003"/>
         </w:numPr>
       </w:pPr>
       <w:r>
@@ -18489,8 +18511,8 @@
         <w:t xml:space="preserve">meet the same boundary is left open.</w:t>
       </w:r>
     </w:p>
-    <w:bookmarkEnd w:id="56"/>
-    <w:bookmarkStart w:id="57" w:name="limitations-and-threats-to-validity"/>
+    <w:bookmarkEnd w:id="58"/>
+    <w:bookmarkStart w:id="59" w:name="limitations-and-threats-to-validity"/>
     <w:p>
       <w:pPr>
         <w:pStyle w:val="Heading2"/>
@@ -18911,7 +18933,7 @@
         <w:t xml:space="preserve"> </w:t>
       </w:r>
       <w:r>
-        <w:t xml:space="preserve">The repeated-split intervals of Table VI</w:t>
+        <w:t xml:space="preserve">The repeated-split intervals of Table 6</w:t>
       </w:r>
       <w:r>
         <w:t xml:space="preserve"> </w:t>
@@ -18928,7 +18950,7 @@
         </m:r>
       </m:oMath>
       <w:r>
-        <w:t xml:space="preserve">-values of Table VII are conditional on the 22 DS2</w:t>
+        <w:t xml:space="preserve">-values of Table 7 are conditional on the 22 DS2</w:t>
       </w:r>
       <w:r>
         <w:t xml:space="preserve"> </w:t>
@@ -18993,7 +19015,7 @@
         <w:t xml:space="preserve"> </w:t>
       </w:r>
       <w:r>
-        <w:t xml:space="preserve">every MIT-BIH cell (Table V). Coverage on its own flatters HCP, which covers by</w:t>
+        <w:t xml:space="preserve">every MIT-BIH cell (Table 5). Coverage on its own flatters HCP, which covers by</w:t>
       </w:r>
       <w:r>
         <w:t xml:space="preserve"> </w:t>
@@ -19151,7 +19173,7 @@
         <w:t xml:space="preserve"> </w:t>
       </w:r>
       <w:r>
-        <w:t xml:space="preserve">coefficient stays positive (Table VII), and PTB-XL’s correlation drops from</w:t>
+        <w:t xml:space="preserve">coefficient stays positive (Table 7), and PTB-XL’s correlation drops from</w:t>
       </w:r>
       <w:r>
         <w:t xml:space="preserve"> </w:t>
@@ -19543,9 +19565,9 @@
         <w:t xml:space="preserve">formally frozen; it is released with its deviation log.</w:t>
       </w:r>
     </w:p>
-    <w:bookmarkEnd w:id="57"/>
-    <w:bookmarkEnd w:id="58"/>
-    <w:bookmarkStart w:id="59" w:name="conclusion"/>
+    <w:bookmarkEnd w:id="59"/>
+    <w:bookmarkEnd w:id="60"/>
+    <w:bookmarkStart w:id="61" w:name="conclusion"/>
     <w:p>
       <w:pPr>
         <w:pStyle w:val="Heading1"/>
@@ -19659,8 +19681,8 @@
         <w:t xml:space="preserve">face the same boundary is an open question.</w:t>
       </w:r>
     </w:p>
-    <w:bookmarkEnd w:id="59"/>
-    <w:bookmarkStart w:id="60" w:name="data-and-code-availability"/>
+    <w:bookmarkEnd w:id="61"/>
+    <w:bookmarkStart w:id="62" w:name="data-and-code-availability"/>
     <w:p>
       <w:pPr>
         <w:pStyle w:val="Heading1"/>
@@ -19708,8 +19730,8 @@
         <w:t xml:space="preserve">[identifier to be inserted].</w:t>
       </w:r>
     </w:p>
-    <w:bookmarkEnd w:id="60"/>
-    <w:bookmarkStart w:id="61" w:name="ethics-statement"/>
+    <w:bookmarkEnd w:id="62"/>
+    <w:bookmarkStart w:id="63" w:name="ethics-statement"/>
     <w:p>
       <w:pPr>
         <w:pStyle w:val="Heading1"/>
@@ -19745,17 +19767,108 @@
         <w:t xml:space="preserve">authors.]</w:t>
       </w:r>
     </w:p>
-    <w:bookmarkEnd w:id="61"/>
-    <w:bookmarkStart w:id="65" w:name="appendix-a.-supplementary-derivations"/>
+    <w:bookmarkEnd w:id="63"/>
+    <w:bookmarkStart w:id="64" w:name="credit-authorship-contribution-statement"/>
     <w:p>
       <w:pPr>
         <w:pStyle w:val="Heading1"/>
       </w:pPr>
       <w:r>
+        <w:t xml:space="preserve">CRediT Authorship Contribution Statement</w:t>
+      </w:r>
+    </w:p>
+    <w:p>
+      <w:pPr>
+        <w:pStyle w:val="FirstParagraph"/>
+      </w:pPr>
+      <w:r>
+        <w:t xml:space="preserve">[To be completed by the authors using the CRediT taxonomy.]</w:t>
+      </w:r>
+    </w:p>
+    <w:bookmarkEnd w:id="64"/>
+    <w:bookmarkStart w:id="65" w:name="declaration-of-competing-interest"/>
+    <w:p>
+      <w:pPr>
+        <w:pStyle w:val="Heading1"/>
+      </w:pPr>
+      <w:r>
+        <w:t xml:space="preserve">Declaration of Competing Interest</w:t>
+      </w:r>
+    </w:p>
+    <w:p>
+      <w:pPr>
+        <w:pStyle w:val="FirstParagraph"/>
+      </w:pPr>
+      <w:r>
+        <w:t xml:space="preserve">[To be completed by the authors.]</w:t>
+      </w:r>
+    </w:p>
+    <w:bookmarkEnd w:id="65"/>
+    <w:bookmarkStart w:id="66" w:name="funding"/>
+    <w:p>
+      <w:pPr>
+        <w:pStyle w:val="Heading1"/>
+      </w:pPr>
+      <w:r>
+        <w:t xml:space="preserve">Funding</w:t>
+      </w:r>
+    </w:p>
+    <w:p>
+      <w:pPr>
+        <w:pStyle w:val="FirstParagraph"/>
+      </w:pPr>
+      <w:r>
+        <w:t xml:space="preserve">[To be completed by the authors.]</w:t>
+      </w:r>
+    </w:p>
+    <w:bookmarkEnd w:id="66"/>
+    <w:bookmarkStart w:id="67" w:name="X071796dd6bc546c91e96cca1cf5ff96599de61f"/>
+    <w:p>
+      <w:pPr>
+        <w:pStyle w:val="Heading1"/>
+      </w:pPr>
+      <w:r>
+        <w:t xml:space="preserve">Declaration of Generative AI and AI-Assisted Technologies in the Writing Process</w:t>
+      </w:r>
+    </w:p>
+    <w:p>
+      <w:pPr>
+        <w:pStyle w:val="FirstParagraph"/>
+        <w:jc w:val="both"/>
+      </w:pPr>
+      <w:r>
+        <w:t xml:space="preserve">During the preparation of this work the author(s) used [name of tool or</w:t>
+      </w:r>
+      <w:r>
+        <w:t xml:space="preserve"> </w:t>
+      </w:r>
+      <w:r>
+        <w:t xml:space="preserve">service] in order to [purpose]. After using this tool or service, the author(s)</w:t>
+      </w:r>
+      <w:r>
+        <w:t xml:space="preserve"> </w:t>
+      </w:r>
+      <w:r>
+        <w:t xml:space="preserve">reviewed and edited the content as needed and take(s) full responsibility for</w:t>
+      </w:r>
+      <w:r>
+        <w:t xml:space="preserve"> </w:t>
+      </w:r>
+      <w:r>
+        <w:t xml:space="preserve">the content of the publication.</w:t>
+      </w:r>
+    </w:p>
+    <w:bookmarkEnd w:id="67"/>
+    <w:bookmarkStart w:id="71" w:name="appendix-a.-supplementary-derivations"/>
+    <w:p>
+      <w:pPr>
+        <w:pStyle w:val="Heading1"/>
+      </w:pPr>
+      <w:r>
         <w:t xml:space="preserve">Appendix A. Supplementary Derivations</w:t>
       </w:r>
     </w:p>
-    <w:bookmarkStart w:id="62" w:name="a.1-the-boundary-case-of-proposition-1"/>
+    <w:bookmarkStart w:id="68" w:name="a.1-the-boundary-case-of-proposition-1"/>
     <w:p>
       <w:pPr>
         <w:pStyle w:val="Heading2"/>
@@ -20050,8 +20163,8 @@
         <w:t xml:space="preserve">.</w:t>
       </w:r>
     </w:p>
-    <w:bookmarkEnd w:id="62"/>
-    <w:bookmarkStart w:id="63" w:name="a.2-variance-under-compound-symmetry"/>
+    <w:bookmarkEnd w:id="68"/>
+    <w:bookmarkStart w:id="69" w:name="a.2-variance-under-compound-symmetry"/>
     <w:p>
       <w:pPr>
         <w:pStyle w:val="Heading2"/>
@@ -20539,8 +20652,8 @@
         <w:t xml:space="preserve">vanishes. We make no claim outside (A).</w:t>
       </w:r>
     </w:p>
-    <w:bookmarkEnd w:id="63"/>
-    <w:bookmarkStart w:id="64" w:name="a.3-equal-weighting-in-hcp"/>
+    <w:bookmarkEnd w:id="69"/>
+    <w:bookmarkStart w:id="70" w:name="a.3-equal-weighting-in-hcp"/>
     <w:p>
       <w:pPr>
         <w:pStyle w:val="Heading2"/>
@@ -21055,9 +21168,9 @@
         <w:t xml:space="preserve">.</w:t>
       </w:r>
     </w:p>
-    <w:bookmarkEnd w:id="64"/>
-    <w:bookmarkEnd w:id="65"/>
-    <w:bookmarkStart w:id="66" w:name="X06db9a02045705c8b7d21c68ec78218971b4832"/>
+    <w:bookmarkEnd w:id="70"/>
+    <w:bookmarkEnd w:id="71"/>
+    <w:bookmarkStart w:id="72" w:name="X06db9a02045705c8b7d21c68ec78218971b4832"/>
     <w:p>
       <w:pPr>
         <w:pStyle w:val="Heading1"/>
@@ -21096,7 +21209,7 @@
         <w:t xml:space="preserve"> </w:t>
       </w:r>
       <w:r>
-        <w:t xml:space="preserve">difference to block balance. Table IX records each interim conclusion alongside</w:t>
+        <w:t xml:space="preserve">difference to block balance. Table 9 records each interim conclusion alongside</w:t>
       </w:r>
       <w:r>
         <w:t xml:space="preserve"> </w:t>
@@ -21110,23 +21223,21 @@
         <w:pStyle w:val="BodyText"/>
         <w:keepNext/>
         <w:spacing w:before="160"/>
-        <w:jc w:val="center"/>
-      </w:pPr>
-      <w:r/>
+        <w:jc w:val="left"/>
+      </w:pPr>
+      <w:r/>
+      <w:r>
+        <w:rPr>
+          <w:b/>
+          <w:sz w:val="18"/>
+        </w:rPr>
+        <w:t xml:space="preserve">Table 9. </w:t>
+      </w:r>
       <w:r>
         <w:rPr>
           <w:sz w:val="18"/>
         </w:rPr>
-        <w:t>TABLE IX</w:t>
-      </w:r>
-      <w:r>
-        <w:br/>
-      </w:r>
-      <w:r>
-        <w:rPr>
-          <w:sz w:val="16"/>
-        </w:rPr>
-        <w:t>INTERIM CONCLUSIONS ON MIT-BIH AND THE CONTROL THAT OVERTURNED EACH.</w:t>
+        <w:t>Interim conclusions on MIT-BIH and the control that overturned each.</w:t>
       </w:r>
     </w:p>
     <w:tbl>
@@ -21493,8 +21604,8 @@
         </w:tc>
       </w:tr>
     </w:tbl>
-    <w:bookmarkEnd w:id="66"/>
-    <w:bookmarkStart w:id="67" w:name="Xbf53aa51c2c3289f595a160de988653028afcc2"/>
+    <w:bookmarkEnd w:id="72"/>
+    <w:bookmarkStart w:id="73" w:name="Xbf53aa51c2c3289f595a160de988653028afcc2"/>
     <w:p>
       <w:pPr>
         <w:pStyle w:val="Heading1"/>
@@ -21802,8 +21913,8 @@
         <w:t xml:space="preserve">headers) out of a 12.6 GB dataset, before any preprocessing or training.</w:t>
       </w:r>
     </w:p>
-    <w:bookmarkEnd w:id="67"/>
-    <w:bookmarkStart w:id="68" w:name="references"/>
+    <w:bookmarkEnd w:id="73"/>
+    <w:bookmarkStart w:id="74" w:name="references"/>
     <w:p>
       <w:pPr>
         <w:pStyle w:val="Heading1"/>
@@ -23510,11 +23621,12 @@
         <w:t>T. Bender et al., “Analysis of a Deep Learning Model for 12-Lead ECG Classification Reveals Learned Features Similar to Diagnostic Criteria,” IEEE J. Biomed. Health Inform., vol. 28, no. 4, pp. 1848–1859, Apr. 2024, doi: 10.1109/jbhi.2023.3271858.</w:t>
       </w:r>
     </w:p>
-    <w:bookmarkEnd w:id="68"/>
+    <w:bookmarkEnd w:id="74"/>
     <w:sectPr>
       <w:footnotePr>
         <w:numRestart w:val="eachSect"/>
       </w:footnotePr>
+      <w:lnNumType w:countBy="1" w:restart="continuous" w:distance="283"/>
     </w:sectPr>
   </w:body>
 </w:document>
@@ -23816,6 +23928,9 @@
     <w:abstractNumId w:val="991"/>
   </w:num>
   <w:num w:numId="1002">
+    <w:abstractNumId w:val="991"/>
+  </w:num>
+  <w:num w:numId="1003">
     <w:abstractNumId w:val="99411"/>
     <w:lvlOverride w:ilvl="0">
       <w:startOverride w:val="1"/>

</xml_diff>

<commit_message>
Draf netral jurnal: hapus Highlights dan bagian administratif
Arahan dosen pembimbing: jurnal dan template belum ditentukan; draf hanya berisi isi naskah. Dihapus: Highlights, Ethics Statement, CRediT, Competing Interest, Funding, deklarasi AI, placeholder DOI. Fakta data publik ter-de-identifikasi tanpa data baru dipindah ke Data and Code Availability. Daftar isian untuk dosen dicatat di Catatan penyusunan. 23 halaman.
</commit_message>
<xml_diff>
--- a/docs/paper/manuscript-draft.docx
+++ b/docs/paper/manuscript-draft.docx
@@ -20,80 +20,10 @@
           <w:i/>
           <w:iCs/>
         </w:rPr>
-        <w:t xml:space="preserve">Working draft for internal review — generated 2026-10-03 from commit a407735.</w:t>
+        <w:t xml:space="preserve">Working draft for internal review — generated 2026-10-03 from commit 4d143e2.</w:t>
       </w:r>
     </w:p>
-    <w:bookmarkStart w:id="9" w:name="highlights"/>
-    <w:p>
-      <w:pPr>
-        <w:pStyle w:val="Heading1"/>
-      </w:pPr>
-      <w:r>
-        <w:t xml:space="preserve">Highlights</w:t>
-      </w:r>
-    </w:p>
-    <w:p>
-      <w:pPr>
-        <w:pStyle w:val="Compact"/>
-        <w:numPr>
-          <w:ilvl w:val="0"/>
-          <w:numId w:val="1001"/>
-        </w:numPr>
-      </w:pPr>
-      <w:r>
-        <w:t xml:space="preserve">Metadata alone decide whether block-level conformal coverage can be guaranteed</w:t>
-      </w:r>
-    </w:p>
-    <w:p>
-      <w:pPr>
-        <w:pStyle w:val="Compact"/>
-        <w:numPr>
-          <w:ilvl w:val="0"/>
-          <w:numId w:val="1001"/>
-        </w:numPr>
-      </w:pPr>
-      <w:r>
-        <w:t xml:space="preserve">All four declared PTB-XL dependence sources leave one admissible calibration block</w:t>
-      </w:r>
-    </w:p>
-    <w:p>
-      <w:pPr>
-        <w:pStyle w:val="Compact"/>
-        <w:numPr>
-          <w:ilvl w:val="0"/>
-          <w:numId w:val="1001"/>
-        </w:numPr>
-      </w:pPr>
-      <w:r>
-        <w:t xml:space="preserve">Under patient blocks, 24 of 44 PTB-XL statements lack a finite threshold at 5% error</w:t>
-      </w:r>
-    </w:p>
-    <w:p>
-      <w:pPr>
-        <w:pStyle w:val="Compact"/>
-        <w:numPr>
-          <w:ilvl w:val="0"/>
-          <w:numId w:val="1001"/>
-        </w:numPr>
-      </w:pPr>
-      <w:r>
-        <w:t xml:space="preserve">Most of the apparent coverage gain of HCP over split conformal is mechanical</w:t>
-      </w:r>
-    </w:p>
-    <w:p>
-      <w:pPr>
-        <w:pStyle w:val="Compact"/>
-        <w:numPr>
-          <w:ilvl w:val="0"/>
-          <w:numId w:val="1001"/>
-        </w:numPr>
-      </w:pPr>
-      <w:r>
-        <w:t xml:space="preserve">Repeated splits of fixed subjects yield split-level, not population-level, intervals</w:t>
-      </w:r>
-    </w:p>
-    <w:bookmarkEnd w:id="9"/>
-    <w:bookmarkStart w:id="10" w:name="abstract"/>
+    <w:bookmarkStart w:id="9" w:name="abstract"/>
     <w:p>
       <w:pPr>
         <w:pStyle w:val="Heading1"/>
@@ -223,8 +153,8 @@
         <w:t xml:space="preserve">Conformal prediction; electrocardiography; uncertainty quantification; hierarchical data; exchangeability; calibration; study design</w:t>
       </w:r>
     </w:p>
-    <w:bookmarkEnd w:id="10"/>
-    <w:bookmarkStart w:id="14" w:name="introduction"/>
+    <w:bookmarkEnd w:id="9"/>
+    <w:bookmarkStart w:id="13" w:name="introduction"/>
     <w:p>
       <w:pPr>
         <w:pStyle w:val="Heading1"/>
@@ -629,18 +559,18 @@
           <wp:inline>
             <wp:extent cx="5334000" cy="3745353"/>
             <wp:effectExtent b="0" l="0" r="0" t="0"/>
-            <wp:docPr descr="Fig. 1. Audit workflow. Stage 1 (blue header) uses metadata only and returns verdicts that are exact given the declared dependence sources D, before any model is trained (RQ1; §3, §5.1). Stage 2 (orange headers) uses conformity scores from three backbones, at feasible levels only, to compare naive split conformal (B1) with HCP (B12), attribute the B1 deficit to dependence, relate it to the design effect, separate split-level from subject-level uncertainty and check robustness (RQ2; §5.2–§5.5)." title="" id="12" name="Picture"/>
+            <wp:docPr descr="Fig. 1. Audit workflow. Stage 1 (blue header) uses metadata only and returns verdicts that are exact given the declared dependence sources D, before any model is trained (RQ1; §3, §5.1). Stage 2 (orange headers) uses conformity scores from three backbones, at feasible levels only, to compare naive split conformal (B1) with HCP (B12), attribute the B1 deficit to dependence, relate it to the design effect, separate split-level from subject-level uncertainty and check robustness (RQ2; §5.2–§5.5)." title="" id="11" name="Picture"/>
             <a:graphic>
               <a:graphicData uri="http://schemas.openxmlformats.org/drawingml/2006/picture">
                 <pic:pic>
                   <pic:nvPicPr>
-                    <pic:cNvPr descr="figures/fig1_audit_workflow.png" id="13" name="Picture"/>
+                    <pic:cNvPr descr="figures/fig1_audit_workflow.png" id="12" name="Picture"/>
                     <pic:cNvPicPr>
                       <a:picLocks noChangeArrowheads="1" noChangeAspect="1"/>
                     </pic:cNvPicPr>
                   </pic:nvPicPr>
                   <pic:blipFill>
-                    <a:blip r:embed="rId11"/>
+                    <a:blip r:embed="rId10"/>
                     <a:stretch>
                       <a:fillRect/>
                     </a:stretch>
@@ -700,7 +630,7 @@
         <w:pStyle w:val="Compact"/>
         <w:numPr>
           <w:ilvl w:val="0"/>
-          <w:numId w:val="1002"/>
+          <w:numId w:val="1001"/>
         </w:numPr>
       </w:pPr>
       <w:r>
@@ -774,7 +704,7 @@
         <w:pStyle w:val="Compact"/>
         <w:numPr>
           <w:ilvl w:val="0"/>
-          <w:numId w:val="1002"/>
+          <w:numId w:val="1001"/>
         </w:numPr>
       </w:pPr>
       <w:r>
@@ -834,7 +764,7 @@
         <w:pStyle w:val="Compact"/>
         <w:numPr>
           <w:ilvl w:val="0"/>
-          <w:numId w:val="1002"/>
+          <w:numId w:val="1001"/>
         </w:numPr>
       </w:pPr>
       <w:r>
@@ -928,8 +858,8 @@
         <w:t xml:space="preserve">design, and Sections 5 and 6 present and discuss the findings.</w:t>
       </w:r>
     </w:p>
-    <w:bookmarkEnd w:id="14"/>
-    <w:bookmarkStart w:id="17" w:name="related-work"/>
+    <w:bookmarkEnd w:id="13"/>
+    <w:bookmarkStart w:id="16" w:name="related-work"/>
     <w:p>
       <w:pPr>
         <w:pStyle w:val="Heading1"/>
@@ -938,7 +868,7 @@
         <w:t xml:space="preserve">2. Related Work</w:t>
       </w:r>
     </w:p>
-    <w:bookmarkStart w:id="15" w:name="X82604ee80040ca60fd96cad68dfd92d7ce32f61"/>
+    <w:bookmarkStart w:id="14" w:name="X82604ee80040ca60fd96cad68dfd92d7ce32f61"/>
     <w:p>
       <w:pPr>
         <w:pStyle w:val="Heading2"/>
@@ -1141,8 +1071,8 @@
         <w:t xml:space="preserve">what happens on clinical data when it does.</w:t>
       </w:r>
     </w:p>
-    <w:bookmarkEnd w:id="15"/>
-    <w:bookmarkStart w:id="16" w:name="Xde641f5d420a891fdb073e7aa4fa0944e53f724"/>
+    <w:bookmarkEnd w:id="14"/>
+    <w:bookmarkStart w:id="15" w:name="Xde641f5d420a891fdb073e7aa4fa0944e53f724"/>
     <w:p>
       <w:pPr>
         <w:pStyle w:val="Heading2"/>
@@ -1401,9 +1331,9 @@
         <w:t xml:space="preserve">procedure.</w:t>
       </w:r>
     </w:p>
+    <w:bookmarkEnd w:id="15"/>
     <w:bookmarkEnd w:id="16"/>
-    <w:bookmarkEnd w:id="17"/>
-    <w:bookmarkStart w:id="25" w:name="problem-formulation-and-hcp-feasibility"/>
+    <w:bookmarkStart w:id="24" w:name="problem-formulation-and-hcp-feasibility"/>
     <w:p>
       <w:pPr>
         <w:pStyle w:val="Heading1"/>
@@ -1439,7 +1369,7 @@
         <w:t xml:space="preserve">distinct from findings.</w:t>
       </w:r>
     </w:p>
-    <w:bookmarkStart w:id="18" w:name="hierarchical-calibration"/>
+    <w:bookmarkStart w:id="17" w:name="hierarchical-calibration"/>
     <w:p>
       <w:pPr>
         <w:pStyle w:val="Heading2"/>
@@ -2693,8 +2623,8 @@
         </m:oMath>
       </m:oMathPara>
     </w:p>
-    <w:bookmarkEnd w:id="18"/>
-    <w:bookmarkStart w:id="19" w:name="finite-threshold-feasibility"/>
+    <w:bookmarkEnd w:id="17"/>
+    <w:bookmarkStart w:id="18" w:name="finite-threshold-feasibility"/>
     <w:p>
       <w:pPr>
         <w:pStyle w:val="Heading2"/>
@@ -4988,8 +4918,8 @@
         <w:t xml:space="preserve">correction now used in the conformal literature targets the wrong quantity [40].</w:t>
       </w:r>
     </w:p>
-    <w:bookmarkEnd w:id="19"/>
-    <w:bookmarkStart w:id="23" w:name="crossed-dependence-sources"/>
+    <w:bookmarkEnd w:id="18"/>
+    <w:bookmarkStart w:id="22" w:name="crossed-dependence-sources"/>
     <w:p>
       <w:pPr>
         <w:pStyle w:val="Heading2"/>
@@ -5789,18 +5719,18 @@
           <wp:inline>
             <wp:extent cx="3108960" cy="1073695"/>
             <wp:effectExtent b="0" l="0" r="0" t="0"/>
-            <wp:docPr descr="Fig. 2. Schematic of Proposition 2 on eight hypothetical records (circles). Solid arcs link records of the same patient and dashed arcs records of the same device. A grouping sufficient for both sources must keep every linked pair in one block, so the finest such grouping is the join, the connected components (shaded). On PTB-XL the same mechanism collapses four declared sources to a single block (§5.1)." title="" id="21" name="Picture"/>
+            <wp:docPr descr="Fig. 2. Schematic of Proposition 2 on eight hypothetical records (circles). Solid arcs link records of the same patient and dashed arcs records of the same device. A grouping sufficient for both sources must keep every linked pair in one block, so the finest such grouping is the join, the connected components (shaded). On PTB-XL the same mechanism collapses four declared sources to a single block (§5.1)." title="" id="20" name="Picture"/>
             <a:graphic>
               <a:graphicData uri="http://schemas.openxmlformats.org/drawingml/2006/picture">
                 <pic:pic>
                   <pic:nvPicPr>
-                    <pic:cNvPr descr="figures/fig2_join_schematic.png" id="22" name="Picture"/>
+                    <pic:cNvPr descr="figures/fig2_join_schematic.png" id="21" name="Picture"/>
                     <pic:cNvPicPr>
                       <a:picLocks noChangeArrowheads="1" noChangeAspect="1"/>
                     </pic:cNvPicPr>
                   </pic:nvPicPr>
                   <pic:blipFill>
-                    <a:blip r:embed="rId20"/>
+                    <a:blip r:embed="rId19"/>
                     <a:stretch>
                       <a:fillRect/>
                     </a:stretch>
@@ -6332,8 +6262,8 @@
         <w:t xml:space="preserve">property of the data.</w:t>
       </w:r>
     </w:p>
-    <w:bookmarkEnd w:id="23"/>
-    <w:bookmarkStart w:id="24" w:name="label-conditional-feasibility"/>
+    <w:bookmarkEnd w:id="22"/>
+    <w:bookmarkStart w:id="23" w:name="label-conditional-feasibility"/>
     <w:p>
       <w:pPr>
         <w:pStyle w:val="Heading2"/>
@@ -7429,9 +7359,9 @@
         <w:t xml:space="preserve">.</w:t>
       </w:r>
     </w:p>
+    <w:bookmarkEnd w:id="23"/>
     <w:bookmarkEnd w:id="24"/>
-    <w:bookmarkEnd w:id="25"/>
-    <w:bookmarkStart w:id="31" w:name="audit-design"/>
+    <w:bookmarkStart w:id="30" w:name="audit-design"/>
     <w:p>
       <w:pPr>
         <w:pStyle w:val="Heading1"/>
@@ -7587,7 +7517,7 @@
         <w:t xml:space="preserve">second.</w:t>
       </w:r>
     </w:p>
-    <w:bookmarkStart w:id="26" w:name="datasets-and-dependence-structures"/>
+    <w:bookmarkStart w:id="25" w:name="datasets-and-dependence-structures"/>
     <w:p>
       <w:pPr>
         <w:pStyle w:val="Heading2"/>
@@ -8738,8 +8668,8 @@
         <w:t xml:space="preserve">becomes an assumption that authors must state.</w:t>
       </w:r>
     </w:p>
-    <w:bookmarkEnd w:id="26"/>
-    <w:bookmarkStart w:id="27" w:name="calibration-and-evaluation-protocol"/>
+    <w:bookmarkEnd w:id="25"/>
+    <w:bookmarkStart w:id="26" w:name="calibration-and-evaluation-protocol"/>
     <w:p>
       <w:pPr>
         <w:pStyle w:val="Heading2"/>
@@ -8901,8 +8831,8 @@
         <w:t xml:space="preserve">the maximum score over the true labels.</w:t>
       </w:r>
     </w:p>
-    <w:bookmarkEnd w:id="27"/>
-    <w:bookmarkStart w:id="28" w:name="models-and-conformity-scores"/>
+    <w:bookmarkEnd w:id="26"/>
+    <w:bookmarkStart w:id="27" w:name="models-and-conformity-scores"/>
     <w:p>
       <w:pPr>
         <w:pStyle w:val="Heading2"/>
@@ -9219,8 +9149,8 @@
         <w:t xml:space="preserve">to scalar HCP (§3.4).</w:t>
       </w:r>
     </w:p>
-    <w:bookmarkEnd w:id="28"/>
-    <w:bookmarkStart w:id="29" w:name="statistical-analysis"/>
+    <w:bookmarkEnd w:id="27"/>
+    <w:bookmarkStart w:id="28" w:name="statistical-analysis"/>
     <w:p>
       <w:pPr>
         <w:pStyle w:val="Heading2"/>
@@ -10109,8 +10039,8 @@
         </w:tc>
       </w:tr>
     </w:tbl>
-    <w:bookmarkEnd w:id="29"/>
-    <w:bookmarkStart w:id="30" w:name="reproducibility"/>
+    <w:bookmarkEnd w:id="28"/>
+    <w:bookmarkStart w:id="29" w:name="reproducibility"/>
     <w:p>
       <w:pPr>
         <w:pStyle w:val="Heading2"/>
@@ -10170,9 +10100,9 @@
         <w:t xml:space="preserve">a partial cache behind.</w:t>
       </w:r>
     </w:p>
+    <w:bookmarkEnd w:id="29"/>
     <w:bookmarkEnd w:id="30"/>
-    <w:bookmarkEnd w:id="31"/>
-    <w:bookmarkStart w:id="55" w:name="results"/>
+    <w:bookmarkStart w:id="54" w:name="results"/>
     <w:p>
       <w:pPr>
         <w:pStyle w:val="Heading1"/>
@@ -10273,7 +10203,7 @@
         <w:t xml:space="preserve">.</w:t>
       </w:r>
     </w:p>
-    <w:bookmarkStart w:id="38" w:name="X703171b6c9ef8344f5ae4ef526c91a89ce0ec43"/>
+    <w:bookmarkStart w:id="37" w:name="X703171b6c9ef8344f5ae4ef526c91a89ce0ec43"/>
     <w:p>
       <w:pPr>
         <w:pStyle w:val="Heading2"/>
@@ -11404,18 +11334,18 @@
           <wp:inline>
             <wp:extent cx="3108960" cy="2176272"/>
             <wp:effectExtent b="0" l="0" r="0" t="0"/>
-            <wp:docPr descr="Fig. 3. Feasibility frontier \alpha_{\min}=1/(K_1+1). Each marker is a calibration grouping on PTB-XL fold 9 (circles: single dependence source; squares: join of sources) or the MIT-BIH record partition (diamond). Values in parentheses are K_1. A grouping supports a guarantee at level \alpha only if its marker lies below the corresponding dotted line." title="" id="33" name="Picture"/>
+            <wp:docPr descr="Fig. 3. Feasibility frontier \alpha_{\min}=1/(K_1+1). Each marker is a calibration grouping on PTB-XL fold 9 (circles: single dependence source; squares: join of sources) or the MIT-BIH record partition (diamond). Values in parentheses are K_1. A grouping supports a guarantee at level \alpha only if its marker lies below the corresponding dotted line." title="" id="32" name="Picture"/>
             <a:graphic>
               <a:graphicData uri="http://schemas.openxmlformats.org/drawingml/2006/picture">
                 <pic:pic>
                   <pic:nvPicPr>
-                    <pic:cNvPr descr="figures/fig3_feasibility_frontier.png" id="34" name="Picture"/>
+                    <pic:cNvPr descr="figures/fig3_feasibility_frontier.png" id="33" name="Picture"/>
                     <pic:cNvPicPr>
                       <a:picLocks noChangeArrowheads="1" noChangeAspect="1"/>
                     </pic:cNvPicPr>
                   </pic:nvPicPr>
                   <pic:blipFill>
-                    <a:blip r:embed="rId32"/>
+                    <a:blip r:embed="rId31"/>
                     <a:stretch>
                       <a:fillRect/>
                     </a:stretch>
@@ -12626,18 +12556,18 @@
           <wp:inline>
             <wp:extent cx="5334000" cy="1604287"/>
             <wp:effectExtent b="0" l="0" r="0" t="0"/>
-            <wp:docPr descr="Fig. 4. Calibration blocks carrying each label, by level of the PTB-XL hierarchy (fold 9, patient blocks; log scale). Dashed and dotted lines mark the minimum number of blocks for a finite per-label threshold at \alpha=0.05 and \alpha=0.10. Dark bars meet the \alpha=0.05 requirement, light bars only the \alpha=0.10 requirement, and orange bars neither." title="" id="36" name="Picture"/>
+            <wp:docPr descr="Fig. 4. Calibration blocks carrying each label, by level of the PTB-XL hierarchy (fold 9, patient blocks; log scale). Dashed and dotted lines mark the minimum number of blocks for a finite per-label threshold at \alpha=0.05 and \alpha=0.10. Dark bars meet the \alpha=0.05 requirement, light bars only the \alpha=0.10 requirement, and orange bars neither." title="" id="35" name="Picture"/>
             <a:graphic>
               <a:graphicData uri="http://schemas.openxmlformats.org/drawingml/2006/picture">
                 <pic:pic>
                   <pic:nvPicPr>
-                    <pic:cNvPr descr="figures/fig4_label_feasibility.png" id="37" name="Picture"/>
+                    <pic:cNvPr descr="figures/fig4_label_feasibility.png" id="36" name="Picture"/>
                     <pic:cNvPicPr>
                       <a:picLocks noChangeArrowheads="1" noChangeAspect="1"/>
                     </pic:cNvPicPr>
                   </pic:nvPicPr>
                   <pic:blipFill>
-                    <a:blip r:embed="rId35"/>
+                    <a:blip r:embed="rId34"/>
                     <a:stretch>
                       <a:fillRect/>
                     </a:stretch>
@@ -12762,8 +12692,8 @@
         <w:t xml:space="preserve">requirement, and orange bars neither.</w:t>
       </w:r>
     </w:p>
-    <w:bookmarkEnd w:id="38"/>
-    <w:bookmarkStart w:id="42" w:name="coverage-under-block-dependence"/>
+    <w:bookmarkEnd w:id="37"/>
+    <w:bookmarkStart w:id="41" w:name="coverage-under-block-dependence"/>
     <w:p>
       <w:pPr>
         <w:pStyle w:val="Heading2"/>
@@ -13931,18 +13861,18 @@
           <wp:inline>
             <wp:extent cx="5334000" cy="1679032"/>
             <wp:effectExtent b="0" l="0" r="0" t="0"/>
-            <wp:docPr descr="Fig. 5. Coverage minus nominal 1-\alpha for split conformal (B1, mean with 2.5–97.5% range across 200 block-level splits) and HCP (B12, mean), primary backbone. Shaded MIT-BIH levels lie below \alpha_{\min}=1/12, where HCP returns every label. Note the different vertical scales." title="" id="40" name="Picture"/>
+            <wp:docPr descr="Fig. 5. Coverage minus nominal 1-\alpha for split conformal (B1, mean with 2.5–97.5% range across 200 block-level splits) and HCP (B12, mean), primary backbone. Shaded MIT-BIH levels lie below \alpha_{\min}=1/12, where HCP returns every label. Note the different vertical scales." title="" id="39" name="Picture"/>
             <a:graphic>
               <a:graphicData uri="http://schemas.openxmlformats.org/drawingml/2006/picture">
                 <pic:pic>
                   <pic:nvPicPr>
-                    <pic:cNvPr descr="figures/fig5_coverage.png" id="41" name="Picture"/>
+                    <pic:cNvPr descr="figures/fig5_coverage.png" id="40" name="Picture"/>
                     <pic:cNvPicPr>
                       <a:picLocks noChangeArrowheads="1" noChangeAspect="1"/>
                     </pic:cNvPicPr>
                   </pic:nvPicPr>
                   <pic:blipFill>
-                    <a:blip r:embed="rId39"/>
+                    <a:blip r:embed="rId38"/>
                     <a:stretch>
                       <a:fillRect/>
                     </a:stretch>
@@ -14042,8 +13972,8 @@
         <w:t xml:space="preserve">, where HCP returns every label. Note the different vertical scales.</w:t>
       </w:r>
     </w:p>
-    <w:bookmarkEnd w:id="42"/>
-    <w:bookmarkStart w:id="46" w:name="X971afb3920367740875daf59080031d77744c88"/>
+    <w:bookmarkEnd w:id="41"/>
+    <w:bookmarkStart w:id="45" w:name="X971afb3920367740875daf59080031d77744c88"/>
     <w:p>
       <w:pPr>
         <w:pStyle w:val="Heading2"/>
@@ -15659,18 +15589,18 @@
           <wp:inline>
             <wp:extent cx="5334000" cy="1559365"/>
             <wp:effectExtent b="0" l="0" r="0" t="0"/>
-            <wp:docPr descr="Fig. 6. Attribution of the MIT-BIH deficit, primary backbone. (a) Effects of clustering, block-size imbalance and their interaction on B1 coverage in the 2×2 factorial design (Monte Carlo 95% interval over 400 splits; open markers include zero). (b) B12−B1 coverage gap on the original data and after permuting beats between records (bars: mean; whiskers: 2.5–97.5% range across splits). Percentages give the mechanical share, the permuted gap as a fraction of the original." title="" id="44" name="Picture"/>
+            <wp:docPr descr="Fig. 6. Attribution of the MIT-BIH deficit, primary backbone. (a) Effects of clustering, block-size imbalance and their interaction on B1 coverage in the 2×2 factorial design (Monte Carlo 95% interval over 400 splits; open markers include zero). (b) B12−B1 coverage gap on the original data and after permuting beats between records (bars: mean; whiskers: 2.5–97.5% range across splits). Percentages give the mechanical share, the permuted gap as a fraction of the original." title="" id="43" name="Picture"/>
             <a:graphic>
               <a:graphicData uri="http://schemas.openxmlformats.org/drawingml/2006/picture">
                 <pic:pic>
                   <pic:nvPicPr>
-                    <pic:cNvPr descr="figures/fig6_attribution.png" id="45" name="Picture"/>
+                    <pic:cNvPr descr="figures/fig6_attribution.png" id="44" name="Picture"/>
                     <pic:cNvPicPr>
                       <a:picLocks noChangeArrowheads="1" noChangeAspect="1"/>
                     </pic:cNvPicPr>
                   </pic:nvPicPr>
                   <pic:blipFill>
-                    <a:blip r:embed="rId43"/>
+                    <a:blip r:embed="rId42"/>
                     <a:stretch>
                       <a:fillRect/>
                     </a:stretch>
@@ -15706,8 +15636,8 @@
         <w:t xml:space="preserve">Fig. 6. Attribution of the MIT-BIH deficit, primary backbone. (a) Effects of clustering, block-size imbalance and their interaction on B1 coverage in the 2×2 factorial design (Monte Carlo 95% interval over 400 splits; open markers include zero). (b) B12−B1 coverage gap on the original data and after permuting beats between records (bars: mean; whiskers: 2.5–97.5% range across splits). Percentages give the mechanical share, the permuted gap as a fraction of the original.</w:t>
       </w:r>
     </w:p>
-    <w:bookmarkEnd w:id="46"/>
-    <w:bookmarkStart w:id="50" w:name="the-deficit-tracks-the-design-effect"/>
+    <w:bookmarkEnd w:id="45"/>
+    <w:bookmarkStart w:id="49" w:name="the-deficit-tracks-the-design-effect"/>
     <w:p>
       <w:pPr>
         <w:pStyle w:val="Heading2"/>
@@ -16596,18 +16526,18 @@
           <wp:inline>
             <wp:extent cx="3108960" cy="2277948"/>
             <wp:effectExtent b="0" l="0" r="0" t="0"/>
-            <wp:docPr descr="Fig. 7. B1 coverage deficit against the design effect. MIT-BIH points (blue) are obtained by randomly reassigning a growing fraction of beats to other records, with calibration records subsampled to a common size; PTB-XL (orange) is the observed patient partition with its Monte Carlo 95% interval. The annotation gives the Spearman correlation over the 12 points at \alpha=0.10, 0.15, 0.20." title="" id="48" name="Picture"/>
+            <wp:docPr descr="Fig. 7. B1 coverage deficit against the design effect. MIT-BIH points (blue) are obtained by randomly reassigning a growing fraction of beats to other records, with calibration records subsampled to a common size; PTB-XL (orange) is the observed patient partition with its Monte Carlo 95% interval. The annotation gives the Spearman correlation over the 12 points at \alpha=0.10, 0.15, 0.20." title="" id="47" name="Picture"/>
             <a:graphic>
               <a:graphicData uri="http://schemas.openxmlformats.org/drawingml/2006/picture">
                 <pic:pic>
                   <pic:nvPicPr>
-                    <pic:cNvPr descr="figures/fig7_dose_response.png" id="49" name="Picture"/>
+                    <pic:cNvPr descr="figures/fig7_dose_response.png" id="48" name="Picture"/>
                     <pic:cNvPicPr>
                       <a:picLocks noChangeArrowheads="1" noChangeAspect="1"/>
                     </pic:cNvPicPr>
                   </pic:nvPicPr>
                   <pic:blipFill>
-                    <a:blip r:embed="rId47"/>
+                    <a:blip r:embed="rId46"/>
                     <a:stretch>
                       <a:fillRect/>
                     </a:stretch>
@@ -16681,8 +16611,8 @@
         <w:t xml:space="preserve">.</w:t>
       </w:r>
     </w:p>
-    <w:bookmarkEnd w:id="50"/>
-    <w:bookmarkStart w:id="54" w:name="robustness-to-backbone-and-checkpoint"/>
+    <w:bookmarkEnd w:id="49"/>
+    <w:bookmarkStart w:id="53" w:name="robustness-to-backbone-and-checkpoint"/>
     <w:p>
       <w:pPr>
         <w:pStyle w:val="Heading2"/>
@@ -17393,18 +17323,18 @@
           <wp:inline>
             <wp:extent cx="5334000" cy="1775293"/>
             <wp:effectExtent b="0" l="0" r="0" t="0"/>
-            <wp:docPr descr="Fig. 8. Robustness of the audit. (a) MIT-BIH B1 coverage deficit against the matched permutation null, by backbone and \alpha: point estimate with Monte Carlo 95% interval over 200 splits of the 22 DS2 records (open markers include zero), and record-level 95% CI from the leave-one-record-out jackknife (light bars). (b) B1 coverage minus nominal under best-validation (horizontal) and last-epoch (vertical) weights for the two residual networks, 16 backbone×dataset×\alpha cells; shaded quadrants mark agreement in sign and the dotted line marks equality." title="" id="52" name="Picture"/>
+            <wp:docPr descr="Fig. 8. Robustness of the audit. (a) MIT-BIH B1 coverage deficit against the matched permutation null, by backbone and \alpha: point estimate with Monte Carlo 95% interval over 200 splits of the 22 DS2 records (open markers include zero), and record-level 95% CI from the leave-one-record-out jackknife (light bars). (b) B1 coverage minus nominal under best-validation (horizontal) and last-epoch (vertical) weights for the two residual networks, 16 backbone×dataset×\alpha cells; shaded quadrants mark agreement in sign and the dotted line marks equality." title="" id="51" name="Picture"/>
             <a:graphic>
               <a:graphicData uri="http://schemas.openxmlformats.org/drawingml/2006/picture">
                 <pic:pic>
                   <pic:nvPicPr>
-                    <pic:cNvPr descr="figures/fig8_robustness.png" id="53" name="Picture"/>
+                    <pic:cNvPr descr="figures/fig8_robustness.png" id="52" name="Picture"/>
                     <pic:cNvPicPr>
                       <a:picLocks noChangeArrowheads="1" noChangeAspect="1"/>
                     </pic:cNvPicPr>
                   </pic:nvPicPr>
                   <pic:blipFill>
-                    <a:blip r:embed="rId51"/>
+                    <a:blip r:embed="rId50"/>
                     <a:stretch>
                       <a:fillRect/>
                     </a:stretch>
@@ -17462,9 +17392,9 @@
         <w:t xml:space="preserve">cells; shaded quadrants mark agreement in sign and the dotted line marks equality.</w:t>
       </w:r>
     </w:p>
+    <w:bookmarkEnd w:id="53"/>
     <w:bookmarkEnd w:id="54"/>
-    <w:bookmarkEnd w:id="55"/>
-    <w:bookmarkStart w:id="60" w:name="discussion"/>
+    <w:bookmarkStart w:id="59" w:name="discussion"/>
     <w:p>
       <w:pPr>
         <w:pStyle w:val="Heading1"/>
@@ -17473,7 +17403,7 @@
         <w:t xml:space="preserve">6. Discussion</w:t>
       </w:r>
     </w:p>
-    <w:bookmarkStart w:id="56" w:name="main-findings"/>
+    <w:bookmarkStart w:id="55" w:name="main-findings"/>
     <w:p>
       <w:pPr>
         <w:pStyle w:val="Heading2"/>
@@ -17823,8 +17753,8 @@
         <w:t xml:space="preserve">coverage loss.</w:t>
       </w:r>
     </w:p>
-    <w:bookmarkEnd w:id="56"/>
-    <w:bookmarkStart w:id="57" w:name="X10a21a4c9ffce0be86017eff986db914a5bca64"/>
+    <w:bookmarkEnd w:id="55"/>
+    <w:bookmarkStart w:id="56" w:name="X10a21a4c9ffce0be86017eff986db914a5bca64"/>
     <w:p>
       <w:pPr>
         <w:pStyle w:val="Heading2"/>
@@ -18114,8 +18044,8 @@
         <w:t xml:space="preserve">that the sign of a coverage gap is not yet known.</w:t>
       </w:r>
     </w:p>
-    <w:bookmarkEnd w:id="57"/>
-    <w:bookmarkStart w:id="58" w:name="implications-and-relation-to-prior-work"/>
+    <w:bookmarkEnd w:id="56"/>
+    <w:bookmarkStart w:id="57" w:name="implications-and-relation-to-prior-work"/>
     <w:p>
       <w:pPr>
         <w:pStyle w:val="Heading2"/>
@@ -18144,7 +18074,7 @@
         <w:pStyle w:val="Compact"/>
         <w:numPr>
           <w:ilvl w:val="0"/>
-          <w:numId w:val="1003"/>
+          <w:numId w:val="1002"/>
         </w:numPr>
       </w:pPr>
       <w:r>
@@ -18174,7 +18104,7 @@
         <w:pStyle w:val="Compact"/>
         <w:numPr>
           <w:ilvl w:val="0"/>
-          <w:numId w:val="1003"/>
+          <w:numId w:val="1002"/>
         </w:numPr>
       </w:pPr>
       <w:r>
@@ -18233,7 +18163,7 @@
         <w:pStyle w:val="Compact"/>
         <w:numPr>
           <w:ilvl w:val="0"/>
-          <w:numId w:val="1003"/>
+          <w:numId w:val="1002"/>
         </w:numPr>
       </w:pPr>
       <w:r>
@@ -18315,7 +18245,7 @@
         <w:pStyle w:val="Compact"/>
         <w:numPr>
           <w:ilvl w:val="0"/>
-          <w:numId w:val="1003"/>
+          <w:numId w:val="1002"/>
         </w:numPr>
       </w:pPr>
       <w:r>
@@ -18511,8 +18441,8 @@
         <w:t xml:space="preserve">meet the same boundary is left open.</w:t>
       </w:r>
     </w:p>
-    <w:bookmarkEnd w:id="58"/>
-    <w:bookmarkStart w:id="59" w:name="limitations-and-threats-to-validity"/>
+    <w:bookmarkEnd w:id="57"/>
+    <w:bookmarkStart w:id="58" w:name="limitations-and-threats-to-validity"/>
     <w:p>
       <w:pPr>
         <w:pStyle w:val="Heading2"/>
@@ -19565,9 +19495,9 @@
         <w:t xml:space="preserve">formally frozen; it is released with its deviation log.</w:t>
       </w:r>
     </w:p>
+    <w:bookmarkEnd w:id="58"/>
     <w:bookmarkEnd w:id="59"/>
-    <w:bookmarkEnd w:id="60"/>
-    <w:bookmarkStart w:id="61" w:name="conclusion"/>
+    <w:bookmarkStart w:id="60" w:name="conclusion"/>
     <w:p>
       <w:pPr>
         <w:pStyle w:val="Heading1"/>
@@ -19681,8 +19611,8 @@
         <w:t xml:space="preserve">face the same boundary is an open question.</w:t>
       </w:r>
     </w:p>
-    <w:bookmarkEnd w:id="61"/>
-    <w:bookmarkStart w:id="62" w:name="data-and-code-availability"/>
+    <w:bookmarkEnd w:id="60"/>
+    <w:bookmarkStart w:id="61" w:name="data-and-code-availability"/>
     <w:p>
       <w:pPr>
         <w:pStyle w:val="Heading1"/>
@@ -19709,35 +19639,50 @@
         <w:t xml:space="preserve"> </w:t>
       </w:r>
       <w:r>
-        <w:t xml:space="preserve">available from PhysioNet under their respective licences. The code, the analysis</w:t>
-      </w:r>
-      <w:r>
-        <w:t xml:space="preserve"> </w:t>
-      </w:r>
-      <w:r>
-        <w:t xml:space="preserve">protocol with its deviation log, and the JSON artifact behind every reported</w:t>
-      </w:r>
-      <w:r>
-        <w:t xml:space="preserve"> </w:t>
-      </w:r>
-      <w:r>
-        <w:t xml:space="preserve">number will be archived under a persistent identifier before publication</w:t>
-      </w:r>
-      <w:r>
-        <w:t xml:space="preserve"> </w:t>
-      </w:r>
-      <w:r>
-        <w:t xml:space="preserve">[identifier to be inserted].</w:t>
+        <w:t xml:space="preserve">available from PhysioNet under their respective licences; all recordings are</w:t>
+      </w:r>
+      <w:r>
+        <w:t xml:space="preserve"> </w:t>
+      </w:r>
+      <w:r>
+        <w:t xml:space="preserve">de-identified, and no new data were collected for this study. The code, the</w:t>
+      </w:r>
+      <w:r>
+        <w:t xml:space="preserve"> </w:t>
+      </w:r>
+      <w:r>
+        <w:t xml:space="preserve">analysis protocol with its deviation log, and the JSON artifact behind every</w:t>
+      </w:r>
+      <w:r>
+        <w:t xml:space="preserve"> </w:t>
+      </w:r>
+      <w:r>
+        <w:t xml:space="preserve">reported number will be archived under a persistent identifier before</w:t>
+      </w:r>
+      <w:r>
+        <w:t xml:space="preserve"> </w:t>
+      </w:r>
+      <w:r>
+        <w:t xml:space="preserve">publication.</w:t>
       </w:r>
     </w:p>
-    <w:bookmarkEnd w:id="62"/>
-    <w:bookmarkStart w:id="63" w:name="ethics-statement"/>
+    <w:bookmarkEnd w:id="61"/>
+    <w:bookmarkStart w:id="65" w:name="appendix-a.-supplementary-derivations"/>
     <w:p>
       <w:pPr>
         <w:pStyle w:val="Heading1"/>
       </w:pPr>
       <w:r>
-        <w:t xml:space="preserve">Ethics Statement</w:t>
+        <w:t xml:space="preserve">Appendix A. Supplementary Derivations</w:t>
+      </w:r>
+    </w:p>
+    <w:bookmarkStart w:id="62" w:name="a.1-the-boundary-case-of-proposition-1"/>
+    <w:p>
+      <w:pPr>
+        <w:pStyle w:val="Heading2"/>
+      </w:pPr>
+      <w:r>
+        <w:t xml:space="preserve">A.1 The boundary case of Proposition 1</w:t>
       </w:r>
     </w:p>
     <w:p>
@@ -19746,143 +19691,6 @@
         <w:jc w:val="both"/>
       </w:pPr>
       <w:r>
-        <w:t xml:space="preserve">This study is a secondary analysis of publicly available, de-identified</w:t>
-      </w:r>
-      <w:r>
-        <w:t xml:space="preserve"> </w:t>
-      </w:r>
-      <w:r>
-        <w:t xml:space="preserve">recordings; no new data were collected and no participant was contacted.</w:t>
-      </w:r>
-      <w:r>
-        <w:t xml:space="preserve"> </w:t>
-      </w:r>
-      <w:r>
-        <w:t xml:space="preserve">[Institutional statement on the need for ethics review to be added by the</w:t>
-      </w:r>
-      <w:r>
-        <w:t xml:space="preserve"> </w:t>
-      </w:r>
-      <w:r>
-        <w:t xml:space="preserve">authors.]</w:t>
-      </w:r>
-    </w:p>
-    <w:bookmarkEnd w:id="63"/>
-    <w:bookmarkStart w:id="64" w:name="credit-authorship-contribution-statement"/>
-    <w:p>
-      <w:pPr>
-        <w:pStyle w:val="Heading1"/>
-      </w:pPr>
-      <w:r>
-        <w:t xml:space="preserve">CRediT Authorship Contribution Statement</w:t>
-      </w:r>
-    </w:p>
-    <w:p>
-      <w:pPr>
-        <w:pStyle w:val="FirstParagraph"/>
-      </w:pPr>
-      <w:r>
-        <w:t xml:space="preserve">[To be completed by the authors using the CRediT taxonomy.]</w:t>
-      </w:r>
-    </w:p>
-    <w:bookmarkEnd w:id="64"/>
-    <w:bookmarkStart w:id="65" w:name="declaration-of-competing-interest"/>
-    <w:p>
-      <w:pPr>
-        <w:pStyle w:val="Heading1"/>
-      </w:pPr>
-      <w:r>
-        <w:t xml:space="preserve">Declaration of Competing Interest</w:t>
-      </w:r>
-    </w:p>
-    <w:p>
-      <w:pPr>
-        <w:pStyle w:val="FirstParagraph"/>
-      </w:pPr>
-      <w:r>
-        <w:t xml:space="preserve">[To be completed by the authors.]</w:t>
-      </w:r>
-    </w:p>
-    <w:bookmarkEnd w:id="65"/>
-    <w:bookmarkStart w:id="66" w:name="funding"/>
-    <w:p>
-      <w:pPr>
-        <w:pStyle w:val="Heading1"/>
-      </w:pPr>
-      <w:r>
-        <w:t xml:space="preserve">Funding</w:t>
-      </w:r>
-    </w:p>
-    <w:p>
-      <w:pPr>
-        <w:pStyle w:val="FirstParagraph"/>
-      </w:pPr>
-      <w:r>
-        <w:t xml:space="preserve">[To be completed by the authors.]</w:t>
-      </w:r>
-    </w:p>
-    <w:bookmarkEnd w:id="66"/>
-    <w:bookmarkStart w:id="67" w:name="X071796dd6bc546c91e96cca1cf5ff96599de61f"/>
-    <w:p>
-      <w:pPr>
-        <w:pStyle w:val="Heading1"/>
-      </w:pPr>
-      <w:r>
-        <w:t xml:space="preserve">Declaration of Generative AI and AI-Assisted Technologies in the Writing Process</w:t>
-      </w:r>
-    </w:p>
-    <w:p>
-      <w:pPr>
-        <w:pStyle w:val="FirstParagraph"/>
-        <w:jc w:val="both"/>
-      </w:pPr>
-      <w:r>
-        <w:t xml:space="preserve">During the preparation of this work the author(s) used [name of tool or</w:t>
-      </w:r>
-      <w:r>
-        <w:t xml:space="preserve"> </w:t>
-      </w:r>
-      <w:r>
-        <w:t xml:space="preserve">service] in order to [purpose]. After using this tool or service, the author(s)</w:t>
-      </w:r>
-      <w:r>
-        <w:t xml:space="preserve"> </w:t>
-      </w:r>
-      <w:r>
-        <w:t xml:space="preserve">reviewed and edited the content as needed and take(s) full responsibility for</w:t>
-      </w:r>
-      <w:r>
-        <w:t xml:space="preserve"> </w:t>
-      </w:r>
-      <w:r>
-        <w:t xml:space="preserve">the content of the publication.</w:t>
-      </w:r>
-    </w:p>
-    <w:bookmarkEnd w:id="67"/>
-    <w:bookmarkStart w:id="71" w:name="appendix-a.-supplementary-derivations"/>
-    <w:p>
-      <w:pPr>
-        <w:pStyle w:val="Heading1"/>
-      </w:pPr>
-      <w:r>
-        <w:t xml:space="preserve">Appendix A. Supplementary Derivations</w:t>
-      </w:r>
-    </w:p>
-    <w:bookmarkStart w:id="68" w:name="a.1-the-boundary-case-of-proposition-1"/>
-    <w:p>
-      <w:pPr>
-        <w:pStyle w:val="Heading2"/>
-      </w:pPr>
-      <w:r>
-        <w:t xml:space="preserve">A.1 The boundary case of Proposition 1</w:t>
-      </w:r>
-    </w:p>
-    <w:p>
-      <w:pPr>
-        <w:pStyle w:val="FirstParagraph"/>
-        <w:jc w:val="both"/>
-      </w:pPr>
-      <w:r>
         <w:t xml:space="preserve">An earlier version of this work wrote (3) as a strict inequality, which fails at</w:t>
       </w:r>
       <w:r>
@@ -20163,8 +19971,8 @@
         <w:t xml:space="preserve">.</w:t>
       </w:r>
     </w:p>
-    <w:bookmarkEnd w:id="68"/>
-    <w:bookmarkStart w:id="69" w:name="a.2-variance-under-compound-symmetry"/>
+    <w:bookmarkEnd w:id="62"/>
+    <w:bookmarkStart w:id="63" w:name="a.2-variance-under-compound-symmetry"/>
     <w:p>
       <w:pPr>
         <w:pStyle w:val="Heading2"/>
@@ -20652,8 +20460,8 @@
         <w:t xml:space="preserve">vanishes. We make no claim outside (A).</w:t>
       </w:r>
     </w:p>
-    <w:bookmarkEnd w:id="69"/>
-    <w:bookmarkStart w:id="70" w:name="a.3-equal-weighting-in-hcp"/>
+    <w:bookmarkEnd w:id="63"/>
+    <w:bookmarkStart w:id="64" w:name="a.3-equal-weighting-in-hcp"/>
     <w:p>
       <w:pPr>
         <w:pStyle w:val="Heading2"/>
@@ -21168,9 +20976,9 @@
         <w:t xml:space="preserve">.</w:t>
       </w:r>
     </w:p>
-    <w:bookmarkEnd w:id="70"/>
-    <w:bookmarkEnd w:id="71"/>
-    <w:bookmarkStart w:id="72" w:name="X06db9a02045705c8b7d21c68ec78218971b4832"/>
+    <w:bookmarkEnd w:id="64"/>
+    <w:bookmarkEnd w:id="65"/>
+    <w:bookmarkStart w:id="66" w:name="X06db9a02045705c8b7d21c68ec78218971b4832"/>
     <w:p>
       <w:pPr>
         <w:pStyle w:val="Heading1"/>
@@ -21604,8 +21412,8 @@
         </w:tc>
       </w:tr>
     </w:tbl>
-    <w:bookmarkEnd w:id="72"/>
-    <w:bookmarkStart w:id="73" w:name="Xbf53aa51c2c3289f595a160de988653028afcc2"/>
+    <w:bookmarkEnd w:id="66"/>
+    <w:bookmarkStart w:id="67" w:name="Xbf53aa51c2c3289f595a160de988653028afcc2"/>
     <w:p>
       <w:pPr>
         <w:pStyle w:val="Heading1"/>
@@ -21913,8 +21721,8 @@
         <w:t xml:space="preserve">headers) out of a 12.6 GB dataset, before any preprocessing or training.</w:t>
       </w:r>
     </w:p>
-    <w:bookmarkEnd w:id="73"/>
-    <w:bookmarkStart w:id="74" w:name="references"/>
+    <w:bookmarkEnd w:id="67"/>
+    <w:bookmarkStart w:id="68" w:name="references"/>
     <w:p>
       <w:pPr>
         <w:pStyle w:val="Heading1"/>
@@ -23621,7 +23429,7 @@
         <w:t>T. Bender et al., “Analysis of a Deep Learning Model for 12-Lead ECG Classification Reveals Learned Features Similar to Diagnostic Criteria,” IEEE J. Biomed. Health Inform., vol. 28, no. 4, pp. 1848–1859, Apr. 2024, doi: 10.1109/jbhi.2023.3271858.</w:t>
       </w:r>
     </w:p>
-    <w:bookmarkEnd w:id="74"/>
+    <w:bookmarkEnd w:id="68"/>
     <w:sectPr>
       <w:footnotePr>
         <w:numRestart w:val="eachSect"/>
@@ -23928,9 +23736,6 @@
     <w:abstractNumId w:val="991"/>
   </w:num>
   <w:num w:numId="1002">
-    <w:abstractNumId w:val="991"/>
-  </w:num>
-  <w:num w:numId="1003">
     <w:abstractNumId w:val="99411"/>
     <w:lvlOverride w:ilvl="0">
       <w:startOverride w:val="1"/>

</xml_diff>

<commit_message>
Rujukan 47 -> 35 dan caption dipadatkan (arahan dosen); 19 halaman
Dibuang 12 rujukan pinggiran yang dikutip sekali: A2, B3, B5, B6, B7 (preprint), C2, D2, D4, E2, E3, F5, F6; kalimat terkait ditulis ulang agar tidak ada klaim tanpa sumber. Dipertahankan: teori inti (A0, A0b), dataset H1-H5, pembanding terdekat E6-E9, atribusi teori P1, P2, I1, I2, A9, A12. Caption 18 gambar/tabel 694 -> 434 kata; legenda simbol, jenis interval dan jumlah split tetap. Verifikasi: nomor rujukan 1-35 berurutan, 35 entri pustaka, tidak ada kode sitasi tersisa, rujukan Tabel 1-9 valid, narasi sebelum setiap float lolos.
</commit_message>
<xml_diff>
--- a/docs/paper/manuscript-draft.docx
+++ b/docs/paper/manuscript-draft.docx
@@ -20,7 +20,7 @@
           <w:i/>
           <w:iCs/>
         </w:rPr>
-        <w:t xml:space="preserve">Working draft for internal review — generated 2026-10-03 from commit 17f8901.</w:t>
+        <w:t xml:space="preserve">Working draft for internal review — generated 2026-10-03 from commit 8ce38ae.</w:t>
       </w:r>
     </w:p>
     <w:bookmarkStart w:id="9" w:name="abstract"/>
@@ -199,19 +199,19 @@
         <w:t xml:space="preserve"> </w:t>
       </w:r>
       <w:r>
-        <w:t xml:space="preserve">across clinical domains [6]–[7] and, for cardiac signals, to calibrate</w:t>
-      </w:r>
-      <w:r>
-        <w:t xml:space="preserve"> </w:t>
-      </w:r>
-      <w:r>
-        <w:t xml:space="preserve">quantized models [8], adapt inference on wearables [9], expose class- and</w:t>
-      </w:r>
-      <w:r>
-        <w:t xml:space="preserve"> </w:t>
-      </w:r>
-      <w:r>
-        <w:t xml:space="preserve">patient-level failures [10] and bound false alarms in monitoring [11]. All of</w:t>
+        <w:t xml:space="preserve">across clinical domains [6] and, for cardiac signals, to calibrate</w:t>
+      </w:r>
+      <w:r>
+        <w:t xml:space="preserve"> </w:t>
+      </w:r>
+      <w:r>
+        <w:t xml:space="preserve">quantized models [7], adapt inference on wearables [8], expose class- and</w:t>
+      </w:r>
+      <w:r>
+        <w:t xml:space="preserve"> </w:t>
+      </w:r>
+      <w:r>
+        <w:t xml:space="preserve">patient-level failures [9] and bound false alarms in monitoring [10]. All of</w:t>
       </w:r>
       <w:r>
         <w:t xml:space="preserve"> </w:t>
@@ -223,7 +223,7 @@
         <w:t xml:space="preserve"> </w:t>
       </w:r>
       <w:r>
-        <w:t xml:space="preserve">without that assumption only a generic bound on the coverage gap survives [12].</w:t>
+        <w:t xml:space="preserve">without that assumption only a generic bound on the coverage gap survives [11].</w:t>
       </w:r>
     </w:p>
     <w:p>
@@ -262,7 +262,7 @@
         <w:t xml:space="preserve"> </w:t>
       </w:r>
       <w:r>
-        <w:t xml:space="preserve">[13]; Dunn et al. developed related two-layer constructions [14]. Because HCP</w:t>
+        <w:t xml:space="preserve">[12]; Dunn et al. developed related two-layer constructions [13]. Because HCP</w:t>
       </w:r>
       <w:r>
         <w:t xml:space="preserve"> </w:t>
@@ -405,7 +405,7 @@
         <w:t xml:space="preserve"> </w:t>
       </w:r>
       <w:r>
-        <w:t xml:space="preserve">between many small and few large groups open as a design question [13], and Sim</w:t>
+        <w:t xml:space="preserve">between many small and few large groups open as a design question [12], and Sim</w:t>
       </w:r>
       <w:r>
         <w:t xml:space="preserve"> </w:t>
@@ -417,7 +417,7 @@
         <w:t xml:space="preserve"> </w:t>
       </w:r>
       <w:r>
-        <w:t xml:space="preserve">conformal prediction scales with subjects, not beats [11].</w:t>
+        <w:t xml:space="preserve">conformal prediction scales with subjects, not beats [10].</w:t>
       </w:r>
     </w:p>
     <w:p>
@@ -444,7 +444,7 @@
         <w:t xml:space="preserve"> </w:t>
       </w:r>
       <w:r>
-        <w:t xml:space="preserve">question by auditing three public ECG resources: PTB-XL [2], [15], in which</w:t>
+        <w:t xml:space="preserve">question by auditing three public ECG resources: PTB-XL [2], [14], in which</w:t>
       </w:r>
       <w:r>
         <w:t xml:space="preserve"> </w:t>
@@ -456,13 +456,13 @@
         <w:t xml:space="preserve"> </w:t>
       </w:r>
       <w:r>
-        <w:t xml:space="preserve">Database [16], in which each of 44 subjects contributes more than 1,500 beats;</w:t>
-      </w:r>
-      <w:r>
-        <w:t xml:space="preserve"> </w:t>
-      </w:r>
-      <w:r>
-        <w:t xml:space="preserve">and the PhysioNet/CinC Challenge 2021 collection [17], which does not document a</w:t>
+        <w:t xml:space="preserve">Database [15], in which each of 44 subjects contributes more than 1,500 beats;</w:t>
+      </w:r>
+      <w:r>
+        <w:t xml:space="preserve"> </w:t>
+      </w:r>
+      <w:r>
+        <w:t xml:space="preserve">and the PhysioNet/CinC Challenge 2021 collection [16], which does not document a</w:t>
       </w:r>
       <w:r>
         <w:t xml:space="preserve"> </w:t>
@@ -505,7 +505,7 @@
           <wp:inline>
             <wp:extent cx="5303520" cy="3723951"/>
             <wp:effectExtent b="0" l="0" r="0" t="0"/>
-            <wp:docPr descr="Fig. 1. Audit workflow. Stage 1 (blue header) uses metadata only and returns verdicts that are exact given the declared dependence sources D, before any model is trained (RQ1; §3, §5.1). Stage 2 (orange headers) uses conformity scores from three backbones, at feasible levels only, to compare naive split conformal (B1) with HCP (B12), attribute the B1 deficit to dependence, relate it to the design effect, separate split-level from subject-level uncertainty and check robustness (RQ2; §5.2–§5.5)." title="" id="11" name="Picture"/>
+            <wp:docPr descr="Fig. 1. Audit workflow. Stage 1 (blue header) uses metadata only and gives verdicts exact given the declared sources D (RQ1); Stage 2 (orange headers) uses conformity scores from three backbones at feasible levels only (RQ2). Section numbers mark where each step is reported." title="" id="11" name="Picture"/>
             <a:graphic>
               <a:graphicData uri="http://schemas.openxmlformats.org/drawingml/2006/picture">
                 <pic:pic>
@@ -549,7 +549,7 @@
         <w:jc w:val="both"/>
       </w:pPr>
       <w:r>
-        <w:t xml:space="preserve">Fig. 1. Audit workflow. Stage 1 (blue header) uses metadata only and returns verdicts that are exact given the declared dependence sources</w:t>
+        <w:t xml:space="preserve">Fig. 1. Audit workflow. Stage 1 (blue header) uses metadata only and gives verdicts exact given the declared sources</w:t>
       </w:r>
       <w:r>
         <w:t xml:space="preserve"> </w:t>
@@ -560,7 +560,10 @@
         </m:r>
       </m:oMath>
       <w:r>
-        <w:t xml:space="preserve">, before any model is trained (RQ1; §3, §5.1). Stage 2 (orange headers) uses conformity scores from three backbones, at feasible levels only, to compare naive split conformal (B1) with HCP (B12), attribute the B1 deficit to dependence, relate it to the design effect, separate split-level from subject-level uncertainty and check robustness (RQ2; §5.2–§5.5).</w:t>
+        <w:t xml:space="preserve"> </w:t>
+      </w:r>
+      <w:r>
+        <w:t xml:space="preserve">(RQ1); Stage 2 (orange headers) uses conformity scores from three backbones at feasible levels only (RQ2). Section numbers mark where each step is reported.</w:t>
       </w:r>
     </w:p>
     <w:p>
@@ -814,7 +817,7 @@
         <w:t xml:space="preserve"> </w:t>
       </w:r>
       <w:r>
-        <w:t xml:space="preserve">total-variation distance to an exchangeable counterpart [12]; the bound is</w:t>
+        <w:t xml:space="preserve">total-variation distance to an exchangeable counterpart [11]; the bound is</w:t>
       </w:r>
       <w:r>
         <w:t xml:space="preserve"> </w:t>
@@ -832,13 +835,13 @@
         <w:t xml:space="preserve"> </w:t>
       </w:r>
       <w:r>
-        <w:t xml:space="preserve">ratios [18], spatial data [19] and network dependence [20]. Bhattacharyya and Barber consider</w:t>
-      </w:r>
-      <w:r>
-        <w:t xml:space="preserve"> </w:t>
-      </w:r>
-      <w:r>
-        <w:t xml:space="preserve">groups whose membership drives the shift [21], so exchangeability still holds</w:t>
+        <w:t xml:space="preserve">ratios [17], spatial data [18] and network dependence [19]. Bhattacharyya and Barber consider</w:t>
+      </w:r>
+      <w:r>
+        <w:t xml:space="preserve"> </w:t>
+      </w:r>
+      <w:r>
+        <w:t xml:space="preserve">groups whose membership drives the shift [20], so exchangeability still holds</w:t>
       </w:r>
       <w:r>
         <w:t xml:space="preserve"> </w:t>
@@ -856,13 +859,7 @@
         <w:t xml:space="preserve"> </w:t>
       </w:r>
       <w:r>
-        <w:t xml:space="preserve">and its variants, Mondrian conformal prediction included [5], and calibrated</w:t>
-      </w:r>
-      <w:r>
-        <w:t xml:space="preserve"> </w:t>
-      </w:r>
-      <w:r>
-        <w:t xml:space="preserve">Mondrian versions have followed [22].</w:t>
+        <w:t xml:space="preserve">and its variants, Mondrian conformal prediction included [5].</w:t>
       </w:r>
     </w:p>
     <w:p>
@@ -877,7 +874,7 @@
         <w:t xml:space="preserve"> </w:t>
       </w:r>
       <w:r>
-        <w:t xml:space="preserve">extended conformal prediction and the jackknife+ [23] to it [13]; (1) and (2)</w:t>
+        <w:t xml:space="preserve">extended conformal prediction to it [12]; (1) and (2)</w:t>
       </w:r>
       <w:r>
         <w:t xml:space="preserve"> </w:t>
@@ -889,13 +886,13 @@
         <w:t xml:space="preserve"> </w:t>
       </w:r>
       <w:r>
-        <w:t xml:space="preserve">constructions were developed independently by Dunn et al. [14]. We take these results as</w:t>
-      </w:r>
-      <w:r>
-        <w:t xml:space="preserve"> </w:t>
-      </w:r>
-      <w:r>
-        <w:t xml:space="preserve">given. Both lines of work are theoretical and evaluated on regression, [13] on</w:t>
+        <w:t xml:space="preserve">constructions were developed independently by Dunn et al. [13]. We take these results as</w:t>
+      </w:r>
+      <w:r>
+        <w:t xml:space="preserve"> </w:t>
+      </w:r>
+      <w:r>
+        <w:t xml:space="preserve">given. Both lines of work are theoretical and evaluated on regression, [12] on</w:t>
       </w:r>
       <w:r>
         <w:t xml:space="preserve"> </w:t>
@@ -969,7 +966,7 @@
         <w:t xml:space="preserve"> </w:t>
       </w:r>
       <w:r>
-        <w:t xml:space="preserve">[13]. We take up its most elementary part, whether a</w:t>
+        <w:t xml:space="preserve">[12]. We take up its most elementary part, whether a</w:t>
       </w:r>
       <w:r>
         <w:t xml:space="preserve"> </w:t>
@@ -1000,55 +997,31 @@
         <w:jc w:val="both"/>
       </w:pPr>
       <w:r>
-        <w:t xml:space="preserve">Multi-label conformal methods, surveyed by Papadopoulos [24], model dependence</w:t>
-      </w:r>
-      <w:r>
-        <w:t xml:space="preserve"> </w:t>
-      </w:r>
-      <w:r>
-        <w:t xml:space="preserve">among labels but assume exchangeable samples, the converse of our need. Pruning</w:t>
-      </w:r>
-      <w:r>
-        <w:t xml:space="preserve"> </w:t>
-      </w:r>
-      <w:r>
-        <w:t xml:space="preserve">makes Label Powerset conformal prediction cheaper [25], and hierarchical</w:t>
-      </w:r>
-      <w:r>
-        <w:t xml:space="preserve"> </w:t>
-      </w:r>
-      <w:r>
-        <w:t xml:space="preserve">multi-label classification without conformal guarantees is well developed [26],</w:t>
-      </w:r>
-      <w:r>
-        <w:t xml:space="preserve"> </w:t>
-      </w:r>
-      <w:r>
-        <w:t xml:space="preserve">[27]. Baheri and Shahbazi calibrate at several</w:t>
-      </w:r>
-      <w:r>
-        <w:t xml:space="preserve"> </w:t>
-      </w:r>
-      <w:r>
-        <w:t xml:space="preserve">levels of a label hierarchy and intersect the sets [28], and Zhang et al. encode</w:t>
-      </w:r>
-      <w:r>
-        <w:t xml:space="preserve"> </w:t>
-      </w:r>
-      <w:r>
-        <w:t xml:space="preserve">prediction sets as nodes of a label graph [29]. Both exploit structure</w:t>
-      </w:r>
-      <w:r>
-        <w:t xml:space="preserve"> </w:t>
-      </w:r>
-      <w:r>
-        <w:t xml:space="preserve">among labels; here the hierarchy only serves to count calibration blocks per</w:t>
-      </w:r>
-      <w:r>
-        <w:t xml:space="preserve"> </w:t>
-      </w:r>
-      <w:r>
-        <w:t xml:space="preserve">label (§3.4).</w:t>
+        <w:t xml:space="preserve">Multi-label conformal methods, surveyed by Papadopoulos [21], model dependence</w:t>
+      </w:r>
+      <w:r>
+        <w:t xml:space="preserve"> </w:t>
+      </w:r>
+      <w:r>
+        <w:t xml:space="preserve">among labels but assume exchangeable samples, the converse of our need. Baheri</w:t>
+      </w:r>
+      <w:r>
+        <w:t xml:space="preserve"> </w:t>
+      </w:r>
+      <w:r>
+        <w:t xml:space="preserve">and Shahbazi calibrate at several levels of a label hierarchy and intersect the</w:t>
+      </w:r>
+      <w:r>
+        <w:t xml:space="preserve"> </w:t>
+      </w:r>
+      <w:r>
+        <w:t xml:space="preserve">sets [22], exploiting structure among labels; here the hierarchy only serves to</w:t>
+      </w:r>
+      <w:r>
+        <w:t xml:space="preserve"> </w:t>
+      </w:r>
+      <w:r>
+        <w:t xml:space="preserve">count calibration blocks per label (§3.4).</w:t>
       </w:r>
     </w:p>
     <w:p>
@@ -1057,7 +1030,7 @@
         <w:jc w:val="both"/>
       </w:pPr>
       <w:r>
-        <w:t xml:space="preserve">Strodthoff et al. set the PTB-XL benchmarks [1] for the dataset of [2], [15],</w:t>
+        <w:t xml:space="preserve">Strodthoff et al. set the PTB-XL benchmarks [1] for the dataset of [2], [14],</w:t>
       </w:r>
       <w:r>
         <w:t xml:space="preserve"> </w:t>
@@ -1075,37 +1048,25 @@
         <w:t xml:space="preserve"> </w:t>
       </w:r>
       <w:r>
-        <w:t xml:space="preserve">training and evaluation [30], [31], since mixing them inflates reported</w:t>
-      </w:r>
-      <w:r>
-        <w:t xml:space="preserve"> </w:t>
-      </w:r>
-      <w:r>
-        <w:t xml:space="preserve">performance [32]. For clinical medicine, a survey of conformal prediction is</w:t>
-      </w:r>
-      <w:r>
-        <w:t xml:space="preserve"> </w:t>
-      </w:r>
-      <w:r>
-        <w:t xml:space="preserve">available [6], alongside applications to anatomical landmarks [33] and</w:t>
-      </w:r>
-      <w:r>
-        <w:t xml:space="preserve"> </w:t>
-      </w:r>
-      <w:r>
-        <w:t xml:space="preserve">multi-label diagnosis coding [7]; conformal risk control [34] and time-series</w:t>
-      </w:r>
-      <w:r>
-        <w:t xml:space="preserve"> </w:t>
-      </w:r>
-      <w:r>
-        <w:t xml:space="preserve">conformal prediction [35] extend the framework to arbitrary losses and temporal</w:t>
-      </w:r>
-      <w:r>
-        <w:t xml:space="preserve"> </w:t>
-      </w:r>
-      <w:r>
-        <w:t xml:space="preserve">data.</w:t>
+        <w:t xml:space="preserve">training and evaluation [23], [24], since mixing them inflates reported</w:t>
+      </w:r>
+      <w:r>
+        <w:t xml:space="preserve"> </w:t>
+      </w:r>
+      <w:r>
+        <w:t xml:space="preserve">performance [25]. Clinical uses of conformal prediction are surveyed in [6], and</w:t>
+      </w:r>
+      <w:r>
+        <w:t xml:space="preserve"> </w:t>
+      </w:r>
+      <w:r>
+        <w:t xml:space="preserve">conformal risk control [26] and time-series conformal prediction [27] extend the</w:t>
+      </w:r>
+      <w:r>
+        <w:t xml:space="preserve"> </w:t>
+      </w:r>
+      <w:r>
+        <w:t xml:space="preserve">framework to arbitrary losses and temporal data.</w:t>
       </w:r>
     </w:p>
     <w:p>
@@ -1126,19 +1087,19 @@
         <w:t xml:space="preserve"> </w:t>
       </w:r>
       <w:r>
-        <w:t xml:space="preserve">and find that it must be redone for the quantized model actually deployed [8];</w:t>
-      </w:r>
-      <w:r>
-        <w:t xml:space="preserve"> </w:t>
-      </w:r>
-      <w:r>
-        <w:t xml:space="preserve">they also bring conformal inference to wearables at the edge [9]. For PPG-based arrhythmia classification in intensive care, Kinalioğlu finds</w:t>
-      </w:r>
-      <w:r>
-        <w:t xml:space="preserve"> </w:t>
-      </w:r>
-      <w:r>
-        <w:t xml:space="preserve">that marginal coverage can hide class- and patient-level failures [10]. Closest to</w:t>
+        <w:t xml:space="preserve">and find that it must be redone for the quantized model actually deployed [7];</w:t>
+      </w:r>
+      <w:r>
+        <w:t xml:space="preserve"> </w:t>
+      </w:r>
+      <w:r>
+        <w:t xml:space="preserve">they also bring conformal inference to wearables at the edge [8]. For PPG-based arrhythmia classification in intensive care, Kinalioğlu finds</w:t>
+      </w:r>
+      <w:r>
+        <w:t xml:space="preserve"> </w:t>
+      </w:r>
+      <w:r>
+        <w:t xml:space="preserve">that marginal coverage can hide class- and patient-level failures [9]. Closest to</w:t>
       </w:r>
       <w:r>
         <w:t xml:space="preserve"> </w:t>
@@ -1162,13 +1123,13 @@
         <w:t xml:space="preserve"> </w:t>
       </w:r>
       <w:r>
-        <w:t xml:space="preserve">rate [11]. Beyond cardiology, calibration that respects groups has been used for</w:t>
-      </w:r>
-      <w:r>
-        <w:t xml:space="preserve"> </w:t>
-      </w:r>
-      <w:r>
-        <w:t xml:space="preserve">patients nested in thousands of hospitals [36].</w:t>
+        <w:t xml:space="preserve">rate [10]. Beyond cardiology, calibration that respects groups has been used for</w:t>
+      </w:r>
+      <w:r>
+        <w:t xml:space="preserve"> </w:t>
+      </w:r>
+      <w:r>
+        <w:t xml:space="preserve">patients nested in thousands of hospitals [28].</w:t>
       </w:r>
     </w:p>
     <w:p>
@@ -1231,7 +1192,7 @@
         <w:jc w:val="both"/>
       </w:pPr>
       <w:r>
-        <w:t xml:space="preserve">Section 3.1 restates the notation of Lee et al. [13]; §3.2–§3.4 derive three</w:t>
+        <w:t xml:space="preserve">Section 3.1 restates the notation of Lee et al. [12]; §3.2–§3.4 derive three</w:t>
       </w:r>
       <w:r>
         <w:t xml:space="preserve"> </w:t>
@@ -1484,7 +1445,7 @@
         <w:t xml:space="preserve"> </w:t>
       </w:r>
       <w:r>
-        <w:t xml:space="preserve">Nesting breaks ordinary exchangeability, and Lee et al. [13] replace it with</w:t>
+        <w:t xml:space="preserve">Nesting breaks ordinary exchangeability, and Lee et al. [12] replace it with</w:t>
       </w:r>
       <w:r>
         <w:t xml:space="preserve"> </w:t>
@@ -2291,7 +2252,7 @@
         <w:t xml:space="preserve"> </w:t>
       </w:r>
       <w:r>
-        <w:t xml:space="preserve">[13, Th. 1] establish</w:t>
+        <w:t xml:space="preserve">[12, Th. 1] establish</w:t>
       </w:r>
     </w:p>
     <w:p>
@@ -3381,7 +3342,7 @@
         <w:t xml:space="preserve"> </w:t>
       </w:r>
       <w:r>
-        <w:t xml:space="preserve">of [13] in a form checkable from metadata, and we claim nothing more. Three</w:t>
+        <w:t xml:space="preserve">of [12] in a form checkable from metadata, and we claim nothing more. Three</w:t>
       </w:r>
       <w:r>
         <w:t xml:space="preserve"> </w:t>
@@ -3906,7 +3867,7 @@
         <w:t xml:space="preserve"> </w:t>
       </w:r>
       <w:r>
-        <w:t xml:space="preserve">expression for an unweighted mean of cluster means [37],</w:t>
+        <w:t xml:space="preserve">expression for an unweighted mean of cluster means [29],</w:t>
       </w:r>
       <w:r>
         <w:t xml:space="preserve"> </w:t>
@@ -4476,7 +4437,7 @@
         <w:t xml:space="preserve"> </w:t>
       </w:r>
       <w:r>
-        <w:t xml:space="preserve">weights [38], [39]; in HCP equal weighting is built into the threshold, and</w:t>
+        <w:t xml:space="preserve">weights [30], [31]; in HCP equal weighting is built into the threshold, and</w:t>
       </w:r>
       <w:r>
         <w:t xml:space="preserve"> </w:t>
@@ -4666,7 +4627,7 @@
         <w:t xml:space="preserve"> </w:t>
       </w:r>
       <w:r>
-        <w:t xml:space="preserve">targets the wrong quantity [40].</w:t>
+        <w:t xml:space="preserve">targets the wrong quantity [32].</w:t>
       </w:r>
     </w:p>
     <w:bookmarkEnd w:id="18"/>
@@ -5464,7 +5425,7 @@
           <wp:inline>
             <wp:extent cx="3108960" cy="1073695"/>
             <wp:effectExtent b="0" l="0" r="0" t="0"/>
-            <wp:docPr descr="Fig. 2. Schematic of Proposition 2 on eight hypothetical records (circles). Solid arcs link records of the same patient and dashed arcs records of the same device. A grouping sufficient for both sources must keep every linked pair in one block, so the finest such grouping is the join, the connected components (shaded). On PTB-XL the same mechanism collapses four declared sources to a single block (§5.1)." title="" id="20" name="Picture"/>
+            <wp:docPr descr="Fig. 2. Proposition 2 on eight hypothetical records. Solid arcs: same patient; dashed arcs: same device; shaded: their join (connected components), the finest grouping sufficient for both sources." title="" id="20" name="Picture"/>
             <a:graphic>
               <a:graphicData uri="http://schemas.openxmlformats.org/drawingml/2006/picture">
                 <pic:pic>
@@ -5508,7 +5469,7 @@
         <w:jc w:val="both"/>
       </w:pPr>
       <w:r>
-        <w:t xml:space="preserve">Fig. 2. Schematic of Proposition 2 on eight hypothetical records (circles). Solid arcs link records of the same patient and dashed arcs records of the same device. A grouping sufficient for both sources must keep every linked pair in one block, so the finest such grouping is the join, the connected components (shaded). On PTB-XL the same mechanism collapses four declared sources to a single block (§5.1).</w:t>
+        <w:t xml:space="preserve">Fig. 2. Proposition 2 on eight hypothetical records. Solid arcs: same patient; dashed arcs: same device; shaded: their join (connected components), the finest grouping sufficient for both sources.</w:t>
       </w:r>
     </w:p>
     <w:p>
@@ -5675,7 +5636,7 @@
         <w:t xml:space="preserve"> </w:t>
       </w:r>
       <w:r>
-        <w:t xml:space="preserve">Whether it extends to the constructions of Dunn et al. [14], or to every</w:t>
+        <w:t xml:space="preserve">Whether it extends to the constructions of Dunn et al. [13], or to every</w:t>
       </w:r>
       <w:r>
         <w:t xml:space="preserve"> </w:t>
@@ -5924,7 +5885,7 @@
         <w:t xml:space="preserve"> </w:t>
       </w:r>
       <w:r>
-        <w:t xml:space="preserve">giant components [41], but there a collapsed join merely weakens a split; here,</w:t>
+        <w:t xml:space="preserve">giant components [33], but there a collapsed join merely weakens a split; here,</w:t>
       </w:r>
       <w:r>
         <w:t xml:space="preserve"> </w:t>
@@ -6194,7 +6155,7 @@
         <w:jc w:val="both"/>
       </w:pPr>
       <w:r>
-        <w:t xml:space="preserve">involves nothing new: Theorem 1 of [13] needs only a fixed scalar score, and with</w:t>
+        <w:t xml:space="preserve">involves nothing new: Theorem 1 of [12] needs only a fixed scalar score, and with</w:t>
       </w:r>
       <w:r>
         <w:t xml:space="preserve"> </w:t>
@@ -6531,7 +6492,7 @@
         <w:t xml:space="preserve"> </w:t>
       </w:r>
       <w:r>
-        <w:t xml:space="preserve">calibration under exchangeability [42]; under hierarchical dependence the count</w:t>
+        <w:t xml:space="preserve">calibration under exchangeability [34]; under hierarchical dependence the count</w:t>
       </w:r>
       <w:r>
         <w:t xml:space="preserve"> </w:t>
@@ -6916,7 +6877,7 @@
         <w:t xml:space="preserve"> </w:t>
       </w:r>
       <w:r>
-        <w:t xml:space="preserve">face the same size-biased selection [40]. Proposition 3 is therefore used only to</w:t>
+        <w:t xml:space="preserve">face the same size-biased selection [32]. Proposition 3 is therefore used only to</w:t>
       </w:r>
       <w:r>
         <w:t xml:space="preserve"> </w:t>
@@ -7900,7 +7861,7 @@
         <w:t xml:space="preserve"> </w:t>
       </w:r>
       <w:r>
-        <w:t xml:space="preserve">Version 1.0.3 [2], [15] holds 21,799 twelve-lead records from 18,869</w:t>
+        <w:t xml:space="preserve">Version 1.0.3 [2], [14] holds 21,799 twelve-lead records from 18,869</w:t>
       </w:r>
       <w:r>
         <w:t xml:space="preserve"> </w:t>
@@ -8012,7 +7973,7 @@
           <wp:inline>
             <wp:extent cx="3108960" cy="2150583"/>
             <wp:effectExtent b="0" l="0" r="0" t="0"/>
-            <wp:docPr descr="Fig. 3. Block geometry of the two primary datasets: block sizes sorted in decreasing order (log–log). The length of each curve is the number of blocks K and its height the block size; H is the harmonic mean block size over the whole dataset. Groupings that end left of the dotted line cannot support a guarantee at \alpha=0.05 even if every block were used for calibration (Corollary 1)." title="" id="26" name="Picture"/>
+            <wp:docPr descr="Fig. 3. Block sizes in decreasing order (log–log). Curve length is the number of blocks K; H is the harmonic mean block size over the whole dataset. Curves ending left of the dotted line cannot support \alpha=0.05 (Corollary 1)." title="" id="26" name="Picture"/>
             <a:graphic>
               <a:graphicData uri="http://schemas.openxmlformats.org/drawingml/2006/picture">
                 <pic:pic>
@@ -8056,7 +8017,7 @@
         <w:jc w:val="both"/>
       </w:pPr>
       <w:r>
-        <w:t xml:space="preserve">Fig. 3. Block geometry of the two primary datasets: block sizes sorted in decreasing order (log–log). The length of each curve is the number of blocks</w:t>
+        <w:t xml:space="preserve">Fig. 3. Block sizes in decreasing order (log–log). Curve length is the number of blocks</w:t>
       </w:r>
       <w:r>
         <w:t xml:space="preserve"> </w:t>
@@ -8067,10 +8028,7 @@
         </m:r>
       </m:oMath>
       <w:r>
-        <w:t xml:space="preserve"> </w:t>
-      </w:r>
-      <w:r>
-        <w:t xml:space="preserve">and its height the block size;</w:t>
+        <w:t xml:space="preserve">;</w:t>
       </w:r>
       <w:r>
         <w:t xml:space="preserve"> </w:t>
@@ -8084,7 +8042,7 @@
         <w:t xml:space="preserve"> </w:t>
       </w:r>
       <w:r>
-        <w:t xml:space="preserve">is the harmonic mean block size over the whole dataset. Groupings that end left of the dotted line cannot support a guarantee at</w:t>
+        <w:t xml:space="preserve">is the harmonic mean block size over the whole dataset. Curves ending left of the dotted line cannot support</w:t>
       </w:r>
       <w:r>
         <w:t xml:space="preserve"> </w:t>
@@ -8107,7 +8065,7 @@
         <w:t xml:space="preserve"> </w:t>
       </w:r>
       <w:r>
-        <w:t xml:space="preserve">even if every block were used for calibration (Corollary 1).</w:t>
+        <w:t xml:space="preserve">(Corollary 1).</w:t>
       </w:r>
     </w:p>
     <w:p>
@@ -8171,7 +8129,7 @@
         <w:t xml:space="preserve"> </w:t>
       </w:r>
       <w:r>
-        <w:t xml:space="preserve">Version 1.0.0 [16] contains 48 half-hour two-channel recordings at</w:t>
+        <w:t xml:space="preserve">Version 1.0.0 [15] contains 48 half-hour two-channel recordings at</w:t>
       </w:r>
       <w:r>
         <w:t xml:space="preserve"> </w:t>
@@ -8289,7 +8247,7 @@
         <w:t xml:space="preserve"> </w:t>
       </w:r>
       <w:r>
-        <w:t xml:space="preserve">[17] holds 66,416 records in seven non-duplicate source folders. No sampled</w:t>
+        <w:t xml:space="preserve">[16] holds 66,416 records in seven non-duplicate source folders. No sampled</w:t>
       </w:r>
       <w:r>
         <w:t xml:space="preserve"> </w:t>
@@ -8437,7 +8395,7 @@
         <w:t xml:space="preserve"> </w:t>
       </w:r>
       <w:r>
-        <w:t xml:space="preserve">exchangeable; B12 is HCP calibrated at the block level [13]. Because we ask</w:t>
+        <w:t xml:space="preserve">exchangeable; B12 is HCP calibrated at the block level [12]. Because we ask</w:t>
       </w:r>
       <w:r>
         <w:t xml:space="preserve"> </w:t>
@@ -8449,7 +8407,7 @@
         <w:t xml:space="preserve"> </w:t>
       </w:r>
       <w:r>
-        <w:t xml:space="preserve">the constructions of Dunn et al. [14] and Mondrian conformal prediction are not</w:t>
+        <w:t xml:space="preserve">the constructions of Dunn et al. [13] and Mondrian conformal prediction are not</w:t>
       </w:r>
       <w:r>
         <w:t xml:space="preserve"> </w:t>
@@ -9927,7 +9885,7 @@
         <w:rPr>
           <w:sz w:val="18"/>
         </w:rPr>
-        <w:t>Feasibility of HCP on PTB-XL fold 9 by grouping.</w:t>
+        <w:t>HCP feasibility on PTB-XL fold 9 by grouping.</w:t>
       </w:r>
     </w:p>
     <w:tbl>
@@ -11150,7 +11108,7 @@
         <w:t xml:space="preserve"> </w:t>
       </w:r>
       <w:r>
-        <w:t xml:space="preserve">known [41]. Fig. 4 places the single sources, their joins and the MIT-BIH record</w:t>
+        <w:t xml:space="preserve">known [33]. Fig. 4 places the single sources, their joins and the MIT-BIH record</w:t>
       </w:r>
       <w:r>
         <w:t xml:space="preserve"> </w:t>
@@ -11169,7 +11127,7 @@
           <wp:inline>
             <wp:extent cx="3108960" cy="2176272"/>
             <wp:effectExtent b="0" l="0" r="0" t="0"/>
-            <wp:docPr descr="Fig. 4. Feasibility frontier \alpha_{\min}=1/(K_1+1). Each marker is a calibration grouping on PTB-XL fold 9 (circles: single dependence source; squares: join of sources) or the MIT-BIH record partition (diamond). Values in parentheses are K_1. A grouping supports a guarantee at level \alpha only if its marker lies below the corresponding dotted line." title="" id="35" name="Picture"/>
+            <wp:docPr descr="Fig. 4. Feasibility frontier \alpha_{\min}=1/(K_1+1) for groupings on PTB-XL fold 9 (circles: single source; squares: joins) and the MIT-BIH records (diamond), with K_1 in parentheses. A level \alpha is attainable only below its dotted line." title="" id="35" name="Picture"/>
             <a:graphic>
               <a:graphicData uri="http://schemas.openxmlformats.org/drawingml/2006/picture">
                 <pic:pic>
@@ -11284,7 +11242,10 @@
         </m:r>
       </m:oMath>
       <w:r>
-        <w:t xml:space="preserve">. Each marker is a calibration grouping on PTB-XL fold 9 (circles: single dependence source; squares: join of sources) or the MIT-BIH record partition (diamond). Values in parentheses are</w:t>
+        <w:t xml:space="preserve"> </w:t>
+      </w:r>
+      <w:r>
+        <w:t xml:space="preserve">for groupings on PTB-XL fold 9 (circles: single source; squares: joins) and the MIT-BIH records (diamond), with</w:t>
       </w:r>
       <w:r>
         <w:t xml:space="preserve"> </w:t>
@@ -11304,7 +11265,10 @@
         </m:sSub>
       </m:oMath>
       <w:r>
-        <w:t xml:space="preserve">. A grouping supports a guarantee at level</w:t>
+        <w:t xml:space="preserve"> </w:t>
+      </w:r>
+      <w:r>
+        <w:t xml:space="preserve">in parentheses. A level</w:t>
       </w:r>
       <w:r>
         <w:t xml:space="preserve"> </w:t>
@@ -11318,7 +11282,7 @@
         <w:t xml:space="preserve"> </w:t>
       </w:r>
       <w:r>
-        <w:t xml:space="preserve">only if its marker lies below the corresponding dotted line.</w:t>
+        <w:t xml:space="preserve">is attainable only below its dotted line.</w:t>
       </w:r>
     </w:p>
     <w:p>
@@ -11438,7 +11402,7 @@
         <w:rPr>
           <w:sz w:val="18"/>
         </w:rPr>
-        <w:t>Labels failing the necessary condition of Proposition 3, PTB-XL fold 9, patient blocks.</w:t>
+        <w:t>PTB-XL labels failing Proposition 3 (fold 9, patient blocks).</w:t>
       </w:r>
     </w:p>
     <w:tbl>
@@ -12116,7 +12080,7 @@
           <wp:inline>
             <wp:extent cx="5303520" cy="1595119"/>
             <wp:effectExtent b="0" l="0" r="0" t="0"/>
-            <wp:docPr descr="Fig. 5. Calibration blocks carrying each label, by level of the PTB-XL hierarchy (fold 9, patient blocks; log scale). Dashed and dotted lines mark the minimum number of blocks for a finite per-label threshold at \alpha=0.05 and \alpha=0.10. Dark bars meet the \alpha=0.05 requirement, light bars only the \alpha=0.10 requirement, and orange bars neither." title="" id="38" name="Picture"/>
+            <wp:docPr descr="Fig. 5. Calibration blocks carrying each PTB-XL label by hierarchy level (fold 9, patient blocks; log scale). Dashed and dotted lines: blocks required at \alpha=0.05 and 0.10. Dark bars meet the 0.05 requirement, light bars only the 0.10 one, orange bars neither." title="" id="38" name="Picture"/>
             <a:graphic>
               <a:graphicData uri="http://schemas.openxmlformats.org/drawingml/2006/picture">
                 <pic:pic>
@@ -12160,7 +12124,7 @@
         <w:jc w:val="both"/>
       </w:pPr>
       <w:r>
-        <w:t xml:space="preserve">Fig. 5. Calibration blocks carrying each label, by level of the PTB-XL hierarchy (fold 9, patient blocks; log scale). Dashed and dotted lines mark the minimum number of blocks for a finite per-label threshold at</w:t>
+        <w:t xml:space="preserve">Fig. 5. Calibration blocks carrying each PTB-XL label by hierarchy level (fold 9, patient blocks; log scale). Dashed and dotted lines: blocks required at</w:t>
       </w:r>
       <w:r>
         <w:t xml:space="preserve"> </w:t>
@@ -12190,15 +12154,6 @@
       </w:r>
       <m:oMath>
         <m:r>
-          <m:t>α</m:t>
-        </m:r>
-        <m:r>
-          <m:rPr>
-            <m:sty m:val="p"/>
-          </m:rPr>
-          <m:t>=</m:t>
-        </m:r>
-        <m:r>
           <m:t>0.10</m:t>
         </m:r>
       </m:oMath>
@@ -12210,15 +12165,6 @@
       </w:r>
       <m:oMath>
         <m:r>
-          <m:t>α</m:t>
-        </m:r>
-        <m:r>
-          <m:rPr>
-            <m:sty m:val="p"/>
-          </m:rPr>
-          <m:t>=</m:t>
-        </m:r>
-        <m:r>
           <m:t>0.05</m:t>
         </m:r>
       </m:oMath>
@@ -12233,15 +12179,6 @@
       </w:r>
       <m:oMath>
         <m:r>
-          <m:t>α</m:t>
-        </m:r>
-        <m:r>
-          <m:rPr>
-            <m:sty m:val="p"/>
-          </m:rPr>
-          <m:t>=</m:t>
-        </m:r>
-        <m:r>
           <m:t>0.10</m:t>
         </m:r>
       </m:oMath>
@@ -12249,7 +12186,7 @@
         <w:t xml:space="preserve"> </w:t>
       </w:r>
       <w:r>
-        <w:t xml:space="preserve">requirement, and orange bars neither.</w:t>
+        <w:t xml:space="preserve">one, orange bars neither.</w:t>
       </w:r>
     </w:p>
     <w:bookmarkEnd w:id="40"/>
@@ -12331,7 +12268,7 @@
         <w:rPr>
           <w:sz w:val="18"/>
         </w:rPr>
-        <w:t>Coverage (mean over splits, with 2.5–97.5% range across splits) and mean set size.</w:t>
+        <w:t>Coverage (mean, 2.5–97.5% range across splits) and mean set size.</w:t>
       </w:r>
     </w:p>
     <w:tbl>
@@ -13410,7 +13347,7 @@
           <wp:inline>
             <wp:extent cx="5303520" cy="1669438"/>
             <wp:effectExtent b="0" l="0" r="0" t="0"/>
-            <wp:docPr descr="Fig. 6. Coverage minus nominal 1-\alpha for split conformal (B1, mean with 2.5–97.5% range across 200 block-level splits) and HCP (B12, mean), primary backbone. Shaded MIT-BIH levels lie below \alpha_{\min}=1/12, where HCP returns every label. Note the different vertical scales." title="" id="42" name="Picture"/>
+            <wp:docPr descr="Fig. 6. Coverage minus nominal 1-\alpha, primary backbone: B1 (mean and 2.5–97.5% range over 200 block-level splits) and B12 (mean). Shading marks MIT-BIH levels below \alpha_{\min}=1/12; vertical scales differ." title="" id="42" name="Picture"/>
             <a:graphic>
               <a:graphicData uri="http://schemas.openxmlformats.org/drawingml/2006/picture">
                 <pic:pic>
@@ -13474,10 +13411,7 @@
         </m:r>
       </m:oMath>
       <w:r>
-        <w:t xml:space="preserve"> </w:t>
-      </w:r>
-      <w:r>
-        <w:t xml:space="preserve">for split conformal (B1, mean with 2.5–97.5% range across 200 block-level splits) and HCP (B12, mean), primary backbone. Shaded MIT-BIH levels lie below</w:t>
+        <w:t xml:space="preserve">, primary backbone: B1 (mean and 2.5–97.5% range over 200 block-level splits) and B12 (mean). Shading marks MIT-BIH levels below</w:t>
       </w:r>
       <w:r>
         <w:t xml:space="preserve"> </w:t>
@@ -13518,7 +13452,7 @@
         </m:r>
       </m:oMath>
       <w:r>
-        <w:t xml:space="preserve">, where HCP returns every label. Note the different vertical scales.</w:t>
+        <w:t xml:space="preserve">; vertical scales differ.</w:t>
       </w:r>
     </w:p>
     <w:bookmarkEnd w:id="44"/>
@@ -13701,7 +13635,7 @@
         <w:rPr>
           <w:sz w:val="18"/>
         </w:rPr>
-        <w:t>MIT-BIH: B1 deficit against the permutation null, pp. Monte Carlo interval: percentile bootstrap over 200 paired splits of the 22 DS2 records, conditional on those records. Record level: leave-one-record-out jackknife (500 paired splits and a new permutation per replicate), 95% t interval with 21 df and Holm-adjusted one-sided p.</w:t>
+        <w:t>MIT-BIH B1 deficit against the permutation null (pp): Monte Carlo interval over 200 paired splits of the 22 DS2 records, and record-level jackknife 95% CI with Holm-adjusted one-sided p (Table 2).</w:t>
       </w:r>
     </w:p>
     <w:tbl>
@@ -15112,7 +15046,7 @@
           <wp:inline>
             <wp:extent cx="5303520" cy="1550454"/>
             <wp:effectExtent b="0" l="0" r="0" t="0"/>
-            <wp:docPr descr="Fig. 7. Attribution of the MIT-BIH deficit, primary backbone. (a) Effects of clustering, block-size imbalance and their interaction on B1 coverage in the 2×2 factorial design (Monte Carlo 95% interval over 400 splits; open markers include zero). (b) B12−B1 coverage gap on the original data and after permuting beats between records (bars: mean; whiskers: 2.5–97.5% range across splits). Percentages give the mechanical share, the permuted gap as a fraction of the original." title="" id="46" name="Picture"/>
+            <wp:docPr descr="Fig. 7. Attribution of the MIT-BIH deficit, primary backbone. (a) Factorial effects on B1 coverage (Monte Carlo 95% intervals, 400 splits; open markers include zero). (b) B12−B1 gap on original and permuted data (whiskers: 2.5–97.5% range); percentages give the mechanical share." title="" id="46" name="Picture"/>
             <a:graphic>
               <a:graphicData uri="http://schemas.openxmlformats.org/drawingml/2006/picture">
                 <pic:pic>
@@ -15156,7 +15090,7 @@
         <w:jc w:val="both"/>
       </w:pPr>
       <w:r>
-        <w:t xml:space="preserve">Fig. 7. Attribution of the MIT-BIH deficit, primary backbone. (a) Effects of clustering, block-size imbalance and their interaction on B1 coverage in the 2×2 factorial design (Monte Carlo 95% interval over 400 splits; open markers include zero). (b) B12−B1 coverage gap on the original data and after permuting beats between records (bars: mean; whiskers: 2.5–97.5% range across splits). Percentages give the mechanical share, the permuted gap as a fraction of the original.</w:t>
+        <w:t xml:space="preserve">Fig. 7. Attribution of the MIT-BIH deficit, primary backbone. (a) Factorial effects on B1 coverage (Monte Carlo 95% intervals, 400 splits; open markers include zero). (b) B12−B1 gap on original and permuted data (whiskers: 2.5–97.5% range); percentages give the mechanical share.</w:t>
       </w:r>
     </w:p>
     <w:bookmarkEnd w:id="48"/>
@@ -15379,7 +15313,7 @@
         <w:rPr>
           <w:sz w:val="18"/>
         </w:rPr>
-        <w:t>Spearman correlation between dependence and coverage deficit (p-values treat points as independent and are shown for completeness).</w:t>
+        <w:t>Spearman correlation between dependence and coverage deficit (p-values treat points as independent).</w:t>
       </w:r>
     </w:p>
     <w:tbl>
@@ -15992,7 +15926,7 @@
         <w:t xml:space="preserve"> </w:t>
       </w:r>
       <w:r>
-        <w:t xml:space="preserve">sufficient statistic; an exceedance-specific design effect is given in [40].</w:t>
+        <w:t xml:space="preserve">sufficient statistic; an exceedance-specific design effect is given in [32].</w:t>
       </w:r>
       <w:r>
         <w:t xml:space="preserve"> </w:t>
@@ -16029,7 +15963,7 @@
           <wp:inline>
             <wp:extent cx="3108960" cy="2277948"/>
             <wp:effectExtent b="0" l="0" r="0" t="0"/>
-            <wp:docPr descr="Fig. 8. B1 coverage deficit against the design effect. MIT-BIH points (blue) are obtained by randomly reassigning a growing fraction of beats to other records, with calibration records subsampled to a common size; PTB-XL (orange) is the observed patient partition with its Monte Carlo 95% interval. The annotation gives the Spearman correlation over the 12 points at \alpha=0.10, 0.15, 0.20." title="" id="50" name="Picture"/>
+            <wp:docPr descr="Fig. 8. B1 coverage deficit against the design effect. MIT-BIH (blue): beats progressively reassigned between records; PTB-XL (orange): observed patient partition with Monte Carlo 95% interval. Spearman correlations over the 12 points are annotated." title="" id="50" name="Picture"/>
             <a:graphic>
               <a:graphicData uri="http://schemas.openxmlformats.org/drawingml/2006/picture">
                 <pic:pic>
@@ -16073,45 +16007,7 @@
         <w:jc w:val="both"/>
       </w:pPr>
       <w:r>
-        <w:t xml:space="preserve">Fig. 8. B1 coverage deficit against the design effect. MIT-BIH points (blue) are obtained by randomly reassigning a growing fraction of beats to other records, with calibration records subsampled to a common size; PTB-XL (orange) is the observed patient partition with its Monte Carlo 95% interval. The annotation gives the Spearman correlation over the 12 points at</w:t>
-      </w:r>
-      <w:r>
-        <w:t xml:space="preserve"> </w:t>
-      </w:r>
-      <m:oMath>
-        <m:r>
-          <m:t>α</m:t>
-        </m:r>
-        <m:r>
-          <m:rPr>
-            <m:sty m:val="p"/>
-          </m:rPr>
-          <m:t>=</m:t>
-        </m:r>
-        <m:r>
-          <m:t>0.10</m:t>
-        </m:r>
-        <m:r>
-          <m:rPr>
-            <m:sty m:val="p"/>
-          </m:rPr>
-          <m:t>,</m:t>
-        </m:r>
-        <m:r>
-          <m:t>0.15</m:t>
-        </m:r>
-        <m:r>
-          <m:rPr>
-            <m:sty m:val="p"/>
-          </m:rPr>
-          <m:t>,</m:t>
-        </m:r>
-        <m:r>
-          <m:t>0.20</m:t>
-        </m:r>
-      </m:oMath>
-      <w:r>
-        <w:t xml:space="preserve">.</w:t>
+        <w:t xml:space="preserve">Fig. 8. B1 coverage deficit against the design effect. MIT-BIH (blue): beats progressively reassigned between records; PTB-XL (orange): observed patient partition with Monte Carlo 95% interval. Spearman correlations over the 12 points are annotated.</w:t>
       </w:r>
     </w:p>
     <w:bookmarkEnd w:id="52"/>
@@ -16804,7 +16700,7 @@
           <wp:inline>
             <wp:extent cx="5303520" cy="1765149"/>
             <wp:effectExtent b="0" l="0" r="0" t="0"/>
-            <wp:docPr descr="Fig. 9. Robustness of the audit. (a) MIT-BIH B1 coverage deficit against the matched permutation null, by backbone and \alpha: point estimate with Monte Carlo 95% interval over 200 splits of the 22 DS2 records (open markers include zero), and record-level 95% CI from the leave-one-record-out jackknife (light bars). (b) B1 coverage minus nominal under best-validation (horizontal) and last-epoch (vertical) weights for the two residual networks, 16 backbone×dataset×\alpha cells; shaded quadrants mark agreement in sign and the dotted line marks equality." title="" id="54" name="Picture"/>
+            <wp:docPr descr="Fig. 9. Robustness. (a) MIT-BIH B1 deficit against the permutation null by backbone and \alpha: Monte Carlo 95% interval (200 splits; open markers include zero) and record-level jackknife 95% CI (light bars). (b) B1 coverage minus nominal under best-validation versus last-epoch weights, 16 cells; shaded quadrants mark sign agreement." title="" id="54" name="Picture"/>
             <a:graphic>
               <a:graphicData uri="http://schemas.openxmlformats.org/drawingml/2006/picture">
                 <pic:pic>
@@ -16848,7 +16744,7 @@
         <w:jc w:val="both"/>
       </w:pPr>
       <w:r>
-        <w:t xml:space="preserve">Fig. 9. Robustness of the audit. (a) MIT-BIH B1 coverage deficit against the matched permutation null, by backbone and</w:t>
+        <w:t xml:space="preserve">Fig. 9. Robustness. (a) MIT-BIH B1 deficit against the permutation null by backbone and</w:t>
       </w:r>
       <w:r>
         <w:t xml:space="preserve"> </w:t>
@@ -16859,18 +16755,7 @@
         </m:r>
       </m:oMath>
       <w:r>
-        <w:t xml:space="preserve">: point estimate with Monte Carlo 95% interval over 200 splits of the 22 DS2 records (open markers include zero), and record-level 95% CI from the leave-one-record-out jackknife (light bars). (b) B1 coverage minus nominal under best-validation (horizontal) and last-epoch (vertical) weights for the two residual networks, 16 backbone×dataset×</w:t>
-      </w:r>
-      <m:oMath>
-        <m:r>
-          <m:t>α</m:t>
-        </m:r>
-      </m:oMath>
-      <w:r>
-        <w:t xml:space="preserve"> </w:t>
-      </w:r>
-      <w:r>
-        <w:t xml:space="preserve">cells; shaded quadrants mark agreement in sign and the dotted line marks equality.</w:t>
+        <w:t xml:space="preserve">: Monte Carlo 95% interval (200 splits; open markers include zero) and record-level jackknife 95% CI (light bars). (b) B1 coverage minus nominal under best-validation versus last-epoch weights, 16 cells; shaded quadrants mark sign agreement.</w:t>
       </w:r>
     </w:p>
     <w:bookmarkEnd w:id="56"/>
@@ -17685,13 +17570,13 @@
         <w:t xml:space="preserve"> </w:t>
       </w:r>
       <w:r>
-        <w:t xml:space="preserve">once group-conditional calibration for demographic fairness [43] must also</w:t>
-      </w:r>
-      <w:r>
-        <w:t xml:space="preserve"> </w:t>
-      </w:r>
-      <w:r>
-        <w:t xml:space="preserve">respect patient blocks, a group with few calibration patients faces the same</w:t>
+        <w:t xml:space="preserve">once group-conditional calibration, for instance across demographic groups, must</w:t>
+      </w:r>
+      <w:r>
+        <w:t xml:space="preserve"> </w:t>
+      </w:r>
+      <w:r>
+        <w:t xml:space="preserve">also respect patient blocks, a group with few calibration patients faces the same</w:t>
       </w:r>
       <w:r>
         <w:t xml:space="preserve"> </w:t>
@@ -17703,25 +17588,19 @@
         <w:t xml:space="preserve"> </w:t>
       </w:r>
       <w:r>
-        <w:t xml:space="preserve">in hospitals [36], lie far from this boundary, which is why it is easy to miss.</w:t>
-      </w:r>
-      <w:r>
-        <w:t xml:space="preserve"> </w:t>
-      </w:r>
-      <w:r>
-        <w:t xml:space="preserve">The inter-patient protocol prevents subject-level leakage [30], [32], [31], and</w:t>
-      </w:r>
-      <w:r>
-        <w:t xml:space="preserve"> </w:t>
-      </w:r>
-      <w:r>
-        <w:t xml:space="preserve">training regimes that differ in this respect have been compared [44], but a split</w:t>
-      </w:r>
-      <w:r>
-        <w:t xml:space="preserve"> </w:t>
-      </w:r>
-      <w:r>
-        <w:t xml:space="preserve">that is inter-patient for training can still leave too few subjects in</w:t>
+        <w:t xml:space="preserve">in hospitals [28], lie far from this boundary, which is why it is easy to miss.</w:t>
+      </w:r>
+      <w:r>
+        <w:t xml:space="preserve"> </w:t>
+      </w:r>
+      <w:r>
+        <w:t xml:space="preserve">The inter-patient protocol prevents subject-level leakage [23], [25], [24], but</w:t>
+      </w:r>
+      <w:r>
+        <w:t xml:space="preserve"> </w:t>
+      </w:r>
+      <w:r>
+        <w:t xml:space="preserve">a split that is inter-patient for training can still leave too few subjects in</w:t>
       </w:r>
       <w:r>
         <w:t xml:space="preserve"> </w:t>
@@ -17736,7 +17615,7 @@
         <w:jc w:val="both"/>
       </w:pPr>
       <w:r>
-        <w:t xml:space="preserve">For the design trade-off left open by Lee et al. [13], our results settle the</w:t>
+        <w:t xml:space="preserve">For the design trade-off left open by Lee et al. [12], our results settle the</w:t>
       </w:r>
       <w:r>
         <w:t xml:space="preserve"> </w:t>
@@ -17760,13 +17639,13 @@
         <w:t xml:space="preserve"> </w:t>
       </w:r>
       <w:r>
-        <w:t xml:space="preserve">distribution of split conformal prediction implies for exchangeable data [45];</w:t>
-      </w:r>
-      <w:r>
-        <w:t xml:space="preserve"> </w:t>
-      </w:r>
-      <w:r>
-        <w:t xml:space="preserve">and, as for rare classes under exchangeability [42], the count that matters per</w:t>
+        <w:t xml:space="preserve">distribution of split conformal prediction implies for exchangeable data [35];</w:t>
+      </w:r>
+      <w:r>
+        <w:t xml:space="preserve"> </w:t>
+      </w:r>
+      <w:r>
+        <w:t xml:space="preserve">and, as for rare classes under exchangeability [34], the count that matters per</w:t>
       </w:r>
       <w:r>
         <w:t xml:space="preserve"> </w:t>
@@ -17778,7 +17657,7 @@
         <w:t xml:space="preserve"> </w:t>
       </w:r>
       <w:r>
-        <w:t xml:space="preserve">condition (§3.4). The findings agree with Sim and Kim [11]: subjects, not beats,</w:t>
+        <w:t xml:space="preserve">condition (§3.4). The findings agree with Sim and Kim [10]: subjects, not beats,</w:t>
       </w:r>
       <w:r>
         <w:t xml:space="preserve"> </w:t>
@@ -17808,13 +17687,13 @@
         <w:t xml:space="preserve"> </w:t>
       </w:r>
       <w:r>
-        <w:t xml:space="preserve">per-patient failures in cardiac monitoring [10] matches the label-level boundary</w:t>
-      </w:r>
-      <w:r>
-        <w:t xml:space="preserve"> </w:t>
-      </w:r>
-      <w:r>
-        <w:t xml:space="preserve">of §5.1. Risk-control extensions [34], [46] and time-series variants [35] rest on</w:t>
+        <w:t xml:space="preserve">per-patient failures in cardiac monitoring [9] matches the label-level boundary</w:t>
+      </w:r>
+      <w:r>
+        <w:t xml:space="preserve"> </w:t>
+      </w:r>
+      <w:r>
+        <w:t xml:space="preserve">of §5.1. Risk-control extensions [26] and time-series variants [27] rest on</w:t>
       </w:r>
       <w:r>
         <w:t xml:space="preserve"> </w:t>
@@ -18416,7 +18295,7 @@
         <w:t xml:space="preserve"> </w:t>
       </w:r>
       <w:r>
-        <w:t xml:space="preserve">[14]. For PTB-XL the verdict is exhaustive only for the declared sources</w:t>
+        <w:t xml:space="preserve">[13]. For PTB-XL the verdict is exhaustive only for the declared sources</w:t>
       </w:r>
       <w:r>
         <w:t xml:space="preserve"> </w:t>
@@ -18428,7 +18307,7 @@
         <w:t xml:space="preserve"> </w:t>
       </w:r>
       <w:r>
-        <w:t xml:space="preserve">joins into a giant component is known [41]. Declaring only {patient, site} gives</w:t>
+        <w:t xml:space="preserve">joins into a giant component is known [33]. Declaring only {patient, site} gives</w:t>
       </w:r>
       <w:r>
         <w:t xml:space="preserve"> </w:t>
@@ -18579,19 +18458,19 @@
         <w:t xml:space="preserve"> </w:t>
       </w:r>
       <w:r>
-        <w:t xml:space="preserve">Finally, what ECG networks learn [47] and how well they discriminate</w:t>
-      </w:r>
-      <w:r>
-        <w:t xml:space="preserve"> </w:t>
-      </w:r>
-      <w:r>
-        <w:t xml:space="preserve">[1] are orthogonal to this question: an accurate model calibrated on too few</w:t>
-      </w:r>
-      <w:r>
-        <w:t xml:space="preserve"> </w:t>
-      </w:r>
-      <w:r>
-        <w:t xml:space="preserve">blocks still carries no guarantee.</w:t>
+        <w:t xml:space="preserve">Finally, how well ECG networks discriminate on benchmarks [1] is</w:t>
+      </w:r>
+      <w:r>
+        <w:t xml:space="preserve"> </w:t>
+      </w:r>
+      <w:r>
+        <w:t xml:space="preserve">orthogonal to this question: an accurate model calibrated on too few blocks still</w:t>
+      </w:r>
+      <w:r>
+        <w:t xml:space="preserve"> </w:t>
+      </w:r>
+      <w:r>
+        <w:t xml:space="preserve">carries no guarantee.</w:t>
       </w:r>
     </w:p>
     <w:p>
@@ -18858,13 +18737,13 @@
         <w:jc w:val="both"/>
       </w:pPr>
       <w:r>
-        <w:t xml:space="preserve">PTB-XL (version 1.0.3) [15], the MIT-BIH Arrhythmia Database [16] and the</w:t>
-      </w:r>
-      <w:r>
-        <w:t xml:space="preserve"> </w:t>
-      </w:r>
-      <w:r>
-        <w:t xml:space="preserve">PhysioNet/CinC Challenge 2021 collection (version 1.0.3) [17] are publicly</w:t>
+        <w:t xml:space="preserve">PTB-XL (version 1.0.3) [14], the MIT-BIH Arrhythmia Database [15] and the</w:t>
+      </w:r>
+      <w:r>
+        <w:t xml:space="preserve"> </w:t>
+      </w:r>
+      <w:r>
+        <w:t xml:space="preserve">PhysioNet/CinC Challenge 2021 collection (version 1.0.3) [16] are publicly</w:t>
       </w:r>
       <w:r>
         <w:t xml:space="preserve"> </w:t>
@@ -19719,7 +19598,7 @@
         <w:t xml:space="preserve"> </w:t>
       </w:r>
       <w:r>
-        <w:t xml:space="preserve">[38], [39]. In HCP it cannot be replaced, so the practitioner is tied to the</w:t>
+        <w:t xml:space="preserve">[30], [31]. In HCP it cannot be replaced, so the practitioner is tied to the</w:t>
       </w:r>
       <w:r>
         <w:t xml:space="preserve"> </w:t>
@@ -20653,7 +20532,7 @@
         <w:t xml:space="preserve"> </w:t>
       </w:r>
       <w:r>
-        <w:t xml:space="preserve">collection [17] hold 66,416 records, from</w:t>
+        <w:t xml:space="preserve">collection [16] hold 66,416 records, from</w:t>
       </w:r>
       <w:r>
         <w:t xml:space="preserve"> </w:t>
@@ -20907,7 +20786,7 @@
         <w:t xml:space="preserve"> </w:t>
       </w:r>
       <w:r>
-        <w:t xml:space="preserve">Sufficiency also presumes a latent block structure [13]; if similarity within an</w:t>
+        <w:t xml:space="preserve">Sufficiency also presumes a latent block structure [12]; if similarity within an</w:t>
       </w:r>
       <w:r>
         <w:t xml:space="preserve"> </w:t>
@@ -21209,7 +21088,7 @@
           <w:i w:val="0"/>
           <w:sz w:val="18"/>
         </w:rPr>
-        <w:t>K. Tangudomkit, S. Chairat, and S. Chaichulee, “Set Prediction for Outpatient Diagnosis Coding with Sparse Mahalanobis Conformal Scoring,” BDCC, vol. 10, no. 7, Art. no. 232, Jul. 2026, doi: 10.3390/bdcc10070232.</w:t>
+        <w:t>O. El Allam and M. Hamlich, “Quantization-aware Mondrian conformal prediction for embedded ECG classification,” Biomedical Signal Processing and Control, vol. 127, Nov. 2026, doi: 10.1016/j.bspc.2026.111217.</w:t>
       </w:r>
     </w:p>
     <w:p>
@@ -21245,7 +21124,7 @@
           <w:i w:val="0"/>
           <w:sz w:val="18"/>
         </w:rPr>
-        <w:t>O. El Allam and M. Hamlich, “Quantization-aware Mondrian conformal prediction for embedded ECG classification,” Biomedical Signal Processing and Control, vol. 127, Nov. 2026, doi: 10.1016/j.bspc.2026.111217.</w:t>
+        <w:t>O. E. ALLAM and M. HAMLICH, “Hierarchical adaptive conformal inference for reliable uncertainty quantification in edge-deployable medical wearables,” Measurement, vol. 279, Jun. 2026, doi: 10.1016/j.measurement.2026.121765.</w:t>
       </w:r>
     </w:p>
     <w:p>
@@ -21281,7 +21160,7 @@
           <w:i w:val="0"/>
           <w:sz w:val="18"/>
         </w:rPr>
-        <w:t>O. E. ALLAM and M. HAMLICH, “Hierarchical adaptive conformal inference for reliable uncertainty quantification in edge-deployable medical wearables,” Measurement, vol. 279, Jun. 2026, doi: 10.1016/j.measurement.2026.121765.</w:t>
+        <w:t>I. H. Kinalioglu, “Conformal reliability assessment of PPG-based ICU arrhythmia classification under class imbalance and patient heterogeneity,” Physiol. Meas., vol. 47, no. 8, Art. no. 085029, Aug. 2026, doi: 10.1088/1361-6579/ae92e8.</w:t>
       </w:r>
     </w:p>
     <w:p>
@@ -21317,7 +21196,7 @@
           <w:i w:val="0"/>
           <w:sz w:val="18"/>
         </w:rPr>
-        <w:t>I. H. Kinalioglu, “Conformal reliability assessment of PPG-based ICU arrhythmia classification under class imbalance and patient heterogeneity,” Physiol. Meas., vol. 47, no. 8, Art. no. 085029, Aug. 2026, doi: 10.1088/1361-6579/ae92e8.</w:t>
+        <w:t>S. Sim and C. Kim, “Anomaly-Selective Conformal Calibration for ECG Monitoring: Threshold Divergence and the Limits of Finite-Sample False Alarm Control,” IEEE Access, vol. 14, pp. 144957–144979, 2026, doi: 10.1109/access.2026.3734990.</w:t>
       </w:r>
     </w:p>
     <w:p>
@@ -21353,7 +21232,7 @@
           <w:i w:val="0"/>
           <w:sz w:val="18"/>
         </w:rPr>
-        <w:t>S. Sim and C. Kim, “Anomaly-Selective Conformal Calibration for ECG Monitoring: Threshold Divergence and the Limits of Finite-Sample False Alarm Control,” IEEE Access, vol. 14, pp. 144957–144979, 2026, doi: 10.1109/access.2026.3734990.</w:t>
+        <w:t>R. F. Barber, E. J. Candès, A. Ramdas, and R. J. Tibshirani, “Conformal prediction beyond exchangeability,” Ann. Statist., vol. 51, no. 2, Apr. 2023, doi: 10.1214/23-aos2276.</w:t>
       </w:r>
     </w:p>
     <w:p>
@@ -21389,7 +21268,7 @@
           <w:i w:val="0"/>
           <w:sz w:val="18"/>
         </w:rPr>
-        <w:t>R. F. Barber, E. J. Candès, A. Ramdas, and R. J. Tibshirani, “Conformal prediction beyond exchangeability,” Ann. Statist., vol. 51, no. 2, Apr. 2023, doi: 10.1214/23-aos2276.</w:t>
+        <w:t>Y. Lee, R. Barber, and R. Willett, “Distribution-free inference with hierarchical data,” ACM J. Data Sci., Mar. 2026, doi: 10.1145/3786352.</w:t>
       </w:r>
     </w:p>
     <w:p>
@@ -21418,42 +21297,6 @@
           <w:sz w:val="18"/>
         </w:rPr>
         <w:t>[13]</w:t>
-        <w:tab/>
-      </w:r>
-      <w:r>
-        <w:rPr>
-          <w:i w:val="0"/>
-          <w:sz w:val="18"/>
-        </w:rPr>
-        <w:t>Y. Lee, R. Barber, and R. Willett, “Distribution-free inference with hierarchical data,” ACM J. Data Sci., Mar. 2026, doi: 10.1145/3786352.</w:t>
-      </w:r>
-    </w:p>
-    <w:p>
-      <w:pPr>
-        <w:pStyle w:val="BodyText"/>
-        <w:tabs>
-          <w:tab w:pos="440" w:val="left"/>
-        </w:tabs>
-        <w:spacing w:after="40"/>
-        <w:ind w:left="440" w:hanging="440"/>
-        <w:jc w:val="both"/>
-      </w:pPr>
-      <w:r/>
-      <w:r/>
-      <w:r/>
-      <w:r/>
-      <w:r>
-        <w:rPr>
-          <w:i/>
-          <w:iCs/>
-        </w:rPr>
-      </w:r>
-      <w:r/>
-      <w:r>
-        <w:rPr>
-          <w:sz w:val="18"/>
-        </w:rPr>
-        <w:t>[14]</w:t>
         <w:tab/>
       </w:r>
       <w:r>
@@ -21483,7 +21326,7 @@
         <w:rPr>
           <w:sz w:val="18"/>
         </w:rPr>
-        <w:t>[15]</w:t>
+        <w:t>[14]</w:t>
         <w:tab/>
       </w:r>
       <w:r>
@@ -21513,7 +21356,7 @@
         <w:rPr>
           <w:sz w:val="18"/>
         </w:rPr>
-        <w:t>[16]</w:t>
+        <w:t>[15]</w:t>
         <w:tab/>
       </w:r>
       <w:r>
@@ -21551,7 +21394,7 @@
         <w:rPr>
           <w:sz w:val="18"/>
         </w:rPr>
-        <w:t>[17]</w:t>
+        <w:t>[16]</w:t>
         <w:tab/>
       </w:r>
       <w:r>
@@ -21587,7 +21430,7 @@
         <w:rPr>
           <w:sz w:val="18"/>
         </w:rPr>
-        <w:t>[18]</w:t>
+        <w:t>[17]</w:t>
         <w:tab/>
       </w:r>
       <w:r>
@@ -21623,7 +21466,7 @@
         <w:rPr>
           <w:sz w:val="18"/>
         </w:rPr>
-        <w:t>[19]</w:t>
+        <w:t>[18]</w:t>
         <w:tab/>
       </w:r>
       <w:r>
@@ -21659,7 +21502,7 @@
         <w:rPr>
           <w:sz w:val="18"/>
         </w:rPr>
-        <w:t>[20]</w:t>
+        <w:t>[19]</w:t>
         <w:tab/>
       </w:r>
       <w:r>
@@ -21695,7 +21538,7 @@
         <w:rPr>
           <w:sz w:val="18"/>
         </w:rPr>
-        <w:t>[21]</w:t>
+        <w:t>[20]</w:t>
         <w:tab/>
       </w:r>
       <w:r>
@@ -21731,7 +21574,7 @@
         <w:rPr>
           <w:sz w:val="18"/>
         </w:rPr>
-        <w:t>[22]</w:t>
+        <w:t>[21]</w:t>
         <w:tab/>
       </w:r>
       <w:r>
@@ -21739,7 +21582,7 @@
           <w:i w:val="0"/>
           <w:sz w:val="18"/>
         </w:rPr>
-        <w:t>J.-I. Seo, Y. E. Jeon, and Y. Kim, “Calibrated Mondrian conformal prediction for uncertainty quantification in spatial modeling,” Pattern Recognition, vol. 180, Dec. 2026, doi: 10.1016/j.patcog.2026.114113.</w:t>
+        <w:t>H. Papadopoulos, “Conformal prediction for multi-label learning: a review of methods and guarantees,” Philosophical Transactions of the Royal Society A: Mathematical, Physical and Engineering Sciences, vol. 384, no. 2327, Art. no. 20250071, Aug. 2026, doi: 10.1098/rsta.2025.0071.</w:t>
       </w:r>
     </w:p>
     <w:p>
@@ -21767,7 +21610,7 @@
         <w:rPr>
           <w:sz w:val="18"/>
         </w:rPr>
-        <w:t>[23]</w:t>
+        <w:t>[22]</w:t>
         <w:tab/>
       </w:r>
       <w:r>
@@ -21775,7 +21618,7 @@
           <w:i w:val="0"/>
           <w:sz w:val="18"/>
         </w:rPr>
-        <w:t>R. F. Barber, E. J. Candès, A. Ramdas, and R. J. Tibshirani, “Predictive inference with the jackknife+,” Ann. Statist., vol. 49, no. 1, Feb. 2021, doi: 10.1214/20-aos1965.</w:t>
+        <w:t>A. Baheri and M. A. Shahbazi, “Conformal prediction across scales: Finite-sample coverage with hierarchical efficiency,” Results in Applied Mathematics, vol. 26, May 2025, doi: 10.1016/j.rinam.2025.100589.</w:t>
       </w:r>
     </w:p>
     <w:p>
@@ -21803,7 +21646,7 @@
         <w:rPr>
           <w:sz w:val="18"/>
         </w:rPr>
-        <w:t>[24]</w:t>
+        <w:t>[23]</w:t>
         <w:tab/>
       </w:r>
       <w:r>
@@ -21811,7 +21654,7 @@
           <w:i w:val="0"/>
           <w:sz w:val="18"/>
         </w:rPr>
-        <w:t>H. Papadopoulos, “Conformal prediction for multi-label learning: a review of methods and guarantees,” Philosophical Transactions of the Royal Society A: Mathematical, Physical and Engineering Sciences, vol. 384, no. 2327, Art. no. 20250071, Aug. 2026, doi: 10.1098/rsta.2025.0071.</w:t>
+        <w:t>F. M. Dias, H. L. M. Monteiro, T. W. Cabral, R. Naji, M. Kuehni, and E. J. d. S. Luz, “Arrhythmia classification from single-lead ECG signals using the inter-patient paradigm,” Computer Methods and Programs in Biomedicine, vol. 202, Apr. 2021, doi: 10.1016/j.cmpb.2021.105948.</w:t>
       </w:r>
     </w:p>
     <w:p>
@@ -21839,7 +21682,7 @@
         <w:rPr>
           <w:sz w:val="18"/>
         </w:rPr>
-        <w:t>[25]</w:t>
+        <w:t>[24]</w:t>
         <w:tab/>
       </w:r>
       <w:r>
@@ -21847,51 +21690,7 @@
           <w:i w:val="0"/>
           <w:sz w:val="18"/>
         </w:rPr>
-        <w:t>L. Maltoudoglou, A. Paisios, L. Lenc, J. Martínek, P. Král, and H. Papadopoulos, “Well-calibrated confidence measures for multi-label text classification with a large number of labels,” Pattern Recognition, vol. 122, Feb. 2022, doi: 10.1016/j.patcog.2021.108271.</w:t>
-      </w:r>
-    </w:p>
-    <w:p>
-      <w:pPr>
-        <w:pStyle w:val="BodyText"/>
-        <w:tabs>
-          <w:tab w:pos="440" w:val="left"/>
-        </w:tabs>
-        <w:spacing w:after="40"/>
-        <w:ind w:left="440" w:hanging="440"/>
-        <w:jc w:val="both"/>
-      </w:pPr>
-      <w:r/>
-      <w:r/>
-      <w:r>
-        <w:rPr>
-          <w:i/>
-          <w:iCs/>
-        </w:rPr>
-      </w:r>
-      <w:r/>
-      <w:r/>
-      <w:r/>
-      <w:r/>
-      <w:r>
-        <w:rPr>
-          <w:i/>
-          <w:iCs/>
-        </w:rPr>
-      </w:r>
-      <w:r/>
-      <w:r>
-        <w:rPr>
-          <w:sz w:val="18"/>
-        </w:rPr>
-        <w:t>[26]</w:t>
-        <w:tab/>
-      </w:r>
-      <w:r>
-        <w:rPr>
-          <w:i w:val="0"/>
-          <w:sz w:val="18"/>
-        </w:rPr>
-        <w:t>W. Huang et al., “HmcNet: A General Approach for Hierarchical Multi-Label Classification,” IEEE Trans. Knowl. Data Eng., vol. 35, no. 9, pp. 8713–8728, Sep. 2023, doi: 10.1109/tkde.2022.3207511.</w:t>
+        <w:t>Y. Li, R. Qian, and K. Li, “Inter-patient arrhythmia classification with improved deep residual convolutional neural network,” Computer Methods and Programs in Biomedicine, vol. 214, Feb. 2022, doi: 10.1016/j.cmpb.2021.106582.</w:t>
       </w:r>
     </w:p>
     <w:p>
@@ -21919,7 +21718,7 @@
         <w:rPr>
           <w:sz w:val="18"/>
         </w:rPr>
-        <w:t>[27]</w:t>
+        <w:t>[25]</w:t>
         <w:tab/>
       </w:r>
       <w:r>
@@ -21927,7 +21726,7 @@
           <w:i w:val="0"/>
           <w:sz w:val="18"/>
         </w:rPr>
-        <w:t>M. Sun, J. Niu, X. Yang, Y. Gu, and W. Zhang, “CEHMR: Curriculum learning enhanced hierarchical multi-label classification for medication recommendation,” Artificial Intelligence in Medicine, vol. 143, Sep. 2023, doi: 10.1016/j.artmed.2023.102613.</w:t>
+        <w:t>G. Wang, M. Chen, Z. Ding, J. Li, H. Yang, and P. Zhang, “Inter-patient ECG arrhythmia heartbeat classification based on unsupervised domain adaptation,” Neurocomputing, vol. 454, pp. 339–349, Sep. 2021, doi: 10.1016/j.neucom.2021.04.104.</w:t>
       </w:r>
     </w:p>
     <w:p>
@@ -21955,7 +21754,7 @@
         <w:rPr>
           <w:sz w:val="18"/>
         </w:rPr>
-        <w:t>[28]</w:t>
+        <w:t>[26]</w:t>
         <w:tab/>
       </w:r>
       <w:r>
@@ -21963,7 +21762,187 @@
           <w:i w:val="0"/>
           <w:sz w:val="18"/>
         </w:rPr>
-        <w:t>A. Baheri and M. A. Shahbazi, “Conformal prediction across scales: Finite-sample coverage with hierarchical efficiency,” Results in Applied Mathematics, vol. 26, May 2025, doi: 10.1016/j.rinam.2025.100589.</w:t>
+        <w:t>A. N. Angelopoulos, “Conformal risk control for non-monotonic losses,” Philosophical Transactions of the Royal Society A: Mathematical, Physical and Engineering Sciences, vol. 384, no. 2327, Art. no. 20250068, Aug. 2026, doi: 10.1098/rsta.2025.0068.</w:t>
+      </w:r>
+    </w:p>
+    <w:p>
+      <w:pPr>
+        <w:pStyle w:val="BodyText"/>
+        <w:tabs>
+          <w:tab w:pos="440" w:val="left"/>
+        </w:tabs>
+        <w:spacing w:after="40"/>
+        <w:ind w:left="440" w:hanging="440"/>
+        <w:jc w:val="both"/>
+      </w:pPr>
+      <w:r/>
+      <w:r/>
+      <w:r/>
+      <w:r/>
+      <w:r>
+        <w:rPr>
+          <w:i/>
+          <w:iCs/>
+        </w:rPr>
+      </w:r>
+      <w:r/>
+      <w:r>
+        <w:rPr>
+          <w:sz w:val="18"/>
+        </w:rPr>
+        <w:t>[27]</w:t>
+        <w:tab/>
+      </w:r>
+      <w:r>
+        <w:rPr>
+          <w:i w:val="0"/>
+          <w:sz w:val="18"/>
+        </w:rPr>
+        <w:t>C. Xu and Y. Xie, “Conformal Prediction for Time Series,” IEEE Trans. Pattern Anal. Mach. Intell., vol. 45, no. 10, pp. 11575–11587, Oct. 2023, doi: 10.1109/tpami.2023.3272339.</w:t>
+      </w:r>
+    </w:p>
+    <w:p>
+      <w:pPr>
+        <w:pStyle w:val="BodyText"/>
+        <w:tabs>
+          <w:tab w:pos="440" w:val="left"/>
+        </w:tabs>
+        <w:spacing w:after="40"/>
+        <w:ind w:left="440" w:hanging="440"/>
+        <w:jc w:val="both"/>
+      </w:pPr>
+      <w:r/>
+      <w:r/>
+      <w:r/>
+      <w:r/>
+      <w:r>
+        <w:rPr>
+          <w:i/>
+          <w:iCs/>
+        </w:rPr>
+      </w:r>
+      <w:r/>
+      <w:r>
+        <w:rPr>
+          <w:sz w:val="18"/>
+        </w:rPr>
+        <w:t>[28]</w:t>
+        <w:tab/>
+      </w:r>
+      <w:r>
+        <w:rPr>
+          <w:i w:val="0"/>
+          <w:sz w:val="18"/>
+        </w:rPr>
+        <w:t>M. A. Shahbazi, A. Baheri, and N. Azadeh-Fard, “A hierarchical conformal framework for uncertainty-aware length of stay prediction in multi-hospital settings,” Sci Rep, vol. 16, no. 1, Art. no. 6564, Jan. 2026, doi: 10.1038/s41598-026-37450-w.</w:t>
+      </w:r>
+    </w:p>
+    <w:p>
+      <w:pPr>
+        <w:pStyle w:val="BodyText"/>
+        <w:tabs>
+          <w:tab w:pos="440" w:val="left"/>
+        </w:tabs>
+        <w:spacing w:after="40"/>
+        <w:ind w:left="440" w:hanging="440"/>
+        <w:jc w:val="both"/>
+      </w:pPr>
+      <w:r/>
+      <w:r/>
+      <w:r/>
+      <w:r/>
+      <w:r>
+        <w:rPr>
+          <w:i/>
+          <w:iCs/>
+        </w:rPr>
+      </w:r>
+      <w:r/>
+      <w:r>
+        <w:rPr>
+          <w:sz w:val="18"/>
+        </w:rPr>
+        <w:t>[29]</w:t>
+        <w:tab/>
+      </w:r>
+      <w:r>
+        <w:rPr>
+          <w:i w:val="0"/>
+          <w:sz w:val="18"/>
+        </w:rPr>
+        <w:t>I. R. White and J. Thomas, “Standardized mean differences in individually-randomized and cluster-randomized trials, with applications to meta-analysis,” Clinical Trials, vol. 2, no. 2, pp. 141–151, Apr. 2005, doi: 10.1191/1740774505cn081oa.</w:t>
+      </w:r>
+    </w:p>
+    <w:p>
+      <w:pPr>
+        <w:pStyle w:val="BodyText"/>
+        <w:tabs>
+          <w:tab w:pos="440" w:val="left"/>
+        </w:tabs>
+        <w:spacing w:after="40"/>
+        <w:ind w:left="440" w:hanging="440"/>
+        <w:jc w:val="both"/>
+      </w:pPr>
+      <w:r/>
+      <w:r/>
+      <w:r/>
+      <w:r/>
+      <w:r>
+        <w:rPr>
+          <w:i/>
+          <w:iCs/>
+        </w:rPr>
+      </w:r>
+      <w:r/>
+      <w:r>
+        <w:rPr>
+          <w:sz w:val="18"/>
+        </w:rPr>
+        <w:t>[30]</w:t>
+        <w:tab/>
+      </w:r>
+      <w:r>
+        <w:rPr>
+          <w:i w:val="0"/>
+          <w:sz w:val="18"/>
+        </w:rPr>
+        <w:t>S. M. Kerry and J. Martin Bland, “Unequal cluster sizes for trials in English and Welsh general practice: implications for sample size calculations,” Statist. Med., vol. 20, no. 3, pp. 377–390, Feb. 2001, doi: 10.1002/1097-0258(20010215)20:3&lt;377::aid-sim799&gt;3.0.co;2-n.</w:t>
+      </w:r>
+    </w:p>
+    <w:p>
+      <w:pPr>
+        <w:pStyle w:val="BodyText"/>
+        <w:tabs>
+          <w:tab w:pos="440" w:val="left"/>
+        </w:tabs>
+        <w:spacing w:after="40"/>
+        <w:ind w:left="440" w:hanging="440"/>
+        <w:jc w:val="both"/>
+      </w:pPr>
+      <w:r/>
+      <w:r/>
+      <w:r/>
+      <w:r/>
+      <w:r>
+        <w:rPr>
+          <w:i/>
+          <w:iCs/>
+        </w:rPr>
+      </w:r>
+      <w:r/>
+      <w:r>
+        <w:rPr>
+          <w:sz w:val="18"/>
+        </w:rPr>
+        <w:t>[31]</w:t>
+        <w:tab/>
+      </w:r>
+      <w:r>
+        <w:rPr>
+          <w:i w:val="0"/>
+          <w:sz w:val="18"/>
+        </w:rPr>
+        <w:t>D. Zhan, L. Xu, Y. Ouyang, R. Sawatzky, and H. Wong, “Methods for dealing with unequal cluster sizes in cluster randomized trials: A scoping review,” PLoS ONE, vol. 16, no. 7, Art. no. e0255389, Jul. 2021, doi: 10.1371/journal.pone.0255389.</w:t>
       </w:r>
     </w:p>
     <w:p>
@@ -21985,7 +21964,7 @@
         <w:rPr>
           <w:sz w:val="18"/>
         </w:rPr>
-        <w:t>[29]</w:t>
+        <w:t>[32]</w:t>
         <w:tab/>
       </w:r>
       <w:r>
@@ -21993,367 +21972,7 @@
           <w:i w:val="0"/>
           <w:sz w:val="18"/>
         </w:rPr>
-        <w:t>B. Zhang, S. Li, and O. Bastani, “Conformal Structured Prediction,” arXiv:2410.06296, Oct. 2024.</w:t>
-      </w:r>
-    </w:p>
-    <w:p>
-      <w:pPr>
-        <w:pStyle w:val="BodyText"/>
-        <w:tabs>
-          <w:tab w:pos="440" w:val="left"/>
-        </w:tabs>
-        <w:spacing w:after="40"/>
-        <w:ind w:left="440" w:hanging="440"/>
-        <w:jc w:val="both"/>
-      </w:pPr>
-      <w:r/>
-      <w:r/>
-      <w:r/>
-      <w:r/>
-      <w:r>
-        <w:rPr>
-          <w:i/>
-          <w:iCs/>
-        </w:rPr>
-      </w:r>
-      <w:r/>
-      <w:r>
-        <w:rPr>
-          <w:sz w:val="18"/>
-        </w:rPr>
-        <w:t>[30]</w:t>
-        <w:tab/>
-      </w:r>
-      <w:r>
-        <w:rPr>
-          <w:i w:val="0"/>
-          <w:sz w:val="18"/>
-        </w:rPr>
-        <w:t>F. M. Dias, H. L. M. Monteiro, T. W. Cabral, R. Naji, M. Kuehni, and E. J. d. S. Luz, “Arrhythmia classification from single-lead ECG signals using the inter-patient paradigm,” Computer Methods and Programs in Biomedicine, vol. 202, Apr. 2021, doi: 10.1016/j.cmpb.2021.105948.</w:t>
-      </w:r>
-    </w:p>
-    <w:p>
-      <w:pPr>
-        <w:pStyle w:val="BodyText"/>
-        <w:tabs>
-          <w:tab w:pos="440" w:val="left"/>
-        </w:tabs>
-        <w:spacing w:after="40"/>
-        <w:ind w:left="440" w:hanging="440"/>
-        <w:jc w:val="both"/>
-      </w:pPr>
-      <w:r/>
-      <w:r/>
-      <w:r/>
-      <w:r/>
-      <w:r>
-        <w:rPr>
-          <w:i/>
-          <w:iCs/>
-        </w:rPr>
-      </w:r>
-      <w:r/>
-      <w:r>
-        <w:rPr>
-          <w:sz w:val="18"/>
-        </w:rPr>
-        <w:t>[31]</w:t>
-        <w:tab/>
-      </w:r>
-      <w:r>
-        <w:rPr>
-          <w:i w:val="0"/>
-          <w:sz w:val="18"/>
-        </w:rPr>
-        <w:t>Y. Li, R. Qian, and K. Li, “Inter-patient arrhythmia classification with improved deep residual convolutional neural network,” Computer Methods and Programs in Biomedicine, vol. 214, Feb. 2022, doi: 10.1016/j.cmpb.2021.106582.</w:t>
-      </w:r>
-    </w:p>
-    <w:p>
-      <w:pPr>
-        <w:pStyle w:val="BodyText"/>
-        <w:tabs>
-          <w:tab w:pos="440" w:val="left"/>
-        </w:tabs>
-        <w:spacing w:after="40"/>
-        <w:ind w:left="440" w:hanging="440"/>
-        <w:jc w:val="both"/>
-      </w:pPr>
-      <w:r/>
-      <w:r/>
-      <w:r/>
-      <w:r/>
-      <w:r>
-        <w:rPr>
-          <w:i/>
-          <w:iCs/>
-        </w:rPr>
-      </w:r>
-      <w:r/>
-      <w:r>
-        <w:rPr>
-          <w:sz w:val="18"/>
-        </w:rPr>
-        <w:t>[32]</w:t>
-        <w:tab/>
-      </w:r>
-      <w:r>
-        <w:rPr>
-          <w:i w:val="0"/>
-          <w:sz w:val="18"/>
-        </w:rPr>
-        <w:t>G. Wang, M. Chen, Z. Ding, J. Li, H. Yang, and P. Zhang, “Inter-patient ECG arrhythmia heartbeat classification based on unsupervised domain adaptation,” Neurocomputing, vol. 454, pp. 339–349, Sep. 2021, doi: 10.1016/j.neucom.2021.04.104.</w:t>
-      </w:r>
-    </w:p>
-    <w:p>
-      <w:pPr>
-        <w:pStyle w:val="BodyText"/>
-        <w:tabs>
-          <w:tab w:pos="440" w:val="left"/>
-        </w:tabs>
-        <w:spacing w:after="40"/>
-        <w:ind w:left="440" w:hanging="440"/>
-        <w:jc w:val="both"/>
-      </w:pPr>
-      <w:r/>
-      <w:r/>
-      <w:r/>
-      <w:r/>
-      <w:r>
-        <w:rPr>
-          <w:i/>
-          <w:iCs/>
-        </w:rPr>
-      </w:r>
-      <w:r/>
-      <w:r>
-        <w:rPr>
-          <w:sz w:val="18"/>
-        </w:rPr>
-        <w:t>[33]</w:t>
-        <w:tab/>
-      </w:r>
-      <w:r>
-        <w:rPr>
-          <w:i w:val="0"/>
-          <w:sz w:val="18"/>
-        </w:rPr>
-        <w:t>J. Jonkers, F. Coopman, L. Duchateau, G. Van Wallendael, and S. Van Hoecke, “Reliable uncertainty quantification for 2D/3D anatomical landmark localization using multi-output conformal prediction,” Medical Image Analysis, vol. 110, May 2026, doi: 10.1016/j.media.2026.103953.</w:t>
-      </w:r>
-    </w:p>
-    <w:p>
-      <w:pPr>
-        <w:pStyle w:val="BodyText"/>
-        <w:tabs>
-          <w:tab w:pos="440" w:val="left"/>
-        </w:tabs>
-        <w:spacing w:after="40"/>
-        <w:ind w:left="440" w:hanging="440"/>
-        <w:jc w:val="both"/>
-      </w:pPr>
-      <w:r/>
-      <w:r/>
-      <w:r/>
-      <w:r/>
-      <w:r>
-        <w:rPr>
-          <w:i/>
-          <w:iCs/>
-        </w:rPr>
-      </w:r>
-      <w:r/>
-      <w:r>
-        <w:rPr>
-          <w:sz w:val="18"/>
-        </w:rPr>
-        <w:t>[34]</w:t>
-        <w:tab/>
-      </w:r>
-      <w:r>
-        <w:rPr>
-          <w:i w:val="0"/>
-          <w:sz w:val="18"/>
-        </w:rPr>
-        <w:t>A. N. Angelopoulos, “Conformal risk control for non-monotonic losses,” Philosophical Transactions of the Royal Society A: Mathematical, Physical and Engineering Sciences, vol. 384, no. 2327, Art. no. 20250068, Aug. 2026, doi: 10.1098/rsta.2025.0068.</w:t>
-      </w:r>
-    </w:p>
-    <w:p>
-      <w:pPr>
-        <w:pStyle w:val="BodyText"/>
-        <w:tabs>
-          <w:tab w:pos="440" w:val="left"/>
-        </w:tabs>
-        <w:spacing w:after="40"/>
-        <w:ind w:left="440" w:hanging="440"/>
-        <w:jc w:val="both"/>
-      </w:pPr>
-      <w:r/>
-      <w:r/>
-      <w:r/>
-      <w:r/>
-      <w:r>
-        <w:rPr>
-          <w:i/>
-          <w:iCs/>
-        </w:rPr>
-      </w:r>
-      <w:r/>
-      <w:r>
-        <w:rPr>
-          <w:sz w:val="18"/>
-        </w:rPr>
-        <w:t>[35]</w:t>
-        <w:tab/>
-      </w:r>
-      <w:r>
-        <w:rPr>
-          <w:i w:val="0"/>
-          <w:sz w:val="18"/>
-        </w:rPr>
-        <w:t>C. Xu and Y. Xie, “Conformal Prediction for Time Series,” IEEE Trans. Pattern Anal. Mach. Intell., vol. 45, no. 10, pp. 11575–11587, Oct. 2023, doi: 10.1109/tpami.2023.3272339.</w:t>
-      </w:r>
-    </w:p>
-    <w:p>
-      <w:pPr>
-        <w:pStyle w:val="BodyText"/>
-        <w:tabs>
-          <w:tab w:pos="440" w:val="left"/>
-        </w:tabs>
-        <w:spacing w:after="40"/>
-        <w:ind w:left="440" w:hanging="440"/>
-        <w:jc w:val="both"/>
-      </w:pPr>
-      <w:r/>
-      <w:r/>
-      <w:r/>
-      <w:r/>
-      <w:r>
-        <w:rPr>
-          <w:i/>
-          <w:iCs/>
-        </w:rPr>
-      </w:r>
-      <w:r/>
-      <w:r>
-        <w:rPr>
-          <w:sz w:val="18"/>
-        </w:rPr>
-        <w:t>[36]</w:t>
-        <w:tab/>
-      </w:r>
-      <w:r>
-        <w:rPr>
-          <w:i w:val="0"/>
-          <w:sz w:val="18"/>
-        </w:rPr>
-        <w:t>M. A. Shahbazi, A. Baheri, and N. Azadeh-Fard, “A hierarchical conformal framework for uncertainty-aware length of stay prediction in multi-hospital settings,” Sci Rep, vol. 16, no. 1, Art. no. 6564, Jan. 2026, doi: 10.1038/s41598-026-37450-w.</w:t>
-      </w:r>
-    </w:p>
-    <w:p>
-      <w:pPr>
-        <w:pStyle w:val="BodyText"/>
-        <w:tabs>
-          <w:tab w:pos="440" w:val="left"/>
-        </w:tabs>
-        <w:spacing w:after="40"/>
-        <w:ind w:left="440" w:hanging="440"/>
-        <w:jc w:val="both"/>
-      </w:pPr>
-      <w:r/>
-      <w:r/>
-      <w:r/>
-      <w:r/>
-      <w:r>
-        <w:rPr>
-          <w:i/>
-          <w:iCs/>
-        </w:rPr>
-      </w:r>
-      <w:r/>
-      <w:r>
-        <w:rPr>
-          <w:sz w:val="18"/>
-        </w:rPr>
-        <w:t>[37]</w:t>
-        <w:tab/>
-      </w:r>
-      <w:r>
-        <w:rPr>
-          <w:i w:val="0"/>
-          <w:sz w:val="18"/>
-        </w:rPr>
-        <w:t>I. R. White and J. Thomas, “Standardized mean differences in individually-randomized and cluster-randomized trials, with applications to meta-analysis,” Clinical Trials, vol. 2, no. 2, pp. 141–151, Apr. 2005, doi: 10.1191/1740774505cn081oa.</w:t>
-      </w:r>
-    </w:p>
-    <w:p>
-      <w:pPr>
-        <w:pStyle w:val="BodyText"/>
-        <w:tabs>
-          <w:tab w:pos="440" w:val="left"/>
-        </w:tabs>
-        <w:spacing w:after="40"/>
-        <w:ind w:left="440" w:hanging="440"/>
-        <w:jc w:val="both"/>
-      </w:pPr>
-      <w:r/>
-      <w:r/>
-      <w:r/>
-      <w:r/>
-      <w:r>
-        <w:rPr>
-          <w:i/>
-          <w:iCs/>
-        </w:rPr>
-      </w:r>
-      <w:r/>
-      <w:r>
-        <w:rPr>
-          <w:sz w:val="18"/>
-        </w:rPr>
-        <w:t>[38]</w:t>
-        <w:tab/>
-      </w:r>
-      <w:r>
-        <w:rPr>
-          <w:i w:val="0"/>
-          <w:sz w:val="18"/>
-        </w:rPr>
-        <w:t>S. M. Kerry and J. Martin Bland, “Unequal cluster sizes for trials in English and Welsh general practice: implications for sample size calculations,” Statist. Med., vol. 20, no. 3, pp. 377–390, Feb. 2001, doi: 10.1002/1097-0258(20010215)20:3&lt;377::aid-sim799&gt;3.0.co;2-n.</w:t>
-      </w:r>
-    </w:p>
-    <w:p>
-      <w:pPr>
-        <w:pStyle w:val="BodyText"/>
-        <w:tabs>
-          <w:tab w:pos="440" w:val="left"/>
-        </w:tabs>
-        <w:spacing w:after="40"/>
-        <w:ind w:left="440" w:hanging="440"/>
-        <w:jc w:val="both"/>
-      </w:pPr>
-      <w:r/>
-      <w:r/>
-      <w:r/>
-      <w:r/>
-      <w:r>
-        <w:rPr>
-          <w:i/>
-          <w:iCs/>
-        </w:rPr>
-      </w:r>
-      <w:r/>
-      <w:r>
-        <w:rPr>
-          <w:sz w:val="18"/>
-        </w:rPr>
-        <w:t>[39]</w:t>
-        <w:tab/>
-      </w:r>
-      <w:r>
-        <w:rPr>
-          <w:i w:val="0"/>
-          <w:sz w:val="18"/>
-        </w:rPr>
-        <w:t>D. Zhan, L. Xu, Y. Ouyang, R. Sawatzky, and H. Wong, “Methods for dealing with unequal cluster sizes in cluster randomized trials: A scoping review,” PLoS ONE, vol. 16, no. 7, Art. no. e0255389, Jul. 2021, doi: 10.1371/journal.pone.0255389.</w:t>
+        <w:t>A. Noonan, “The Exceedance Design Effect: Effective Sample Size for Thresholds under Clustering,” arXiv:2608.21262, Aug. 2026.</w:t>
       </w:r>
     </w:p>
     <w:p>
@@ -22375,37 +21994,7 @@
         <w:rPr>
           <w:sz w:val="18"/>
         </w:rPr>
-        <w:t>[40]</w:t>
-        <w:tab/>
-      </w:r>
-      <w:r>
-        <w:rPr>
-          <w:i w:val="0"/>
-          <w:sz w:val="18"/>
-        </w:rPr>
-        <w:t>A. Noonan, “The Exceedance Design Effect: Effective Sample Size for Thresholds under Clustering,” arXiv:2608.21262, Aug. 2026.</w:t>
-      </w:r>
-    </w:p>
-    <w:p>
-      <w:pPr>
-        <w:pStyle w:val="BodyText"/>
-        <w:tabs>
-          <w:tab w:pos="440" w:val="left"/>
-        </w:tabs>
-        <w:spacing w:after="40"/>
-        <w:ind w:left="440" w:hanging="440"/>
-        <w:jc w:val="both"/>
-      </w:pPr>
-      <w:r/>
-      <w:r/>
-      <w:r/>
-      <w:r/>
-      <w:r/>
-      <w:r>
-        <w:rPr>
-          <w:sz w:val="18"/>
-        </w:rPr>
-        <w:t>[41]</w:t>
+        <w:t>[33]</w:t>
         <w:tab/>
       </w:r>
       <w:r>
@@ -22443,7 +22032,7 @@
         <w:rPr>
           <w:sz w:val="18"/>
         </w:rPr>
-        <w:t>[42]</w:t>
+        <w:t>[34]</w:t>
         <w:tab/>
       </w:r>
       <w:r>
@@ -22479,79 +22068,7 @@
         <w:rPr>
           <w:sz w:val="18"/>
         </w:rPr>
-        <w:t>[43]</w:t>
-        <w:tab/>
-      </w:r>
-      <w:r>
-        <w:rPr>
-          <w:i w:val="0"/>
-          <w:sz w:val="18"/>
-        </w:rPr>
-        <w:t>Y. Li, Z. Zhang, and X. Zhou, “Fair Uncertainty Quantification for Depression Prediction,” IEEE Trans. Affective Comput., vol. 17, no. 3, pp. 3271–3282, Jul. 2026, doi: 10.1109/taffc.2026.3702998.</w:t>
-      </w:r>
-    </w:p>
-    <w:p>
-      <w:pPr>
-        <w:pStyle w:val="BodyText"/>
-        <w:tabs>
-          <w:tab w:pos="440" w:val="left"/>
-        </w:tabs>
-        <w:spacing w:after="40"/>
-        <w:ind w:left="440" w:hanging="440"/>
-        <w:jc w:val="both"/>
-      </w:pPr>
-      <w:r/>
-      <w:r/>
-      <w:r/>
-      <w:r/>
-      <w:r>
-        <w:rPr>
-          <w:i/>
-          <w:iCs/>
-        </w:rPr>
-      </w:r>
-      <w:r/>
-      <w:r>
-        <w:rPr>
-          <w:sz w:val="18"/>
-        </w:rPr>
-        <w:t>[44]</w:t>
-        <w:tab/>
-      </w:r>
-      <w:r>
-        <w:rPr>
-          <w:i w:val="0"/>
-          <w:sz w:val="18"/>
-        </w:rPr>
-        <w:t>R. Bahrami and A. M. Fotouhi, “Investigation of Inter-Patient, Intra-Patient, and Patient-Specific Based Training in Deep Learning for Classification of Heartbeat Arrhythmia,” Cardiovasc Eng Tech, vol. 16, no. 3, pp. 333–342, Jun. 2025, doi: 10.1007/s13239-025-00777-y.</w:t>
-      </w:r>
-    </w:p>
-    <w:p>
-      <w:pPr>
-        <w:pStyle w:val="BodyText"/>
-        <w:tabs>
-          <w:tab w:pos="440" w:val="left"/>
-        </w:tabs>
-        <w:spacing w:after="40"/>
-        <w:ind w:left="440" w:hanging="440"/>
-        <w:jc w:val="both"/>
-      </w:pPr>
-      <w:r/>
-      <w:r/>
-      <w:r/>
-      <w:r/>
-      <w:r>
-        <w:rPr>
-          <w:i/>
-          <w:iCs/>
-        </w:rPr>
-      </w:r>
-      <w:r/>
-      <w:r>
-        <w:rPr>
-          <w:sz w:val="18"/>
-        </w:rPr>
-        <w:t>[45]</w:t>
+        <w:t>[35]</w:t>
         <w:tab/>
       </w:r>
       <w:r>
@@ -22560,86 +22077,6 @@
           <w:sz w:val="18"/>
         </w:rPr>
         <w:t>P. C. Marques F., “Universal distribution of the empirical coverage in split conformal prediction,” Statistics &amp; Probability Letters, vol. 219, Apr. 2025, doi: 10.1016/j.spl.2024.110350.</w:t>
-      </w:r>
-    </w:p>
-    <w:p>
-      <w:pPr>
-        <w:pStyle w:val="BodyText"/>
-        <w:tabs>
-          <w:tab w:pos="440" w:val="left"/>
-        </w:tabs>
-        <w:spacing w:after="40"/>
-        <w:ind w:left="440" w:hanging="440"/>
-        <w:jc w:val="both"/>
-      </w:pPr>
-      <w:r/>
-      <w:r/>
-      <w:r/>
-      <w:r/>
-      <w:r>
-        <w:rPr>
-          <w:i/>
-          <w:iCs/>
-        </w:rPr>
-      </w:r>
-      <w:r/>
-      <w:r>
-        <w:rPr>
-          <w:sz w:val="18"/>
-        </w:rPr>
-        <w:t>[46]</w:t>
-        <w:tab/>
-      </w:r>
-      <w:r>
-        <w:rPr>
-          <w:i w:val="0"/>
-          <w:sz w:val="18"/>
-        </w:rPr>
-        <w:t>D. Wang, P. Wang, Z. Ji, X. Yang, and H. Li, “Conformal Loss-Controlling Prediction,” IEEE Trans. Neural Netw. Learning Syst., vol. 36, no. 2, pp. 2973–2983, Feb. 2025, doi: 10.1109/tnnls.2024.3356512.</w:t>
-      </w:r>
-    </w:p>
-    <w:p>
-      <w:pPr>
-        <w:pStyle w:val="BodyText"/>
-        <w:tabs>
-          <w:tab w:pos="440" w:val="left"/>
-        </w:tabs>
-        <w:spacing w:after="40"/>
-        <w:ind w:left="440" w:hanging="440"/>
-        <w:jc w:val="both"/>
-      </w:pPr>
-      <w:r/>
-      <w:r/>
-      <w:r>
-        <w:rPr>
-          <w:i/>
-          <w:iCs/>
-        </w:rPr>
-      </w:r>
-      <w:r/>
-      <w:r/>
-      <w:r/>
-      <w:r/>
-      <w:r>
-        <w:rPr>
-          <w:i/>
-          <w:iCs/>
-        </w:rPr>
-      </w:r>
-      <w:r/>
-      <w:r>
-        <w:rPr>
-          <w:sz w:val="18"/>
-        </w:rPr>
-        <w:t>[47]</w:t>
-        <w:tab/>
-      </w:r>
-      <w:r>
-        <w:rPr>
-          <w:i w:val="0"/>
-          <w:sz w:val="18"/>
-        </w:rPr>
-        <w:t>T. Bender et al., “Analysis of a Deep Learning Model for 12-Lead ECG Classification Reveals Learned Features Similar to Diagnostic Criteria,” IEEE J. Biomed. Health Inform., vol. 28, no. 4, pp. 1848–1859, Apr. 2024, doi: 10.1109/jbhi.2023.3271858.</w:t>
       </w:r>
     </w:p>
     <w:bookmarkEnd w:id="71"/>

</xml_diff>

<commit_message>
Pertajam klaim sesuai kekuatan bukti (tanggapan review eksternal)
s1: tiga tingkat bukti (terbukti/teramati/tidak diklaim). s2: tambahan relatif terhadap Lee et al. dinyatakan eksplisit. s5.3: judul netral, istilah mechanical didefinisikan (tidak berarti HCP tidak valid). s5.4: dose-response = intervensi mekanistik dalam satu dataset, bukan validasi eksternal/kausal. s6.1: klaim repetisi dibatasi pada dua sumber yang diaudit. s6.4: riwayat analisis dibingkai sebagai jejak audit. Tetap 19 halaman, 35 rujukan.
</commit_message>
<xml_diff>
--- a/docs/paper/manuscript-draft.docx
+++ b/docs/paper/manuscript-draft.docx
@@ -20,7 +20,7 @@
           <w:i/>
           <w:iCs/>
         </w:rPr>
-        <w:t xml:space="preserve">Working draft for internal review — generated 2026-10-03 from commit 8ce38ae.</w:t>
+        <w:t xml:space="preserve">Working draft for internal review — generated 2026-10-03 from commit f624660.</w:t>
       </w:r>
     </w:p>
     <w:bookmarkStart w:id="9" w:name="abstract"/>
@@ -765,7 +765,31 @@
         <w:t xml:space="preserve"> </w:t>
       </w:r>
       <w:r>
-        <w:t xml:space="preserve">held-out PTB-XL fold remains unexamined. Code, per-result artifacts, the analysis</w:t>
+        <w:t xml:space="preserve">held-out PTB-XL fold remains unexamined. We keep three levels of evidence apart:</w:t>
+      </w:r>
+      <w:r>
+        <w:t xml:space="preserve"> </w:t>
+      </w:r>
+      <w:r>
+        <w:t xml:space="preserve">what is proved (Propositions 1–3 and Corollaries 1–2, exact given the declared</w:t>
+      </w:r>
+      <w:r>
+        <w:t xml:space="preserve"> </w:t>
+      </w:r>
+      <w:r>
+        <w:t xml:space="preserve">sources), what is observed on the audited records (§5.2–§5.5), and what is not</w:t>
+      </w:r>
+      <w:r>
+        <w:t xml:space="preserve"> </w:t>
+      </w:r>
+      <w:r>
+        <w:t xml:space="preserve">claimed, namely the population-level sign of the MIT-BIH deficit and a causal</w:t>
+      </w:r>
+      <w:r>
+        <w:t xml:space="preserve"> </w:t>
+      </w:r>
+      <w:r>
+        <w:t xml:space="preserve">role for the design effect. Code, per-result artifacts, the analysis</w:t>
       </w:r>
       <w:r>
         <w:t xml:space="preserve"> </w:t>
@@ -1172,7 +1196,31 @@
         <w:t xml:space="preserve"> </w:t>
       </w:r>
       <w:r>
-        <w:t xml:space="preserve">finite-block correction is removed.</w:t>
+        <w:t xml:space="preserve">finite-block correction is removed. Relative to Lee et al. [12], whose threshold</w:t>
+      </w:r>
+      <w:r>
+        <w:t xml:space="preserve"> </w:t>
+      </w:r>
+      <w:r>
+        <w:t xml:space="preserve">and guarantee we take as given, the additions are the join of crossed sources as</w:t>
+      </w:r>
+      <w:r>
+        <w:t xml:space="preserve"> </w:t>
+      </w:r>
+      <w:r>
+        <w:t xml:space="preserve">the finest admissible grouping, the per-label block count, their evaluation from</w:t>
+      </w:r>
+      <w:r>
+        <w:t xml:space="preserve"> </w:t>
+      </w:r>
+      <w:r>
+        <w:t xml:space="preserve">metadata alone, and an empirical decomposition of the coverage gap with a</w:t>
+      </w:r>
+      <w:r>
+        <w:t xml:space="preserve"> </w:t>
+      </w:r>
+      <w:r>
+        <w:t xml:space="preserve">matched permutation null and a factorial design.</w:t>
       </w:r>
     </w:p>
     <w:bookmarkEnd w:id="15"/>
@@ -13456,13 +13504,13 @@
       </w:r>
     </w:p>
     <w:bookmarkEnd w:id="44"/>
-    <w:bookmarkStart w:id="48" w:name="X971afb3920367740875daf59080031d77744c88"/>
+    <w:bookmarkStart w:id="48" w:name="attributing-the-deficit-to-dependence"/>
     <w:p>
       <w:pPr>
         <w:pStyle w:val="Heading2"/>
       </w:pPr>
       <w:r>
-        <w:t xml:space="preserve">5.3 The deficit is attributable to dependence</w:t>
+        <w:t xml:space="preserve">5.3 Attributing the deficit to dependence</w:t>
       </w:r>
     </w:p>
     <w:p>
@@ -14606,19 +14654,47 @@
         <w:jc w:val="both"/>
       </w:pPr>
       <w:r>
-        <w:t xml:space="preserve">The same control explains why a B12-against-B1 comparison is uninformative. Define the</w:t>
-      </w:r>
-      <w:r>
-        <w:t xml:space="preserve"> </w:t>
-      </w:r>
-      <w:r>
-        <w:t xml:space="preserve">mechanical share as the B12−B1 gap in the permuted arm divided by the gap on the</w:t>
-      </w:r>
-      <w:r>
-        <w:t xml:space="preserve"> </w:t>
-      </w:r>
-      <w:r>
-        <w:t xml:space="preserve">original data. It lies between 81% and 107%: removing dependence barely changes</w:t>
+        <w:t xml:space="preserve">The same control explains why a B12-against-B1 comparison is uninformative. We</w:t>
+      </w:r>
+      <w:r>
+        <w:t xml:space="preserve"> </w:t>
+      </w:r>
+      <w:r>
+        <w:t xml:space="preserve">call</w:t>
+      </w:r>
+      <w:r>
+        <w:t xml:space="preserve"> </w:t>
+      </w:r>
+      <w:r>
+        <w:rPr>
+          <w:i/>
+          <w:iCs/>
+        </w:rPr>
+        <w:t xml:space="preserve">mechanical</w:t>
+      </w:r>
+      <w:r>
+        <w:t xml:space="preserve"> </w:t>
+      </w:r>
+      <w:r>
+        <w:t xml:space="preserve">the part of the B12−B1 gap that survives a null preserving block</w:t>
+      </w:r>
+      <w:r>
+        <w:t xml:space="preserve"> </w:t>
+      </w:r>
+      <w:r>
+        <w:t xml:space="preserve">geometry: it stems from the finite-block correction rather than from correcting</w:t>
+      </w:r>
+      <w:r>
+        <w:t xml:space="preserve"> </w:t>
+      </w:r>
+      <w:r>
+        <w:t xml:space="preserve">dependence, and implies no loss of validity for HCP. The mechanical share is the</w:t>
+      </w:r>
+      <w:r>
+        <w:t xml:space="preserve"> </w:t>
+      </w:r>
+      <w:r>
+        <w:t xml:space="preserve">gap in the permuted arm divided by the gap on the original data. It lies between 81% and 107%: removing dependence barely changes</w:t>
       </w:r>
       <w:r>
         <w:t xml:space="preserve"> </w:t>
@@ -15285,6 +15361,24 @@
         <w:t xml:space="preserve"> </w:t>
       </w:r>
       <w:r>
+        <w:t xml:space="preserve">The experiment is a mechanistic intervention within one dataset, not an external</w:t>
+      </w:r>
+      <w:r>
+        <w:t xml:space="preserve"> </w:t>
+      </w:r>
+      <w:r>
+        <w:t xml:space="preserve">validation, and its correlations order configurations without showing that the</w:t>
+      </w:r>
+      <w:r>
+        <w:t xml:space="preserve"> </w:t>
+      </w:r>
+      <w:r>
+        <w:t xml:space="preserve">design effect causes the deficit.</w:t>
+      </w:r>
+      <w:r>
+        <w:t xml:space="preserve"> </w:t>
+      </w:r>
+      <w:r>
         <w:t xml:space="preserve">Table 7 reports the correlations on three dependence axes; within MIT-BIH the</w:t>
       </w:r>
       <w:r>
@@ -16908,19 +17002,19 @@
         <w:jc w:val="both"/>
       </w:pPr>
       <w:r>
-        <w:t xml:space="preserve">The second question is statistical, and its answer depends on how many repeats</w:t>
-      </w:r>
-      <w:r>
-        <w:t xml:space="preserve"> </w:t>
-      </w:r>
-      <w:r>
-        <w:t xml:space="preserve">blocks contain more than on how strongly their observations correlate</w:t>
-      </w:r>
-      <w:r>
-        <w:t xml:space="preserve"> </w:t>
-      </w:r>
-      <w:r>
-        <w:t xml:space="preserve">(§5.3–§5.4). PTB-XL shows this most clearly. Its within-patient correlation seems</w:t>
+        <w:t xml:space="preserve">The second question is statistical, and on the two resources audited its answer</w:t>
+      </w:r>
+      <w:r>
+        <w:t xml:space="preserve"> </w:t>
+      </w:r>
+      <w:r>
+        <w:t xml:space="preserve">depended on how many repeats blocks contain more than on how strongly their</w:t>
+      </w:r>
+      <w:r>
+        <w:t xml:space="preserve"> </w:t>
+      </w:r>
+      <w:r>
+        <w:t xml:space="preserve">observations correlate (§5.3–§5.4). PTB-XL shows this most clearly. Its within-patient correlation seems</w:t>
       </w:r>
       <w:r>
         <w:t xml:space="preserve"> </w:t>
@@ -18489,7 +18583,19 @@
         <w:t xml:space="preserve"> </w:t>
       </w:r>
       <w:r>
-        <w:t xml:space="preserve">Our reading of the MIT-BIH evidence changed</w:t>
+        <w:t xml:space="preserve">Because the study audits inferential</w:t>
+      </w:r>
+      <w:r>
+        <w:t xml:space="preserve"> </w:t>
+      </w:r>
+      <w:r>
+        <w:t xml:space="preserve">robustness, its analysis history is part of the evidence. Our reading of the</w:t>
+      </w:r>
+      <w:r>
+        <w:t xml:space="preserve"> </w:t>
+      </w:r>
+      <w:r>
+        <w:t xml:space="preserve">MIT-BIH evidence changed</w:t>
       </w:r>
       <w:r>
         <w:t xml:space="preserve"> </w:t>

</xml_diff>

<commit_message>
s1: kontribusi ditulis sebagai paragraf (First/Second/Third), bukan butir
Isi, angka dan rujukan bagian tetap; 'attributes' -> 'traces' agar tidak mengulang kata atribusi. Tetap 19 halaman.
</commit_message>
<xml_diff>
--- a/docs/paper/manuscript-draft.docx
+++ b/docs/paper/manuscript-draft.docx
@@ -20,7 +20,7 @@
           <w:i/>
           <w:iCs/>
         </w:rPr>
-        <w:t xml:space="preserve">Working draft for internal review — generated 2026-10-03 from commit a87f8f9.</w:t>
+        <w:t xml:space="preserve">Working draft for internal review — generated 2026-10-03 from commit 0ce9dfe.</w:t>
       </w:r>
     </w:p>
     <w:bookmarkStart w:id="9" w:name="abstract"/>
@@ -569,187 +569,161 @@
     <w:p>
       <w:pPr>
         <w:pStyle w:val="BodyText"/>
+        <w:jc w:val="both"/>
       </w:pPr>
       <w:r>
-        <w:t xml:space="preserve">We propose no new conformal procedure. The contributions are three.</w:t>
+        <w:t xml:space="preserve">We propose no new conformal procedure; the contributions are three. First, we</w:t>
+      </w:r>
+      <w:r>
+        <w:t xml:space="preserve"> </w:t>
+      </w:r>
+      <w:r>
+        <w:t xml:space="preserve">give a metadata-only feasibility audit (RQ1; §3, §5.1). Combined with the join</w:t>
+      </w:r>
+      <w:r>
+        <w:t xml:space="preserve"> </w:t>
+      </w:r>
+      <w:r>
+        <w:t xml:space="preserve">of the declared dependence sources, the HCP bound yields exact verdicts before</w:t>
+      </w:r>
+      <w:r>
+        <w:t xml:space="preserve"> </w:t>
+      </w:r>
+      <w:r>
+        <w:t xml:space="preserve">any model is trained: all four documented PTB-XL sources together leave one</w:t>
+      </w:r>
+      <w:r>
+        <w:t xml:space="preserve"> </w:t>
+      </w:r>
+      <w:r>
+        <w:t xml:space="preserve">admissible calibration block, 24 of 44 SCP statements have no finite per-label</w:t>
+      </w:r>
+      <w:r>
+        <w:t xml:space="preserve"> </w:t>
+      </w:r>
+      <w:r>
+        <w:t xml:space="preserve">threshold at</w:t>
+      </w:r>
+      <w:r>
+        <w:t xml:space="preserve"> </w:t>
+      </w:r>
+      <m:oMath>
+        <m:r>
+          <m:t>α</m:t>
+        </m:r>
+        <m:r>
+          <m:rPr>
+            <m:sty m:val="p"/>
+          </m:rPr>
+          <m:t>=</m:t>
+        </m:r>
+        <m:r>
+          <m:t>0.05</m:t>
+        </m:r>
+      </m:oMath>
+      <w:r>
+        <w:t xml:space="preserve"> </w:t>
+      </w:r>
+      <w:r>
+        <w:t xml:space="preserve">under patient blocking, and an even split of the 22</w:t>
+      </w:r>
+      <w:r>
+        <w:t xml:space="preserve"> </w:t>
+      </w:r>
+      <w:r>
+        <w:t xml:space="preserve">MIT-BIH evaluation subjects rules out a subject-level guarantee at the 95% level.</w:t>
       </w:r>
     </w:p>
     <w:p>
       <w:pPr>
-        <w:pStyle w:val="Compact"/>
-        <w:numPr>
-          <w:ilvl w:val="0"/>
-          <w:numId w:val="1001"/>
-        </w:numPr>
+        <w:pStyle w:val="BodyText"/>
+        <w:jc w:val="both"/>
       </w:pPr>
       <w:r>
-        <w:t xml:space="preserve">A metadata-only feasibility audit (RQ1; §3, §5.1). The HCP bound,</w:t>
-      </w:r>
-      <w:r>
-        <w:t xml:space="preserve"> </w:t>
-      </w:r>
-      <w:r>
-        <w:t xml:space="preserve">combined with the join of the declared dependence sources, gives exact verdicts</w:t>
-      </w:r>
-      <w:r>
-        <w:t xml:space="preserve"> </w:t>
-      </w:r>
-      <w:r>
-        <w:t xml:space="preserve">before any model is trained: all four documented PTB-XL sources together leave</w:t>
-      </w:r>
-      <w:r>
-        <w:t xml:space="preserve"> </w:t>
-      </w:r>
-      <w:r>
-        <w:t xml:space="preserve">one admissible calibration block, 24 of 44 SCP statements have no finite</w:t>
-      </w:r>
-      <w:r>
-        <w:t xml:space="preserve"> </w:t>
-      </w:r>
-      <w:r>
-        <w:t xml:space="preserve">per-label threshold at</w:t>
-      </w:r>
-      <w:r>
-        <w:t xml:space="preserve"> </w:t>
-      </w:r>
-      <m:oMath>
-        <m:r>
-          <m:t>α</m:t>
-        </m:r>
-        <m:r>
-          <m:rPr>
-            <m:sty m:val="p"/>
-          </m:rPr>
-          <m:t>=</m:t>
-        </m:r>
-        <m:r>
-          <m:t>0.05</m:t>
-        </m:r>
-      </m:oMath>
-      <w:r>
-        <w:t xml:space="preserve"> </w:t>
-      </w:r>
-      <w:r>
-        <w:t xml:space="preserve">under patient blocking, and an even split</w:t>
-      </w:r>
-      <w:r>
-        <w:t xml:space="preserve"> </w:t>
-      </w:r>
-      <w:r>
-        <w:t xml:space="preserve">of the 22 MIT-BIH evaluation subjects rules out a subject-level guarantee at</w:t>
-      </w:r>
-      <w:r>
-        <w:t xml:space="preserve"> </w:t>
-      </w:r>
-      <w:r>
-        <w:t xml:space="preserve">the 95% level.</w:t>
+        <w:t xml:space="preserve">Second, we attribute under-coverage to dependence acting through repetition</w:t>
+      </w:r>
+      <w:r>
+        <w:t xml:space="preserve"> </w:t>
+      </w:r>
+      <w:r>
+        <w:t xml:space="preserve">(RQ2; §5.2–§5.4). On the 22 MIT-BIH evaluation subjects, naive split conformal</w:t>
+      </w:r>
+      <w:r>
+        <w:t xml:space="preserve"> </w:t>
+      </w:r>
+      <w:r>
+        <w:t xml:space="preserve">covers less than a matched permutation null for every backbone and level; a</w:t>
+      </w:r>
+      <w:r>
+        <w:t xml:space="preserve"> </w:t>
+      </w:r>
+      <w:r>
+        <w:t xml:space="preserve">factorial design traces the shortfall mainly to clustering, amplified by</w:t>
+      </w:r>
+      <w:r>
+        <w:t xml:space="preserve"> </w:t>
+      </w:r>
+      <w:r>
+        <w:t xml:space="preserve">block-size imbalance, and a dose–response experiment shows it growing with the</w:t>
+      </w:r>
+      <w:r>
+        <w:t xml:space="preserve"> </w:t>
+      </w:r>
+      <w:r>
+        <w:t xml:space="preserve">design effect. PTB-XL stays near zero despite substantial within-patient</w:t>
+      </w:r>
+      <w:r>
+        <w:t xml:space="preserve"> </w:t>
+      </w:r>
+      <w:r>
+        <w:t xml:space="preserve">correlation, as the design effect predicts. With 22 subjects the deficit is not</w:t>
+      </w:r>
+      <w:r>
+        <w:t xml:space="preserve"> </w:t>
+      </w:r>
+      <w:r>
+        <w:t xml:space="preserve">resolved at the subject level, a limit on the evidence that mirrors the limit on</w:t>
+      </w:r>
+      <w:r>
+        <w:t xml:space="preserve"> </w:t>
+      </w:r>
+      <w:r>
+        <w:t xml:space="preserve">the guarantee. Third, we draw two cautions for evaluating conformal methods on</w:t>
+      </w:r>
+      <w:r>
+        <w:t xml:space="preserve"> </w:t>
+      </w:r>
+      <w:r>
+        <w:t xml:space="preserve">clustered data (§5.3, §6.2). Between 75% and 110% of the apparent gain of HCP</w:t>
+      </w:r>
+      <w:r>
+        <w:t xml:space="preserve"> </w:t>
+      </w:r>
+      <w:r>
+        <w:t xml:space="preserve">over naive split conformal survives when dependence is permuted away, so the</w:t>
+      </w:r>
+      <w:r>
+        <w:t xml:space="preserve"> </w:t>
+      </w:r>
+      <w:r>
+        <w:t xml:space="preserve">gain is largely mechanical; and repeated splits of a fixed set of subjects give</w:t>
+      </w:r>
+      <w:r>
+        <w:t xml:space="preserve"> </w:t>
+      </w:r>
+      <w:r>
+        <w:t xml:space="preserve">intervals for the split procedure rather than the population, which on MIT-BIH</w:t>
+      </w:r>
+      <w:r>
+        <w:t xml:space="preserve"> </w:t>
+      </w:r>
+      <w:r>
+        <w:t xml:space="preserve">exclude zero where a jackknife over subjects does not.</w:t>
       </w:r>
     </w:p>
     <w:p>
       <w:pPr>
-        <w:pStyle w:val="Compact"/>
-        <w:numPr>
-          <w:ilvl w:val="0"/>
-          <w:numId w:val="1001"/>
-        </w:numPr>
-      </w:pPr>
-      <w:r>
-        <w:t xml:space="preserve">Attribution of under-coverage to dependence acting through repetition</w:t>
-      </w:r>
-      <w:r>
-        <w:t xml:space="preserve"> </w:t>
-      </w:r>
-      <w:r>
-        <w:t xml:space="preserve">(RQ2; §5.2–§5.4). On the 22 MIT-BIH evaluation subjects, naive split conformal</w:t>
-      </w:r>
-      <w:r>
-        <w:t xml:space="preserve"> </w:t>
-      </w:r>
-      <w:r>
-        <w:t xml:space="preserve">covers less than a matched permutation null for every backbone and level; a</w:t>
-      </w:r>
-      <w:r>
-        <w:t xml:space="preserve"> </w:t>
-      </w:r>
-      <w:r>
-        <w:t xml:space="preserve">factorial design attributes the shortfall mainly to clustering, amplified by</w:t>
-      </w:r>
-      <w:r>
-        <w:t xml:space="preserve"> </w:t>
-      </w:r>
-      <w:r>
-        <w:t xml:space="preserve">block-size imbalance, and a dose–response experiment shows it growing with the</w:t>
-      </w:r>
-      <w:r>
-        <w:t xml:space="preserve"> </w:t>
-      </w:r>
-      <w:r>
-        <w:t xml:space="preserve">design effect. PTB-XL stays near zero despite substantial within-patient</w:t>
-      </w:r>
-      <w:r>
-        <w:t xml:space="preserve"> </w:t>
-      </w:r>
-      <w:r>
-        <w:t xml:space="preserve">correlation, as the design effect predicts. With 22 subjects the deficit is not</w:t>
-      </w:r>
-      <w:r>
-        <w:t xml:space="preserve"> </w:t>
-      </w:r>
-      <w:r>
-        <w:t xml:space="preserve">resolved at the subject level, a limit on the evidence that mirrors the limit</w:t>
-      </w:r>
-      <w:r>
-        <w:t xml:space="preserve"> </w:t>
-      </w:r>
-      <w:r>
-        <w:t xml:space="preserve">on the guarantee.</w:t>
-      </w:r>
-    </w:p>
-    <w:p>
-      <w:pPr>
-        <w:pStyle w:val="Compact"/>
-        <w:numPr>
-          <w:ilvl w:val="0"/>
-          <w:numId w:val="1001"/>
-        </w:numPr>
-      </w:pPr>
-      <w:r>
-        <w:t xml:space="preserve">Two cautions for evaluating conformal methods on clustered data (§5.3,</w:t>
-      </w:r>
-      <w:r>
-        <w:t xml:space="preserve"> </w:t>
-      </w:r>
-      <w:r>
-        <w:t xml:space="preserve">§6.2). Between 75% and 110% of the apparent gain of HCP over naive split</w:t>
-      </w:r>
-      <w:r>
-        <w:t xml:space="preserve"> </w:t>
-      </w:r>
-      <w:r>
-        <w:t xml:space="preserve">conformal survives when dependence is permuted away, so the gain is largely</w:t>
-      </w:r>
-      <w:r>
-        <w:t xml:space="preserve"> </w:t>
-      </w:r>
-      <w:r>
-        <w:t xml:space="preserve">mechanical; and repeated splits of a fixed set of subjects give intervals for</w:t>
-      </w:r>
-      <w:r>
-        <w:t xml:space="preserve"> </w:t>
-      </w:r>
-      <w:r>
-        <w:t xml:space="preserve">the split procedure, not the population, which on MIT-BIH exclude zero where a</w:t>
-      </w:r>
-      <w:r>
-        <w:t xml:space="preserve"> </w:t>
-      </w:r>
-      <w:r>
-        <w:t xml:space="preserve">jackknife over subjects does not.</w:t>
-      </w:r>
-    </w:p>
-    <w:p>
-      <w:pPr>
-        <w:pStyle w:val="FirstParagraph"/>
+        <w:pStyle w:val="BodyText"/>
         <w:jc w:val="both"/>
       </w:pPr>
       <w:r>
@@ -17480,7 +17454,7 @@
         <w:pStyle w:val="Compact"/>
         <w:numPr>
           <w:ilvl w:val="0"/>
-          <w:numId w:val="1002"/>
+          <w:numId w:val="1001"/>
         </w:numPr>
       </w:pPr>
       <w:r>
@@ -17504,7 +17478,7 @@
         <w:pStyle w:val="Compact"/>
         <w:numPr>
           <w:ilvl w:val="0"/>
-          <w:numId w:val="1002"/>
+          <w:numId w:val="1001"/>
         </w:numPr>
       </w:pPr>
       <w:r>
@@ -17563,7 +17537,7 @@
         <w:pStyle w:val="Compact"/>
         <w:numPr>
           <w:ilvl w:val="0"/>
-          <w:numId w:val="1002"/>
+          <w:numId w:val="1001"/>
         </w:numPr>
       </w:pPr>
       <w:r>
@@ -17639,7 +17613,7 @@
         <w:pStyle w:val="Compact"/>
         <w:numPr>
           <w:ilvl w:val="0"/>
-          <w:numId w:val="1002"/>
+          <w:numId w:val="1001"/>
         </w:numPr>
       </w:pPr>
       <w:r>
@@ -22296,109 +22270,6 @@
       </w:pPr>
     </w:lvl>
   </w:abstractNum>
-  <w:abstractNum w:abstractNumId="991">
-    <w:nsid w:val="0000A991"/>
-    <w:multiLevelType w:val="multilevel"/>
-    <w:lvl w:ilvl="0">
-      <w:numFmt w:val="bullet"/>
-      <w:lvlText w:val=""/>
-      <w:lvlJc w:val="left"/>
-      <w:pPr>
-        <w:ind w:left="720" w:hanging="360"/>
-      </w:pPr>
-      <w:rPr>
-        <w:rFonts w:ascii="Symbol" w:hAnsi="Symbol" w:cs="Symbol" w:hint="default"/>
-      </w:rPr>
-    </w:lvl>
-    <w:lvl w:ilvl="1">
-      <w:numFmt w:val="bullet"/>
-      <w:lvlText w:val="o"/>
-      <w:lvlJc w:val="left"/>
-      <w:pPr>
-        <w:ind w:left="1440" w:hanging="360"/>
-      </w:pPr>
-      <w:rPr>
-        <w:rFonts w:ascii="Courier New" w:hAnsi="Courier New" w:cs="Courier New" w:hint="default"/>
-      </w:rPr>
-    </w:lvl>
-    <w:lvl w:ilvl="2">
-      <w:numFmt w:val="bullet"/>
-      <w:lvlText w:val=""/>
-      <w:lvlJc w:val="left"/>
-      <w:pPr>
-        <w:ind w:left="2160" w:hanging="360"/>
-      </w:pPr>
-      <w:rPr>
-        <w:rFonts w:ascii="Wingdings" w:hAnsi="Wingdings" w:cs="Wingdings" w:hint="default"/>
-      </w:rPr>
-    </w:lvl>
-    <w:lvl w:ilvl="3">
-      <w:numFmt w:val="bullet"/>
-      <w:lvlText w:val=""/>
-      <w:lvlJc w:val="left"/>
-      <w:pPr>
-        <w:ind w:left="2880" w:hanging="360"/>
-      </w:pPr>
-      <w:rPr>
-        <w:rFonts w:ascii="Symbol" w:hAnsi="Symbol" w:cs="Symbol" w:hint="default"/>
-      </w:rPr>
-    </w:lvl>
-    <w:lvl w:ilvl="4">
-      <w:numFmt w:val="bullet"/>
-      <w:lvlText w:val="o"/>
-      <w:lvlJc w:val="left"/>
-      <w:pPr>
-        <w:ind w:left="3600" w:hanging="360"/>
-      </w:pPr>
-      <w:rPr>
-        <w:rFonts w:ascii="Courier New" w:hAnsi="Courier New" w:cs="Courier New" w:hint="default"/>
-      </w:rPr>
-    </w:lvl>
-    <w:lvl w:ilvl="5">
-      <w:numFmt w:val="bullet"/>
-      <w:lvlText w:val=""/>
-      <w:lvlJc w:val="left"/>
-      <w:pPr>
-        <w:ind w:left="4320" w:hanging="360"/>
-      </w:pPr>
-      <w:rPr>
-        <w:rFonts w:ascii="Wingdings" w:hAnsi="Wingdings" w:cs="Wingdings" w:hint="default"/>
-      </w:rPr>
-    </w:lvl>
-    <w:lvl w:ilvl="6">
-      <w:numFmt w:val="bullet"/>
-      <w:lvlText w:val=""/>
-      <w:lvlJc w:val="left"/>
-      <w:pPr>
-        <w:ind w:left="5040" w:hanging="360"/>
-      </w:pPr>
-      <w:rPr>
-        <w:rFonts w:ascii="Symbol" w:hAnsi="Symbol" w:cs="Symbol" w:hint="default"/>
-      </w:rPr>
-    </w:lvl>
-    <w:lvl w:ilvl="7">
-      <w:numFmt w:val="bullet"/>
-      <w:lvlText w:val="o"/>
-      <w:lvlJc w:val="left"/>
-      <w:pPr>
-        <w:ind w:left="5760" w:hanging="360"/>
-      </w:pPr>
-      <w:rPr>
-        <w:rFonts w:ascii="Courier New" w:hAnsi="Courier New" w:cs="Courier New" w:hint="default"/>
-      </w:rPr>
-    </w:lvl>
-    <w:lvl w:ilvl="8">
-      <w:numFmt w:val="bullet"/>
-      <w:lvlText w:val=""/>
-      <w:lvlJc w:val="left"/>
-      <w:pPr>
-        <w:ind w:left="6480" w:hanging="360"/>
-      </w:pPr>
-      <w:rPr>
-        <w:rFonts w:ascii="Wingdings" w:hAnsi="Wingdings" w:cs="Wingdings" w:hint="default"/>
-      </w:rPr>
-    </w:lvl>
-  </w:abstractNum>
   <w:abstractNum w:abstractNumId="99411">
     <w:nsid w:val="00A99411"/>
     <w:multiLevelType w:val="multilevel"/>
@@ -22488,9 +22359,6 @@
     <w:abstractNumId w:val="990"/>
   </w:num>
   <w:num w:numId="1001">
-    <w:abstractNumId w:val="991"/>
-  </w:num>
-  <w:num w:numId="1002">
     <w:abstractNumId w:val="99411"/>
     <w:lvlOverride w:ilvl="0">
       <w:startOverride w:val="1"/>

</xml_diff>

<commit_message>
s6.3: daftar cek tanpa pecahan inline, frasa awal butir tebal
Rumus ceil(1/alpha)-1 dan ceil(m/alpha)-1 di daftar cek diganti rujukan ke K_min(alpha) dari Corollary 1 dan alpha dibagi m, karena Word menumpuk pecahan inline saat dokumen disimpan sehingga jarak baris rusak. Builder mempertahankan huruf tebal frasa awal pada butir bernomor. Catatan serah terima: jangan menyimpan docx dari Word.
</commit_message>
<xml_diff>
--- a/docs/paper/manuscript-draft.docx
+++ b/docs/paper/manuscript-draft.docx
@@ -20,7 +20,7 @@
           <w:i/>
           <w:iCs/>
         </w:rPr>
-        <w:t xml:space="preserve">Working draft for internal review — generated 2026-10-03 from commit 0ce9dfe.</w:t>
+        <w:t xml:space="preserve">Working draft for internal review — generated 2026-10-03 from commit 3f47e92.</w:t>
       </w:r>
     </w:p>
     <w:bookmarkStart w:id="9" w:name="abstract"/>
@@ -17458,7 +17458,17 @@
         </w:numPr>
       </w:pPr>
       <w:r>
-        <w:t xml:space="preserve">Declare dependence sources (patient, device, site, operator, monitoring</w:t>
+        <w:rPr>
+          <w:b/>
+          <w:bCs/>
+        </w:rPr>
+        <w:t xml:space="preserve">Declare dependence sources</w:t>
+      </w:r>
+      <w:r>
+        <w:t xml:space="preserve"> </w:t>
+      </w:r>
+      <w:r>
+        <w:t xml:space="preserve">(patient, device, site, operator, monitoring</w:t>
       </w:r>
       <w:r>
         <w:t xml:space="preserve"> </w:t>
@@ -17482,7 +17492,14 @@
         </w:numPr>
       </w:pPr>
       <w:r>
-        <w:t xml:space="preserve">Count blocks, not records, under the grouping that respects all declared</w:t>
+        <w:rPr>
+          <w:b/>
+          <w:bCs/>
+        </w:rPr>
+        <w:t xml:space="preserve">Count blocks, not records</w:t>
+      </w:r>
+      <w:r>
+        <w:t xml:space="preserve">, under the grouping that respects all declared</w:t>
       </w:r>
       <w:r>
         <w:t xml:space="preserve"> </w:t>
@@ -17494,20 +17511,26 @@
         <w:t xml:space="preserve"> </w:t>
       </w:r>
       <m:oMath>
-        <m:r>
-          <m:rPr>
-            <m:sty m:val="p"/>
-          </m:rPr>
-          <m:t>⌈</m:t>
-        </m:r>
-        <m:r>
-          <m:t>1</m:t>
-        </m:r>
-        <m:r>
-          <m:rPr>
-            <m:sty m:val="p"/>
-          </m:rPr>
-          <m:t>/</m:t>
+        <m:sSub>
+          <m:e>
+            <m:r>
+              <m:t>K</m:t>
+            </m:r>
+          </m:e>
+          <m:sub>
+            <m:r>
+              <m:rPr>
+                <m:sty m:val="p"/>
+              </m:rPr>
+              <m:t>min</m:t>
+            </m:r>
+          </m:sub>
+        </m:sSub>
+        <m:r>
+          <m:rPr>
+            <m:sty m:val="p"/>
+          </m:rPr>
+          <m:t>(</m:t>
         </m:r>
         <m:r>
           <m:t>α</m:t>
@@ -17516,20 +17539,14 @@
           <m:rPr>
             <m:sty m:val="p"/>
           </m:rPr>
-          <m:t>⌉</m:t>
-        </m:r>
-        <m:r>
-          <m:rPr>
-            <m:sty m:val="p"/>
-          </m:rPr>
-          <m:t>−</m:t>
-        </m:r>
-        <m:r>
-          <m:t>1</m:t>
+          <m:t>)</m:t>
         </m:r>
       </m:oMath>
       <w:r>
-        <w:t xml:space="preserve">.</w:t>
+        <w:t xml:space="preserve"> </w:t>
+      </w:r>
+      <w:r>
+        <w:t xml:space="preserve">of Corollary 1.</w:t>
       </w:r>
     </w:p>
     <w:p>
@@ -17541,71 +17558,51 @@
         </w:numPr>
       </w:pPr>
       <w:r>
-        <w:t xml:space="preserve">Repeat the count per label for label-conditional claims, using</w:t>
+        <w:rPr>
+          <w:b/>
+          <w:bCs/>
+        </w:rPr>
+        <w:t xml:space="preserve">Repeat the count per label</w:t>
+      </w:r>
+      <w:r>
+        <w:t xml:space="preserve"> </w:t>
+      </w:r>
+      <w:r>
+        <w:t xml:space="preserve">for label-conditional claims, with</w:t>
       </w:r>
       <w:r>
         <w:t xml:space="preserve"> </w:t>
       </w:r>
       <m:oMath>
         <m:r>
-          <m:rPr>
-            <m:sty m:val="p"/>
-          </m:rPr>
-          <m:t>⌈</m:t>
-        </m:r>
+          <m:t>α</m:t>
+        </m:r>
+      </m:oMath>
+      <w:r>
+        <w:t xml:space="preserve"> </w:t>
+      </w:r>
+      <w:r>
+        <w:t xml:space="preserve">divided by the number</w:t>
+      </w:r>
+      <w:r>
+        <w:t xml:space="preserve"> </w:t>
+      </w:r>
+      <m:oMath>
         <m:r>
           <m:t>m</m:t>
         </m:r>
-        <m:r>
-          <m:rPr>
-            <m:sty m:val="p"/>
-          </m:rPr>
-          <m:t>/</m:t>
-        </m:r>
-        <m:r>
-          <m:t>α</m:t>
-        </m:r>
-        <m:r>
-          <m:rPr>
-            <m:sty m:val="p"/>
-          </m:rPr>
-          <m:t>⌉</m:t>
-        </m:r>
-        <m:r>
-          <m:rPr>
-            <m:sty m:val="p"/>
-          </m:rPr>
-          <m:t>−</m:t>
-        </m:r>
-        <m:r>
-          <m:t>1</m:t>
-        </m:r>
       </m:oMath>
       <w:r>
         <w:t xml:space="preserve"> </w:t>
       </w:r>
       <w:r>
-        <w:t xml:space="preserve">for simultaneous claims over</w:t>
-      </w:r>
-      <w:r>
-        <w:t xml:space="preserve"> </w:t>
-      </w:r>
-      <m:oMath>
-        <m:r>
-          <m:t>m</m:t>
-        </m:r>
-      </m:oMath>
-      <w:r>
-        <w:t xml:space="preserve"> </w:t>
-      </w:r>
-      <w:r>
-        <w:t xml:space="preserve">labels; rare</w:t>
-      </w:r>
-      <w:r>
-        <w:t xml:space="preserve"> </w:t>
-      </w:r>
-      <w:r>
-        <w:t xml:space="preserve">diagnoses usually fail first.</w:t>
+        <w:t xml:space="preserve">of labels claimed simultaneously; rare diagnoses</w:t>
+      </w:r>
+      <w:r>
+        <w:t xml:space="preserve"> </w:t>
+      </w:r>
+      <w:r>
+        <w:t xml:space="preserve">usually fail first.</w:t>
       </w:r>
     </w:p>
     <w:p>
@@ -17617,7 +17614,17 @@
         </w:numPr>
       </w:pPr>
       <w:r>
-        <w:t xml:space="preserve">Estimate repetition through the harmonic mean block size before deciding</w:t>
+        <w:rPr>
+          <w:b/>
+          <w:bCs/>
+        </w:rPr>
+        <w:t xml:space="preserve">Estimate repetition</w:t>
+      </w:r>
+      <w:r>
+        <w:t xml:space="preserve"> </w:t>
+      </w:r>
+      <w:r>
+        <w:t xml:space="preserve">through the harmonic mean block size before deciding</w:t>
       </w:r>
       <w:r>
         <w:t xml:space="preserve"> </w:t>

</xml_diff>

<commit_message>
Fig. 7 baru: skema tiga kontrol MIT-BIH; narasi dipadatkan lagi; 19 halaman
Fig. 7 (diagram): (a) null permutasi, (b) faktorial 2x2, (c) dose-response pada empat rekaman ilustratif; gambar lama 7-9 menjadi 8-10. s4 dan s6 dipadatkan dan diparafrasekan (kata 11.036 -> 10.849; kemiripan 8-gram 11%; tanpa kata khas AI). Proporsi lebar kolom tabel diatur agar sel tidak terbungkus dua baris. Angka, sitasi, pernyataan formal tetap.
</commit_message>
<xml_diff>
--- a/docs/paper/manuscript-draft.docx
+++ b/docs/paper/manuscript-draft.docx
@@ -20,7 +20,7 @@
           <w:i/>
           <w:iCs/>
         </w:rPr>
-        <w:t xml:space="preserve">Working draft for internal review — generated 2026-10-03 from commit 3f47e92.</w:t>
+        <w:t xml:space="preserve">Working draft for internal review — generated 2026-10-03 from commit 17a68eb.</w:t>
       </w:r>
     </w:p>
     <w:bookmarkStart w:id="9" w:name="abstract"/>
@@ -7083,104 +7083,43 @@
         <w:jc w:val="both"/>
       </w:pPr>
       <w:r>
-        <w:t xml:space="preserve">The audit has two stages (Fig. 1). First, the three diagnostics of §3 are</w:t>
-      </w:r>
-      <w:r>
-        <w:t xml:space="preserve"> </w:t>
-      </w:r>
-      <w:r>
-        <w:t xml:space="preserve">evaluated from metadata before any model is trained. Second, naive split</w:t>
-      </w:r>
-      <w:r>
-        <w:t xml:space="preserve"> </w:t>
-      </w:r>
-      <w:r>
-        <w:t xml:space="preserve">conformal (B1) and HCP (B12) are compared for coverage and set size on held-out</w:t>
-      </w:r>
-      <w:r>
-        <w:t xml:space="preserve"> </w:t>
-      </w:r>
-      <w:r>
-        <w:t xml:space="preserve">blocks, over 200 random block-level splits per configuration and on three</w:t>
-      </w:r>
-      <w:r>
-        <w:t xml:space="preserve"> </w:t>
-      </w:r>
-      <w:r>
-        <w:t xml:space="preserve">backbones with 0.10 M, 7.2 M and 16.0 M parameters, at feasible levels only.</w:t>
-      </w:r>
-      <w:r>
-        <w:t xml:space="preserve"> </w:t>
-      </w:r>
-      <w:r>
-        <w:t xml:space="preserve">The metadata diagnostics (</w:t>
-      </w:r>
-      <m:oMath>
-        <m:sSub>
-          <m:e>
-            <m:r>
-              <m:t>K</m:t>
-            </m:r>
-          </m:e>
-          <m:sub>
-            <m:r>
-              <m:t>1</m:t>
-            </m:r>
-          </m:sub>
-        </m:sSub>
-      </m:oMath>
-      <w:r>
-        <w:t xml:space="preserve">,</w:t>
-      </w:r>
-      <w:r>
-        <w:t xml:space="preserve"> </w:t>
-      </w:r>
-      <m:oMath>
-        <m:sSub>
-          <m:e>
-            <m:r>
-              <m:t>K</m:t>
-            </m:r>
-          </m:e>
-          <m:sub>
-            <m:r>
-              <m:t>1</m:t>
-            </m:r>
-          </m:sub>
-        </m:sSub>
-        <m:r>
-          <m:rPr>
-            <m:sty m:val="p"/>
-          </m:rPr>
-          <m:t>(</m:t>
-        </m:r>
-        <m:r>
-          <m:t>ℓ</m:t>
-        </m:r>
-        <m:r>
-          <m:rPr>
-            <m:sty m:val="p"/>
-          </m:rPr>
-          <m:t>)</m:t>
-        </m:r>
-      </m:oMath>
-      <w:r>
-        <w:t xml:space="preserve"> </w:t>
-      </w:r>
-      <w:r>
-        <w:t xml:space="preserve">and the join structure) involve no</w:t>
-      </w:r>
-      <w:r>
-        <w:t xml:space="preserve"> </w:t>
-      </w:r>
-      <w:r>
-        <w:t xml:space="preserve">model and must agree across backbones, a negative control on the pipeline.</w:t>
-      </w:r>
-      <w:r>
-        <w:t xml:space="preserve"> </w:t>
-      </w:r>
-      <w:r>
-        <w:t xml:space="preserve">Throughout, we separate what a dataset</w:t>
+        <w:t xml:space="preserve">The audit has two stages (Fig. 1). The three diagnostics of §3 are first</w:t>
+      </w:r>
+      <w:r>
+        <w:t xml:space="preserve"> </w:t>
+      </w:r>
+      <w:r>
+        <w:t xml:space="preserve">evaluated from metadata, before any model is trained; naive split conformal (B1)</w:t>
+      </w:r>
+      <w:r>
+        <w:t xml:space="preserve"> </w:t>
+      </w:r>
+      <w:r>
+        <w:t xml:space="preserve">and HCP (B12) are then compared for coverage and set size on held-out blocks at</w:t>
+      </w:r>
+      <w:r>
+        <w:t xml:space="preserve"> </w:t>
+      </w:r>
+      <w:r>
+        <w:t xml:space="preserve">feasible levels, over 200 random block-level splits per configuration and three</w:t>
+      </w:r>
+      <w:r>
+        <w:t xml:space="preserve"> </w:t>
+      </w:r>
+      <w:r>
+        <w:t xml:space="preserve">backbones of 0.10 M, 7.2 M and 16.0 M parameters. The metadata diagnostics</w:t>
+      </w:r>
+      <w:r>
+        <w:t xml:space="preserve"> </w:t>
+      </w:r>
+      <w:r>
+        <w:t xml:space="preserve">involve no model and must agree across backbones, a negative control on the</w:t>
+      </w:r>
+      <w:r>
+        <w:t xml:space="preserve"> </w:t>
+      </w:r>
+      <w:r>
+        <w:t xml:space="preserve">pipeline. Throughout, what a dataset</w:t>
       </w:r>
       <w:r>
         <w:t xml:space="preserve"> </w:t>
@@ -7196,7 +7135,7 @@
         <w:t xml:space="preserve"> </w:t>
       </w:r>
       <w:r>
-        <w:t xml:space="preserve">from what can be</w:t>
+        <w:t xml:space="preserve">is kept apart from what can be</w:t>
       </w:r>
       <w:r>
         <w:t xml:space="preserve"> </w:t>
@@ -7230,19 +7169,19 @@
         <w:jc w:val="both"/>
       </w:pPr>
       <w:r>
-        <w:t xml:space="preserve">The three datasets play different roles and do not replicate one another.</w:t>
-      </w:r>
-      <w:r>
-        <w:t xml:space="preserve"> </w:t>
-      </w:r>
-      <w:r>
-        <w:t xml:space="preserve">Table 1 gives the role of each and the block geometry that places the two</w:t>
-      </w:r>
-      <w:r>
-        <w:t xml:space="preserve"> </w:t>
-      </w:r>
-      <w:r>
-        <w:t xml:space="preserve">primary datasets at opposite ends of the design-effect axis.</w:t>
+        <w:t xml:space="preserve">The three datasets play different roles. Table 1 gives each role and the block</w:t>
+      </w:r>
+      <w:r>
+        <w:t xml:space="preserve"> </w:t>
+      </w:r>
+      <w:r>
+        <w:t xml:space="preserve">geometry that places the two primary datasets at opposite ends of the</w:t>
+      </w:r>
+      <w:r>
+        <w:t xml:space="preserve"> </w:t>
+      </w:r>
+      <w:r>
+        <w:t xml:space="preserve">design-effect axis.</w:t>
       </w:r>
     </w:p>
     <w:p>
@@ -7281,10 +7220,10 @@
         </w:tblBorders>
       </w:tblPr>
       <w:tblGrid>
-        <w:gridCol w:w="1980"/>
-        <w:gridCol w:w="1980"/>
-        <w:gridCol w:w="1980"/>
-        <w:gridCol w:w="1980"/>
+        <w:gridCol w:w="1440"/>
+        <w:gridCol w:w="2160"/>
+        <w:gridCol w:w="2160"/>
+        <w:gridCol w:w="2160"/>
       </w:tblGrid>
       <w:tr>
         <w:trPr>
@@ -7774,13 +7713,13 @@
         <w:jc w:val="both"/>
       </w:pPr>
       <w:r>
-        <w:t xml:space="preserve">Within one dataset the number of blocks and the measurements per block come as a</w:t>
-      </w:r>
-      <w:r>
-        <w:t xml:space="preserve"> </w:t>
-      </w:r>
-      <w:r>
-        <w:t xml:space="preserve">package, so no single dataset can separate their effects. Only</w:t>
+        <w:t xml:space="preserve">Block count and block size come as a package within any one dataset, so no</w:t>
+      </w:r>
+      <w:r>
+        <w:t xml:space="preserve"> </w:t>
+      </w:r>
+      <w:r>
+        <w:t xml:space="preserve">single dataset can separate their effects. Only</w:t>
       </w:r>
       <w:r>
         <w:t xml:space="preserve"> </w:t>
@@ -7794,13 +7733,7 @@
         <w:t xml:space="preserve"> </w:t>
       </w:r>
       <w:r>
-        <w:t xml:space="preserve">is a</w:t>
-      </w:r>
-      <w:r>
-        <w:t xml:space="preserve"> </w:t>
-      </w:r>
-      <w:r>
-        <w:t xml:space="preserve">structural property of the data:</w:t>
+        <w:t xml:space="preserve">is structural:</w:t>
       </w:r>
       <w:r>
         <w:t xml:space="preserve"> </w:t>
@@ -7823,19 +7756,25 @@
         <w:t xml:space="preserve"> </w:t>
       </w:r>
       <w:r>
-        <w:t xml:space="preserve">follows from the split design (958 is half</w:t>
-      </w:r>
-      <w:r>
-        <w:t xml:space="preserve"> </w:t>
-      </w:r>
-      <w:r>
-        <w:t xml:space="preserve">of the 1,917 patients in our fold-9 evaluation subset), and the design effect</w:t>
-      </w:r>
-      <w:r>
-        <w:t xml:space="preserve"> </w:t>
-      </w:r>
-      <w:r>
-        <w:t xml:space="preserve">depends on the model through the score ICC</w:t>
+        <w:t xml:space="preserve">follows</w:t>
+      </w:r>
+      <w:r>
+        <w:t xml:space="preserve"> </w:t>
+      </w:r>
+      <w:r>
+        <w:t xml:space="preserve">from the split design (958 is half of the 1,917 patients in our fold-9</w:t>
+      </w:r>
+      <w:r>
+        <w:t xml:space="preserve"> </w:t>
+      </w:r>
+      <w:r>
+        <w:t xml:space="preserve">evaluation subset), and the design effect depends on the model through the score</w:t>
+      </w:r>
+      <w:r>
+        <w:t xml:space="preserve"> </w:t>
+      </w:r>
+      <w:r>
+        <w:t xml:space="preserve">ICC</w:t>
       </w:r>
       <w:r>
         <w:t xml:space="preserve"> </w:t>
@@ -7846,13 +7785,13 @@
         </m:r>
       </m:oMath>
       <w:r>
-        <w:t xml:space="preserve">. Challenge 2021 supports no</w:t>
-      </w:r>
-      <w:r>
-        <w:t xml:space="preserve"> </w:t>
-      </w:r>
-      <w:r>
-        <w:t xml:space="preserve">claim of generality; it is included because a diagnostic that only ever returns</w:t>
+        <w:t xml:space="preserve">. Challenge 2021 supports no claim of generality; it is there because a</w:t>
+      </w:r>
+      <w:r>
+        <w:t xml:space="preserve"> </w:t>
+      </w:r>
+      <w:r>
+        <w:t xml:space="preserve">diagnostic that only ever returns</w:t>
       </w:r>
       <w:r>
         <w:t xml:space="preserve"> </w:t>
@@ -7864,7 +7803,7 @@
         <w:t xml:space="preserve"> </w:t>
       </w:r>
       <w:r>
-        <w:t xml:space="preserve">has not shown that it can discriminate.</w:t>
+        <w:t xml:space="preserve">has not shown it can discriminate.</w:t>
       </w:r>
     </w:p>
     <w:p>
@@ -7964,25 +7903,25 @@
         <w:t xml:space="preserve"> </w:t>
       </w:r>
       <w:r>
-        <w:t xml:space="preserve">missing) and 11 devices (none missing), cross rather than nest, which is the</w:t>
-      </w:r>
-      <w:r>
-        <w:t xml:space="preserve"> </w:t>
-      </w:r>
-      <w:r>
-        <w:t xml:space="preserve">situation of Corollary 2. Fig. 3 contrasts these groupings with the MIT-BIH</w:t>
-      </w:r>
-      <w:r>
-        <w:t xml:space="preserve"> </w:t>
-      </w:r>
-      <w:r>
-        <w:t xml:space="preserve">records: the length of each curve is the number of blocks, which governs</w:t>
-      </w:r>
-      <w:r>
-        <w:t xml:space="preserve"> </w:t>
-      </w:r>
-      <w:r>
-        <w:t xml:space="preserve">feasibility, and its height is the block size, which drives the design effect.</w:t>
+        <w:t xml:space="preserve">missing) and 11 devices (none missing), cross rather than nest, the situation of</w:t>
+      </w:r>
+      <w:r>
+        <w:t xml:space="preserve"> </w:t>
+      </w:r>
+      <w:r>
+        <w:t xml:space="preserve">Corollary 2. Fig. 3 sets these groupings beside the MIT-BIH records: curve length</w:t>
+      </w:r>
+      <w:r>
+        <w:t xml:space="preserve"> </w:t>
+      </w:r>
+      <w:r>
+        <w:t xml:space="preserve">is the number of blocks, which governs feasibility, and height is block size,</w:t>
+      </w:r>
+      <w:r>
+        <w:t xml:space="preserve"> </w:t>
+      </w:r>
+      <w:r>
+        <w:t xml:space="preserve">which drives the design effect.</w:t>
       </w:r>
     </w:p>
     <w:p>
@@ -8096,43 +8035,43 @@
         <w:jc w:val="both"/>
       </w:pPr>
       <w:r>
-        <w:t xml:space="preserve">PTB-XL patient blocks are many and nearly singletons; the other three PTB-XL</w:t>
-      </w:r>
-      <w:r>
-        <w:t xml:space="preserve"> </w:t>
-      </w:r>
-      <w:r>
-        <w:t xml:space="preserve">sources and the MIT-BIH records offer few blocks of hundreds to thousands of</w:t>
-      </w:r>
-      <w:r>
-        <w:t xml:space="preserve"> </w:t>
-      </w:r>
-      <w:r>
-        <w:t xml:space="preserve">observations each. The published stratified ten-fold split is used as released</w:t>
-      </w:r>
-      <w:r>
-        <w:t xml:space="preserve"> </w:t>
-      </w:r>
-      <w:r>
-        <w:t xml:space="preserve">(17,418 records in folds 1–8, 2,183 in fold 9, 2,198 in fold 10), with no patient</w:t>
-      </w:r>
-      <w:r>
-        <w:t xml:space="preserve"> </w:t>
-      </w:r>
-      <w:r>
-        <w:t xml:space="preserve">in two folds. Cardiologists validated 67.0% of records in folds 1–8 on average</w:t>
-      </w:r>
-      <w:r>
-        <w:t xml:space="preserve"> </w:t>
-      </w:r>
-      <w:r>
-        <w:t xml:space="preserve">(range 64–68%) but every record in folds 9 and 10, so confirmatory analysis is</w:t>
-      </w:r>
-      <w:r>
-        <w:t xml:space="preserve"> </w:t>
-      </w:r>
-      <w:r>
-        <w:t xml:space="preserve">restricted to folds 9–10, with fold 10 held in reserve and still unexamined.</w:t>
+        <w:t xml:space="preserve">PTB-XL patient blocks are many and nearly singletons, whereas the other PTB-XL</w:t>
+      </w:r>
+      <w:r>
+        <w:t xml:space="preserve"> </w:t>
+      </w:r>
+      <w:r>
+        <w:t xml:space="preserve">sources and the MIT-BIH records give few blocks of hundreds to thousands of</w:t>
+      </w:r>
+      <w:r>
+        <w:t xml:space="preserve"> </w:t>
+      </w:r>
+      <w:r>
+        <w:t xml:space="preserve">observations. The stratified ten-fold split is used as released (17,418 records</w:t>
+      </w:r>
+      <w:r>
+        <w:t xml:space="preserve"> </w:t>
+      </w:r>
+      <w:r>
+        <w:t xml:space="preserve">in folds 1–8, 2,183 in fold 9, 2,198 in fold 10; no patient in two folds).</w:t>
+      </w:r>
+      <w:r>
+        <w:t xml:space="preserve"> </w:t>
+      </w:r>
+      <w:r>
+        <w:t xml:space="preserve">Cardiologists validated 67.0% of records in folds 1–8 (range 64–68%) but all</w:t>
+      </w:r>
+      <w:r>
+        <w:t xml:space="preserve"> </w:t>
+      </w:r>
+      <w:r>
+        <w:t xml:space="preserve">records in folds 9 and 10, so confirmatory analysis uses folds 9–10, with fold 10</w:t>
+      </w:r>
+      <w:r>
+        <w:t xml:space="preserve"> </w:t>
+      </w:r>
+      <w:r>
+        <w:t xml:space="preserve">held in reserve and still unexamined.</w:t>
       </w:r>
     </w:p>
     <w:p>
@@ -8151,55 +8090,49 @@
         <w:t xml:space="preserve"> </w:t>
       </w:r>
       <w:r>
-        <w:t xml:space="preserve">Version 1.0.0 [15] contains 48 half-hour two-channel recordings at</w:t>
-      </w:r>
-      <w:r>
-        <w:t xml:space="preserve"> </w:t>
-      </w:r>
-      <w:r>
-        <w:t xml:space="preserve">360 Hz, annotated beat by beat by cardiologists. The four paced records (102,</w:t>
-      </w:r>
-      <w:r>
-        <w:t xml:space="preserve"> </w:t>
-      </w:r>
-      <w:r>
-        <w:t xml:space="preserve">104, 107, 217) are removed as usual, leaving 44. Mapping annotations to the five</w:t>
-      </w:r>
-      <w:r>
-        <w:t xml:space="preserve"> </w:t>
-      </w:r>
-      <w:r>
-        <w:t xml:space="preserve">AAMI classes gives 100,733 beats, each a window centered on its R peak, filtered</w:t>
-      </w:r>
-      <w:r>
-        <w:t xml:space="preserve"> </w:t>
-      </w:r>
-      <w:r>
-        <w:t xml:space="preserve">as for PTB-XL and z-normalized per beat. The 40 beats within 128 samples of a</w:t>
-      </w:r>
-      <w:r>
-        <w:t xml:space="preserve"> </w:t>
-      </w:r>
-      <w:r>
-        <w:t xml:space="preserve">record boundary cannot fit a full 256-sample (711 ms) window and are dropped</w:t>
-      </w:r>
-      <w:r>
-        <w:t xml:space="preserve"> </w:t>
-      </w:r>
-      <w:r>
-        <w:t xml:space="preserve">rather than zero-padded, leaving 100,693: N 90,087, S 2,781, V 7,008, F 802 and</w:t>
-      </w:r>
-      <w:r>
-        <w:t xml:space="preserve"> </w:t>
-      </w:r>
-      <w:r>
-        <w:t xml:space="preserve">Q 15, with class Q kept and reported as degenerate. The MLII lead is selected by</w:t>
-      </w:r>
-      <w:r>
-        <w:t xml:space="preserve"> </w:t>
-      </w:r>
-      <w:r>
-        <w:t xml:space="preserve">name, because record 114 stores its channels as</w:t>
+        <w:t xml:space="preserve">Version 1.0.0 [15] holds 48 half-hour two-channel recordings at</w:t>
+      </w:r>
+      <w:r>
+        <w:t xml:space="preserve"> </w:t>
+      </w:r>
+      <w:r>
+        <w:t xml:space="preserve">360 Hz, annotated beat by beat by cardiologists; the four paced records (102,</w:t>
+      </w:r>
+      <w:r>
+        <w:t xml:space="preserve"> </w:t>
+      </w:r>
+      <w:r>
+        <w:t xml:space="preserve">104, 107, 217) are removed, leaving 44. Mapping annotations to the five AAMI</w:t>
+      </w:r>
+      <w:r>
+        <w:t xml:space="preserve"> </w:t>
+      </w:r>
+      <w:r>
+        <w:t xml:space="preserve">classes gives 100,733 beats, each a window centered on its R peak, filtered as</w:t>
+      </w:r>
+      <w:r>
+        <w:t xml:space="preserve"> </w:t>
+      </w:r>
+      <w:r>
+        <w:t xml:space="preserve">for PTB-XL and z-normalized per beat. The 40 beats too close to a record boundary</w:t>
+      </w:r>
+      <w:r>
+        <w:t xml:space="preserve"> </w:t>
+      </w:r>
+      <w:r>
+        <w:t xml:space="preserve">for a full 256-sample (711 ms) window are dropped, leaving 100,693: N 90,087,</w:t>
+      </w:r>
+      <w:r>
+        <w:t xml:space="preserve"> </w:t>
+      </w:r>
+      <w:r>
+        <w:t xml:space="preserve">S 2,781, V 7,008, F 802 and Q 15, with Q kept and reported as degenerate. The</w:t>
+      </w:r>
+      <w:r>
+        <w:t xml:space="preserve"> </w:t>
+      </w:r>
+      <w:r>
+        <w:t xml:space="preserve">MLII lead is selected by name, because record 114 stores its channels as</w:t>
       </w:r>
       <w:r>
         <w:t xml:space="preserve"> </w:t>
@@ -8211,40 +8144,31 @@
         <w:t xml:space="preserve">[V5, MLII]</w:t>
       </w:r>
       <w:r>
-        <w:t xml:space="preserve"> </w:t>
-      </w:r>
-      <w:r>
-        <w:t xml:space="preserve">and selection by</w:t>
-      </w:r>
-      <w:r>
-        <w:t xml:space="preserve"> </w:t>
-      </w:r>
-      <w:r>
-        <w:t xml:space="preserve">index would silently swap leads. The inter-patient partition splits the records</w:t>
-      </w:r>
-      <w:r>
-        <w:t xml:space="preserve"> </w:t>
-      </w:r>
-      <w:r>
-        <w:t xml:space="preserve">into DS1 and DS2, 22 each, with 51,000 and 49,693 beats. Records hold 1,517 to</w:t>
-      </w:r>
-      <w:r>
-        <w:t xml:space="preserve"> </w:t>
-      </w:r>
-      <w:r>
-        <w:t xml:space="preserve">3,361 beats (median 2,257), three orders of magnitude more than a PTB-XL block.</w:t>
-      </w:r>
-      <w:r>
-        <w:t xml:space="preserve"> </w:t>
-      </w:r>
-      <w:r>
-        <w:t xml:space="preserve">Records 201 and 202 come from one subject but fall on opposite sides of the</w:t>
-      </w:r>
-      <w:r>
-        <w:t xml:space="preserve"> </w:t>
-      </w:r>
-      <w:r>
-        <w:t xml:space="preserve">partition; we keep the standard split for comparability and disclose the leak.</w:t>
+        <w:t xml:space="preserve">. The inter-patient partition gives DS1 and DS2, 22 records each,</w:t>
+      </w:r>
+      <w:r>
+        <w:t xml:space="preserve"> </w:t>
+      </w:r>
+      <w:r>
+        <w:t xml:space="preserve">with 51,000 and 49,693 beats; records hold 1,517 to 3,361 beats (median 2,257),</w:t>
+      </w:r>
+      <w:r>
+        <w:t xml:space="preserve"> </w:t>
+      </w:r>
+      <w:r>
+        <w:t xml:space="preserve">three orders of magnitude more than a PTB-XL block. Records 201 and 202 come from</w:t>
+      </w:r>
+      <w:r>
+        <w:t xml:space="preserve"> </w:t>
+      </w:r>
+      <w:r>
+        <w:t xml:space="preserve">one subject but fall on opposite sides of the partition; we keep the standard</w:t>
+      </w:r>
+      <w:r>
+        <w:t xml:space="preserve"> </w:t>
+      </w:r>
+      <w:r>
+        <w:t xml:space="preserve">split for comparability and disclose the leak.</w:t>
       </w:r>
     </w:p>
     <w:p>
@@ -8417,19 +8341,19 @@
         <w:t xml:space="preserve"> </w:t>
       </w:r>
       <w:r>
-        <w:t xml:space="preserve">exchangeable; B12 is HCP calibrated at the block level [12]. Because we ask</w:t>
-      </w:r>
-      <w:r>
-        <w:t xml:space="preserve"> </w:t>
-      </w:r>
-      <w:r>
-        <w:t xml:space="preserve">whether any guarantee can be enforced, not which construction is most efficient,</w:t>
-      </w:r>
-      <w:r>
-        <w:t xml:space="preserve"> </w:t>
-      </w:r>
-      <w:r>
-        <w:t xml:space="preserve">the constructions of Dunn et al. [13] and Mondrian conformal prediction are not</w:t>
+        <w:t xml:space="preserve">exchangeable; B12 is HCP calibrated at the block level [12]. We ask whether any</w:t>
+      </w:r>
+      <w:r>
+        <w:t xml:space="preserve"> </w:t>
+      </w:r>
+      <w:r>
+        <w:t xml:space="preserve">guarantee can be enforced, not which construction is most efficient, so the</w:t>
+      </w:r>
+      <w:r>
+        <w:t xml:space="preserve"> </w:t>
+      </w:r>
+      <w:r>
+        <w:t xml:space="preserve">constructions of Dunn et al. [13] and Mondrian conformal prediction are not</w:t>
       </w:r>
       <w:r>
         <w:t xml:space="preserve"> </w:t>
@@ -8444,43 +8368,37 @@
         <w:jc w:val="both"/>
       </w:pPr>
       <w:r>
-        <w:t xml:space="preserve">PTB-XL uses folds 1–6 for training, fold 7 for validation, and fold 9 split at</w:t>
-      </w:r>
-      <w:r>
-        <w:t xml:space="preserve"> </w:t>
-      </w:r>
-      <w:r>
-        <w:t xml:space="preserve">the patient level into calibration and evaluation halves, with 200–400</w:t>
-      </w:r>
-      <w:r>
-        <w:t xml:space="preserve"> </w:t>
-      </w:r>
-      <w:r>
-        <w:t xml:space="preserve">repetitions; fold 8 is left out because its label quality differs from that of</w:t>
-      </w:r>
-      <w:r>
-        <w:t xml:space="preserve"> </w:t>
-      </w:r>
-      <w:r>
-        <w:t xml:space="preserve">fold 9, and fold 10 is reserved for one final confirmatory evaluation. MIT-BIH</w:t>
-      </w:r>
-      <w:r>
-        <w:t xml:space="preserve"> </w:t>
-      </w:r>
-      <w:r>
-        <w:t xml:space="preserve">trains on DS1 minus four validation records (124, 205, 215, 230), validates on</w:t>
-      </w:r>
-      <w:r>
-        <w:t xml:space="preserve"> </w:t>
-      </w:r>
-      <w:r>
-        <w:t xml:space="preserve">those four, and splits DS2 11/11 at the record level into calibration and</w:t>
-      </w:r>
-      <w:r>
-        <w:t xml:space="preserve"> </w:t>
-      </w:r>
-      <w:r>
-        <w:t xml:space="preserve">evaluation, again with 200–400 repetitions.</w:t>
+        <w:t xml:space="preserve">PTB-XL trains on folds 1–6, validates on fold 7 and splits fold 9 at the patient</w:t>
+      </w:r>
+      <w:r>
+        <w:t xml:space="preserve"> </w:t>
+      </w:r>
+      <w:r>
+        <w:t xml:space="preserve">level into calibration and evaluation halves (200–400 repetitions); fold 8 is</w:t>
+      </w:r>
+      <w:r>
+        <w:t xml:space="preserve"> </w:t>
+      </w:r>
+      <w:r>
+        <w:t xml:space="preserve">left out for its different label quality, and fold 10 is reserved for one final</w:t>
+      </w:r>
+      <w:r>
+        <w:t xml:space="preserve"> </w:t>
+      </w:r>
+      <w:r>
+        <w:t xml:space="preserve">confirmatory evaluation. MIT-BIH trains on DS1 minus four validation records</w:t>
+      </w:r>
+      <w:r>
+        <w:t xml:space="preserve"> </w:t>
+      </w:r>
+      <w:r>
+        <w:t xml:space="preserve">(124, 205, 215, 230), validates on those four, and splits DS2 11/11 at the record</w:t>
+      </w:r>
+      <w:r>
+        <w:t xml:space="preserve"> </w:t>
+      </w:r>
+      <w:r>
+        <w:t xml:space="preserve">level (200–400 repetitions).</w:t>
       </w:r>
     </w:p>
     <w:p>
@@ -8507,37 +8425,37 @@
         <w:t xml:space="preserve"> </w:t>
       </w:r>
       <w:r>
-        <w:t xml:space="preserve">exchangeable observation. The guarantee (2) of HCP concerns one observation from</w:t>
-      </w:r>
-      <w:r>
-        <w:t xml:space="preserve"> </w:t>
-      </w:r>
-      <w:r>
-        <w:t xml:space="preserve">a new block, and its empirical counterpart averages within each test block before</w:t>
-      </w:r>
-      <w:r>
-        <w:t xml:space="preserve"> </w:t>
-      </w:r>
-      <w:r>
-        <w:t xml:space="preserve">averaging over blocks. The two coincide for equal block sizes and nearly so on</w:t>
-      </w:r>
-      <w:r>
-        <w:t xml:space="preserve"> </w:t>
-      </w:r>
-      <w:r>
-        <w:t xml:space="preserve">PTB-XL; MIT-BIH records differ in length by up to a factor of 2.2, so both are</w:t>
-      </w:r>
-      <w:r>
-        <w:t xml:space="preserve"> </w:t>
-      </w:r>
-      <w:r>
-        <w:t xml:space="preserve">reported there (§5.3). On PTB-XL we report superset coverage (5), using the</w:t>
-      </w:r>
-      <w:r>
-        <w:t xml:space="preserve"> </w:t>
-      </w:r>
-      <w:r>
-        <w:t xml:space="preserve">maximum score over the true labels.</w:t>
+        <w:t xml:space="preserve">exchangeable observation, whereas guarantee (2) concerns one observation from a</w:t>
+      </w:r>
+      <w:r>
+        <w:t xml:space="preserve"> </w:t>
+      </w:r>
+      <w:r>
+        <w:t xml:space="preserve">new block, whose empirical counterpart averages within each test block first.</w:t>
+      </w:r>
+      <w:r>
+        <w:t xml:space="preserve"> </w:t>
+      </w:r>
+      <w:r>
+        <w:t xml:space="preserve">The two coincide for equal block sizes and nearly so on PTB-XL; MIT-BIH records</w:t>
+      </w:r>
+      <w:r>
+        <w:t xml:space="preserve"> </w:t>
+      </w:r>
+      <w:r>
+        <w:t xml:space="preserve">differ in length by up to a factor of 2.2, so both are reported there (§5.3). On</w:t>
+      </w:r>
+      <w:r>
+        <w:t xml:space="preserve"> </w:t>
+      </w:r>
+      <w:r>
+        <w:t xml:space="preserve">PTB-XL we report superset coverage (5), using the maximum score over the true</w:t>
+      </w:r>
+      <w:r>
+        <w:t xml:space="preserve"> </w:t>
+      </w:r>
+      <w:r>
+        <w:t xml:space="preserve">labels.</w:t>
       </w:r>
     </w:p>
     <w:bookmarkEnd w:id="29"/>
@@ -8556,43 +8474,43 @@
         <w:jc w:val="both"/>
       </w:pPr>
       <w:r>
-        <w:t xml:space="preserve">Conformal guarantees do not depend on the model, so the backbone changes the size</w:t>
-      </w:r>
-      <w:r>
-        <w:t xml:space="preserve"> </w:t>
-      </w:r>
-      <w:r>
-        <w:t xml:space="preserve">of prediction sets, not their validity. The primary backbone, SmallECGNet, is a</w:t>
-      </w:r>
-      <w:r>
-        <w:t xml:space="preserve"> </w:t>
-      </w:r>
-      <w:r>
-        <w:t xml:space="preserve">compact 1-D convolutional network with 104,389 parameters for 12-lead input and</w:t>
-      </w:r>
-      <w:r>
-        <w:t xml:space="preserve"> </w:t>
-      </w:r>
-      <w:r>
-        <w:t xml:space="preserve">101,925 for a single lead. Each audit is repeated with two 1-D residual networks</w:t>
-      </w:r>
-      <w:r>
-        <w:t xml:space="preserve"> </w:t>
-      </w:r>
-      <w:r>
-        <w:t xml:space="preserve">of the PTB-XL benchmark family [1], ResNet1D-34 (7,225,733 / 7,220,805</w:t>
-      </w:r>
-      <w:r>
-        <w:t xml:space="preserve"> </w:t>
-      </w:r>
-      <w:r>
-        <w:t xml:space="preserve">parameters) and ResNet1D-50 (15,969,413 / 15,964,485), trained with Adam</w:t>
-      </w:r>
-      <w:r>
-        <w:t xml:space="preserve"> </w:t>
-      </w:r>
-      <w:r>
-        <w:t xml:space="preserve">(learning rate</w:t>
+        <w:t xml:space="preserve">Conformal guarantees do not depend on the model, so the backbone changes set</w:t>
+      </w:r>
+      <w:r>
+        <w:t xml:space="preserve"> </w:t>
+      </w:r>
+      <w:r>
+        <w:t xml:space="preserve">size, not validity. The primary backbone, SmallECGNet, is a compact 1-D</w:t>
+      </w:r>
+      <w:r>
+        <w:t xml:space="preserve"> </w:t>
+      </w:r>
+      <w:r>
+        <w:t xml:space="preserve">convolutional network (104,389 parameters for 12-lead input, 101,925 for one</w:t>
+      </w:r>
+      <w:r>
+        <w:t xml:space="preserve"> </w:t>
+      </w:r>
+      <w:r>
+        <w:t xml:space="preserve">lead), reused from the primary study without retraining. Each audit is repeated</w:t>
+      </w:r>
+      <w:r>
+        <w:t xml:space="preserve"> </w:t>
+      </w:r>
+      <w:r>
+        <w:t xml:space="preserve">with two 1-D residual networks of the PTB-XL benchmark family [1], ResNet1D-34</w:t>
+      </w:r>
+      <w:r>
+        <w:t xml:space="preserve"> </w:t>
+      </w:r>
+      <w:r>
+        <w:t xml:space="preserve">(7,225,733 / 7,220,805 parameters) and ResNet1D-50 (15,969,413 / 15,964,485),</w:t>
+      </w:r>
+      <w:r>
+        <w:t xml:space="preserve"> </w:t>
+      </w:r>
+      <w:r>
+        <w:t xml:space="preserve">trained with Adam (learning rate</w:t>
       </w:r>
       <w:r>
         <w:t xml:space="preserve"> </w:t>
@@ -8618,79 +8536,73 @@
         </m:sSup>
       </m:oMath>
       <w:r>
-        <w:t xml:space="preserve">), early stopping on validation loss (patience 5) and a</w:t>
-      </w:r>
-      <w:r>
-        <w:t xml:space="preserve"> </w:t>
-      </w:r>
-      <w:r>
-        <w:t xml:space="preserve">cap of 25 epochs on PTB-XL and 30 on MIT-BIH. The SmallECGNet weights come from</w:t>
-      </w:r>
-      <w:r>
-        <w:t xml:space="preserve"> </w:t>
-      </w:r>
-      <w:r>
-        <w:t xml:space="preserve">the primary study, which used the same optimizer and stopping rule, and are not</w:t>
-      </w:r>
-      <w:r>
-        <w:t xml:space="preserve"> </w:t>
-      </w:r>
-      <w:r>
-        <w:t xml:space="preserve">retrained. Losses are binary cross-entropy over the five superclasses (PTB-XL)</w:t>
-      </w:r>
-      <w:r>
-        <w:t xml:space="preserve"> </w:t>
-      </w:r>
-      <w:r>
-        <w:t xml:space="preserve">and cross-entropy over the five AAMI classes (MIT-BIH), without class weighting.</w:t>
-      </w:r>
-      <w:r>
-        <w:t xml:space="preserve"> </w:t>
-      </w:r>
-      <w:r>
-        <w:t xml:space="preserve">Batches hold 128 records or 256 beats; for the residual networks they are</w:t>
-      </w:r>
-      <w:r>
-        <w:t xml:space="preserve"> </w:t>
-      </w:r>
-      <w:r>
-        <w:t xml:space="preserve">accumulated from micro-batches of 32 or 64, so batch-normalization statistics</w:t>
-      </w:r>
-      <w:r>
-        <w:t xml:space="preserve"> </w:t>
-      </w:r>
-      <w:r>
-        <w:t xml:space="preserve">are per micro-batch. The primary backbone reaches a macro-AUROC of 0.9016 on</w:t>
-      </w:r>
-      <w:r>
-        <w:t xml:space="preserve"> </w:t>
-      </w:r>
-      <w:r>
-        <w:t xml:space="preserve">PTB-XL and, on MIT-BIH, an accuracy of 0.8690 with balanced accuracy 0.3748 and</w:t>
-      </w:r>
-      <w:r>
-        <w:t xml:space="preserve"> </w:t>
-      </w:r>
-      <w:r>
-        <w:t xml:space="preserve">macro-F1 0.3144. The backbones were deliberately not tuned for discrimination:</w:t>
-      </w:r>
-      <w:r>
-        <w:t xml:space="preserve"> </w:t>
-      </w:r>
-      <w:r>
-        <w:t xml:space="preserve">validity holds for any score fixed before calibration, so a weak minority-class</w:t>
-      </w:r>
-      <w:r>
-        <w:t xml:space="preserve"> </w:t>
-      </w:r>
-      <w:r>
-        <w:t xml:space="preserve">score enlarges sets without affecting the coverage under audit, and three</w:t>
-      </w:r>
-      <w:r>
-        <w:t xml:space="preserve"> </w:t>
-      </w:r>
-      <w:r>
-        <w:t xml:space="preserve">backbones show that no conclusion hinges on one score. Scores are</w:t>
+        <w:t xml:space="preserve">), early stopping on validation loss</w:t>
+      </w:r>
+      <w:r>
+        <w:t xml:space="preserve"> </w:t>
+      </w:r>
+      <w:r>
+        <w:t xml:space="preserve">(patience 5) and at most 25 epochs on PTB-XL and 30 on MIT-BIH; SmallECGNet had</w:t>
+      </w:r>
+      <w:r>
+        <w:t xml:space="preserve"> </w:t>
+      </w:r>
+      <w:r>
+        <w:t xml:space="preserve">used the same optimizer and stopping rule.</w:t>
+      </w:r>
+      <w:r>
+        <w:t xml:space="preserve"> </w:t>
+      </w:r>
+      <w:r>
+        <w:t xml:space="preserve">Losses are binary cross-entropy over the five superclasses (PTB-XL) and</w:t>
+      </w:r>
+      <w:r>
+        <w:t xml:space="preserve"> </w:t>
+      </w:r>
+      <w:r>
+        <w:t xml:space="preserve">cross-entropy over the five AAMI classes (MIT-BIH), without class weighting;</w:t>
+      </w:r>
+      <w:r>
+        <w:t xml:space="preserve"> </w:t>
+      </w:r>
+      <w:r>
+        <w:t xml:space="preserve">batches hold 128 records or 256 beats, accumulated for the residual networks from</w:t>
+      </w:r>
+      <w:r>
+        <w:t xml:space="preserve"> </w:t>
+      </w:r>
+      <w:r>
+        <w:t xml:space="preserve">micro-batches of 32 or 64, so batch-normalization statistics are per</w:t>
+      </w:r>
+      <w:r>
+        <w:t xml:space="preserve"> </w:t>
+      </w:r>
+      <w:r>
+        <w:t xml:space="preserve">micro-batch. The primary backbone reaches a macro-AUROC of 0.9016 on PTB-XL and,</w:t>
+      </w:r>
+      <w:r>
+        <w:t xml:space="preserve"> </w:t>
+      </w:r>
+      <w:r>
+        <w:t xml:space="preserve">on MIT-BIH, an accuracy of 0.8690 with balanced accuracy 0.3748 and macro-F1</w:t>
+      </w:r>
+      <w:r>
+        <w:t xml:space="preserve"> </w:t>
+      </w:r>
+      <w:r>
+        <w:t xml:space="preserve">0.3144. The backbones were deliberately not tuned for discrimination: validity</w:t>
+      </w:r>
+      <w:r>
+        <w:t xml:space="preserve"> </w:t>
+      </w:r>
+      <w:r>
+        <w:t xml:space="preserve">holds for any score fixed before calibration, so a weak minority-class score</w:t>
+      </w:r>
+      <w:r>
+        <w:t xml:space="preserve"> </w:t>
+      </w:r>
+      <w:r>
+        <w:t xml:space="preserve">enlarges sets without affecting the coverage under audit. Scores are</w:t>
       </w:r>
       <w:r>
         <w:t xml:space="preserve"> </w:t>
@@ -8837,13 +8749,13 @@
         <w:t xml:space="preserve"> </w:t>
       </w:r>
       <w:r>
-        <w:t xml:space="preserve">label for multi-label PTB-XL; the record-level score for superset coverage is the</w:t>
-      </w:r>
-      <w:r>
-        <w:t xml:space="preserve"> </w:t>
-      </w:r>
-      <w:r>
-        <w:t xml:space="preserve">maximum over the true labels, which reduces to scalar HCP (§3.4).</w:t>
+        <w:t xml:space="preserve">label for multi-label PTB-XL, where the superset score is the maximum over the</w:t>
+      </w:r>
+      <w:r>
+        <w:t xml:space="preserve"> </w:t>
+      </w:r>
+      <w:r>
+        <w:t xml:space="preserve">true labels and reduces to scalar HCP (§3.4).</w:t>
       </w:r>
     </w:p>
     <w:bookmarkEnd w:id="30"/>
@@ -8868,43 +8780,43 @@
         <w:t xml:space="preserve"> </w:t>
       </w:r>
       <w:r>
-        <w:t xml:space="preserve">beats, which would reproduce the error under study. Two kinds of uncertainty are</w:t>
-      </w:r>
-      <w:r>
-        <w:t xml:space="preserve"> </w:t>
-      </w:r>
-      <w:r>
-        <w:t xml:space="preserve">kept apart. Intervals over repeated random splits of a fixed set of blocks</w:t>
-      </w:r>
-      <w:r>
-        <w:t xml:space="preserve"> </w:t>
-      </w:r>
-      <w:r>
-        <w:t xml:space="preserve">describe the Monte Carlo variability of the split procedure on those blocks; they</w:t>
-      </w:r>
-      <w:r>
-        <w:t xml:space="preserve"> </w:t>
-      </w:r>
-      <w:r>
-        <w:t xml:space="preserve">narrow as splits are added and are not confidence intervals for the patient</w:t>
-      </w:r>
-      <w:r>
-        <w:t xml:space="preserve"> </w:t>
-      </w:r>
-      <w:r>
-        <w:t xml:space="preserve">population. For the central MIT-BIH comparison we therefore also treat records as</w:t>
-      </w:r>
-      <w:r>
-        <w:t xml:space="preserve"> </w:t>
-      </w:r>
-      <w:r>
-        <w:t xml:space="preserve">the sampling unit, with a leave-one-record-out jackknife over the 22 DS2 records</w:t>
-      </w:r>
-      <w:r>
-        <w:t xml:space="preserve"> </w:t>
-      </w:r>
-      <w:r>
-        <w:t xml:space="preserve">and Holm correction across the three</w:t>
+        <w:t xml:space="preserve">beats, which would reproduce the error under study. Intervals over repeated</w:t>
+      </w:r>
+      <w:r>
+        <w:t xml:space="preserve"> </w:t>
+      </w:r>
+      <w:r>
+        <w:t xml:space="preserve">random splits of a fixed set of blocks describe the Monte Carlo variability of</w:t>
+      </w:r>
+      <w:r>
+        <w:t xml:space="preserve"> </w:t>
+      </w:r>
+      <w:r>
+        <w:t xml:space="preserve">the split procedure on those blocks; they narrow as splits are added and are not</w:t>
+      </w:r>
+      <w:r>
+        <w:t xml:space="preserve"> </w:t>
+      </w:r>
+      <w:r>
+        <w:t xml:space="preserve">confidence intervals for the patient population. For the central MIT-BIH</w:t>
+      </w:r>
+      <w:r>
+        <w:t xml:space="preserve"> </w:t>
+      </w:r>
+      <w:r>
+        <w:t xml:space="preserve">comparison we therefore also treat records as the sampling unit, through a</w:t>
+      </w:r>
+      <w:r>
+        <w:t xml:space="preserve"> </w:t>
+      </w:r>
+      <w:r>
+        <w:t xml:space="preserve">leave-one-record-out jackknife over the 22 DS2 records with Holm correction</w:t>
+      </w:r>
+      <w:r>
+        <w:t xml:space="preserve"> </w:t>
+      </w:r>
+      <w:r>
+        <w:t xml:space="preserve">across the three</w:t>
       </w:r>
       <w:r>
         <w:t xml:space="preserve"> </w:t>
@@ -8918,37 +8830,31 @@
         <w:t xml:space="preserve"> </w:t>
       </w:r>
       <w:r>
-        <w:t xml:space="preserve">levels of each backbone, added post</w:t>
-      </w:r>
-      <w:r>
-        <w:t xml:space="preserve"> </w:t>
-      </w:r>
-      <w:r>
-        <w:t xml:space="preserve">hoc once the distinction was noticed. All analyses follow an internal,</w:t>
-      </w:r>
-      <w:r>
-        <w:t xml:space="preserve"> </w:t>
-      </w:r>
-      <w:r>
-        <w:t xml:space="preserve">version-controlled protocol whose deviation log lists every departure from the</w:t>
-      </w:r>
-      <w:r>
-        <w:t xml:space="preserve"> </w:t>
-      </w:r>
-      <w:r>
-        <w:t xml:space="preserve">initial plan (§6.4). Friedman–Nemenyi tests are avoided: they are designed for</w:t>
-      </w:r>
-      <w:r>
-        <w:t xml:space="preserve"> </w:t>
-      </w:r>
-      <w:r>
-        <w:t xml:space="preserve">many classifiers over many datasets, conventionally five or more, and are</w:t>
-      </w:r>
-      <w:r>
-        <w:t xml:space="preserve"> </w:t>
-      </w:r>
-      <w:r>
-        <w:t xml:space="preserve">uninformative with two.</w:t>
+        <w:t xml:space="preserve">levels of each backbone, added post hoc once the</w:t>
+      </w:r>
+      <w:r>
+        <w:t xml:space="preserve"> </w:t>
+      </w:r>
+      <w:r>
+        <w:t xml:space="preserve">distinction was noticed. All analyses follow an internal, version-controlled</w:t>
+      </w:r>
+      <w:r>
+        <w:t xml:space="preserve"> </w:t>
+      </w:r>
+      <w:r>
+        <w:t xml:space="preserve">protocol whose deviation log records every departure from the initial plan</w:t>
+      </w:r>
+      <w:r>
+        <w:t xml:space="preserve"> </w:t>
+      </w:r>
+      <w:r>
+        <w:t xml:space="preserve">(§6.4). Friedman–Nemenyi tests, designed for many classifiers over many</w:t>
+      </w:r>
+      <w:r>
+        <w:t xml:space="preserve"> </w:t>
+      </w:r>
+      <w:r>
+        <w:t xml:space="preserve">datasets, are uninformative with two and are not used.</w:t>
       </w:r>
     </w:p>
     <w:p>
@@ -8957,43 +8863,37 @@
         <w:jc w:val="both"/>
       </w:pPr>
       <w:r>
-        <w:t xml:space="preserve">The permutation null reassigns beats to DS2 records through one random</w:t>
-      </w:r>
-      <w:r>
-        <w:t xml:space="preserve"> </w:t>
-      </w:r>
-      <w:r>
-        <w:t xml:space="preserve">permutation of their record labels, preserving every block size, and the observed</w:t>
-      </w:r>
-      <w:r>
-        <w:t xml:space="preserve"> </w:t>
-      </w:r>
-      <w:r>
-        <w:t xml:space="preserve">and permuted arms share the same sequence of splits. In the factorial design the</w:t>
-      </w:r>
-      <w:r>
-        <w:t xml:space="preserve"> </w:t>
-      </w:r>
-      <w:r>
-        <w:t xml:space="preserve">clustered arm uses the original records and the randomized arm the permuted ones;</w:t>
-      </w:r>
-      <w:r>
-        <w:t xml:space="preserve"> </w:t>
-      </w:r>
-      <w:r>
-        <w:t xml:space="preserve">the balanced arm subsamples every calibration record to 1,355 beats (60% of the</w:t>
-      </w:r>
-      <w:r>
-        <w:t xml:space="preserve"> </w:t>
-      </w:r>
-      <w:r>
-        <w:t xml:space="preserve">mean record length) and the imbalanced arm to 60% of its own length, so that</w:t>
-      </w:r>
-      <w:r>
-        <w:t xml:space="preserve"> </w:t>
-      </w:r>
-      <w:r>
-        <w:t xml:space="preserve">calibration sizes match in expectation, while test records are used in full. The</w:t>
+        <w:t xml:space="preserve">The three MIT-BIH controls are sketched in Fig. 7 (§5.3). The permutation null</w:t>
+      </w:r>
+      <w:r>
+        <w:t xml:space="preserve"> </w:t>
+      </w:r>
+      <w:r>
+        <w:t xml:space="preserve">applies one random permutation of record labels to DS2 beats, preserving every</w:t>
+      </w:r>
+      <w:r>
+        <w:t xml:space="preserve"> </w:t>
+      </w:r>
+      <w:r>
+        <w:t xml:space="preserve">block size, and shares its splits with the observed arm. The factorial design</w:t>
+      </w:r>
+      <w:r>
+        <w:t xml:space="preserve"> </w:t>
+      </w:r>
+      <w:r>
+        <w:t xml:space="preserve">crosses original and permuted membership with calibration records subsampled to</w:t>
+      </w:r>
+      <w:r>
+        <w:t xml:space="preserve"> </w:t>
+      </w:r>
+      <w:r>
+        <w:t xml:space="preserve">1,355 beats (60% of the mean record length) or to 60% of their own length, which</w:t>
+      </w:r>
+      <w:r>
+        <w:t xml:space="preserve"> </w:t>
+      </w:r>
+      <w:r>
+        <w:t xml:space="preserve">matches calibration size in expectation; test records are used in full. The</w:t>
       </w:r>
       <w:r>
         <w:t xml:space="preserve"> </w:t>
@@ -9064,19 +8964,19 @@
         <w:t xml:space="preserve"> </w:t>
       </w:r>
       <w:r>
-        <w:t xml:space="preserve">of beats, again preserving block sizes, and subsamples</w:t>
-      </w:r>
-      <w:r>
-        <w:t xml:space="preserve"> </w:t>
-      </w:r>
-      <w:r>
-        <w:t xml:space="preserve">calibration records to 1,355 beats. Intraclass correlations use the one-way ANOVA</w:t>
-      </w:r>
-      <w:r>
-        <w:t xml:space="preserve"> </w:t>
-      </w:r>
-      <w:r>
-        <w:t xml:space="preserve">estimator for unbalanced designs,</w:t>
+        <w:t xml:space="preserve">of beats and subsamples calibration records to 1,355</w:t>
+      </w:r>
+      <w:r>
+        <w:t xml:space="preserve"> </w:t>
+      </w:r>
+      <w:r>
+        <w:t xml:space="preserve">beats. Intraclass correlations use the one-way ANOVA estimator for unbalanced</w:t>
+      </w:r>
+      <w:r>
+        <w:t xml:space="preserve"> </w:t>
+      </w:r>
+      <w:r>
+        <w:t xml:space="preserve">designs,</w:t>
       </w:r>
       <w:r>
         <w:t xml:space="preserve"> </w:t>
@@ -9231,19 +9131,19 @@
         </m:r>
       </m:oMath>
       <w:r>
-        <w:t xml:space="preserve">, on conformity</w:t>
-      </w:r>
-      <w:r>
-        <w:t xml:space="preserve"> </w:t>
-      </w:r>
-      <w:r>
-        <w:t xml:space="preserve">scores (on PTB-XL, the superset score of (5)); the indicator version thresholds at</w:t>
-      </w:r>
-      <w:r>
-        <w:t xml:space="preserve"> </w:t>
-      </w:r>
-      <w:r>
-        <w:t xml:space="preserve">the</w:t>
+        <w:t xml:space="preserve">, on</w:t>
+      </w:r>
+      <w:r>
+        <w:t xml:space="preserve"> </w:t>
+      </w:r>
+      <w:r>
+        <w:t xml:space="preserve">conformity scores (on PTB-XL, the superset score of (5)); the indicator version</w:t>
+      </w:r>
+      <w:r>
+        <w:t xml:space="preserve"> </w:t>
+      </w:r>
+      <w:r>
+        <w:t xml:space="preserve">thresholds at the</w:t>
       </w:r>
       <w:r>
         <w:t xml:space="preserve"> </w:t>
@@ -9278,13 +9178,13 @@
         <w:t xml:space="preserve"> </w:t>
       </w:r>
       <w:r>
-        <w:t xml:space="preserve">quantile of all evaluation scores. Table 2 lists the procedure</w:t>
-      </w:r>
-      <w:r>
-        <w:t xml:space="preserve"> </w:t>
-      </w:r>
-      <w:r>
-        <w:t xml:space="preserve">behind each reported quantity.</w:t>
+        <w:t xml:space="preserve">quantile of all evaluation scores. Table 2 lists</w:t>
+      </w:r>
+      <w:r>
+        <w:t xml:space="preserve"> </w:t>
+      </w:r>
+      <w:r>
+        <w:t xml:space="preserve">the procedure behind each reported quantity.</w:t>
       </w:r>
     </w:p>
     <w:p>
@@ -9323,8 +9223,8 @@
         </w:tblBorders>
       </w:tblPr>
       <w:tblGrid>
-        <w:gridCol w:w="3960"/>
-        <w:gridCol w:w="3960"/>
+        <w:gridCol w:w="2018"/>
+        <w:gridCol w:w="5901"/>
       </w:tblGrid>
       <w:tr>
         <w:trPr>
@@ -9704,7 +9604,7 @@
     </w:p>
     <w:bookmarkEnd w:id="32"/>
     <w:bookmarkEnd w:id="33"/>
-    <w:bookmarkStart w:id="57" w:name="results"/>
+    <w:bookmarkStart w:id="60" w:name="results"/>
     <w:p>
       <w:pPr>
         <w:pStyle w:val="Heading1"/>
@@ -9924,15 +9824,15 @@
         </w:tblBorders>
       </w:tblPr>
       <w:tblGrid>
-        <w:gridCol w:w="766"/>
-        <w:gridCol w:w="1021"/>
-        <w:gridCol w:w="1021"/>
-        <w:gridCol w:w="1021"/>
-        <w:gridCol w:w="1021"/>
-        <w:gridCol w:w="766"/>
-        <w:gridCol w:w="766"/>
-        <w:gridCol w:w="766"/>
-        <w:gridCol w:w="766"/>
+        <w:gridCol w:w="1560"/>
+        <w:gridCol w:w="1200"/>
+        <w:gridCol w:w="720"/>
+        <w:gridCol w:w="1320"/>
+        <w:gridCol w:w="1200"/>
+        <w:gridCol w:w="480"/>
+        <w:gridCol w:w="480"/>
+        <w:gridCol w:w="480"/>
+        <w:gridCol w:w="480"/>
       </w:tblGrid>
       <w:tr>
         <w:trPr>
@@ -11441,12 +11341,12 @@
         </w:tblBorders>
       </w:tblPr>
       <w:tblGrid>
-        <w:gridCol w:w="880"/>
-        <w:gridCol w:w="1173"/>
-        <w:gridCol w:w="1173"/>
-        <w:gridCol w:w="1173"/>
-        <w:gridCol w:w="1173"/>
-        <w:gridCol w:w="1173"/>
+        <w:gridCol w:w="1613"/>
+        <w:gridCol w:w="733"/>
+        <w:gridCol w:w="1320"/>
+        <w:gridCol w:w="1026"/>
+        <w:gridCol w:w="1026"/>
+        <w:gridCol w:w="1026"/>
         <w:gridCol w:w="1173"/>
       </w:tblGrid>
       <w:tr>
@@ -12307,12 +12207,12 @@
         </w:tblBorders>
       </w:tblPr>
       <w:tblGrid>
-        <w:gridCol w:w="1080"/>
-        <w:gridCol w:w="1440"/>
-        <w:gridCol w:w="1080"/>
-        <w:gridCol w:w="1440"/>
-        <w:gridCol w:w="1440"/>
-        <w:gridCol w:w="1440"/>
+        <w:gridCol w:w="990"/>
+        <w:gridCol w:w="866"/>
+        <w:gridCol w:w="3093"/>
+        <w:gridCol w:w="1237"/>
+        <w:gridCol w:w="866"/>
+        <w:gridCol w:w="866"/>
       </w:tblGrid>
       <w:tr>
         <w:trPr>
@@ -13478,7 +13378,7 @@
       </w:r>
     </w:p>
     <w:bookmarkEnd w:id="44"/>
-    <w:bookmarkStart w:id="48" w:name="attributing-the-deficit-to-dependence"/>
+    <w:bookmarkStart w:id="51" w:name="attributing-the-deficit-to-dependence"/>
     <w:p>
       <w:pPr>
         <w:pStyle w:val="Heading2"/>
@@ -13490,6 +13390,92 @@
     <w:p>
       <w:pPr>
         <w:pStyle w:val="FirstParagraph"/>
+        <w:jc w:val="both"/>
+      </w:pPr>
+      <w:r>
+        <w:t xml:space="preserve">Three controls separate dependence from the other features of MIT-BIH blocks,</w:t>
+      </w:r>
+      <w:r>
+        <w:t xml:space="preserve"> </w:t>
+      </w:r>
+      <w:r>
+        <w:t xml:space="preserve">and Fig. 7 sketches how each one rearranges beats among records.</w:t>
+      </w:r>
+    </w:p>
+    <w:p>
+      <w:pPr>
+        <w:pStyle w:val="CaptionedFigure"/>
+        <w:jc w:val="both"/>
+      </w:pPr>
+      <w:r>
+        <w:drawing>
+          <wp:inline>
+            <wp:extent cx="5303520" cy="1273853"/>
+            <wp:effectExtent b="0" l="0" r="0" t="0"/>
+            <wp:docPr descr="Fig. 7. Controls used on MIT-BIH, drawn on four illustrative records (colors mark the original record of each beat). (a) Permutation null. (b) 2×2 factorial design crossing clustering with calibration block-size balance. (c) Dose–response: a growing fraction p of beats reassigned at random." title="" id="46" name="Picture"/>
+            <a:graphic>
+              <a:graphicData uri="http://schemas.openxmlformats.org/drawingml/2006/picture">
+                <pic:pic>
+                  <pic:nvPicPr>
+                    <pic:cNvPr descr="figures/fig7_control_design.png" id="47" name="Picture"/>
+                    <pic:cNvPicPr>
+                      <a:picLocks noChangeArrowheads="1" noChangeAspect="1"/>
+                    </pic:cNvPicPr>
+                  </pic:nvPicPr>
+                  <pic:blipFill>
+                    <a:blip r:embed="rId45"/>
+                    <a:stretch>
+                      <a:fillRect/>
+                    </a:stretch>
+                  </pic:blipFill>
+                  <pic:spPr bwMode="auto">
+                    <a:xfrm>
+                      <a:off x="0" y="0"/>
+                      <a:ext cx="5303520" cy="1273853"/>
+                    </a:xfrm>
+                    <a:prstGeom prst="rect">
+                      <a:avLst/>
+                    </a:prstGeom>
+                    <a:noFill/>
+                    <a:ln w="9525">
+                      <a:noFill/>
+                      <a:headEnd/>
+                      <a:tailEnd/>
+                    </a:ln>
+                  </pic:spPr>
+                </pic:pic>
+              </a:graphicData>
+            </a:graphic>
+          </wp:inline>
+        </w:drawing>
+      </w:r>
+    </w:p>
+    <w:p>
+      <w:pPr>
+        <w:pStyle w:val="ImageCaption"/>
+        <w:jc w:val="both"/>
+      </w:pPr>
+      <w:r>
+        <w:t xml:space="preserve">Fig. 7. Controls used on MIT-BIH, drawn on four illustrative records (colors mark the original record of each beat). (a) Permutation null. (b) 2×2 factorial design crossing clustering with calibration block-size balance. (c) Dose–response: a growing fraction</w:t>
+      </w:r>
+      <w:r>
+        <w:t xml:space="preserve"> </w:t>
+      </w:r>
+      <m:oMath>
+        <m:r>
+          <m:t>p</m:t>
+        </m:r>
+      </m:oMath>
+      <w:r>
+        <w:t xml:space="preserve"> </w:t>
+      </w:r>
+      <w:r>
+        <w:t xml:space="preserve">of beats reassigned at random.</w:t>
+      </w:r>
+    </w:p>
+    <w:p>
+      <w:pPr>
+        <w:pStyle w:val="BodyText"/>
         <w:jc w:val="both"/>
       </w:pPr>
       <w:r>
@@ -15071,7 +15057,7 @@
         <w:t xml:space="preserve"> </w:t>
       </w:r>
       <w:r>
-        <w:t xml:space="preserve">Table 6, these intervals are conditional on the 22 DS2 records. Fig. 7 sets the</w:t>
+        <w:t xml:space="preserve">Table 6, these intervals are conditional on the 22 DS2 records. Fig. 8 sets the</w:t>
       </w:r>
       <w:r>
         <w:t xml:space="preserve"> </w:t>
@@ -15096,18 +15082,18 @@
           <wp:inline>
             <wp:extent cx="5303520" cy="1550454"/>
             <wp:effectExtent b="0" l="0" r="0" t="0"/>
-            <wp:docPr descr="Fig. 7. Attribution of the MIT-BIH deficit, primary backbone. (a) Factorial effects on B1 coverage (Monte Carlo 95% intervals, 400 splits; open markers include zero). (b) B12−B1 gap on original and permuted data (whiskers: 2.5–97.5% range); percentages give the mechanical share." title="" id="46" name="Picture"/>
+            <wp:docPr descr="Fig. 8. Attribution of the MIT-BIH deficit, primary backbone. (a) Factorial effects on B1 coverage (Monte Carlo 95% intervals, 400 splits; open markers include zero). (b) B12−B1 gap on original and permuted data (whiskers: 2.5–97.5% range); percentages give the mechanical share." title="" id="49" name="Picture"/>
             <a:graphic>
               <a:graphicData uri="http://schemas.openxmlformats.org/drawingml/2006/picture">
                 <pic:pic>
                   <pic:nvPicPr>
-                    <pic:cNvPr descr="figures/fig7_attribution.png" id="47" name="Picture"/>
+                    <pic:cNvPr descr="figures/fig8_attribution.png" id="50" name="Picture"/>
                     <pic:cNvPicPr>
                       <a:picLocks noChangeArrowheads="1" noChangeAspect="1"/>
                     </pic:cNvPicPr>
                   </pic:nvPicPr>
                   <pic:blipFill>
-                    <a:blip r:embed="rId45"/>
+                    <a:blip r:embed="rId48"/>
                     <a:stretch>
                       <a:fillRect/>
                     </a:stretch>
@@ -15140,11 +15126,11 @@
         <w:jc w:val="both"/>
       </w:pPr>
       <w:r>
-        <w:t xml:space="preserve">Fig. 7. Attribution of the MIT-BIH deficit, primary backbone. (a) Factorial effects on B1 coverage (Monte Carlo 95% intervals, 400 splits; open markers include zero). (b) B12−B1 gap on original and permuted data (whiskers: 2.5–97.5% range); percentages give the mechanical share.</w:t>
+        <w:t xml:space="preserve">Fig. 8. Attribution of the MIT-BIH deficit, primary backbone. (a) Factorial effects on B1 coverage (Monte Carlo 95% intervals, 400 splits; open markers include zero). (b) B12−B1 gap on original and permuted data (whiskers: 2.5–97.5% range); percentages give the mechanical share.</w:t>
       </w:r>
     </w:p>
-    <w:bookmarkEnd w:id="48"/>
-    <w:bookmarkStart w:id="52" w:name="the-deficit-tracks-the-design-effect"/>
+    <w:bookmarkEnd w:id="51"/>
+    <w:bookmarkStart w:id="55" w:name="the-deficit-tracks-the-design-effect"/>
     <w:p>
       <w:pPr>
         <w:pStyle w:val="Heading2"/>
@@ -15398,11 +15384,11 @@
         </w:tblBorders>
       </w:tblPr>
       <w:tblGrid>
-        <w:gridCol w:w="1485"/>
-        <w:gridCol w:w="1980"/>
-        <w:gridCol w:w="1485"/>
-        <w:gridCol w:w="1485"/>
-        <w:gridCol w:w="1485"/>
+        <w:gridCol w:w="2762"/>
+        <w:gridCol w:w="460"/>
+        <w:gridCol w:w="1565"/>
+        <w:gridCol w:w="1565"/>
+        <w:gridCol w:w="1565"/>
       </w:tblGrid>
       <w:tr>
         <w:trPr>
@@ -16000,7 +15986,7 @@
         <w:t xml:space="preserve"> </w:t>
       </w:r>
       <w:r>
-        <w:t xml:space="preserve">Fig. 8 plots the deficit against DEff: the MIT-BIH gradient carries the combined</w:t>
+        <w:t xml:space="preserve">Fig. 9 plots the deficit against DEff: the MIT-BIH gradient carries the combined</w:t>
       </w:r>
       <w:r>
         <w:t xml:space="preserve"> </w:t>
@@ -16031,18 +16017,18 @@
           <wp:inline>
             <wp:extent cx="3108960" cy="2277948"/>
             <wp:effectExtent b="0" l="0" r="0" t="0"/>
-            <wp:docPr descr="Fig. 8. B1 coverage deficit against the design effect. MIT-BIH (blue): beats progressively reassigned between records; PTB-XL (orange): observed patient partition with Monte Carlo 95% interval. Spearman correlations over the 12 points are annotated." title="" id="50" name="Picture"/>
+            <wp:docPr descr="Fig. 9. B1 coverage deficit against the design effect. MIT-BIH (blue): beats progressively reassigned between records; PTB-XL (orange): observed patient partition with Monte Carlo 95% interval. Spearman correlations over the 12 points are annotated." title="" id="53" name="Picture"/>
             <a:graphic>
               <a:graphicData uri="http://schemas.openxmlformats.org/drawingml/2006/picture">
                 <pic:pic>
                   <pic:nvPicPr>
-                    <pic:cNvPr descr="figures/fig8_dose_response.png" id="51" name="Picture"/>
+                    <pic:cNvPr descr="figures/fig9_dose_response.png" id="54" name="Picture"/>
                     <pic:cNvPicPr>
                       <a:picLocks noChangeArrowheads="1" noChangeAspect="1"/>
                     </pic:cNvPicPr>
                   </pic:nvPicPr>
                   <pic:blipFill>
-                    <a:blip r:embed="rId49"/>
+                    <a:blip r:embed="rId52"/>
                     <a:stretch>
                       <a:fillRect/>
                     </a:stretch>
@@ -16075,11 +16061,11 @@
         <w:jc w:val="both"/>
       </w:pPr>
       <w:r>
-        <w:t xml:space="preserve">Fig. 8. B1 coverage deficit against the design effect. MIT-BIH (blue): beats progressively reassigned between records; PTB-XL (orange): observed patient partition with Monte Carlo 95% interval. Spearman correlations over the 12 points are annotated.</w:t>
+        <w:t xml:space="preserve">Fig. 9. B1 coverage deficit against the design effect. MIT-BIH (blue): beats progressively reassigned between records; PTB-XL (orange): observed patient partition with Monte Carlo 95% interval. Spearman correlations over the 12 points are annotated.</w:t>
       </w:r>
     </w:p>
-    <w:bookmarkEnd w:id="52"/>
-    <w:bookmarkStart w:id="56" w:name="robustness-to-backbone-and-checkpoint"/>
+    <w:bookmarkEnd w:id="55"/>
+    <w:bookmarkStart w:id="59" w:name="robustness-to-backbone-and-checkpoint"/>
     <w:p>
       <w:pPr>
         <w:pStyle w:val="Heading2"/>
@@ -16205,11 +16191,11 @@
         </w:tblBorders>
       </w:tblPr>
       <w:tblGrid>
-        <w:gridCol w:w="1320"/>
-        <w:gridCol w:w="1320"/>
-        <w:gridCol w:w="1760"/>
-        <w:gridCol w:w="1760"/>
-        <w:gridCol w:w="1760"/>
+        <w:gridCol w:w="1716"/>
+        <w:gridCol w:w="3036"/>
+        <w:gridCol w:w="1056"/>
+        <w:gridCol w:w="1056"/>
+        <w:gridCol w:w="1056"/>
       </w:tblGrid>
       <w:tr>
         <w:trPr>
@@ -16731,7 +16717,7 @@
         <w:t xml:space="preserve"> </w:t>
       </w:r>
       <w:r>
-        <w:t xml:space="preserve">between backbones are not interpreted. Fig. 9 summarizes both checks. Panel (a)</w:t>
+        <w:t xml:space="preserve">between backbones are not interpreted. Fig. 10 summarizes both checks. Panel (a)</w:t>
       </w:r>
       <w:r>
         <w:t xml:space="preserve"> </w:t>
@@ -16768,18 +16754,18 @@
           <wp:inline>
             <wp:extent cx="5303520" cy="1765149"/>
             <wp:effectExtent b="0" l="0" r="0" t="0"/>
-            <wp:docPr descr="Fig. 9. Robustness. (a) MIT-BIH B1 deficit against the permutation null by backbone and \alpha: Monte Carlo 95% interval (200 splits; open markers include zero) and record-level jackknife 95% CI (light bars). (b) B1 coverage minus nominal under best-validation versus last-epoch weights, 16 cells; shaded quadrants mark sign agreement." title="" id="54" name="Picture"/>
+            <wp:docPr descr="Fig. 10. Robustness. (a) MIT-BIH B1 deficit against the permutation null by backbone and \alpha: Monte Carlo 95% interval (200 splits; open markers include zero) and record-level jackknife 95% CI (light bars). (b) B1 coverage minus nominal under best-validation versus last-epoch weights, 16 cells; shaded quadrants mark sign agreement." title="" id="57" name="Picture"/>
             <a:graphic>
               <a:graphicData uri="http://schemas.openxmlformats.org/drawingml/2006/picture">
                 <pic:pic>
                   <pic:nvPicPr>
-                    <pic:cNvPr descr="figures/fig9_robustness.png" id="55" name="Picture"/>
+                    <pic:cNvPr descr="figures/fig10_robustness.png" id="58" name="Picture"/>
                     <pic:cNvPicPr>
                       <a:picLocks noChangeArrowheads="1" noChangeAspect="1"/>
                     </pic:cNvPicPr>
                   </pic:nvPicPr>
                   <pic:blipFill>
-                    <a:blip r:embed="rId53"/>
+                    <a:blip r:embed="rId56"/>
                     <a:stretch>
                       <a:fillRect/>
                     </a:stretch>
@@ -16812,7 +16798,7 @@
         <w:jc w:val="both"/>
       </w:pPr>
       <w:r>
-        <w:t xml:space="preserve">Fig. 9. Robustness. (a) MIT-BIH B1 deficit against the permutation null by backbone and</w:t>
+        <w:t xml:space="preserve">Fig. 10. Robustness. (a) MIT-BIH B1 deficit against the permutation null by backbone and</w:t>
       </w:r>
       <w:r>
         <w:t xml:space="preserve"> </w:t>
@@ -16826,9 +16812,9 @@
         <w:t xml:space="preserve">: Monte Carlo 95% interval (200 splits; open markers include zero) and record-level jackknife 95% CI (light bars). (b) B1 coverage minus nominal under best-validation versus last-epoch weights, 16 cells; shaded quadrants mark sign agreement.</w:t>
       </w:r>
     </w:p>
-    <w:bookmarkEnd w:id="56"/>
-    <w:bookmarkEnd w:id="57"/>
-    <w:bookmarkStart w:id="62" w:name="discussion"/>
+    <w:bookmarkEnd w:id="59"/>
+    <w:bookmarkEnd w:id="60"/>
+    <w:bookmarkStart w:id="65" w:name="discussion"/>
     <w:p>
       <w:pPr>
         <w:pStyle w:val="Heading1"/>
@@ -16837,7 +16823,7 @@
         <w:t xml:space="preserve">6. Discussion</w:t>
       </w:r>
     </w:p>
-    <w:bookmarkStart w:id="58" w:name="main-findings"/>
+    <w:bookmarkStart w:id="61" w:name="main-findings"/>
     <w:p>
       <w:pPr>
         <w:pStyle w:val="Heading2"/>
@@ -16896,37 +16882,31 @@
         <w:t xml:space="preserve"> </w:t>
       </w:r>
       <w:r>
-        <w:t xml:space="preserve">coverage when it is not? The first is combinatorial and is</w:t>
-      </w:r>
-      <w:r>
-        <w:t xml:space="preserve"> </w:t>
-      </w:r>
-      <w:r>
-        <w:t xml:space="preserve">settled by metadata. On the resources audited here the answer is stricter than</w:t>
-      </w:r>
-      <w:r>
-        <w:t xml:space="preserve"> </w:t>
-      </w:r>
-      <w:r>
-        <w:t xml:space="preserve">their size suggests, because declared sources collapse under the join and rare</w:t>
-      </w:r>
-      <w:r>
-        <w:t xml:space="preserve"> </w:t>
-      </w:r>
-      <w:r>
-        <w:t xml:space="preserve">labels are spread over few patients (§5.1). Proposition 1 makes the point</w:t>
-      </w:r>
-      <w:r>
-        <w:t xml:space="preserve"> </w:t>
-      </w:r>
-      <w:r>
-        <w:t xml:space="preserve">directly: splitting the 22 evaluation subjects of the canonical MIT-BIH partition</w:t>
-      </w:r>
-      <w:r>
-        <w:t xml:space="preserve"> </w:t>
-      </w:r>
-      <w:r>
-        <w:t xml:space="preserve">evenly between calibration and test leaves</w:t>
+        <w:t xml:space="preserve">coverage when it is not? The first is combinatorial and settled</w:t>
+      </w:r>
+      <w:r>
+        <w:t xml:space="preserve"> </w:t>
+      </w:r>
+      <w:r>
+        <w:t xml:space="preserve">by metadata, and on the resources audited the answer is stricter than their size</w:t>
+      </w:r>
+      <w:r>
+        <w:t xml:space="preserve"> </w:t>
+      </w:r>
+      <w:r>
+        <w:t xml:space="preserve">suggests: declared sources collapse under the join, rare labels are spread over</w:t>
+      </w:r>
+      <w:r>
+        <w:t xml:space="preserve"> </w:t>
+      </w:r>
+      <w:r>
+        <w:t xml:space="preserve">few patients (§5.1), and an even split of the 22 MIT-BIH evaluation subjects</w:t>
+      </w:r>
+      <w:r>
+        <w:t xml:space="preserve"> </w:t>
+      </w:r>
+      <w:r>
+        <w:t xml:space="preserve">leaves</w:t>
       </w:r>
       <w:r>
         <w:t xml:space="preserve"> </w:t>
@@ -16955,19 +16935,13 @@
         </m:r>
       </m:oMath>
       <w:r>
-        <w:t xml:space="preserve">, which rules out a</w:t>
-      </w:r>
-      <w:r>
-        <w:t xml:space="preserve"> </w:t>
-      </w:r>
-      <w:r>
-        <w:t xml:space="preserve">subject-level guarantee at the 95% level for this design, whatever the model and</w:t>
-      </w:r>
-      <w:r>
-        <w:t xml:space="preserve"> </w:t>
-      </w:r>
-      <w:r>
-        <w:t xml:space="preserve">however many beats each record holds.</w:t>
+        <w:t xml:space="preserve">, too few for a subject-level guarantee at the 95% level whatever</w:t>
+      </w:r>
+      <w:r>
+        <w:t xml:space="preserve"> </w:t>
+      </w:r>
+      <w:r>
+        <w:t xml:space="preserve">the model and however many beats each record holds.</w:t>
       </w:r>
     </w:p>
     <w:p>
@@ -16982,19 +16956,19 @@
         <w:t xml:space="preserve"> </w:t>
       </w:r>
       <w:r>
-        <w:t xml:space="preserve">depended on how many repeats blocks contain more than on how strongly their</w:t>
-      </w:r>
-      <w:r>
-        <w:t xml:space="preserve"> </w:t>
-      </w:r>
-      <w:r>
-        <w:t xml:space="preserve">observations correlate (§5.3–§5.4). PTB-XL shows this most clearly. Its within-patient correlation seems</w:t>
-      </w:r>
-      <w:r>
-        <w:t xml:space="preserve"> </w:t>
-      </w:r>
-      <w:r>
-        <w:t xml:space="preserve">to call for block-level calibration, yet with</w:t>
+        <w:t xml:space="preserve">depended more on how many repeats blocks contain than on how strongly their</w:t>
+      </w:r>
+      <w:r>
+        <w:t xml:space="preserve"> </w:t>
+      </w:r>
+      <w:r>
+        <w:t xml:space="preserve">observations correlate (§5.3–§5.4). PTB-XL shows this most clearly: its</w:t>
+      </w:r>
+      <w:r>
+        <w:t xml:space="preserve"> </w:t>
+      </w:r>
+      <w:r>
+        <w:t xml:space="preserve">within-patient correlation seems to call for block-level calibration, yet with</w:t>
       </w:r>
       <w:r>
         <w:t xml:space="preserve"> </w:t>
@@ -17075,19 +17049,19 @@
         </m:r>
       </m:oMath>
       <w:r>
-        <w:t xml:space="preserve">, and counting repeats correctly predicts that such</w:t>
-      </w:r>
-      <w:r>
-        <w:t xml:space="preserve"> </w:t>
-      </w:r>
-      <w:r>
-        <w:t xml:space="preserve">calibration is unnecessary for marginal coverage at these levels. Both quantities</w:t>
-      </w:r>
-      <w:r>
-        <w:t xml:space="preserve"> </w:t>
-      </w:r>
-      <w:r>
-        <w:t xml:space="preserve">should be reported, and neither belongs to the dataset alone:</w:t>
+        <w:t xml:space="preserve">, correctly</w:t>
+      </w:r>
+      <w:r>
+        <w:t xml:space="preserve"> </w:t>
+      </w:r>
+      <w:r>
+        <w:t xml:space="preserve">predicting that such calibration is unnecessary for marginal coverage at these</w:t>
+      </w:r>
+      <w:r>
+        <w:t xml:space="preserve"> </w:t>
+      </w:r>
+      <w:r>
+        <w:t xml:space="preserve">levels. Neither quantity belongs to the dataset alone, since</w:t>
       </w:r>
       <w:r>
         <w:t xml:space="preserve"> </w:t>
@@ -17110,13 +17084,13 @@
         <w:t xml:space="preserve"> </w:t>
       </w:r>
       <w:r>
-        <w:t xml:space="preserve">depends on</w:t>
-      </w:r>
-      <w:r>
-        <w:t xml:space="preserve"> </w:t>
-      </w:r>
-      <w:r>
-        <w:t xml:space="preserve">the split design and</w:t>
+        <w:t xml:space="preserve">depends on the</w:t>
+      </w:r>
+      <w:r>
+        <w:t xml:space="preserve"> </w:t>
+      </w:r>
+      <w:r>
+        <w:t xml:space="preserve">split design and</w:t>
       </w:r>
       <w:r>
         <w:t xml:space="preserve"> </w:t>
@@ -17136,29 +17110,29 @@
         <w:t xml:space="preserve"> </w:t>
       </w:r>
       <w:r>
-        <w:t xml:space="preserve">MIT-BIH the deficit has the same sign across backbones, levels and splits of the</w:t>
-      </w:r>
-      <w:r>
-        <w:t xml:space="preserve"> </w:t>
-      </w:r>
-      <w:r>
-        <w:t xml:space="preserve">22 evaluation subjects, yet a jackknife over those subjects cannot resolve it</w:t>
-      </w:r>
-      <w:r>
-        <w:t xml:space="preserve"> </w:t>
-      </w:r>
-      <w:r>
-        <w:t xml:space="preserve">(§5.3): the scarcity of blocks that bounds the guarantee also bounds what an</w:t>
-      </w:r>
-      <w:r>
-        <w:t xml:space="preserve"> </w:t>
-      </w:r>
-      <w:r>
-        <w:t xml:space="preserve">audit of the same subjects can establish.</w:t>
+        <w:t xml:space="preserve">MIT-BIH the deficit keeps its sign across backbones, levels and splits, yet a</w:t>
+      </w:r>
+      <w:r>
+        <w:t xml:space="preserve"> </w:t>
+      </w:r>
+      <w:r>
+        <w:t xml:space="preserve">jackknife over the 22 subjects cannot resolve it (§5.3): the scarcity of blocks</w:t>
+      </w:r>
+      <w:r>
+        <w:t xml:space="preserve"> </w:t>
+      </w:r>
+      <w:r>
+        <w:t xml:space="preserve">that bounds the guarantee also bounds what an audit of the same subjects can</w:t>
+      </w:r>
+      <w:r>
+        <w:t xml:space="preserve"> </w:t>
+      </w:r>
+      <w:r>
+        <w:t xml:space="preserve">establish.</w:t>
       </w:r>
     </w:p>
-    <w:bookmarkEnd w:id="58"/>
-    <w:bookmarkStart w:id="59" w:name="X10a21a4c9ffce0be86017eff986db914a5bca64"/>
+    <w:bookmarkEnd w:id="61"/>
+    <w:bookmarkStart w:id="62" w:name="X10a21a4c9ffce0be86017eff986db914a5bca64"/>
     <w:p>
       <w:pPr>
         <w:pStyle w:val="Heading2"/>
@@ -17173,13 +17147,13 @@
         <w:jc w:val="both"/>
       </w:pPr>
       <w:r>
-        <w:t xml:space="preserve">The lesson that travels furthest concerns evaluation rather than ECG. On the same</w:t>
-      </w:r>
-      <w:r>
-        <w:t xml:space="preserve"> </w:t>
-      </w:r>
-      <w:r>
-        <w:t xml:space="preserve">data HCP seems to</w:t>
+        <w:t xml:space="preserve">The lesson that travels furthest concerns evaluation rather than ECG. HCP seems</w:t>
+      </w:r>
+      <w:r>
+        <w:t xml:space="preserve"> </w:t>
+      </w:r>
+      <w:r>
+        <w:t xml:space="preserve">to</w:t>
       </w:r>
       <w:r>
         <w:t xml:space="preserve"> </w:t>
@@ -17191,19 +17165,19 @@
         <w:t xml:space="preserve"> </w:t>
       </w:r>
       <w:r>
-        <w:t xml:space="preserve">the coverage that naive split conformal loses, but</w:t>
-      </w:r>
-      <w:r>
-        <w:t xml:space="preserve"> </w:t>
-      </w:r>
-      <w:r>
-        <w:t xml:space="preserve">75–110% of the difference persists once within-block dependence is permuted away</w:t>
-      </w:r>
-      <w:r>
-        <w:t xml:space="preserve"> </w:t>
-      </w:r>
-      <w:r>
-        <w:t xml:space="preserve">(§5.3, §5.5). The mass</w:t>
+        <w:t xml:space="preserve">the coverage that naive split conformal loses, but 75–110% of the</w:t>
+      </w:r>
+      <w:r>
+        <w:t xml:space="preserve"> </w:t>
+      </w:r>
+      <w:r>
+        <w:t xml:space="preserve">difference persists once within-block dependence is permuted away (§5.3, §5.5).</w:t>
+      </w:r>
+      <w:r>
+        <w:t xml:space="preserve"> </w:t>
+      </w:r>
+      <w:r>
+        <w:t xml:space="preserve">The mass</w:t>
       </w:r>
       <w:r>
         <w:t xml:space="preserve"> </w:t>
@@ -17279,13 +17253,13 @@
         <w:t xml:space="preserve"> </w:t>
       </w:r>
       <w:r>
-        <w:t xml:space="preserve">lifts HCP to a higher empirical</w:t>
-      </w:r>
-      <w:r>
-        <w:t xml:space="preserve"> </w:t>
-      </w:r>
-      <w:r>
-        <w:t xml:space="preserve">quantile regardless of dependence, and when</w:t>
+        <w:t xml:space="preserve">lifts HCP to a higher empirical quantile</w:t>
+      </w:r>
+      <w:r>
+        <w:t xml:space="preserve"> </w:t>
+      </w:r>
+      <w:r>
+        <w:t xml:space="preserve">regardless of dependence, and when</w:t>
       </w:r>
       <w:r>
         <w:t xml:space="preserve"> </w:t>
@@ -17308,13 +17282,13 @@
         <w:t xml:space="preserve"> </w:t>
       </w:r>
       <w:r>
-        <w:t xml:space="preserve">is small, exactly where</w:t>
-      </w:r>
-      <w:r>
-        <w:t xml:space="preserve"> </w:t>
-      </w:r>
-      <w:r>
-        <w:t xml:space="preserve">block-level calibration matters, this mechanical inflation dominates. Below</w:t>
+        <w:t xml:space="preserve">is small, exactly where block-level</w:t>
+      </w:r>
+      <w:r>
+        <w:t xml:space="preserve"> </w:t>
+      </w:r>
+      <w:r>
+        <w:t xml:space="preserve">calibration matters, this mechanical inflation dominates; below</w:t>
       </w:r>
       <w:r>
         <w:t xml:space="preserve"> </w:t>
@@ -17340,31 +17314,25 @@
         <w:t xml:space="preserve"> </w:t>
       </w:r>
       <w:r>
-        <w:t xml:space="preserve">the comparison degenerates, since HCP covers by returning every</w:t>
-      </w:r>
-      <w:r>
-        <w:t xml:space="preserve"> </w:t>
-      </w:r>
-      <w:r>
-        <w:t xml:space="preserve">label (Fig. 6). A claim that a hierarchical method improves coverage should</w:t>
-      </w:r>
-      <w:r>
-        <w:t xml:space="preserve"> </w:t>
-      </w:r>
-      <w:r>
-        <w:t xml:space="preserve">therefore be tested against a null that keeps block sizes and score marginals but</w:t>
-      </w:r>
-      <w:r>
-        <w:t xml:space="preserve"> </w:t>
-      </w:r>
-      <w:r>
-        <w:t xml:space="preserve">removes dependence, and coverage should always be reported with set size,</w:t>
-      </w:r>
-      <w:r>
-        <w:t xml:space="preserve"> </w:t>
-      </w:r>
-      <w:r>
-        <w:t xml:space="preserve">abstention being the cheapest route to coverage.</w:t>
+        <w:t xml:space="preserve">HCP simply returns every label (Fig. 6). Claims that a hierarchical method</w:t>
+      </w:r>
+      <w:r>
+        <w:t xml:space="preserve"> </w:t>
+      </w:r>
+      <w:r>
+        <w:t xml:space="preserve">improves coverage should be tested against a null that keeps block sizes and</w:t>
+      </w:r>
+      <w:r>
+        <w:t xml:space="preserve"> </w:t>
+      </w:r>
+      <w:r>
+        <w:t xml:space="preserve">score marginals but removes dependence, and coverage should always come with set</w:t>
+      </w:r>
+      <w:r>
+        <w:t xml:space="preserve"> </w:t>
+      </w:r>
+      <w:r>
+        <w:t xml:space="preserve">size, abstention being the cheapest route to coverage.</w:t>
       </w:r>
     </w:p>
     <w:p>
@@ -17379,53 +17347,47 @@
         <w:t xml:space="preserve"> </w:t>
       </w:r>
       <w:r>
-        <w:t xml:space="preserve">over many random calibration–test splits of one dataset. With clustered data</w:t>
-      </w:r>
-      <w:r>
-        <w:t xml:space="preserve"> </w:t>
-      </w:r>
-      <w:r>
-        <w:t xml:space="preserve">those splits reuse the same subjects, so the spread or bootstrap interval of the</w:t>
-      </w:r>
-      <w:r>
-        <w:t xml:space="preserve"> </w:t>
-      </w:r>
-      <w:r>
-        <w:t xml:space="preserve">coverages describes the split procedure on those subjects and shrinks as splits</w:t>
-      </w:r>
-      <w:r>
-        <w:t xml:space="preserve"> </w:t>
-      </w:r>
-      <w:r>
-        <w:t xml:space="preserve">are added; it is not a confidence interval for the population. On MIT-BIH this</w:t>
-      </w:r>
-      <w:r>
-        <w:t xml:space="preserve"> </w:t>
-      </w:r>
-      <w:r>
-        <w:t xml:space="preserve">decides the reading: repeated-split intervals exclude zero in most cells of</w:t>
-      </w:r>
-      <w:r>
-        <w:t xml:space="preserve"> </w:t>
-      </w:r>
-      <w:r>
-        <w:t xml:space="preserve">Table 6, while the jackknife over the same 22 subjects includes zero in all of</w:t>
-      </w:r>
-      <w:r>
-        <w:t xml:space="preserve"> </w:t>
-      </w:r>
-      <w:r>
-        <w:t xml:space="preserve">them. Population claims should resample subjects, and with few subjects the</w:t>
-      </w:r>
-      <w:r>
-        <w:t xml:space="preserve"> </w:t>
-      </w:r>
-      <w:r>
-        <w:t xml:space="preserve">honest conclusion may be that the sign of a coverage gap is not yet known.</w:t>
+        <w:t xml:space="preserve">over many random calibration–test splits of one dataset, but with clustered data</w:t>
+      </w:r>
+      <w:r>
+        <w:t xml:space="preserve"> </w:t>
+      </w:r>
+      <w:r>
+        <w:t xml:space="preserve">those splits reuse the same subjects, so the resulting interval describes the</w:t>
+      </w:r>
+      <w:r>
+        <w:t xml:space="preserve"> </w:t>
+      </w:r>
+      <w:r>
+        <w:t xml:space="preserve">split procedure on those subjects and shrinks as splits are added. On MIT-BIH</w:t>
+      </w:r>
+      <w:r>
+        <w:t xml:space="preserve"> </w:t>
+      </w:r>
+      <w:r>
+        <w:t xml:space="preserve">this decides the reading: repeated-split intervals exclude zero in most cells of</w:t>
+      </w:r>
+      <w:r>
+        <w:t xml:space="preserve"> </w:t>
+      </w:r>
+      <w:r>
+        <w:t xml:space="preserve">Table 6, while the jackknife over the same 22 subjects includes zero in all.</w:t>
+      </w:r>
+      <w:r>
+        <w:t xml:space="preserve"> </w:t>
+      </w:r>
+      <w:r>
+        <w:t xml:space="preserve">Population claims should resample subjects, and with few subjects the honest</w:t>
+      </w:r>
+      <w:r>
+        <w:t xml:space="preserve"> </w:t>
+      </w:r>
+      <w:r>
+        <w:t xml:space="preserve">conclusion may be that the sign of a coverage gap is not yet known.</w:t>
       </w:r>
     </w:p>
-    <w:bookmarkEnd w:id="59"/>
-    <w:bookmarkStart w:id="60" w:name="implications-and-relation-to-prior-work"/>
+    <w:bookmarkEnd w:id="62"/>
+    <w:bookmarkStart w:id="63" w:name="implications-and-relation-to-prior-work"/>
     <w:p>
       <w:pPr>
         <w:pStyle w:val="Heading2"/>
@@ -17783,8 +17745,8 @@
         <w:t xml:space="preserve">versions meet the same boundary is open.</w:t>
       </w:r>
     </w:p>
-    <w:bookmarkEnd w:id="60"/>
-    <w:bookmarkStart w:id="61" w:name="limitations-and-threats-to-validity"/>
+    <w:bookmarkEnd w:id="63"/>
+    <w:bookmarkStart w:id="64" w:name="limitations-and-threats-to-validity"/>
     <w:p>
       <w:pPr>
         <w:pStyle w:val="Heading2"/>
@@ -18073,13 +18035,7 @@
         <w:t xml:space="preserve"> </w:t>
       </w:r>
       <w:r>
-        <w:t xml:space="preserve">1989–1996; its device, nurse and site metadata make the block analysis possible,</w:t>
-      </w:r>
-      <w:r>
-        <w:t xml:space="preserve"> </w:t>
-      </w:r>
-      <w:r>
-        <w:t xml:space="preserve">but its</w:t>
+        <w:t xml:space="preserve">1989–1996; its metadata make the block analysis possible, but its</w:t>
       </w:r>
       <w:r>
         <w:t xml:space="preserve"> </w:t>
@@ -18107,43 +18063,31 @@
         <w:t xml:space="preserve"> </w:t>
       </w:r>
       <w:r>
-        <w:t xml:space="preserve">may not carry over to present-day multi-center cohorts.</w:t>
-      </w:r>
-      <w:r>
-        <w:t xml:space="preserve"> </w:t>
-      </w:r>
-      <w:r>
-        <w:t xml:space="preserve">Eleven of the twelve dose–response points are synthetic MIT-BIH configurations,</w:t>
-      </w:r>
-      <w:r>
-        <w:t xml:space="preserve"> </w:t>
-      </w:r>
-      <w:r>
-        <w:t xml:space="preserve">so the combined correlation reflects an intervention within one dataset, and</w:t>
-      </w:r>
-      <w:r>
-        <w:t xml:space="preserve"> </w:t>
-      </w:r>
-      <w:r>
-        <w:t xml:space="preserve">PTB-XL, which differs in modality, task and block type, serves only as a</w:t>
-      </w:r>
-      <w:r>
-        <w:t xml:space="preserve"> </w:t>
-      </w:r>
-      <w:r>
-        <w:t xml:space="preserve">prediction check (§5.4). All results concern ECG; temporal dependence within a</w:t>
-      </w:r>
-      <w:r>
-        <w:t xml:space="preserve"> </w:t>
-      </w:r>
-      <w:r>
-        <w:t xml:space="preserve">patient across visits is not addressed, and other clinical signals with repeated</w:t>
-      </w:r>
-      <w:r>
-        <w:t xml:space="preserve"> </w:t>
-      </w:r>
-      <w:r>
-        <w:t xml:space="preserve">measurements were not examined.</w:t>
+        <w:t xml:space="preserve">may not carry over to present-day multi-center cohorts. Eleven of the twelve</w:t>
+      </w:r>
+      <w:r>
+        <w:t xml:space="preserve"> </w:t>
+      </w:r>
+      <w:r>
+        <w:t xml:space="preserve">dose–response points are synthetic MIT-BIH configurations, and PTB-XL, which</w:t>
+      </w:r>
+      <w:r>
+        <w:t xml:space="preserve"> </w:t>
+      </w:r>
+      <w:r>
+        <w:t xml:space="preserve">differs in modality, task and block type, serves only as a prediction check</w:t>
+      </w:r>
+      <w:r>
+        <w:t xml:space="preserve"> </w:t>
+      </w:r>
+      <w:r>
+        <w:t xml:space="preserve">(§5.4). All results concern ECG; temporal dependence within a patient across</w:t>
+      </w:r>
+      <w:r>
+        <w:t xml:space="preserve"> </w:t>
+      </w:r>
+      <w:r>
+        <w:t xml:space="preserve">visits and other clinical signals with repeated measurements were not examined.</w:t>
       </w:r>
     </w:p>
     <w:p>
@@ -18168,7 +18112,7 @@
         <w:t xml:space="preserve"> </w:t>
       </w:r>
       <w:r>
-        <w:t xml:space="preserve">and Fig. 7 and the Spearman</w:t>
+        <w:t xml:space="preserve">and Fig. 8 and the Spearman</w:t>
       </w:r>
       <w:r>
         <w:t xml:space="preserve"> </w:t>
@@ -18191,25 +18135,19 @@
         <w:t xml:space="preserve"> </w:t>
       </w:r>
       <w:r>
-        <w:t xml:space="preserve">jackknife treats records as the sampling unit, and its intervals include zero in</w:t>
-      </w:r>
-      <w:r>
-        <w:t xml:space="preserve"> </w:t>
-      </w:r>
-      <w:r>
-        <w:t xml:space="preserve">every cell; since each replicate rests on 500 splits, Monte Carlo error inflates</w:t>
-      </w:r>
-      <w:r>
-        <w:t xml:space="preserve"> </w:t>
-      </w:r>
-      <w:r>
-        <w:t xml:space="preserve">its variance somewhat, so those intervals are conservative. No single split or</w:t>
-      </w:r>
-      <w:r>
-        <w:t xml:space="preserve"> </w:t>
-      </w:r>
-      <w:r>
-        <w:t xml:space="preserve">dose–response point shows a deficit: the split-to-split range covers</w:t>
+        <w:t xml:space="preserve">jackknife treats records as the sampling unit; its intervals include zero in</w:t>
+      </w:r>
+      <w:r>
+        <w:t xml:space="preserve"> </w:t>
+      </w:r>
+      <w:r>
+        <w:t xml:space="preserve">every cell and, because each replicate rests on 500 splits, are slightly</w:t>
+      </w:r>
+      <w:r>
+        <w:t xml:space="preserve"> </w:t>
+      </w:r>
+      <w:r>
+        <w:t xml:space="preserve">conservative. The split-to-split range covers</w:t>
       </w:r>
       <w:r>
         <w:t xml:space="preserve"> </w:t>
@@ -18232,37 +18170,43 @@
         <w:t xml:space="preserve"> </w:t>
       </w:r>
       <w:r>
-        <w:t xml:space="preserve">in every MIT-BIH cell (Table 5). Two criteria of the initial protocol were</w:t>
-      </w:r>
-      <w:r>
-        <w:t xml:space="preserve"> </w:t>
-      </w:r>
-      <w:r>
-        <w:t xml:space="preserve">dropped,</w:t>
-      </w:r>
-      <w:r>
-        <w:t xml:space="preserve"> </w:t>
-      </w:r>
-      <w:r>
-        <w:t xml:space="preserve">“HCP covers better than split conformal”</w:t>
-      </w:r>
-      <w:r>
-        <w:t xml:space="preserve"> </w:t>
-      </w:r>
-      <w:r>
-        <w:t xml:space="preserve">once the permutation control</w:t>
-      </w:r>
-      <w:r>
-        <w:t xml:space="preserve"> </w:t>
-      </w:r>
-      <w:r>
-        <w:t xml:space="preserve">showed the gap to be largely mechanical (§5.3), and a Spearman test across two</w:t>
-      </w:r>
-      <w:r>
-        <w:t xml:space="preserve"> </w:t>
-      </w:r>
-      <w:r>
-        <w:t xml:space="preserve">datasets, whose rank correlation can only be</w:t>
+        <w:t xml:space="preserve">in every MIT-BIH cell</w:t>
+      </w:r>
+      <w:r>
+        <w:t xml:space="preserve"> </w:t>
+      </w:r>
+      <w:r>
+        <w:t xml:space="preserve">(Table 5). Two criteria of the initial protocol were dropped,</w:t>
+      </w:r>
+      <w:r>
+        <w:t xml:space="preserve"> </w:t>
+      </w:r>
+      <w:r>
+        <w:t xml:space="preserve">“HCP covers</w:t>
+      </w:r>
+      <w:r>
+        <w:t xml:space="preserve"> </w:t>
+      </w:r>
+      <w:r>
+        <w:t xml:space="preserve">better than split conformal”</w:t>
+      </w:r>
+      <w:r>
+        <w:t xml:space="preserve"> </w:t>
+      </w:r>
+      <w:r>
+        <w:t xml:space="preserve">once the permutation control showed the gap to be</w:t>
+      </w:r>
+      <w:r>
+        <w:t xml:space="preserve"> </w:t>
+      </w:r>
+      <w:r>
+        <w:t xml:space="preserve">largely mechanical (§5.3), and a Spearman test across two datasets, whose rank</w:t>
+      </w:r>
+      <w:r>
+        <w:t xml:space="preserve"> </w:t>
+      </w:r>
+      <w:r>
+        <w:t xml:space="preserve">correlation can only be</w:t>
       </w:r>
       <w:r>
         <w:t xml:space="preserve"> </w:t>
@@ -18279,25 +18223,19 @@
         </m:r>
       </m:oMath>
       <w:r>
-        <w:t xml:space="preserve">; these and the unused parts of</w:t>
-      </w:r>
-      <w:r>
-        <w:t xml:space="preserve"> </w:t>
-      </w:r>
-      <w:r>
-        <w:t xml:space="preserve">the initial statistical plan (patient-level bootstrap, a paired permutation test</w:t>
-      </w:r>
-      <w:r>
-        <w:t xml:space="preserve"> </w:t>
-      </w:r>
-      <w:r>
-        <w:t xml:space="preserve">with 10,000 permutations, exact binomial intervals, Cliff’s delta) are listed in</w:t>
-      </w:r>
-      <w:r>
-        <w:t xml:space="preserve"> </w:t>
-      </w:r>
-      <w:r>
-        <w:t xml:space="preserve">the protocol’s deviation log.</w:t>
+        <w:t xml:space="preserve">; these and the unused parts of the initial plan</w:t>
+      </w:r>
+      <w:r>
+        <w:t xml:space="preserve"> </w:t>
+      </w:r>
+      <w:r>
+        <w:t xml:space="preserve">(patient-level bootstrap, a paired permutation test with 10,000 permutations,</w:t>
+      </w:r>
+      <w:r>
+        <w:t xml:space="preserve"> </w:t>
+      </w:r>
+      <w:r>
+        <w:t xml:space="preserve">exact binomial intervals, Cliff’s delta) are listed in the deviation log.</w:t>
       </w:r>
     </w:p>
     <w:p>
@@ -18334,55 +18272,49 @@
         <w:t xml:space="preserve"> </w:t>
       </w:r>
       <w:r>
-        <w:t xml:space="preserve">The variance involves the correlation of the coverage indicator, not of the raw</w:t>
-      </w:r>
-      <w:r>
-        <w:t xml:space="preserve"> </w:t>
-      </w:r>
-      <w:r>
-        <w:t xml:space="preserve">score; with the indicator correlation every Spearman coefficient stays positive</w:t>
-      </w:r>
-      <w:r>
-        <w:t xml:space="preserve"> </w:t>
-      </w:r>
-      <w:r>
-        <w:t xml:space="preserve">(Table 7), and PTB-XL’s correlation drops from 0.35 to 0.19–0.20 while its</w:t>
-      </w:r>
-      <w:r>
-        <w:t xml:space="preserve"> </w:t>
-      </w:r>
-      <w:r>
-        <w:t xml:space="preserve">design effect stays near 1. The design effect ranks configurations, but we do not</w:t>
-      </w:r>
-      <w:r>
-        <w:t xml:space="preserve"> </w:t>
-      </w:r>
-      <w:r>
-        <w:t xml:space="preserve">show that it is sufficient for coverage loss. Corollary 2 is proved for HCP only</w:t>
-      </w:r>
-      <w:r>
-        <w:t xml:space="preserve"> </w:t>
-      </w:r>
-      <w:r>
-        <w:t xml:space="preserve">(§3.3), and the hierarchical constructions are not compared with one another</w:t>
-      </w:r>
-      <w:r>
-        <w:t xml:space="preserve"> </w:t>
-      </w:r>
-      <w:r>
-        <w:t xml:space="preserve">[13]. For PTB-XL the verdict is exhaustive only for the declared sources</w:t>
-      </w:r>
-      <w:r>
-        <w:t xml:space="preserve"> </w:t>
-      </w:r>
-      <w:r>
-        <w:t xml:space="preserve">{patient, site, nurse, device}, which the data cannot verify, and the merging of</w:t>
-      </w:r>
-      <w:r>
-        <w:t xml:space="preserve"> </w:t>
-      </w:r>
-      <w:r>
-        <w:t xml:space="preserve">joins into a giant component is known [33]. Declaring only {patient, site} gives</w:t>
+        <w:t xml:space="preserve">With the indicator correlation that enters the variance, every Spearman</w:t>
+      </w:r>
+      <w:r>
+        <w:t xml:space="preserve"> </w:t>
+      </w:r>
+      <w:r>
+        <w:t xml:space="preserve">coefficient stays positive (Table 7) and PTB-XL’s correlation drops from 0.35</w:t>
+      </w:r>
+      <w:r>
+        <w:t xml:space="preserve"> </w:t>
+      </w:r>
+      <w:r>
+        <w:t xml:space="preserve">to 0.19–0.20 while its design effect stays near 1; we do not show that the design</w:t>
+      </w:r>
+      <w:r>
+        <w:t xml:space="preserve"> </w:t>
+      </w:r>
+      <w:r>
+        <w:t xml:space="preserve">effect is sufficient for coverage loss. Corollary 2 is proved for HCP only (§3.3),</w:t>
+      </w:r>
+      <w:r>
+        <w:t xml:space="preserve"> </w:t>
+      </w:r>
+      <w:r>
+        <w:t xml:space="preserve">and the hierarchical constructions are not compared with one another [13]. For</w:t>
+      </w:r>
+      <w:r>
+        <w:t xml:space="preserve"> </w:t>
+      </w:r>
+      <w:r>
+        <w:t xml:space="preserve">PTB-XL the verdict is exhaustive only for the declared sources {patient, site,</w:t>
+      </w:r>
+      <w:r>
+        <w:t xml:space="preserve"> </w:t>
+      </w:r>
+      <w:r>
+        <w:t xml:space="preserve">nurse, device}, which the data cannot verify [33]. Declaring only {patient, site}</w:t>
+      </w:r>
+      <w:r>
+        <w:t xml:space="preserve"> </w:t>
+      </w:r>
+      <w:r>
+        <w:t xml:space="preserve">gives</w:t>
       </w:r>
       <w:r>
         <w:t xml:space="preserve"> </w:t>
@@ -18437,19 +18369,19 @@
         <w:t xml:space="preserve"> </w:t>
       </w:r>
       <w:r>
-        <w:t xml:space="preserve">feasible, yet 31 of</w:t>
-      </w:r>
-      <w:r>
-        <w:t xml:space="preserve"> </w:t>
-      </w:r>
-      <w:r>
-        <w:t xml:space="preserve">these blocks consist entirely of 188 records without nurse metadata, and on the</w:t>
-      </w:r>
-      <w:r>
-        <w:t xml:space="preserve"> </w:t>
-      </w:r>
-      <w:r>
-        <w:t xml:space="preserve">1,960 fully annotated records the same declaration gives</w:t>
+        <w:t xml:space="preserve">feasible, yet</w:t>
+      </w:r>
+      <w:r>
+        <w:t xml:space="preserve"> </w:t>
+      </w:r>
+      <w:r>
+        <w:t xml:space="preserve">31 of these blocks consist entirely of 188 records without nurse metadata, and on</w:t>
+      </w:r>
+      <w:r>
+        <w:t xml:space="preserve"> </w:t>
+      </w:r>
+      <w:r>
+        <w:t xml:space="preserve">the 1,960 fully annotated records the same declaration gives</w:t>
       </w:r>
       <w:r>
         <w:t xml:space="preserve"> </w:t>
@@ -18478,13 +18410,13 @@
         </m:r>
       </m:oMath>
       <w:r>
-        <w:t xml:space="preserve">. The result is</w:t>
-      </w:r>
-      <w:r>
-        <w:t xml:space="preserve"> </w:t>
-      </w:r>
-      <w:r>
-        <w:t xml:space="preserve">therefore conditional:</w:t>
+        <w:t xml:space="preserve">. The result</w:t>
+      </w:r>
+      <w:r>
+        <w:t xml:space="preserve"> </w:t>
+      </w:r>
+      <w:r>
+        <w:t xml:space="preserve">is therefore conditional:</w:t>
       </w:r>
       <w:r>
         <w:t xml:space="preserve"> </w:t>
@@ -18533,19 +18465,19 @@
         <w:t xml:space="preserve"> </w:t>
       </w:r>
       <w:r>
-        <w:t xml:space="preserve">Finally, how well ECG networks discriminate on benchmarks [1] is</w:t>
-      </w:r>
-      <w:r>
-        <w:t xml:space="preserve"> </w:t>
-      </w:r>
-      <w:r>
-        <w:t xml:space="preserve">orthogonal to this question: an accurate model calibrated on too few blocks still</w:t>
-      </w:r>
-      <w:r>
-        <w:t xml:space="preserve"> </w:t>
-      </w:r>
-      <w:r>
-        <w:t xml:space="preserve">carries no guarantee.</w:t>
+        <w:t xml:space="preserve">How well ECG networks discriminate on benchmarks [1] is orthogonal to</w:t>
+      </w:r>
+      <w:r>
+        <w:t xml:space="preserve"> </w:t>
+      </w:r>
+      <w:r>
+        <w:t xml:space="preserve">this question: an accurate model calibrated on too few blocks still carries no</w:t>
+      </w:r>
+      <w:r>
+        <w:t xml:space="preserve"> </w:t>
+      </w:r>
+      <w:r>
+        <w:t xml:space="preserve">guarantee.</w:t>
       </w:r>
     </w:p>
     <w:p>
@@ -18576,55 +18508,49 @@
         <w:t xml:space="preserve"> </w:t>
       </w:r>
       <w:r>
-        <w:t xml:space="preserve">MIT-BIH evidence changed</w:t>
-      </w:r>
-      <w:r>
-        <w:t xml:space="preserve"> </w:t>
-      </w:r>
-      <w:r>
-        <w:t xml:space="preserve">three times, each time prompted by an added control rather than by rereading</w:t>
-      </w:r>
-      <w:r>
-        <w:t xml:space="preserve"> </w:t>
-      </w:r>
-      <w:r>
-        <w:t xml:space="preserve">data, and its statistical strength was revised once more (Appendix B). Every</w:t>
-      </w:r>
-      <w:r>
-        <w:t xml:space="preserve"> </w:t>
-      </w:r>
-      <w:r>
-        <w:t xml:space="preserve">analysis introduced or modified after results were seen made the evidence</w:t>
-      </w:r>
-      <w:r>
-        <w:t xml:space="preserve"> </w:t>
-      </w:r>
-      <w:r>
-        <w:t xml:space="preserve">stricter: the permutation control overturned a criterion that favored our</w:t>
-      </w:r>
-      <w:r>
-        <w:t xml:space="preserve"> </w:t>
-      </w:r>
-      <w:r>
-        <w:t xml:space="preserve">hypothesis; the Holm correction, specified in the initial protocol but applied</w:t>
-      </w:r>
-      <w:r>
-        <w:t xml:space="preserve"> </w:t>
-      </w:r>
-      <w:r>
-        <w:t xml:space="preserve">late, removed the last significant level for ResNet1D-34; the reporting axis was</w:t>
-      </w:r>
-      <w:r>
-        <w:t xml:space="preserve"> </w:t>
-      </w:r>
-      <w:r>
-        <w:t xml:space="preserve">chosen after ICC failed to place the two datasets on one scale; and the</w:t>
-      </w:r>
-      <w:r>
-        <w:t xml:space="preserve"> </w:t>
-      </w:r>
-      <w:r>
-        <w:t xml:space="preserve">record-level jackknife, specified and committed before it was run, showed that</w:t>
+        <w:t xml:space="preserve">MIT-BIH evidence changed three times, each time after an added control rather</w:t>
+      </w:r>
+      <w:r>
+        <w:t xml:space="preserve"> </w:t>
+      </w:r>
+      <w:r>
+        <w:t xml:space="preserve">than a rereading of data, and its statistical strength was revised once more</w:t>
+      </w:r>
+      <w:r>
+        <w:t xml:space="preserve"> </w:t>
+      </w:r>
+      <w:r>
+        <w:t xml:space="preserve">(Appendix B). Every analysis introduced or modified after results were seen made</w:t>
+      </w:r>
+      <w:r>
+        <w:t xml:space="preserve"> </w:t>
+      </w:r>
+      <w:r>
+        <w:t xml:space="preserve">the evidence stricter: the permutation control overturned a criterion that</w:t>
+      </w:r>
+      <w:r>
+        <w:t xml:space="preserve"> </w:t>
+      </w:r>
+      <w:r>
+        <w:t xml:space="preserve">favored our hypothesis; the Holm correction, specified in the initial protocol</w:t>
+      </w:r>
+      <w:r>
+        <w:t xml:space="preserve"> </w:t>
+      </w:r>
+      <w:r>
+        <w:t xml:space="preserve">but applied late, removed the last significant level for ResNet1D-34; the</w:t>
+      </w:r>
+      <w:r>
+        <w:t xml:space="preserve"> </w:t>
+      </w:r>
+      <w:r>
+        <w:t xml:space="preserve">reporting axis was chosen after ICC failed to place the two datasets on one</w:t>
+      </w:r>
+      <w:r>
+        <w:t xml:space="preserve"> </w:t>
+      </w:r>
+      <w:r>
+        <w:t xml:space="preserve">scale; and the record-level jackknife, committed before it was run, showed that</w:t>
       </w:r>
       <w:r>
         <w:t xml:space="preserve"> </w:t>
@@ -18677,30 +18603,30 @@
         <w:t xml:space="preserve"> </w:t>
       </w:r>
       <w:r>
-        <w:t xml:space="preserve">appeared in our theoretical notes before data collection, but the decision to</w:t>
-      </w:r>
-      <w:r>
-        <w:t xml:space="preserve"> </w:t>
-      </w:r>
-      <w:r>
-        <w:t xml:space="preserve">report on this axis was taken with the results in view. The analysis protocol was</w:t>
-      </w:r>
-      <w:r>
-        <w:t xml:space="preserve"> </w:t>
-      </w:r>
-      <w:r>
-        <w:t xml:space="preserve">kept under version control but not publicly registered or formally frozen; it is</w:t>
-      </w:r>
-      <w:r>
-        <w:t xml:space="preserve"> </w:t>
-      </w:r>
-      <w:r>
-        <w:t xml:space="preserve">released with its deviation log.</w:t>
+        <w:t xml:space="preserve">appeared in our notes before data collection, but the decision to report on this</w:t>
+      </w:r>
+      <w:r>
+        <w:t xml:space="preserve"> </w:t>
+      </w:r>
+      <w:r>
+        <w:t xml:space="preserve">axis was taken with results in view. The protocol was kept under version control</w:t>
+      </w:r>
+      <w:r>
+        <w:t xml:space="preserve"> </w:t>
+      </w:r>
+      <w:r>
+        <w:t xml:space="preserve">but not publicly registered or formally frozen; it is released with its deviation</w:t>
+      </w:r>
+      <w:r>
+        <w:t xml:space="preserve"> </w:t>
+      </w:r>
+      <w:r>
+        <w:t xml:space="preserve">log.</w:t>
       </w:r>
     </w:p>
-    <w:bookmarkEnd w:id="61"/>
-    <w:bookmarkEnd w:id="62"/>
-    <w:bookmarkStart w:id="63" w:name="conclusion"/>
+    <w:bookmarkEnd w:id="64"/>
+    <w:bookmarkEnd w:id="65"/>
+    <w:bookmarkStart w:id="66" w:name="conclusion"/>
     <w:p>
       <w:pPr>
         <w:pStyle w:val="Heading1"/>
@@ -18808,8 +18734,8 @@
         <w:t xml:space="preserve">block-level procedures face the same boundary is open.</w:t>
       </w:r>
     </w:p>
-    <w:bookmarkEnd w:id="63"/>
-    <w:bookmarkStart w:id="64" w:name="data-and-code-availability"/>
+    <w:bookmarkEnd w:id="66"/>
+    <w:bookmarkStart w:id="67" w:name="data-and-code-availability"/>
     <w:p>
       <w:pPr>
         <w:pStyle w:val="Heading1"/>
@@ -18863,8 +18789,8 @@
         <w:t xml:space="preserve">publication.</w:t>
       </w:r>
     </w:p>
-    <w:bookmarkEnd w:id="64"/>
-    <w:bookmarkStart w:id="68" w:name="appendix-a.-supplementary-derivations"/>
+    <w:bookmarkEnd w:id="67"/>
+    <w:bookmarkStart w:id="71" w:name="appendix-a.-supplementary-derivations"/>
     <w:p>
       <w:pPr>
         <w:pStyle w:val="Heading1"/>
@@ -18873,7 +18799,7 @@
         <w:t xml:space="preserve">Appendix A. Supplementary Derivations</w:t>
       </w:r>
     </w:p>
-    <w:bookmarkStart w:id="65" w:name="a.1-the-boundary-case-of-proposition-1"/>
+    <w:bookmarkStart w:id="68" w:name="a.1-the-boundary-case-of-proposition-1"/>
     <w:p>
       <w:pPr>
         <w:pStyle w:val="Heading2"/>
@@ -19168,8 +19094,8 @@
         <w:t xml:space="preserve">.</w:t>
       </w:r>
     </w:p>
-    <w:bookmarkEnd w:id="65"/>
-    <w:bookmarkStart w:id="66" w:name="a.2-variance-under-compound-symmetry"/>
+    <w:bookmarkEnd w:id="68"/>
+    <w:bookmarkStart w:id="69" w:name="a.2-variance-under-compound-symmetry"/>
     <w:p>
       <w:pPr>
         <w:pStyle w:val="Heading2"/>
@@ -19657,8 +19583,8 @@
         <w:t xml:space="preserve">vanishes. We make no claim outside (A).</w:t>
       </w:r>
     </w:p>
-    <w:bookmarkEnd w:id="66"/>
-    <w:bookmarkStart w:id="67" w:name="a.3-equal-weighting-in-hcp"/>
+    <w:bookmarkEnd w:id="69"/>
+    <w:bookmarkStart w:id="70" w:name="a.3-equal-weighting-in-hcp"/>
     <w:p>
       <w:pPr>
         <w:pStyle w:val="Heading2"/>
@@ -20167,9 +20093,9 @@
         <w:t xml:space="preserve">.</w:t>
       </w:r>
     </w:p>
-    <w:bookmarkEnd w:id="67"/>
-    <w:bookmarkEnd w:id="68"/>
-    <w:bookmarkStart w:id="69" w:name="X06db9a02045705c8b7d21c68ec78218971b4832"/>
+    <w:bookmarkEnd w:id="70"/>
+    <w:bookmarkEnd w:id="71"/>
+    <w:bookmarkStart w:id="72" w:name="X06db9a02045705c8b7d21c68ec78218971b4832"/>
     <w:p>
       <w:pPr>
         <w:pStyle w:val="Heading1"/>
@@ -20247,9 +20173,9 @@
         </w:tblBorders>
       </w:tblPr>
       <w:tblGrid>
-        <w:gridCol w:w="2640"/>
-        <w:gridCol w:w="2640"/>
-        <w:gridCol w:w="2640"/>
+        <w:gridCol w:w="316"/>
+        <w:gridCol w:w="3801"/>
+        <w:gridCol w:w="3801"/>
       </w:tblGrid>
       <w:tr>
         <w:trPr>
@@ -20597,8 +20523,8 @@
         </w:tc>
       </w:tr>
     </w:tbl>
-    <w:bookmarkEnd w:id="69"/>
-    <w:bookmarkStart w:id="70" w:name="Xbf53aa51c2c3289f595a160de988653028afcc2"/>
+    <w:bookmarkEnd w:id="72"/>
+    <w:bookmarkStart w:id="73" w:name="Xbf53aa51c2c3289f595a160de988653028afcc2"/>
     <w:p>
       <w:pPr>
         <w:pStyle w:val="Heading1"/>
@@ -20900,8 +20826,8 @@
         <w:t xml:space="preserve">of a 12.6 GB dataset, before any preprocessing or training.</w:t>
       </w:r>
     </w:p>
-    <w:bookmarkEnd w:id="70"/>
-    <w:bookmarkStart w:id="71" w:name="references"/>
+    <w:bookmarkEnd w:id="73"/>
+    <w:bookmarkStart w:id="74" w:name="references"/>
     <w:p>
       <w:pPr>
         <w:pStyle w:val="Heading1"/>
@@ -22166,7 +22092,7 @@
         <w:t>P. C. Marques F., “Universal distribution of the empirical coverage in split conformal prediction,” Statistics &amp; Probability Letters, vol. 219, Apr. 2025, doi: 10.1016/j.spl.2024.110350.</w:t>
       </w:r>
     </w:p>
-    <w:bookmarkEnd w:id="71"/>
+    <w:bookmarkEnd w:id="74"/>
     <w:sectPr>
       <w:footnotePr>
         <w:numRestart w:val="eachSect"/>

</xml_diff>

<commit_message>
Ekspor RIS 35 rujukan (urut nomor sitasi) untuk Mendeley; nama penulis E9 diseragamkan
scripts/export_ris.py -> docs/paper/references.ris: JOUR/CONF/DATA, penulis, judul, jurnal, tahun, volume, nomor, halaman, DOI + URL, catatan nomor sitasi dan kode sumber. E9: 'ALLAM, Oussama EL'/'HAMLICH' (artefak huruf kapital Crossref) diseragamkan dengan E7 menjadi 'El Allam, Oussama'/'Hamlich, Mohamed'; daftar pustaka docx [8] ikut terperbaiki.
</commit_message>
<xml_diff>
--- a/docs/paper/manuscript-draft.docx
+++ b/docs/paper/manuscript-draft.docx
@@ -20,7 +20,7 @@
           <w:i/>
           <w:iCs/>
         </w:rPr>
-        <w:t xml:space="preserve">Working draft for internal review — generated 2026-10-03 from commit 17a68eb.</w:t>
+        <w:t xml:space="preserve">Working draft for internal review — generated 2026-10-03 from commit 2a75719.</w:t>
       </w:r>
     </w:p>
     <w:bookmarkStart w:id="9" w:name="abstract"/>
@@ -21137,7 +21137,7 @@
           <w:i w:val="0"/>
           <w:sz w:val="18"/>
         </w:rPr>
-        <w:t>O. E. ALLAM and M. HAMLICH, “Hierarchical adaptive conformal inference for reliable uncertainty quantification in edge-deployable medical wearables,” Measurement, vol. 279, Jun. 2026, doi: 10.1016/j.measurement.2026.121765.</w:t>
+        <w:t>O. El Allam and M. Hamlich, “Hierarchical adaptive conformal inference for reliable uncertainty quantification in edge-deployable medical wearables,” Measurement, vol. 279, Jun. 2026, doi: 10.1016/j.measurement.2026.121765.</w:t>
       </w:r>
     </w:p>
     <w:p>

</xml_diff>

<commit_message>
Gate 2A.2/2A.3: verifikasi I1/A13, lepas I2 (rumus diturunkan di A.2), perjelas K1=34
</commit_message>
<xml_diff>
--- a/docs/paper/manuscript-draft.docx
+++ b/docs/paper/manuscript-draft.docx
@@ -20,7 +20,7 @@
           <w:i/>
           <w:iCs/>
         </w:rPr>
-        <w:t xml:space="preserve">Working draft for internal review — generated 2026-10-03 from commit 31bcb36.</w:t>
+        <w:t xml:space="preserve">Working draft for internal review — generated 2026-10-04 from commit 4e95c57.</w:t>
       </w:r>
     </w:p>
     <w:bookmarkStart w:id="9" w:name="abstract"/>
@@ -4484,13 +4484,36 @@
         <w:t xml:space="preserve"> </w:t>
       </w:r>
       <w:r>
-        <w:t xml:space="preserve">average of block-level empirical CDFs, whose variance under (A) is the textbook</w:t>
-      </w:r>
-      <w:r>
-        <w:t xml:space="preserve"> </w:t>
-      </w:r>
-      <w:r>
-        <w:t xml:space="preserve">expression for an unweighted mean of cluster means [30],</w:t>
+        <w:t xml:space="preserve">average of block-level empirical CDFs, whose variance under (A) follows from</w:t>
+      </w:r>
+      <w:r>
+        <w:t xml:space="preserve"> </w:t>
+      </w:r>
+      <w:r>
+        <w:t xml:space="preserve">averaging</w:t>
+      </w:r>
+      <w:r>
+        <w:t xml:space="preserve"> </w:t>
+      </w:r>
+      <m:oMath>
+        <m:sSub>
+          <m:e>
+            <m:r>
+              <m:t>K</m:t>
+            </m:r>
+          </m:e>
+          <m:sub>
+            <m:r>
+              <m:t>1</m:t>
+            </m:r>
+          </m:sub>
+        </m:sSub>
+      </m:oMath>
+      <w:r>
+        <w:t xml:space="preserve"> </w:t>
+      </w:r>
+      <w:r>
+        <w:t xml:space="preserve">independent block means with equal weights,</w:t>
       </w:r>
       <w:r>
         <w:t xml:space="preserve"> </w:t>
@@ -5068,19 +5091,19 @@
         <w:t xml:space="preserve"> </w:t>
       </w:r>
       <w:r>
-        <w:t xml:space="preserve">[21]. Cluster-randomized</w:t>
-      </w:r>
-      <w:r>
-        <w:t xml:space="preserve"> </w:t>
-      </w:r>
-      <w:r>
-        <w:t xml:space="preserve">trials usually replace equal weighting of cluster means with minimum-variance</w:t>
-      </w:r>
-      <w:r>
-        <w:t xml:space="preserve"> </w:t>
-      </w:r>
-      <w:r>
-        <w:t xml:space="preserve">weights [31], [32]; in HCP equal weighting is built into the threshold, and</w:t>
+        <w:t xml:space="preserve">[21]. In cluster-randomized trials, minimum-variance weighting of cluster</w:t>
+      </w:r>
+      <w:r>
+        <w:t xml:space="preserve"> </w:t>
+      </w:r>
+      <w:r>
+        <w:t xml:space="preserve">means is more efficient than equal weighting when cluster sizes vary [30], [31];</w:t>
+      </w:r>
+      <w:r>
+        <w:t xml:space="preserve"> </w:t>
+      </w:r>
+      <w:r>
+        <w:t xml:space="preserve">in HCP equal weighting is built into the threshold, and</w:t>
       </w:r>
       <w:r>
         <w:t xml:space="preserve"> </w:t>
@@ -7277,7 +7300,7 @@
         <w:t xml:space="preserve"> </w:t>
       </w:r>
       <w:r>
-        <w:t xml:space="preserve">giant components [33], but there a collapsed join merely weakens a split; here,</w:t>
+        <w:t xml:space="preserve">giant components [32], but there a collapsed join merely weakens a split; here,</w:t>
       </w:r>
       <w:r>
         <w:t xml:space="preserve"> </w:t>
@@ -7915,7 +7938,7 @@
         <w:t xml:space="preserve"> </w:t>
       </w:r>
       <w:r>
-        <w:t xml:space="preserve">class-conditional calibration under exchangeability [34]; under hierarchical</w:t>
+        <w:t xml:space="preserve">class-conditional calibration under exchangeability [33]; under hierarchical</w:t>
       </w:r>
       <w:r>
         <w:t xml:space="preserve"> </w:t>
@@ -12609,7 +12632,7 @@
         <w:t xml:space="preserve"> </w:t>
       </w:r>
       <w:r>
-        <w:t xml:space="preserve">known [33]. Fig. 4 places the single sources, their joins and the MIT-BIH record</w:t>
+        <w:t xml:space="preserve">known [32]. Fig. 4 places the single sources, their joins and the MIT-BIH record</w:t>
       </w:r>
       <w:r>
         <w:t xml:space="preserve"> </w:t>
@@ -19314,13 +19337,13 @@
         <w:t xml:space="preserve"> </w:t>
       </w:r>
       <w:r>
-        <w:t xml:space="preserve">distribution of split conformal prediction implies for exchangeable data [35];</w:t>
-      </w:r>
-      <w:r>
-        <w:t xml:space="preserve"> </w:t>
-      </w:r>
-      <w:r>
-        <w:t xml:space="preserve">and, as for rare classes under exchangeability [34], the count that matters per</w:t>
+        <w:t xml:space="preserve">distribution of split conformal prediction implies for exchangeable data [34];</w:t>
+      </w:r>
+      <w:r>
+        <w:t xml:space="preserve"> </w:t>
+      </w:r>
+      <w:r>
+        <w:t xml:space="preserve">and, as for rare classes under exchangeability [33], the count that matters per</w:t>
       </w:r>
       <w:r>
         <w:t xml:space="preserve"> </w:t>
@@ -19984,24 +20007,21 @@
         <w:t xml:space="preserve"> </w:t>
       </w:r>
       <w:r>
-        <w:t xml:space="preserve">gives</w:t>
-      </w:r>
-      <w:r>
-        <w:t xml:space="preserve"> </w:t>
-      </w:r>
-      <m:oMath>
-        <m:sSub>
-          <m:e>
-            <m:r>
-              <m:t>K</m:t>
-            </m:r>
-          </m:e>
-          <m:sub>
-            <m:r>
-              <m:t>1</m:t>
-            </m:r>
-          </m:sub>
-        </m:sSub>
+        <w:t xml:space="preserve">merges the 1,942 fold-9 patients into 34 calibration blocks (their join, §3.3),</w:t>
+      </w:r>
+      <w:r>
+        <w:t xml:space="preserve"> </w:t>
+      </w:r>
+      <w:r>
+        <w:t xml:space="preserve">so</w:t>
+      </w:r>
+      <w:r>
+        <w:t xml:space="preserve"> </w:t>
+      </w:r>
+      <m:oMath>
+        <m:r>
+          <m:t>α</m:t>
+        </m:r>
         <m:r>
           <m:rPr>
             <m:sty m:val="p"/>
@@ -20009,29 +20029,6 @@
           <m:t>=</m:t>
         </m:r>
         <m:r>
-          <m:t>34</m:t>
-        </m:r>
-      </m:oMath>
-      <w:r>
-        <w:t xml:space="preserve"> </w:t>
-      </w:r>
-      <w:r>
-        <w:t xml:space="preserve">on the full fold-9 pool and makes</w:t>
-      </w:r>
-      <w:r>
-        <w:t xml:space="preserve"> </w:t>
-      </w:r>
-      <m:oMath>
-        <m:r>
-          <m:t>α</m:t>
-        </m:r>
-        <m:r>
-          <m:rPr>
-            <m:sty m:val="p"/>
-          </m:rPr>
-          <m:t>=</m:t>
-        </m:r>
-        <m:r>
           <m:t>0.05</m:t>
         </m:r>
       </m:oMath>
@@ -20039,7 +20036,7 @@
         <w:t xml:space="preserve"> </w:t>
       </w:r>
       <w:r>
-        <w:t xml:space="preserve">feasible, yet</w:t>
+        <w:t xml:space="preserve">becomes feasible, yet</w:t>
       </w:r>
       <w:r>
         <w:t xml:space="preserve"> </w:t>
@@ -21401,6 +21398,429 @@
         <w:jc w:val="both"/>
       </w:pPr>
       <w:r>
+        <w:t xml:space="preserve">Each block mean</w:t>
+      </w:r>
+      <w:r>
+        <w:t xml:space="preserve"> </w:t>
+      </w:r>
+      <m:oMath>
+        <m:sSub>
+          <m:e>
+            <m:acc>
+              <m:accPr>
+                <m:chr m:val="‾"/>
+              </m:accPr>
+              <m:e>
+                <m:r>
+                  <m:t>F</m:t>
+                </m:r>
+              </m:e>
+            </m:acc>
+          </m:e>
+          <m:sub>
+            <m:r>
+              <m:t>k</m:t>
+            </m:r>
+          </m:sub>
+        </m:sSub>
+        <m:r>
+          <m:rPr>
+            <m:sty m:val="p"/>
+          </m:rPr>
+          <m:t>(</m:t>
+        </m:r>
+        <m:r>
+          <m:t>t</m:t>
+        </m:r>
+        <m:r>
+          <m:rPr>
+            <m:sty m:val="p"/>
+          </m:rPr>
+          <m:t>)</m:t>
+        </m:r>
+      </m:oMath>
+      <w:r>
+        <w:t xml:space="preserve"> </w:t>
+      </w:r>
+      <w:r>
+        <w:t xml:space="preserve">has variance</w:t>
+      </w:r>
+      <w:r>
+        <w:t xml:space="preserve"> </w:t>
+      </w:r>
+      <m:oMath>
+        <m:sSup>
+          <m:e>
+            <m:r>
+              <m:t>σ</m:t>
+            </m:r>
+          </m:e>
+          <m:sup>
+            <m:r>
+              <m:t>2</m:t>
+            </m:r>
+          </m:sup>
+        </m:sSup>
+        <m:r>
+          <m:rPr>
+            <m:sty m:val="p"/>
+          </m:rPr>
+          <m:t>(</m:t>
+        </m:r>
+        <m:r>
+          <m:t>t</m:t>
+        </m:r>
+        <m:r>
+          <m:rPr>
+            <m:sty m:val="p"/>
+          </m:rPr>
+          <m:t>)</m:t>
+        </m:r>
+        <m:r>
+          <m:rPr>
+            <m:sty m:val="p"/>
+          </m:rPr>
+          <m:t>[</m:t>
+        </m:r>
+        <m:r>
+          <m:t>ρ</m:t>
+        </m:r>
+        <m:r>
+          <m:rPr>
+            <m:sty m:val="p"/>
+          </m:rPr>
+          <m:t>(</m:t>
+        </m:r>
+        <m:r>
+          <m:t>t</m:t>
+        </m:r>
+        <m:r>
+          <m:rPr>
+            <m:sty m:val="p"/>
+          </m:rPr>
+          <m:t>)</m:t>
+        </m:r>
+        <m:r>
+          <m:rPr>
+            <m:sty m:val="p"/>
+          </m:rPr>
+          <m:t>+</m:t>
+        </m:r>
+        <m:r>
+          <m:rPr>
+            <m:sty m:val="p"/>
+          </m:rPr>
+          <m:t>{</m:t>
+        </m:r>
+        <m:r>
+          <m:t>1</m:t>
+        </m:r>
+        <m:r>
+          <m:rPr>
+            <m:sty m:val="p"/>
+          </m:rPr>
+          <m:t>−</m:t>
+        </m:r>
+        <m:r>
+          <m:t>ρ</m:t>
+        </m:r>
+        <m:r>
+          <m:rPr>
+            <m:sty m:val="p"/>
+          </m:rPr>
+          <m:t>(</m:t>
+        </m:r>
+        <m:r>
+          <m:t>t</m:t>
+        </m:r>
+        <m:r>
+          <m:rPr>
+            <m:sty m:val="p"/>
+          </m:rPr>
+          <m:t>)</m:t>
+        </m:r>
+        <m:r>
+          <m:rPr>
+            <m:sty m:val="p"/>
+          </m:rPr>
+          <m:t>}</m:t>
+        </m:r>
+        <m:r>
+          <m:rPr>
+            <m:sty m:val="p"/>
+          </m:rPr>
+          <m:t>/</m:t>
+        </m:r>
+        <m:sSub>
+          <m:e>
+            <m:r>
+              <m:t>N</m:t>
+            </m:r>
+          </m:e>
+          <m:sub>
+            <m:r>
+              <m:t>k</m:t>
+            </m:r>
+          </m:sub>
+        </m:sSub>
+        <m:r>
+          <m:rPr>
+            <m:sty m:val="p"/>
+          </m:rPr>
+          <m:t>]</m:t>
+        </m:r>
+      </m:oMath>
+      <w:r>
+        <w:t xml:space="preserve">,</w:t>
+      </w:r>
+      <w:r>
+        <w:t xml:space="preserve"> </w:t>
+      </w:r>
+      <w:r>
+        <w:t xml:space="preserve">and averaging</w:t>
+      </w:r>
+      <w:r>
+        <w:t xml:space="preserve"> </w:t>
+      </w:r>
+      <m:oMath>
+        <m:sSub>
+          <m:e>
+            <m:r>
+              <m:t>K</m:t>
+            </m:r>
+          </m:e>
+          <m:sub>
+            <m:r>
+              <m:t>1</m:t>
+            </m:r>
+          </m:sub>
+        </m:sSub>
+      </m:oMath>
+      <w:r>
+        <w:t xml:space="preserve"> </w:t>
+      </w:r>
+      <w:r>
+        <w:t xml:space="preserve">independent blocks with equal weights gives</w:t>
+      </w:r>
+      <w:r>
+        <w:t xml:space="preserve"> </w:t>
+      </w:r>
+      <m:oMath>
+        <m:sSup>
+          <m:e>
+            <m:r>
+              <m:t>σ</m:t>
+            </m:r>
+          </m:e>
+          <m:sup>
+            <m:r>
+              <m:t>2</m:t>
+            </m:r>
+          </m:sup>
+        </m:sSup>
+        <m:r>
+          <m:rPr>
+            <m:sty m:val="p"/>
+          </m:rPr>
+          <m:t>(</m:t>
+        </m:r>
+        <m:r>
+          <m:t>t</m:t>
+        </m:r>
+        <m:r>
+          <m:rPr>
+            <m:sty m:val="p"/>
+          </m:rPr>
+          <m:t>)</m:t>
+        </m:r>
+        <m:r>
+          <m:rPr>
+            <m:sty m:val="p"/>
+          </m:rPr>
+          <m:t>[</m:t>
+        </m:r>
+        <m:r>
+          <m:t>ρ</m:t>
+        </m:r>
+        <m:r>
+          <m:rPr>
+            <m:sty m:val="p"/>
+          </m:rPr>
+          <m:t>(</m:t>
+        </m:r>
+        <m:r>
+          <m:t>t</m:t>
+        </m:r>
+        <m:r>
+          <m:rPr>
+            <m:sty m:val="p"/>
+          </m:rPr>
+          <m:t>)</m:t>
+        </m:r>
+        <m:r>
+          <m:rPr>
+            <m:sty m:val="p"/>
+          </m:rPr>
+          <m:t>+</m:t>
+        </m:r>
+        <m:r>
+          <m:rPr>
+            <m:sty m:val="p"/>
+          </m:rPr>
+          <m:t>{</m:t>
+        </m:r>
+        <m:r>
+          <m:t>1</m:t>
+        </m:r>
+        <m:r>
+          <m:rPr>
+            <m:sty m:val="p"/>
+          </m:rPr>
+          <m:t>−</m:t>
+        </m:r>
+        <m:r>
+          <m:t>ρ</m:t>
+        </m:r>
+        <m:r>
+          <m:rPr>
+            <m:sty m:val="p"/>
+          </m:rPr>
+          <m:t>(</m:t>
+        </m:r>
+        <m:r>
+          <m:t>t</m:t>
+        </m:r>
+        <m:r>
+          <m:rPr>
+            <m:sty m:val="p"/>
+          </m:rPr>
+          <m:t>)</m:t>
+        </m:r>
+        <m:r>
+          <m:rPr>
+            <m:sty m:val="p"/>
+          </m:rPr>
+          <m:t>}</m:t>
+        </m:r>
+        <m:r>
+          <m:rPr>
+            <m:sty m:val="p"/>
+          </m:rPr>
+          <m:t>/</m:t>
+        </m:r>
+        <m:r>
+          <m:t>H</m:t>
+        </m:r>
+        <m:r>
+          <m:rPr>
+            <m:sty m:val="p"/>
+          </m:rPr>
+          <m:t>]</m:t>
+        </m:r>
+        <m:r>
+          <m:rPr>
+            <m:sty m:val="p"/>
+          </m:rPr>
+          <m:t>/</m:t>
+        </m:r>
+        <m:sSub>
+          <m:e>
+            <m:r>
+              <m:t>K</m:t>
+            </m:r>
+          </m:e>
+          <m:sub>
+            <m:r>
+              <m:t>1</m:t>
+            </m:r>
+          </m:sub>
+        </m:sSub>
+      </m:oMath>
+      <w:r>
+        <w:t xml:space="preserve">, which equals (A.1) because</w:t>
+      </w:r>
+      <w:r>
+        <w:t xml:space="preserve"> </w:t>
+      </w:r>
+      <m:oMath>
+        <m:r>
+          <m:t>H</m:t>
+        </m:r>
+        <m:r>
+          <m:rPr>
+            <m:sty m:val="p"/>
+          </m:rPr>
+          <m:t>=</m:t>
+        </m:r>
+        <m:sSub>
+          <m:e>
+            <m:r>
+              <m:t>K</m:t>
+            </m:r>
+          </m:e>
+          <m:sub>
+            <m:r>
+              <m:t>1</m:t>
+            </m:r>
+          </m:sub>
+        </m:sSub>
+        <m:r>
+          <m:rPr>
+            <m:sty m:val="p"/>
+          </m:rPr>
+          <m:t>/</m:t>
+        </m:r>
+        <m:nary>
+          <m:naryPr>
+            <m:chr m:val="∑"/>
+            <m:limLoc m:val="undOvr"/>
+            <m:subHide m:val="off"/>
+            <m:supHide m:val="on"/>
+          </m:naryPr>
+          <m:sub>
+            <m:r>
+              <m:t>k</m:t>
+            </m:r>
+          </m:sub>
+          <m:sup>
+            <m:r>
+              <m:t>​</m:t>
+            </m:r>
+          </m:sup>
+          <m:e>
+            <m:sSubSup>
+              <m:e>
+                <m:r>
+                  <m:t>N</m:t>
+                </m:r>
+              </m:e>
+              <m:sub>
+                <m:r>
+                  <m:t>k</m:t>
+                </m:r>
+              </m:sub>
+              <m:sup>
+                <m:r>
+                  <m:rPr>
+                    <m:sty m:val="p"/>
+                  </m:rPr>
+                  <m:t>−</m:t>
+                </m:r>
+                <m:r>
+                  <m:t>1</m:t>
+                </m:r>
+              </m:sup>
+            </m:sSubSup>
+          </m:e>
+        </m:nary>
+      </m:oMath>
+      <w:r>
+        <w:t xml:space="preserve">.</w:t>
+      </w:r>
+      <w:r>
+        <w:t xml:space="preserve"> </w:t>
+      </w:r>
+      <w:r>
         <w:t xml:space="preserve">As</w:t>
       </w:r>
       <w:r>
@@ -21543,31 +21963,31 @@
         <w:jc w:val="both"/>
       </w:pPr>
       <w:r>
-        <w:t xml:space="preserve">Cluster-randomized trials compare equal and size-proportional weighting of</w:t>
-      </w:r>
-      <w:r>
-        <w:t xml:space="preserve"> </w:t>
-      </w:r>
-      <w:r>
-        <w:t xml:space="preserve">cluster means, and equal weighting loses efficiency when cluster sizes vary</w:t>
-      </w:r>
-      <w:r>
-        <w:t xml:space="preserve"> </w:t>
-      </w:r>
-      <w:r>
-        <w:t xml:space="preserve">[31], [32]. In HCP it cannot be replaced, so the practitioner is tied to the</w:t>
-      </w:r>
-      <w:r>
-        <w:t xml:space="preserve"> </w:t>
-      </w:r>
-      <w:r>
-        <w:t xml:space="preserve">estimator that cluster-sampling theory regards as most sensitive to block</w:t>
-      </w:r>
-      <w:r>
-        <w:t xml:space="preserve"> </w:t>
-      </w:r>
-      <w:r>
-        <w:t xml:space="preserve">imbalance, without the standard remedy. We state this as an observation and do</w:t>
+        <w:t xml:space="preserve">Methodological work on cluster-randomized trials compares uniform,</w:t>
+      </w:r>
+      <w:r>
+        <w:t xml:space="preserve"> </w:t>
+      </w:r>
+      <w:r>
+        <w:t xml:space="preserve">size-proportional and minimum-variance weighting of cluster means and finds</w:t>
+      </w:r>
+      <w:r>
+        <w:t xml:space="preserve"> </w:t>
+      </w:r>
+      <w:r>
+        <w:t xml:space="preserve">minimum-variance weights more efficient than uniform ones when cluster sizes vary</w:t>
+      </w:r>
+      <w:r>
+        <w:t xml:space="preserve"> </w:t>
+      </w:r>
+      <w:r>
+        <w:t xml:space="preserve">[30], [31]. In HCP uniform weighting cannot be replaced, so the practitioner is</w:t>
+      </w:r>
+      <w:r>
+        <w:t xml:space="preserve"> </w:t>
+      </w:r>
+      <w:r>
+        <w:t xml:space="preserve">tied to the less efficient of these two choices without the remedy used there. We state this as an observation and do</w:t>
       </w:r>
       <w:r>
         <w:t xml:space="preserve"> </w:t>
@@ -23857,7 +24277,7 @@
           <w:i w:val="0"/>
           <w:sz w:val="18"/>
         </w:rPr>
-        <w:t>I. R. White and J. Thomas, “Standardized mean differences in individually-randomized and cluster-randomized trials, with applications to meta-analysis,” Clinical Trials, vol. 2, no. 2, pp. 141–151, Apr. 2005, doi: 10.1191/1740774505cn081oa.</w:t>
+        <w:t>S. M. Kerry and J. Martin Bland, “Unequal cluster sizes for trials in English and Welsh general practice: implications for sample size calculations,” Statist. Med., vol. 20, no. 3, pp. 377–390, Feb. 2001, doi: 10.1002/1097-0258(20010215)20:3&lt;377::aid-sim799&gt;3.0.co;2-n.</w:t>
       </w:r>
     </w:p>
     <w:p>
@@ -23886,42 +24306,6 @@
           <w:sz w:val="18"/>
         </w:rPr>
         <w:t>[31]</w:t>
-        <w:tab/>
-      </w:r>
-      <w:r>
-        <w:rPr>
-          <w:i w:val="0"/>
-          <w:sz w:val="18"/>
-        </w:rPr>
-        <w:t>S. M. Kerry and J. Martin Bland, “Unequal cluster sizes for trials in English and Welsh general practice: implications for sample size calculations,” Statist. Med., vol. 20, no. 3, pp. 377–390, Feb. 2001, doi: 10.1002/1097-0258(20010215)20:3&lt;377::aid-sim799&gt;3.0.co;2-n.</w:t>
-      </w:r>
-    </w:p>
-    <w:p>
-      <w:pPr>
-        <w:pStyle w:val="BodyText"/>
-        <w:tabs>
-          <w:tab w:pos="440" w:val="left"/>
-        </w:tabs>
-        <w:spacing w:after="40"/>
-        <w:ind w:left="440" w:hanging="440"/>
-        <w:jc w:val="both"/>
-      </w:pPr>
-      <w:r/>
-      <w:r/>
-      <w:r/>
-      <w:r/>
-      <w:r>
-        <w:rPr>
-          <w:i/>
-          <w:iCs/>
-        </w:rPr>
-      </w:r>
-      <w:r/>
-      <w:r>
-        <w:rPr>
-          <w:sz w:val="18"/>
-        </w:rPr>
-        <w:t>[32]</w:t>
         <w:tab/>
       </w:r>
       <w:r>
@@ -23951,7 +24335,7 @@
         <w:rPr>
           <w:sz w:val="18"/>
         </w:rPr>
-        <w:t>[33]</w:t>
+        <w:t>[32]</w:t>
         <w:tab/>
       </w:r>
       <w:r>
@@ -23989,7 +24373,7 @@
         <w:rPr>
           <w:sz w:val="18"/>
         </w:rPr>
-        <w:t>[34]</w:t>
+        <w:t>[33]</w:t>
         <w:tab/>
       </w:r>
       <w:r>
@@ -24025,7 +24409,7 @@
         <w:rPr>
           <w:sz w:val="18"/>
         </w:rPr>
-        <w:t>[35]</w:t>
+        <w:t>[34]</w:t>
         <w:tab/>
       </w:r>
       <w:r>

</xml_diff>

<commit_message>
PASS 2B: rujukan primer giant component [P3], penghalusan bahasa terarah, bukti Prop. 3, abstrak 250 kata, tata letak 20 halaman
</commit_message>
<xml_diff>
--- a/docs/paper/manuscript-draft.docx
+++ b/docs/paper/manuscript-draft.docx
@@ -20,7 +20,7 @@
           <w:i/>
           <w:iCs/>
         </w:rPr>
-        <w:t xml:space="preserve">Working draft for internal review — generated 2026-10-04 from commit 4e95c57.</w:t>
+        <w:t xml:space="preserve">Working draft for internal review — generated 2026-10-04 from commit a7b41e5.</w:t>
       </w:r>
     </w:p>
     <w:bookmarkStart w:id="9" w:name="abstract"/>
@@ -38,7 +38,7 @@
         <w:jc w:val="both"/>
       </w:pPr>
       <w:r>
-        <w:t xml:space="preserve">Conformal prediction guarantees finite-sample coverage only when calibration and test data are exchangeable, a condition that repeated recordings, segments and beats from the same patient violate. Hierarchical conformal prediction (HCP) recovers the guarantee by calibrating over blocks, yet its threshold exists only for target error rates of at least</w:t>
+        <w:t xml:space="preserve">Conformal prediction guarantees finite-sample coverage only when calibration and test data are exchangeable, which repeated recordings, segments and beats from one patient violate. Hierarchical conformal prediction (HCP) recovers the guarantee by calibrating over blocks, yet its threshold exists only for target error rates of at least</w:t>
       </w:r>
       <w:r>
         <w:t xml:space="preserve"> </w:t>
@@ -111,7 +111,7 @@
         <w:t xml:space="preserve"> </w:t>
       </w:r>
       <w:r>
-        <w:t xml:space="preserve">the number of calibration blocks. We audit three public electrocardiogram resources to ask whether this guarantee can be enforced when several dependence sources are declared and coverage is required per diagnosis, and whether ignoring blocks costs coverage. From metadata alone, declaring the four documented dependence sources of PTB-XL leaves a single admissible calibration block, and under patient blocking 24 of 44 diagnostic SCP statements have no finite per-label threshold at</w:t>
+        <w:t xml:space="preserve">the number of calibration blocks. We audit three public electrocardiogram resources: can this guarantee be enforced when several dependence sources are declared and coverage is required per diagnosis, and does ignoring blocks cost coverage? From metadata alone, declaring the four documented dependence sources of PTB-XL leaves a single admissible calibration block, and under patient blocking 24 of 44 diagnostic SCP statements have no finite per-label threshold at</w:t>
       </w:r>
       <w:r>
         <w:t xml:space="preserve"> </w:t>
@@ -131,7 +131,7 @@
         </m:r>
       </m:oMath>
       <w:r>
-        <w:t xml:space="preserve">. Across repeated splits of the 22 MIT-BIH evaluation subjects, naive split conformal covers 1.5–2.4 percentage points less than a matched permutation null; a factorial design attributes the shortfall mainly to clustering, and a controlled dose–response experiment shows it growing with the design effect (rank correlation 0.80–0.85 over 12 configurations, 11 of them synthetic). A jackknife over subjects, however, cannot resolve the sign of this deficit: the scarcity of blocks that limits the guarantee also limits the evidence. PTB-XL shows no deficit despite a within-patient correlation of 0.35, consistent with most of its patients contributing one recording. Most of the coverage gap between HCP and naive calibration is mechanical: 75–110% of it persists when dependence is permuted away and block sizes are kept. Blocks, not records, should be counted, and subjects, not splits, resampled, before claims about distribution-free coverage are made on clinical data.</w:t>
+        <w:t xml:space="preserve">. Across repeated splits of the 22 MIT-BIH evaluation subjects, naive split conformal covers 1.5–2.4 percentage points less than a matched permutation null (primary backbone); a factorial design attributes the shortfall mainly to clustering, and a controlled dose–response experiment shows it growing with the design effect (rank correlation 0.80–0.85 over 12 configurations, 11 of them synthetic). A jackknife over subjects cannot resolve the sign of this deficit: the scarcity of blocks that limits the guarantee also limits the evidence. PTB-XL, where most patients contribute one recording, shows no deficit despite a within-patient correlation of 0.35. Most of the coverage gap between HCP and naive calibration is mechanical: 75–110% of it persists when dependence is permuted away and block sizes are kept. Clinical coverage claims should count blocks, not records, and resample subjects, not splits.</w:t>
       </w:r>
     </w:p>
     <w:p>
@@ -405,31 +405,31 @@
         <w:t xml:space="preserve"> </w:t>
       </w:r>
       <w:r>
-        <w:t xml:space="preserve">between many small and few large groups open as a design question [12]. Dunn et</w:t>
-      </w:r>
-      <w:r>
-        <w:t xml:space="preserve"> </w:t>
-      </w:r>
-      <w:r>
-        <w:t xml:space="preserve">al. state how many groups their hierarchical constructions need for non-trivial</w:t>
-      </w:r>
-      <w:r>
-        <w:t xml:space="preserve"> </w:t>
-      </w:r>
-      <w:r>
-        <w:t xml:space="preserve">prediction sets [13], and Sim and Kim showed for ECG monitoring that the</w:t>
-      </w:r>
-      <w:r>
-        <w:t xml:space="preserve"> </w:t>
-      </w:r>
-      <w:r>
-        <w:t xml:space="preserve">false-alarm guarantee of split conformal prediction counts subjects, not beats,</w:t>
-      </w:r>
-      <w:r>
-        <w:t xml:space="preserve"> </w:t>
-      </w:r>
-      <w:r>
-        <w:t xml:space="preserve">and needs at least 19 calibration subjects at</w:t>
+        <w:t xml:space="preserve">between many small and few large groups open as a design question [12]; Dunn et</w:t>
+      </w:r>
+      <w:r>
+        <w:t xml:space="preserve"> </w:t>
+      </w:r>
+      <w:r>
+        <w:t xml:space="preserve">al. state how many groups their constructions need for non-trivial prediction</w:t>
+      </w:r>
+      <w:r>
+        <w:t xml:space="preserve"> </w:t>
+      </w:r>
+      <w:r>
+        <w:t xml:space="preserve">sets [13]; and Sim and Kim showed for ECG monitoring that the false-alarm</w:t>
+      </w:r>
+      <w:r>
+        <w:t xml:space="preserve"> </w:t>
+      </w:r>
+      <w:r>
+        <w:t xml:space="preserve">guarantee of split conformal prediction counts subjects, not beats, and needs at</w:t>
+      </w:r>
+      <w:r>
+        <w:t xml:space="preserve"> </w:t>
+      </w:r>
+      <w:r>
+        <w:t xml:space="preserve">least 19 calibration subjects at</w:t>
       </w:r>
       <w:r>
         <w:t xml:space="preserve"> </w:t>
@@ -467,25 +467,25 @@
         <w:t xml:space="preserve"> </w:t>
       </w:r>
       <w:r>
-        <w:t xml:space="preserve">real clinical resources, where several dependence sources can be crossed and</w:t>
-      </w:r>
-      <w:r>
-        <w:t xml:space="preserve"> </w:t>
-      </w:r>
-      <w:r>
-        <w:t xml:space="preserve">coverage may be required per diagnosis, and how much of an observed coverage gap</w:t>
-      </w:r>
-      <w:r>
-        <w:t xml:space="preserve"> </w:t>
-      </w:r>
-      <w:r>
-        <w:t xml:space="preserve">reflects dependence rather than the method itself, remains insufficiently</w:t>
-      </w:r>
-      <w:r>
-        <w:t xml:space="preserve"> </w:t>
-      </w:r>
-      <w:r>
-        <w:t xml:space="preserve">characterized. We address these design-stage questions by auditing three public</w:t>
+        <w:t xml:space="preserve">clinical resources where several dependence sources cross and coverage may be</w:t>
+      </w:r>
+      <w:r>
+        <w:t xml:space="preserve"> </w:t>
+      </w:r>
+      <w:r>
+        <w:t xml:space="preserve">required per diagnosis, and how much of an observed coverage gap reflects</w:t>
+      </w:r>
+      <w:r>
+        <w:t xml:space="preserve"> </w:t>
+      </w:r>
+      <w:r>
+        <w:t xml:space="preserve">dependence rather than the method itself, remains insufficiently characterized.</w:t>
+      </w:r>
+      <w:r>
+        <w:t xml:space="preserve"> </w:t>
+      </w:r>
+      <w:r>
+        <w:t xml:space="preserve">We address these design-stage questions by auditing three public</w:t>
       </w:r>
       <w:r>
         <w:t xml:space="preserve"> </w:t>
@@ -509,31 +509,37 @@
         <w:t xml:space="preserve"> </w:t>
       </w:r>
       <w:r>
-        <w:t xml:space="preserve">Challenge 2021 collection [16], which does not document a patient identifier. Two questions guide the audit. Can a block-level guarantee be</w:t>
-      </w:r>
-      <w:r>
-        <w:t xml:space="preserve"> </w:t>
-      </w:r>
-      <w:r>
-        <w:t xml:space="preserve">enforced at conventional error rates (RQ1)? Does ignoring block structure cost</w:t>
-      </w:r>
-      <w:r>
-        <w:t xml:space="preserve"> </w:t>
-      </w:r>
-      <w:r>
-        <w:t xml:space="preserve">coverage, and through what mechanism (RQ2)? Fig. 1 shows the two stages that</w:t>
-      </w:r>
-      <w:r>
-        <w:t xml:space="preserve"> </w:t>
-      </w:r>
-      <w:r>
-        <w:t xml:space="preserve">answer them, RQ1 from metadata alone and RQ2 from the conformity scores of three</w:t>
-      </w:r>
-      <w:r>
-        <w:t xml:space="preserve"> </w:t>
-      </w:r>
-      <w:r>
-        <w:t xml:space="preserve">backbones, with the section that reports each step.</w:t>
+        <w:t xml:space="preserve">Challenge 2021 collection [16], which does not document a patient identifier.</w:t>
+      </w:r>
+      <w:r>
+        <w:t xml:space="preserve"> </w:t>
+      </w:r>
+      <w:r>
+        <w:t xml:space="preserve">Two questions guide the audit. Can a block-level guarantee be enforced at</w:t>
+      </w:r>
+      <w:r>
+        <w:t xml:space="preserve"> </w:t>
+      </w:r>
+      <w:r>
+        <w:t xml:space="preserve">conventional error rates (RQ1)? Does ignoring block structure cost coverage, and</w:t>
+      </w:r>
+      <w:r>
+        <w:t xml:space="preserve"> </w:t>
+      </w:r>
+      <w:r>
+        <w:t xml:space="preserve">through what mechanism (RQ2)? Fig. 1 shows the two stages that answer them, RQ1</w:t>
+      </w:r>
+      <w:r>
+        <w:t xml:space="preserve"> </w:t>
+      </w:r>
+      <w:r>
+        <w:t xml:space="preserve">from metadata alone and RQ2 from the conformity scores of three backbones, with</w:t>
+      </w:r>
+      <w:r>
+        <w:t xml:space="preserve"> </w:t>
+      </w:r>
+      <w:r>
+        <w:t xml:space="preserve">the section that reports each step.</w:t>
       </w:r>
     </w:p>
     <w:p>
@@ -544,7 +550,7 @@
       <w:r>
         <w:drawing>
           <wp:inline>
-            <wp:extent cx="5303520" cy="3723951"/>
+            <wp:extent cx="5029200" cy="3531333"/>
             <wp:effectExtent b="0" l="0" r="0" t="0"/>
             <wp:docPr descr="Fig. 1. Audit workflow. Stage 1 (blue header) uses metadata only and gives verdicts exact given the declared sources D (RQ1); Stage 2 (orange headers) uses conformity scores from three backbones at feasible levels only (RQ2). Section numbers mark where each step is reported." title="" id="11" name="Picture"/>
             <a:graphic>
@@ -565,7 +571,7 @@
                   <pic:spPr bwMode="auto">
                     <a:xfrm>
                       <a:off x="0" y="0"/>
-                      <a:ext cx="5303520" cy="3723951"/>
+                      <a:ext cx="5029200" cy="3531333"/>
                     </a:xfrm>
                     <a:prstGeom prst="rect">
                       <a:avLst/>
@@ -804,19 +810,25 @@
         <w:jc w:val="both"/>
       </w:pPr>
       <w:r>
-        <w:t xml:space="preserve">Every finding is checked across three backbones whose sizes differ more than a</w:t>
-      </w:r>
-      <w:r>
-        <w:t xml:space="preserve"> </w:t>
-      </w:r>
-      <w:r>
-        <w:t xml:space="preserve">hundredfold and across two checkpoints; resampling is always over blocks, and the</w:t>
-      </w:r>
-      <w:r>
-        <w:t xml:space="preserve"> </w:t>
-      </w:r>
-      <w:r>
-        <w:t xml:space="preserve">held-out PTB-XL fold remains unexamined. We keep three levels of evidence apart:</w:t>
+        <w:t xml:space="preserve">Every empirical finding is checked across three backbones whose sizes differ more</w:t>
+      </w:r>
+      <w:r>
+        <w:t xml:space="preserve"> </w:t>
+      </w:r>
+      <w:r>
+        <w:t xml:space="preserve">than a hundredfold and across two checkpoints; resampling is always over blocks,</w:t>
+      </w:r>
+      <w:r>
+        <w:t xml:space="preserve"> </w:t>
+      </w:r>
+      <w:r>
+        <w:t xml:space="preserve">and the held-out PTB-XL fold remains unexamined. We keep three levels of evidence</w:t>
+      </w:r>
+      <w:r>
+        <w:t xml:space="preserve"> </w:t>
+      </w:r>
+      <w:r>
+        <w:t xml:space="preserve">apart:</w:t>
       </w:r>
       <w:r>
         <w:t xml:space="preserve"> </w:t>
@@ -910,13 +922,25 @@
         <w:t xml:space="preserve"> </w:t>
       </w:r>
       <w:r>
-        <w:t xml:space="preserve">ratios [17], spatial data [18] and network dependence [19]. Bhattacharyya and</w:t>
-      </w:r>
-      <w:r>
-        <w:t xml:space="preserve"> </w:t>
-      </w:r>
-      <w:r>
-        <w:t xml:space="preserve">Barber consider groups whose membership drives the shift [20], so exchangeability</w:t>
+        <w:t xml:space="preserve">ratios [17], spatial data [18], network dependence [19] and temporal data [20],</w:t>
+      </w:r>
+      <w:r>
+        <w:t xml:space="preserve"> </w:t>
+      </w:r>
+      <w:r>
+        <w:t xml:space="preserve">and conformal risk control extends the guarantee to general losses [21].</w:t>
+      </w:r>
+      <w:r>
+        <w:t xml:space="preserve"> </w:t>
+      </w:r>
+      <w:r>
+        <w:t xml:space="preserve">Bhattacharyya and</w:t>
+      </w:r>
+      <w:r>
+        <w:t xml:space="preserve"> </w:t>
+      </w:r>
+      <w:r>
+        <w:t xml:space="preserve">Barber consider groups whose membership drives the shift [22], so exchangeability</w:t>
       </w:r>
       <w:r>
         <w:t xml:space="preserve"> </w:t>
@@ -1234,7 +1258,7 @@
         <w:t xml:space="preserve"> </w:t>
       </w:r>
       <w:r>
-        <w:t xml:space="preserve">target level [21].</w:t>
+        <w:t xml:space="preserve">target level [23].</w:t>
       </w:r>
     </w:p>
     <w:p>
@@ -1280,7 +1304,7 @@
         <w:jc w:val="both"/>
       </w:pPr>
       <w:r>
-        <w:t xml:space="preserve">Multi-label conformal methods, surveyed by Papadopoulos [22], model dependence</w:t>
+        <w:t xml:space="preserve">Multi-label conformal methods, surveyed by Papadopoulos [24], model dependence</w:t>
       </w:r>
       <w:r>
         <w:t xml:space="preserve"> </w:t>
@@ -1298,7 +1322,7 @@
         <w:t xml:space="preserve"> </w:t>
       </w:r>
       <w:r>
-        <w:t xml:space="preserve">sets [23], exploiting structure among labels; here the hierarchy only serves to</w:t>
+        <w:t xml:space="preserve">sets [25], exploiting structure among labels; here the hierarchy only serves to</w:t>
       </w:r>
       <w:r>
         <w:t xml:space="preserve"> </w:t>
@@ -1331,25 +1355,19 @@
         <w:t xml:space="preserve"> </w:t>
       </w:r>
       <w:r>
-        <w:t xml:space="preserve">training and evaluation [24], [25], since mixing them inflates reported</w:t>
-      </w:r>
-      <w:r>
-        <w:t xml:space="preserve"> </w:t>
-      </w:r>
-      <w:r>
-        <w:t xml:space="preserve">performance [26]. Clinical uses of conformal prediction are surveyed in [6], and</w:t>
-      </w:r>
-      <w:r>
-        <w:t xml:space="preserve"> </w:t>
-      </w:r>
-      <w:r>
-        <w:t xml:space="preserve">conformal risk control [27] and time-series conformal prediction [28] extend the</w:t>
-      </w:r>
-      <w:r>
-        <w:t xml:space="preserve"> </w:t>
-      </w:r>
-      <w:r>
-        <w:t xml:space="preserve">framework to arbitrary losses and temporal data. On patient-disjoint PTB-XL</w:t>
+        <w:t xml:space="preserve">training and evaluation [26], [27], since mixing them inflates reported</w:t>
+      </w:r>
+      <w:r>
+        <w:t xml:space="preserve"> </w:t>
+      </w:r>
+      <w:r>
+        <w:t xml:space="preserve">performance [28]. Clinical uses of conformal prediction are surveyed in [6]. On</w:t>
+      </w:r>
+      <w:r>
+        <w:t xml:space="preserve"> </w:t>
+      </w:r>
+      <w:r>
+        <w:t xml:space="preserve">patient-disjoint PTB-XL</w:t>
       </w:r>
       <w:r>
         <w:t xml:space="preserve"> </w:t>
@@ -5091,7 +5109,7 @@
         <w:t xml:space="preserve"> </w:t>
       </w:r>
       <w:r>
-        <w:t xml:space="preserve">[21]. In cluster-randomized trials, minimum-variance weighting of cluster</w:t>
+        <w:t xml:space="preserve">[23]. In cluster-randomized trials, minimum-variance weighting of cluster</w:t>
       </w:r>
       <w:r>
         <w:t xml:space="preserve"> </w:t>
@@ -5226,25 +5244,25 @@
         <w:t xml:space="preserve"> </w:t>
       </w:r>
       <w:r>
-        <w:t xml:space="preserve">calibrated effective sample size. Noonan derives a large-sample variance for the</w:t>
-      </w:r>
-      <w:r>
-        <w:t xml:space="preserve"> </w:t>
-      </w:r>
-      <w:r>
-        <w:t xml:space="preserve">coverage of a threshold estimated from clustered data, in which the relevant</w:t>
-      </w:r>
-      <w:r>
-        <w:t xml:space="preserve"> </w:t>
-      </w:r>
-      <w:r>
-        <w:t xml:space="preserve">correlation is that of the exceedance indicator rather than of the score and can</w:t>
-      </w:r>
-      <w:r>
-        <w:t xml:space="preserve"> </w:t>
-      </w:r>
-      <w:r>
-        <w:t xml:space="preserve">change with the target level [21]. The primary analysis estimates</w:t>
+        <w:t xml:space="preserve">calibrated effective sample size. Because the variance that governs the coverage</w:t>
+      </w:r>
+      <w:r>
+        <w:t xml:space="preserve"> </w:t>
+      </w:r>
+      <w:r>
+        <w:t xml:space="preserve">of a clustered threshold involves the correlation of the exceedance indicator,</w:t>
+      </w:r>
+      <w:r>
+        <w:t xml:space="preserve"> </w:t>
+      </w:r>
+      <w:r>
+        <w:t xml:space="preserve">which can change with the target level [23], every analysis on this axis, run</w:t>
+      </w:r>
+      <w:r>
+        <w:t xml:space="preserve"> </w:t>
+      </w:r>
+      <w:r>
+        <w:t xml:space="preserve">primarily with</w:t>
       </w:r>
       <w:r>
         <w:t xml:space="preserve"> </w:t>
@@ -5258,13 +5276,7 @@
         <w:t xml:space="preserve"> </w:t>
       </w:r>
       <w:r>
-        <w:t xml:space="preserve">from</w:t>
-      </w:r>
-      <w:r>
-        <w:t xml:space="preserve"> </w:t>
-      </w:r>
-      <w:r>
-        <w:t xml:space="preserve">conformity scores, and every analysis on this axis is therefore repeated with the</w:t>
+        <w:t xml:space="preserve">estimated from conformity scores, is repeated with the</w:t>
       </w:r>
       <w:r>
         <w:t xml:space="preserve"> </w:t>
@@ -7300,7 +7312,7 @@
         <w:t xml:space="preserve"> </w:t>
       </w:r>
       <w:r>
-        <w:t xml:space="preserve">giant components [32], but there a collapsed join merely weakens a split; here,</w:t>
+        <w:t xml:space="preserve">giant components [32], [33], but there a collapsed join merely weakens a split; here,</w:t>
       </w:r>
       <w:r>
         <w:t xml:space="preserve"> </w:t>
@@ -7938,7 +7950,7 @@
         <w:t xml:space="preserve"> </w:t>
       </w:r>
       <w:r>
-        <w:t xml:space="preserve">class-conditional calibration under exchangeability [33]; under hierarchical</w:t>
+        <w:t xml:space="preserve">class-conditional calibration under exchangeability [34]; under hierarchical</w:t>
       </w:r>
       <w:r>
         <w:t xml:space="preserve"> </w:t>
@@ -8052,54 +8064,63 @@
           </m:rPr>
           <m:t>≥</m:t>
         </m:r>
-        <m:f>
-          <m:fPr>
-            <m:type m:val="bar"/>
-          </m:fPr>
-          <m:num>
+        <m:r>
+          <m:t>1</m:t>
+        </m:r>
+        <m:r>
+          <m:rPr>
+            <m:sty m:val="p"/>
+          </m:rPr>
+          <m:t>/</m:t>
+        </m:r>
+        <m:r>
+          <m:rPr>
+            <m:sty m:val="p"/>
+          </m:rPr>
+          <m:t>{</m:t>
+        </m:r>
+        <m:sSub>
+          <m:e>
+            <m:r>
+              <m:t>K</m:t>
+            </m:r>
+          </m:e>
+          <m:sub>
             <m:r>
               <m:t>1</m:t>
             </m:r>
-          </m:num>
-          <m:den>
-            <m:sSub>
-              <m:e>
-                <m:r>
-                  <m:t>K</m:t>
-                </m:r>
-              </m:e>
-              <m:sub>
-                <m:r>
-                  <m:t>1</m:t>
-                </m:r>
-              </m:sub>
-            </m:sSub>
-            <m:r>
-              <m:rPr>
-                <m:sty m:val="p"/>
-              </m:rPr>
-              <m:t>(</m:t>
-            </m:r>
-            <m:r>
-              <m:t>ℓ</m:t>
-            </m:r>
-            <m:r>
-              <m:rPr>
-                <m:sty m:val="p"/>
-              </m:rPr>
-              <m:t>)</m:t>
-            </m:r>
-            <m:r>
-              <m:rPr>
-                <m:sty m:val="p"/>
-              </m:rPr>
-              <m:t>+</m:t>
-            </m:r>
-            <m:r>
-              <m:t>1</m:t>
-            </m:r>
-          </m:den>
-        </m:f>
+          </m:sub>
+        </m:sSub>
+        <m:r>
+          <m:rPr>
+            <m:sty m:val="p"/>
+          </m:rPr>
+          <m:t>(</m:t>
+        </m:r>
+        <m:r>
+          <m:t>ℓ</m:t>
+        </m:r>
+        <m:r>
+          <m:rPr>
+            <m:sty m:val="p"/>
+          </m:rPr>
+          <m:t>)</m:t>
+        </m:r>
+        <m:r>
+          <m:rPr>
+            <m:sty m:val="p"/>
+          </m:rPr>
+          <m:t>+</m:t>
+        </m:r>
+        <m:r>
+          <m:t>1</m:t>
+        </m:r>
+        <m:r>
+          <m:rPr>
+            <m:sty m:val="p"/>
+          </m:rPr>
+          <m:t>}</m:t>
+        </m:r>
       </m:oMath>
       <w:r>
         <w:rPr>
@@ -8190,6 +8211,138 @@
           <w:iCs/>
         </w:rPr>
         <w:t xml:space="preserve">.</w:t>
+      </w:r>
+    </w:p>
+    <w:p>
+      <w:pPr>
+        <w:pStyle w:val="BodyText"/>
+        <w:jc w:val="both"/>
+      </w:pPr>
+      <w:r>
+        <w:rPr>
+          <w:i/>
+          <w:iCs/>
+        </w:rPr>
+        <w:t xml:space="preserve">Proof.</w:t>
+      </w:r>
+      <w:r>
+        <w:t xml:space="preserve"> </w:t>
+      </w:r>
+      <w:r>
+        <w:t xml:space="preserve">The per-label threshold is (1) computed on the</w:t>
+      </w:r>
+      <w:r>
+        <w:t xml:space="preserve"> </w:t>
+      </w:r>
+      <m:oMath>
+        <m:sSub>
+          <m:e>
+            <m:r>
+              <m:t>K</m:t>
+            </m:r>
+          </m:e>
+          <m:sub>
+            <m:r>
+              <m:t>1</m:t>
+            </m:r>
+          </m:sub>
+        </m:sSub>
+        <m:r>
+          <m:rPr>
+            <m:sty m:val="p"/>
+          </m:rPr>
+          <m:t>(</m:t>
+        </m:r>
+        <m:r>
+          <m:t>ℓ</m:t>
+        </m:r>
+        <m:r>
+          <m:rPr>
+            <m:sty m:val="p"/>
+          </m:rPr>
+          <m:t>)</m:t>
+        </m:r>
+      </m:oMath>
+      <w:r>
+        <w:t xml:space="preserve"> </w:t>
+      </w:r>
+      <w:r>
+        <w:t xml:space="preserve">blocks that</w:t>
+      </w:r>
+      <w:r>
+        <w:t xml:space="preserve"> </w:t>
+      </w:r>
+      <w:r>
+        <w:t xml:space="preserve">contain</w:t>
+      </w:r>
+      <w:r>
+        <w:t xml:space="preserve"> </w:t>
+      </w:r>
+      <m:oMath>
+        <m:r>
+          <m:t>ℓ</m:t>
+        </m:r>
+      </m:oMath>
+      <w:r>
+        <w:t xml:space="preserve">; Proposition 1 applies with</w:t>
+      </w:r>
+      <w:r>
+        <w:t xml:space="preserve"> </w:t>
+      </w:r>
+      <m:oMath>
+        <m:sSub>
+          <m:e>
+            <m:r>
+              <m:t>K</m:t>
+            </m:r>
+          </m:e>
+          <m:sub>
+            <m:r>
+              <m:t>1</m:t>
+            </m:r>
+          </m:sub>
+        </m:sSub>
+        <m:r>
+          <m:rPr>
+            <m:sty m:val="p"/>
+          </m:rPr>
+          <m:t>(</m:t>
+        </m:r>
+        <m:r>
+          <m:t>ℓ</m:t>
+        </m:r>
+        <m:r>
+          <m:rPr>
+            <m:sty m:val="p"/>
+          </m:rPr>
+          <m:t>)</m:t>
+        </m:r>
+      </m:oMath>
+      <w:r>
+        <w:t xml:space="preserve"> </w:t>
+      </w:r>
+      <w:r>
+        <w:t xml:space="preserve">in place of</w:t>
+      </w:r>
+      <w:r>
+        <w:t xml:space="preserve"> </w:t>
+      </w:r>
+      <m:oMath>
+        <m:sSub>
+          <m:e>
+            <m:r>
+              <m:t>K</m:t>
+            </m:r>
+          </m:e>
+          <m:sub>
+            <m:r>
+              <m:t>1</m:t>
+            </m:r>
+          </m:sub>
+        </m:sSub>
+      </m:oMath>
+      <w:r>
+        <w:t xml:space="preserve">. ∎</w:t>
       </w:r>
     </w:p>
     <w:p>
@@ -9906,13 +10059,13 @@
         <w:t xml:space="preserve"> </w:t>
       </w:r>
       <w:r>
-        <w:t xml:space="preserve">halves (200–400 repetitions); fold 8 is left out for its different label quality,</w:t>
-      </w:r>
-      <w:r>
-        <w:t xml:space="preserve"> </w:t>
-      </w:r>
-      <w:r>
-        <w:t xml:space="preserve">and fold 10 is reserved and unexamined. The feasibility counts of §5.1 instead</w:t>
+        <w:t xml:space="preserve">halves (200–400 repetitions); fold 8 is left out for its different label quality.</w:t>
+      </w:r>
+      <w:r>
+        <w:t xml:space="preserve"> </w:t>
+      </w:r>
+      <w:r>
+        <w:t xml:space="preserve">The feasibility counts of §5.1 instead</w:t>
       </w:r>
       <w:r>
         <w:t xml:space="preserve"> </w:t>
@@ -10018,19 +10171,19 @@
         <w:jc w:val="both"/>
       </w:pPr>
       <w:r>
-        <w:t xml:space="preserve">Conformal guarantees do not depend on the model, so the backbone changes set</w:t>
-      </w:r>
-      <w:r>
-        <w:t xml:space="preserve"> </w:t>
-      </w:r>
-      <w:r>
-        <w:t xml:space="preserve">size, not validity. The primary backbone, SmallECGNet, is a compact 1-D</w:t>
-      </w:r>
-      <w:r>
-        <w:t xml:space="preserve"> </w:t>
-      </w:r>
-      <w:r>
-        <w:t xml:space="preserve">convolutional network (104,389 parameters for 12-lead input, 101,925 for one</w:t>
+        <w:t xml:space="preserve">Conformal validity does not depend on the model, so the backbone changes set</w:t>
+      </w:r>
+      <w:r>
+        <w:t xml:space="preserve"> </w:t>
+      </w:r>
+      <w:r>
+        <w:t xml:space="preserve">size, not coverage guarantees. The primary backbone, SmallECGNet, is a compact</w:t>
+      </w:r>
+      <w:r>
+        <w:t xml:space="preserve"> </w:t>
+      </w:r>
+      <w:r>
+        <w:t xml:space="preserve">1-D convolutional network (104,389 parameters for 12-lead input, 101,925 for one</w:t>
       </w:r>
       <w:r>
         <w:t xml:space="preserve"> </w:t>
@@ -10042,25 +10195,25 @@
         <w:t xml:space="preserve"> </w:t>
       </w:r>
       <w:r>
-        <w:t xml:space="preserve">retraining. Each audit is repeated</w:t>
-      </w:r>
-      <w:r>
-        <w:t xml:space="preserve"> </w:t>
-      </w:r>
-      <w:r>
-        <w:t xml:space="preserve">with two 1-D residual networks of the PTB-XL benchmark family [1], ResNet1D-34</w:t>
-      </w:r>
-      <w:r>
-        <w:t xml:space="preserve"> </w:t>
-      </w:r>
-      <w:r>
-        <w:t xml:space="preserve">(7,225,733 / 7,220,805 parameters) and ResNet1D-50 (15,969,413 / 15,964,485),</w:t>
-      </w:r>
-      <w:r>
-        <w:t xml:space="preserve"> </w:t>
-      </w:r>
-      <w:r>
-        <w:t xml:space="preserve">trained with Adam (learning rate</w:t>
+        <w:t xml:space="preserve">retraining. Each audit is repeated with two 1-D residual networks of the PTB-XL</w:t>
+      </w:r>
+      <w:r>
+        <w:t xml:space="preserve"> </w:t>
+      </w:r>
+      <w:r>
+        <w:t xml:space="preserve">benchmark family [1], ResNet1D-34 (7,225,733 / 7,220,805 parameters) and</w:t>
+      </w:r>
+      <w:r>
+        <w:t xml:space="preserve"> </w:t>
+      </w:r>
+      <w:r>
+        <w:t xml:space="preserve">ResNet1D-50 (15,969,413 / 15,964,485). All three were trained with Adam</w:t>
+      </w:r>
+      <w:r>
+        <w:t xml:space="preserve"> </w:t>
+      </w:r>
+      <w:r>
+        <w:t xml:space="preserve">(learning rate</w:t>
       </w:r>
       <w:r>
         <w:t xml:space="preserve"> </w:t>
@@ -10086,19 +10239,13 @@
         </m:sSup>
       </m:oMath>
       <w:r>
-        <w:t xml:space="preserve">), early stopping on validation loss</w:t>
-      </w:r>
-      <w:r>
-        <w:t xml:space="preserve"> </w:t>
-      </w:r>
-      <w:r>
-        <w:t xml:space="preserve">(patience 5) and at most 25 epochs on PTB-XL and 30 on MIT-BIH; SmallECGNet was</w:t>
-      </w:r>
-      <w:r>
-        <w:t xml:space="preserve"> </w:t>
-      </w:r>
-      <w:r>
-        <w:t xml:space="preserve">trained with the same optimizer, stopping rule and batch sizes.</w:t>
+        <w:t xml:space="preserve">), early stopping on validation loss (patience 5) and at</w:t>
+      </w:r>
+      <w:r>
+        <w:t xml:space="preserve"> </w:t>
+      </w:r>
+      <w:r>
+        <w:t xml:space="preserve">most 25 epochs on PTB-XL and 30 on MIT-BIH.</w:t>
       </w:r>
       <w:r>
         <w:t xml:space="preserve"> </w:t>
@@ -10140,19 +10287,19 @@
         <w:t xml:space="preserve"> </w:t>
       </w:r>
       <w:r>
-        <w:t xml:space="preserve">0.3144. The backbones were deliberately not tuned for discrimination: validity</w:t>
-      </w:r>
-      <w:r>
-        <w:t xml:space="preserve"> </w:t>
-      </w:r>
-      <w:r>
-        <w:t xml:space="preserve">holds for any score fixed before calibration, so a weak minority-class score</w:t>
-      </w:r>
-      <w:r>
-        <w:t xml:space="preserve"> </w:t>
-      </w:r>
-      <w:r>
-        <w:t xml:space="preserve">enlarges sets without affecting the coverage under audit. Scores are</w:t>
+        <w:t xml:space="preserve">0.3144. The backbones were deliberately not tuned for discrimination, because a</w:t>
+      </w:r>
+      <w:r>
+        <w:t xml:space="preserve"> </w:t>
+      </w:r>
+      <w:r>
+        <w:t xml:space="preserve">weak minority-class score enlarges sets without affecting the coverage under</w:t>
+      </w:r>
+      <w:r>
+        <w:t xml:space="preserve"> </w:t>
+      </w:r>
+      <w:r>
+        <w:t xml:space="preserve">audit. Scores are</w:t>
       </w:r>
       <w:r>
         <w:t xml:space="preserve"> </w:t>
@@ -12632,7 +12779,7 @@
         <w:t xml:space="preserve"> </w:t>
       </w:r>
       <w:r>
-        <w:t xml:space="preserve">known [32]. Fig. 4 places the single sources, their joins and the MIT-BIH record</w:t>
+        <w:t xml:space="preserve">known [32], [33]. Fig. 4 places the single sources, their joins and the MIT-BIH record</w:t>
       </w:r>
       <w:r>
         <w:t xml:space="preserve"> </w:t>
@@ -13620,7 +13767,7 @@
       <w:r>
         <w:drawing>
           <wp:inline>
-            <wp:extent cx="5303520" cy="1595119"/>
+            <wp:extent cx="5029200" cy="1512613"/>
             <wp:effectExtent b="0" l="0" r="0" t="0"/>
             <wp:docPr descr="Fig. 5. Calibration blocks carrying each PTB-XL label by hierarchy level (fold 9, patient blocks; log scale). Dashed and dotted lines: blocks required at \alpha=0.05 and 0.10. Dark bars meet the 0.05 requirement, light bars only the 0.10 one, orange bars neither." title="" id="39" name="Picture"/>
             <a:graphic>
@@ -13641,7 +13788,7 @@
                   <pic:spPr bwMode="auto">
                     <a:xfrm>
                       <a:off x="0" y="0"/>
-                      <a:ext cx="5303520" cy="1595119"/>
+                      <a:ext cx="5029200" cy="1512613"/>
                     </a:xfrm>
                     <a:prstGeom prst="rect">
                       <a:avLst/>
@@ -13995,6 +14142,7 @@
           <w:p>
             <w:pPr>
               <w:pStyle w:val="Compact"/>
+              <w:keepNext/>
             </w:pPr>
             <w:r>
               <w:rPr>
@@ -14009,6 +14157,7 @@
           <w:p>
             <w:pPr>
               <w:pStyle w:val="Compact"/>
+              <w:keepNext/>
               <w:jc w:val="right"/>
             </w:pPr>
             <w:r>
@@ -14024,6 +14173,7 @@
           <w:p>
             <w:pPr>
               <w:pStyle w:val="Compact"/>
+              <w:keepNext/>
             </w:pPr>
             <w:r>
               <w:rPr>
@@ -14038,6 +14188,7 @@
           <w:p>
             <w:pPr>
               <w:pStyle w:val="Compact"/>
+              <w:keepNext/>
               <w:jc w:val="right"/>
             </w:pPr>
             <w:r>
@@ -14053,6 +14204,7 @@
           <w:p>
             <w:pPr>
               <w:pStyle w:val="Compact"/>
+              <w:keepNext/>
               <w:jc w:val="right"/>
             </w:pPr>
             <w:r>
@@ -14068,6 +14220,7 @@
           <w:p>
             <w:pPr>
               <w:pStyle w:val="Compact"/>
+              <w:keepNext/>
               <w:jc w:val="right"/>
             </w:pPr>
             <w:r>
@@ -14088,14 +14241,16 @@
           <w:p>
             <w:pPr>
               <w:pStyle w:val="Compact"/>
-            </w:pPr>
-          </w:p>
-        </w:tc>
-        <w:tc>
-          <w:tcPr/>
-          <w:p>
-            <w:pPr>
-              <w:pStyle w:val="Compact"/>
+              <w:keepNext/>
+            </w:pPr>
+          </w:p>
+        </w:tc>
+        <w:tc>
+          <w:tcPr/>
+          <w:p>
+            <w:pPr>
+              <w:pStyle w:val="Compact"/>
+              <w:keepNext/>
               <w:jc w:val="right"/>
             </w:pPr>
             <w:r>
@@ -14111,6 +14266,7 @@
           <w:p>
             <w:pPr>
               <w:pStyle w:val="Compact"/>
+              <w:keepNext/>
             </w:pPr>
             <w:r>
               <w:rPr>
@@ -14125,6 +14281,7 @@
           <w:p>
             <w:pPr>
               <w:pStyle w:val="Compact"/>
+              <w:keepNext/>
               <w:jc w:val="right"/>
             </w:pPr>
             <w:r>
@@ -14140,6 +14297,7 @@
           <w:p>
             <w:pPr>
               <w:pStyle w:val="Compact"/>
+              <w:keepNext/>
               <w:jc w:val="right"/>
             </w:pPr>
             <w:r>
@@ -14155,6 +14313,7 @@
           <w:p>
             <w:pPr>
               <w:pStyle w:val="Compact"/>
+              <w:keepNext/>
               <w:jc w:val="right"/>
             </w:pPr>
             <w:r>
@@ -14175,14 +14334,16 @@
           <w:p>
             <w:pPr>
               <w:pStyle w:val="Compact"/>
-            </w:pPr>
-          </w:p>
-        </w:tc>
-        <w:tc>
-          <w:tcPr/>
-          <w:p>
-            <w:pPr>
-              <w:pStyle w:val="Compact"/>
+              <w:keepNext/>
+            </w:pPr>
+          </w:p>
+        </w:tc>
+        <w:tc>
+          <w:tcPr/>
+          <w:p>
+            <w:pPr>
+              <w:pStyle w:val="Compact"/>
+              <w:keepNext/>
               <w:jc w:val="right"/>
             </w:pPr>
             <w:r>
@@ -14198,6 +14359,7 @@
           <w:p>
             <w:pPr>
               <w:pStyle w:val="Compact"/>
+              <w:keepNext/>
             </w:pPr>
             <w:r>
               <w:rPr>
@@ -14212,6 +14374,7 @@
           <w:p>
             <w:pPr>
               <w:pStyle w:val="Compact"/>
+              <w:keepNext/>
               <w:jc w:val="right"/>
             </w:pPr>
             <w:r>
@@ -14227,6 +14390,7 @@
           <w:p>
             <w:pPr>
               <w:pStyle w:val="Compact"/>
+              <w:keepNext/>
               <w:jc w:val="right"/>
             </w:pPr>
             <w:r>
@@ -14242,6 +14406,7 @@
           <w:p>
             <w:pPr>
               <w:pStyle w:val="Compact"/>
+              <w:keepNext/>
               <w:jc w:val="right"/>
             </w:pPr>
             <w:r>
@@ -14262,14 +14427,16 @@
           <w:p>
             <w:pPr>
               <w:pStyle w:val="Compact"/>
-            </w:pPr>
-          </w:p>
-        </w:tc>
-        <w:tc>
-          <w:tcPr/>
-          <w:p>
-            <w:pPr>
-              <w:pStyle w:val="Compact"/>
+              <w:keepNext/>
+            </w:pPr>
+          </w:p>
+        </w:tc>
+        <w:tc>
+          <w:tcPr/>
+          <w:p>
+            <w:pPr>
+              <w:pStyle w:val="Compact"/>
+              <w:keepNext/>
               <w:jc w:val="right"/>
             </w:pPr>
             <w:r>
@@ -14285,6 +14452,7 @@
           <w:p>
             <w:pPr>
               <w:pStyle w:val="Compact"/>
+              <w:keepNext/>
             </w:pPr>
             <w:r>
               <w:rPr>
@@ -14299,6 +14467,7 @@
           <w:p>
             <w:pPr>
               <w:pStyle w:val="Compact"/>
+              <w:keepNext/>
               <w:jc w:val="right"/>
             </w:pPr>
             <w:r>
@@ -14314,6 +14483,7 @@
           <w:p>
             <w:pPr>
               <w:pStyle w:val="Compact"/>
+              <w:keepNext/>
               <w:jc w:val="right"/>
             </w:pPr>
             <w:r>
@@ -14329,6 +14499,7 @@
           <w:p>
             <w:pPr>
               <w:pStyle w:val="Compact"/>
+              <w:keepNext/>
               <w:jc w:val="right"/>
             </w:pPr>
             <w:r>
@@ -14436,6 +14607,7 @@
           <w:p>
             <w:pPr>
               <w:pStyle w:val="Compact"/>
+              <w:keepNext/>
             </w:pPr>
             <w:r>
               <w:rPr>
@@ -14450,6 +14622,7 @@
           <w:p>
             <w:pPr>
               <w:pStyle w:val="Compact"/>
+              <w:keepNext/>
               <w:jc w:val="right"/>
             </w:pPr>
             <w:r>
@@ -14465,6 +14638,7 @@
           <w:p>
             <w:pPr>
               <w:pStyle w:val="Compact"/>
+              <w:keepNext/>
             </w:pPr>
             <w:r>
               <w:rPr>
@@ -14479,6 +14653,7 @@
           <w:p>
             <w:pPr>
               <w:pStyle w:val="Compact"/>
+              <w:keepNext/>
               <w:jc w:val="right"/>
             </w:pPr>
             <w:r>
@@ -14494,6 +14669,7 @@
           <w:p>
             <w:pPr>
               <w:pStyle w:val="Compact"/>
+              <w:keepNext/>
               <w:jc w:val="right"/>
             </w:pPr>
             <w:r>
@@ -14509,6 +14685,7 @@
           <w:p>
             <w:pPr>
               <w:pStyle w:val="Compact"/>
+              <w:keepNext/>
               <w:jc w:val="right"/>
             </w:pPr>
             <w:r>
@@ -14529,14 +14706,16 @@
           <w:p>
             <w:pPr>
               <w:pStyle w:val="Compact"/>
-            </w:pPr>
-          </w:p>
-        </w:tc>
-        <w:tc>
-          <w:tcPr/>
-          <w:p>
-            <w:pPr>
-              <w:pStyle w:val="Compact"/>
+              <w:keepNext/>
+            </w:pPr>
+          </w:p>
+        </w:tc>
+        <w:tc>
+          <w:tcPr/>
+          <w:p>
+            <w:pPr>
+              <w:pStyle w:val="Compact"/>
+              <w:keepNext/>
               <w:jc w:val="right"/>
             </w:pPr>
             <w:r>
@@ -14552,6 +14731,7 @@
           <w:p>
             <w:pPr>
               <w:pStyle w:val="Compact"/>
+              <w:keepNext/>
             </w:pPr>
             <w:r>
               <w:rPr>
@@ -14566,6 +14746,7 @@
           <w:p>
             <w:pPr>
               <w:pStyle w:val="Compact"/>
+              <w:keepNext/>
               <w:jc w:val="right"/>
             </w:pPr>
             <w:r>
@@ -14581,6 +14762,7 @@
           <w:p>
             <w:pPr>
               <w:pStyle w:val="Compact"/>
+              <w:keepNext/>
               <w:jc w:val="right"/>
             </w:pPr>
             <w:r>
@@ -14596,6 +14778,7 @@
           <w:p>
             <w:pPr>
               <w:pStyle w:val="Compact"/>
+              <w:keepNext/>
               <w:jc w:val="right"/>
             </w:pPr>
             <w:r>
@@ -14887,7 +15070,7 @@
       <w:r>
         <w:drawing>
           <wp:inline>
-            <wp:extent cx="5303520" cy="1669438"/>
+            <wp:extent cx="5029200" cy="1583087"/>
             <wp:effectExtent b="0" l="0" r="0" t="0"/>
             <wp:docPr descr="Fig. 6. Coverage minus nominal 1-\alpha, primary backbone: B1 (mean and 2.5–97.5% range over 200 block-level splits) and B12 (mean). Shading marks MIT-BIH levels below \alpha_{\min}=1/12; vertical scales differ." title="" id="43" name="Picture"/>
             <a:graphic>
@@ -14908,7 +15091,7 @@
                   <pic:spPr bwMode="auto">
                     <a:xfrm>
                       <a:off x="0" y="0"/>
-                      <a:ext cx="5303520" cy="1669438"/>
+                      <a:ext cx="5029200" cy="1583087"/>
                     </a:xfrm>
                     <a:prstGeom prst="rect">
                       <a:avLst/>
@@ -15030,7 +15213,7 @@
       <w:r>
         <w:drawing>
           <wp:inline>
-            <wp:extent cx="5303520" cy="1273853"/>
+            <wp:extent cx="5029200" cy="1207964"/>
             <wp:effectExtent b="0" l="0" r="0" t="0"/>
             <wp:docPr descr="Fig. 7. Controls used on MIT-BIH, drawn on four illustrative records (colors mark the original record of each beat). (a) Permutation null. (b) 2×2 factorial design crossing clustering with calibration block-size balance. (c) Dose–response: a growing fraction p of beats reassigned at random." title="" id="47" name="Picture"/>
             <a:graphic>
@@ -15051,7 +15234,7 @@
                   <pic:spPr bwMode="auto">
                     <a:xfrm>
                       <a:off x="0" y="0"/>
-                      <a:ext cx="5303520" cy="1273853"/>
+                      <a:ext cx="5029200" cy="1207964"/>
                     </a:xfrm>
                     <a:prstGeom prst="rect">
                       <a:avLst/>
@@ -15408,6 +15591,7 @@
           <w:p>
             <w:pPr>
               <w:pStyle w:val="Compact"/>
+              <w:keepNext/>
             </w:pPr>
             <w:r>
               <w:rPr>
@@ -15422,6 +15606,7 @@
           <w:p>
             <w:pPr>
               <w:pStyle w:val="Compact"/>
+              <w:keepNext/>
             </w:pPr>
             <w:r>
               <w:rPr>
@@ -15436,6 +15621,7 @@
           <w:p>
             <w:pPr>
               <w:pStyle w:val="Compact"/>
+              <w:keepNext/>
             </w:pPr>
             <w:r>
               <w:rPr>
@@ -15450,6 +15636,7 @@
           <w:p>
             <w:pPr>
               <w:pStyle w:val="Compact"/>
+              <w:keepNext/>
             </w:pPr>
             <w:r>
               <w:rPr>
@@ -15464,6 +15651,7 @@
           <w:p>
             <w:pPr>
               <w:pStyle w:val="Compact"/>
+              <w:keepNext/>
             </w:pPr>
             <w:r>
               <w:rPr>
@@ -15478,6 +15666,7 @@
           <w:p>
             <w:pPr>
               <w:pStyle w:val="Compact"/>
+              <w:keepNext/>
             </w:pPr>
             <w:r>
               <w:rPr>
@@ -15497,22 +15686,25 @@
           <w:p>
             <w:pPr>
               <w:pStyle w:val="Compact"/>
-            </w:pPr>
-          </w:p>
-        </w:tc>
-        <w:tc>
-          <w:tcPr/>
-          <w:p>
-            <w:pPr>
-              <w:pStyle w:val="Compact"/>
-            </w:pPr>
-          </w:p>
-        </w:tc>
-        <w:tc>
-          <w:tcPr/>
-          <w:p>
-            <w:pPr>
-              <w:pStyle w:val="Compact"/>
+              <w:keepNext/>
+            </w:pPr>
+          </w:p>
+        </w:tc>
+        <w:tc>
+          <w:tcPr/>
+          <w:p>
+            <w:pPr>
+              <w:pStyle w:val="Compact"/>
+              <w:keepNext/>
+            </w:pPr>
+          </w:p>
+        </w:tc>
+        <w:tc>
+          <w:tcPr/>
+          <w:p>
+            <w:pPr>
+              <w:pStyle w:val="Compact"/>
+              <w:keepNext/>
             </w:pPr>
             <w:r>
               <w:rPr>
@@ -15527,6 +15719,7 @@
           <w:p>
             <w:pPr>
               <w:pStyle w:val="Compact"/>
+              <w:keepNext/>
             </w:pPr>
             <w:r>
               <w:rPr>
@@ -15541,6 +15734,7 @@
           <w:p>
             <w:pPr>
               <w:pStyle w:val="Compact"/>
+              <w:keepNext/>
             </w:pPr>
             <w:r>
               <w:rPr>
@@ -15555,6 +15749,7 @@
           <w:p>
             <w:pPr>
               <w:pStyle w:val="Compact"/>
+              <w:keepNext/>
             </w:pPr>
             <w:r>
               <w:rPr>
@@ -15651,6 +15846,7 @@
           <w:p>
             <w:pPr>
               <w:pStyle w:val="Compact"/>
+              <w:keepNext/>
             </w:pPr>
             <w:r>
               <w:rPr>
@@ -15665,6 +15861,7 @@
           <w:p>
             <w:pPr>
               <w:pStyle w:val="Compact"/>
+              <w:keepNext/>
             </w:pPr>
             <w:r>
               <w:rPr>
@@ -15679,6 +15876,7 @@
           <w:p>
             <w:pPr>
               <w:pStyle w:val="Compact"/>
+              <w:keepNext/>
             </w:pPr>
             <w:r>
               <w:rPr>
@@ -15693,6 +15891,7 @@
           <w:p>
             <w:pPr>
               <w:pStyle w:val="Compact"/>
+              <w:keepNext/>
             </w:pPr>
             <w:r>
               <w:rPr>
@@ -15707,6 +15906,7 @@
           <w:p>
             <w:pPr>
               <w:pStyle w:val="Compact"/>
+              <w:keepNext/>
             </w:pPr>
             <w:r>
               <w:rPr>
@@ -15721,6 +15921,7 @@
           <w:p>
             <w:pPr>
               <w:pStyle w:val="Compact"/>
+              <w:keepNext/>
             </w:pPr>
             <w:r>
               <w:rPr>
@@ -15740,22 +15941,25 @@
           <w:p>
             <w:pPr>
               <w:pStyle w:val="Compact"/>
-            </w:pPr>
-          </w:p>
-        </w:tc>
-        <w:tc>
-          <w:tcPr/>
-          <w:p>
-            <w:pPr>
-              <w:pStyle w:val="Compact"/>
-            </w:pPr>
-          </w:p>
-        </w:tc>
-        <w:tc>
-          <w:tcPr/>
-          <w:p>
-            <w:pPr>
-              <w:pStyle w:val="Compact"/>
+              <w:keepNext/>
+            </w:pPr>
+          </w:p>
+        </w:tc>
+        <w:tc>
+          <w:tcPr/>
+          <w:p>
+            <w:pPr>
+              <w:pStyle w:val="Compact"/>
+              <w:keepNext/>
+            </w:pPr>
+          </w:p>
+        </w:tc>
+        <w:tc>
+          <w:tcPr/>
+          <w:p>
+            <w:pPr>
+              <w:pStyle w:val="Compact"/>
+              <w:keepNext/>
             </w:pPr>
             <w:r>
               <w:rPr>
@@ -15770,6 +15974,7 @@
           <w:p>
             <w:pPr>
               <w:pStyle w:val="Compact"/>
+              <w:keepNext/>
             </w:pPr>
             <w:r>
               <w:rPr>
@@ -15784,6 +15989,7 @@
           <w:p>
             <w:pPr>
               <w:pStyle w:val="Compact"/>
+              <w:keepNext/>
             </w:pPr>
             <w:r>
               <w:rPr>
@@ -15798,6 +16004,7 @@
           <w:p>
             <w:pPr>
               <w:pStyle w:val="Compact"/>
+              <w:keepNext/>
             </w:pPr>
             <w:r>
               <w:rPr>
@@ -15894,6 +16101,7 @@
           <w:p>
             <w:pPr>
               <w:pStyle w:val="Compact"/>
+              <w:keepNext/>
             </w:pPr>
             <w:r>
               <w:rPr>
@@ -15908,6 +16116,7 @@
           <w:p>
             <w:pPr>
               <w:pStyle w:val="Compact"/>
+              <w:keepNext/>
             </w:pPr>
             <w:r>
               <w:rPr>
@@ -15922,6 +16131,7 @@
           <w:p>
             <w:pPr>
               <w:pStyle w:val="Compact"/>
+              <w:keepNext/>
             </w:pPr>
             <w:r>
               <w:rPr>
@@ -15936,6 +16146,7 @@
           <w:p>
             <w:pPr>
               <w:pStyle w:val="Compact"/>
+              <w:keepNext/>
             </w:pPr>
             <w:r>
               <w:rPr>
@@ -15950,6 +16161,7 @@
           <w:p>
             <w:pPr>
               <w:pStyle w:val="Compact"/>
+              <w:keepNext/>
             </w:pPr>
             <w:r>
               <w:rPr>
@@ -15964,6 +16176,7 @@
           <w:p>
             <w:pPr>
               <w:pStyle w:val="Compact"/>
+              <w:keepNext/>
             </w:pPr>
             <w:r>
               <w:rPr>
@@ -15983,22 +16196,25 @@
           <w:p>
             <w:pPr>
               <w:pStyle w:val="Compact"/>
-            </w:pPr>
-          </w:p>
-        </w:tc>
-        <w:tc>
-          <w:tcPr/>
-          <w:p>
-            <w:pPr>
-              <w:pStyle w:val="Compact"/>
-            </w:pPr>
-          </w:p>
-        </w:tc>
-        <w:tc>
-          <w:tcPr/>
-          <w:p>
-            <w:pPr>
-              <w:pStyle w:val="Compact"/>
+              <w:keepNext/>
+            </w:pPr>
+          </w:p>
+        </w:tc>
+        <w:tc>
+          <w:tcPr/>
+          <w:p>
+            <w:pPr>
+              <w:pStyle w:val="Compact"/>
+              <w:keepNext/>
+            </w:pPr>
+          </w:p>
+        </w:tc>
+        <w:tc>
+          <w:tcPr/>
+          <w:p>
+            <w:pPr>
+              <w:pStyle w:val="Compact"/>
+              <w:keepNext/>
             </w:pPr>
             <w:r>
               <w:rPr>
@@ -16013,6 +16229,7 @@
           <w:p>
             <w:pPr>
               <w:pStyle w:val="Compact"/>
+              <w:keepNext/>
             </w:pPr>
             <w:r>
               <w:rPr>
@@ -16027,6 +16244,7 @@
           <w:p>
             <w:pPr>
               <w:pStyle w:val="Compact"/>
+              <w:keepNext/>
             </w:pPr>
             <w:r>
               <w:rPr>
@@ -16041,6 +16259,7 @@
           <w:p>
             <w:pPr>
               <w:pStyle w:val="Compact"/>
+              <w:keepNext/>
             </w:pPr>
             <w:r>
               <w:rPr>
@@ -16700,7 +16919,7 @@
       <w:r>
         <w:drawing>
           <wp:inline>
-            <wp:extent cx="5303520" cy="1550454"/>
+            <wp:extent cx="5029200" cy="1470258"/>
             <wp:effectExtent b="0" l="0" r="0" t="0"/>
             <wp:docPr descr="Fig. 8. Attribution of the MIT-BIH deficit, primary backbone. (a) Factorial effects on B1 coverage (Monte Carlo 95% intervals, 400 splits; open markers include zero). (b) B12−B1 gap on original and permuted data (whiskers: 2.5–97.5% range); percentages give the mechanical share." title="" id="50" name="Picture"/>
             <a:graphic>
@@ -16721,7 +16940,7 @@
                   <pic:spPr bwMode="auto">
                     <a:xfrm>
                       <a:off x="0" y="0"/>
-                      <a:ext cx="5303520" cy="1550454"/>
+                      <a:ext cx="5029200" cy="1470258"/>
                     </a:xfrm>
                     <a:prstGeom prst="rect">
                       <a:avLst/>
@@ -17004,11 +17223,11 @@
         </w:tblBorders>
       </w:tblPr>
       <w:tblGrid>
-        <w:gridCol w:w="2762"/>
-        <w:gridCol w:w="460"/>
-        <w:gridCol w:w="1565"/>
-        <w:gridCol w:w="1565"/>
-        <w:gridCol w:w="1565"/>
+        <w:gridCol w:w="2669"/>
+        <w:gridCol w:w="711"/>
+        <w:gridCol w:w="1512"/>
+        <w:gridCol w:w="1512"/>
+        <w:gridCol w:w="1512"/>
       </w:tblGrid>
       <w:tr>
         <w:trPr>
@@ -17629,7 +17848,7 @@
         <w:t xml:space="preserve"> </w:t>
       </w:r>
       <w:r>
-        <w:t xml:space="preserve">exceedance-specific design effect is given in [21].</w:t>
+        <w:t xml:space="preserve">exceedance-specific design effect is given in [23].</w:t>
       </w:r>
       <w:r>
         <w:t xml:space="preserve"> </w:t>
@@ -18407,7 +18626,7 @@
       <w:r>
         <w:drawing>
           <wp:inline>
-            <wp:extent cx="5303520" cy="1765149"/>
+            <wp:extent cx="5029200" cy="1673848"/>
             <wp:effectExtent b="0" l="0" r="0" t="0"/>
             <wp:docPr descr="Fig. 10. Robustness. (a) MIT-BIH B1 deficit against the permutation null by backbone and \alpha: Monte Carlo 95% interval (200 splits; open markers include zero) and record-level jackknife 95% CI (light bars). (b) B1 coverage minus nominal under best-validation versus last-epoch weights, 16 cells; shaded quadrants mark sign agreement." title="" id="58" name="Picture"/>
             <a:graphic>
@@ -18428,7 +18647,7 @@
                   <pic:spPr bwMode="auto">
                     <a:xfrm>
                       <a:off x="0" y="0"/>
-                      <a:ext cx="5303520" cy="1765149"/>
+                      <a:ext cx="5029200" cy="1673848"/>
                     </a:xfrm>
                     <a:prstGeom prst="rect">
                       <a:avLst/>
@@ -19286,7 +19505,7 @@
         <w:t xml:space="preserve"> </w:t>
       </w:r>
       <w:r>
-        <w:t xml:space="preserve">The inter-patient protocol prevents subject-level leakage [24], [26], [25], but</w:t>
+        <w:t xml:space="preserve">The inter-patient protocol prevents subject-level leakage [26], [28], [27], but</w:t>
       </w:r>
       <w:r>
         <w:t xml:space="preserve"> </w:t>
@@ -19337,13 +19556,13 @@
         <w:t xml:space="preserve"> </w:t>
       </w:r>
       <w:r>
-        <w:t xml:space="preserve">distribution of split conformal prediction implies for exchangeable data [34];</w:t>
-      </w:r>
-      <w:r>
-        <w:t xml:space="preserve"> </w:t>
-      </w:r>
-      <w:r>
-        <w:t xml:space="preserve">and, as for rare classes under exchangeability [33], the count that matters per</w:t>
+        <w:t xml:space="preserve">distribution of split conformal prediction implies for exchangeable data [35];</w:t>
+      </w:r>
+      <w:r>
+        <w:t xml:space="preserve"> </w:t>
+      </w:r>
+      <w:r>
+        <w:t xml:space="preserve">and, as for rare classes under exchangeability [34], the count that matters per</w:t>
       </w:r>
       <w:r>
         <w:t xml:space="preserve"> </w:t>
@@ -19423,7 +19642,7 @@
         <w:t xml:space="preserve"> </w:t>
       </w:r>
       <w:r>
-        <w:t xml:space="preserve">of §5.1. Risk-control extensions [27] and time-series variants [28] rest on</w:t>
+        <w:t xml:space="preserve">of §5.1. Risk-control extensions [21] and time-series variants [20] rest on</w:t>
       </w:r>
       <w:r>
         <w:t xml:space="preserve"> </w:t>
@@ -22099,21 +22318,18 @@
         <w:t xml:space="preserve"> </w:t>
       </w:r>
       <m:oMath>
-        <m:f>
-          <m:fPr>
-            <m:type m:val="lin"/>
-          </m:fPr>
-          <m:num>
-            <m:r>
-              <m:t>1</m:t>
-            </m:r>
-          </m:num>
-          <m:den>
-            <m:r>
-              <m:t>3</m:t>
-            </m:r>
-          </m:den>
-        </m:f>
+        <m:r>
+          <m:t>1</m:t>
+        </m:r>
+        <m:r>
+          <m:rPr>
+            <m:sty m:val="p"/>
+          </m:rPr>
+          <m:t>/</m:t>
+        </m:r>
+        <m:r>
+          <m:t>3</m:t>
+        </m:r>
       </m:oMath>
       <w:r>
         <w:t xml:space="preserve"> </w:t>
@@ -22216,21 +22432,18 @@
         <w:t xml:space="preserve"> </w:t>
       </w:r>
       <m:oMath>
-        <m:f>
-          <m:fPr>
-            <m:type m:val="lin"/>
-          </m:fPr>
-          <m:num>
-            <m:r>
-              <m:t>2</m:t>
-            </m:r>
-          </m:num>
-          <m:den>
-            <m:r>
-              <m:t>3</m:t>
-            </m:r>
-          </m:den>
-        </m:f>
+        <m:r>
+          <m:t>2</m:t>
+        </m:r>
+        <m:r>
+          <m:rPr>
+            <m:sty m:val="p"/>
+          </m:rPr>
+          <m:t>/</m:t>
+        </m:r>
+        <m:r>
+          <m:t>3</m:t>
+        </m:r>
       </m:oMath>
       <w:r>
         <w:t xml:space="preserve">. Shifting the calibration mass to</w:t>
@@ -22245,21 +22458,18 @@
           </m:rPr>
           <m:t>(</m:t>
         </m:r>
-        <m:f>
-          <m:fPr>
-            <m:type m:val="lin"/>
-          </m:fPr>
-          <m:num>
-            <m:r>
-              <m:t>2</m:t>
-            </m:r>
-          </m:num>
-          <m:den>
-            <m:r>
-              <m:t>3</m:t>
-            </m:r>
-          </m:den>
-        </m:f>
+        <m:r>
+          <m:t>2</m:t>
+        </m:r>
+        <m:r>
+          <m:rPr>
+            <m:sty m:val="p"/>
+          </m:rPr>
+          <m:t>/</m:t>
+        </m:r>
+        <m:r>
+          <m:t>3</m:t>
+        </m:r>
         <m:r>
           <m:rPr>
             <m:sty m:val="p"/>
@@ -22286,21 +22496,18 @@
         <w:t xml:space="preserve"> </w:t>
       </w:r>
       <m:oMath>
-        <m:f>
-          <m:fPr>
-            <m:type m:val="lin"/>
-          </m:fPr>
-          <m:num>
-            <m:r>
-              <m:t>1</m:t>
-            </m:r>
-          </m:num>
-          <m:den>
-            <m:r>
-              <m:t>3</m:t>
-            </m:r>
-          </m:den>
-        </m:f>
+        <m:r>
+          <m:t>1</m:t>
+        </m:r>
+        <m:r>
+          <m:rPr>
+            <m:sty m:val="p"/>
+          </m:rPr>
+          <m:t>/</m:t>
+        </m:r>
+        <m:r>
+          <m:t>3</m:t>
+        </m:r>
       </m:oMath>
       <w:r>
         <w:t xml:space="preserve"> </w:t>
@@ -22416,42 +22623,36 @@
           </m:rPr>
           <m:t>=</m:t>
         </m:r>
-        <m:f>
-          <m:fPr>
-            <m:type m:val="lin"/>
-          </m:fPr>
-          <m:num>
-            <m:r>
-              <m:t>1</m:t>
-            </m:r>
-          </m:num>
-          <m:den>
-            <m:r>
-              <m:t>2</m:t>
-            </m:r>
-          </m:den>
-        </m:f>
+        <m:r>
+          <m:t>1</m:t>
+        </m:r>
+        <m:r>
+          <m:rPr>
+            <m:sty m:val="p"/>
+          </m:rPr>
+          <m:t>/</m:t>
+        </m:r>
+        <m:r>
+          <m:t>2</m:t>
+        </m:r>
         <m:r>
           <m:rPr>
             <m:sty m:val="p"/>
           </m:rPr>
           <m:t>&lt;</m:t>
         </m:r>
-        <m:f>
-          <m:fPr>
-            <m:type m:val="lin"/>
-          </m:fPr>
-          <m:num>
-            <m:r>
-              <m:t>2</m:t>
-            </m:r>
-          </m:num>
-          <m:den>
-            <m:r>
-              <m:t>3</m:t>
-            </m:r>
-          </m:den>
-        </m:f>
+        <m:r>
+          <m:t>2</m:t>
+        </m:r>
+        <m:r>
+          <m:rPr>
+            <m:sty m:val="p"/>
+          </m:rPr>
+          <m:t>/</m:t>
+        </m:r>
+        <m:r>
+          <m:t>3</m:t>
+        </m:r>
       </m:oMath>
       <w:r>
         <w:t xml:space="preserve">.</w:t>
@@ -23923,6 +24124,78 @@
           <w:i w:val="0"/>
           <w:sz w:val="18"/>
         </w:rPr>
+        <w:t>C. Xu and Y. Xie, “Conformal Prediction for Time Series,” IEEE Trans. Pattern Anal. Mach. Intell., vol. 45, no. 10, pp. 11575–11587, Oct. 2023, doi: 10.1109/tpami.2023.3272339.</w:t>
+      </w:r>
+    </w:p>
+    <w:p>
+      <w:pPr>
+        <w:pStyle w:val="BodyText"/>
+        <w:tabs>
+          <w:tab w:pos="440" w:val="left"/>
+        </w:tabs>
+        <w:spacing w:after="40"/>
+        <w:ind w:left="440" w:hanging="440"/>
+        <w:jc w:val="both"/>
+      </w:pPr>
+      <w:r/>
+      <w:r/>
+      <w:r/>
+      <w:r/>
+      <w:r>
+        <w:rPr>
+          <w:i/>
+          <w:iCs/>
+        </w:rPr>
+      </w:r>
+      <w:r/>
+      <w:r>
+        <w:rPr>
+          <w:sz w:val="18"/>
+        </w:rPr>
+        <w:t>[21]</w:t>
+        <w:tab/>
+      </w:r>
+      <w:r>
+        <w:rPr>
+          <w:i w:val="0"/>
+          <w:sz w:val="18"/>
+        </w:rPr>
+        <w:t>A. N. Angelopoulos, “Conformal risk control for non-monotonic losses,” Philosophical Transactions of the Royal Society A: Mathematical, Physical and Engineering Sciences, vol. 384, no. 2327, Art. no. 20250068, Aug. 2026, doi: 10.1098/rsta.2025.0068.</w:t>
+      </w:r>
+    </w:p>
+    <w:p>
+      <w:pPr>
+        <w:pStyle w:val="BodyText"/>
+        <w:tabs>
+          <w:tab w:pos="440" w:val="left"/>
+        </w:tabs>
+        <w:spacing w:after="40"/>
+        <w:ind w:left="440" w:hanging="440"/>
+        <w:jc w:val="both"/>
+      </w:pPr>
+      <w:r/>
+      <w:r/>
+      <w:r/>
+      <w:r/>
+      <w:r>
+        <w:rPr>
+          <w:i/>
+          <w:iCs/>
+        </w:rPr>
+      </w:r>
+      <w:r/>
+      <w:r>
+        <w:rPr>
+          <w:sz w:val="18"/>
+        </w:rPr>
+        <w:t>[22]</w:t>
+        <w:tab/>
+      </w:r>
+      <w:r>
+        <w:rPr>
+          <w:i w:val="0"/>
+          <w:sz w:val="18"/>
+        </w:rPr>
         <w:t>A. Bhattacharyya and R. F. Barber, “Group-weighted conformal prediction,” Electron. J. Statist., vol. 20, no. 1, Jan. 2026, doi: 10.1214/26-ejs2506.</w:t>
       </w:r>
     </w:p>
@@ -23945,7 +24218,7 @@
         <w:rPr>
           <w:sz w:val="18"/>
         </w:rPr>
-        <w:t>[21]</w:t>
+        <w:t>[23]</w:t>
         <w:tab/>
       </w:r>
       <w:r>
@@ -23981,7 +24254,7 @@
         <w:rPr>
           <w:sz w:val="18"/>
         </w:rPr>
-        <w:t>[22]</w:t>
+        <w:t>[24]</w:t>
         <w:tab/>
       </w:r>
       <w:r>
@@ -24017,7 +24290,7 @@
         <w:rPr>
           <w:sz w:val="18"/>
         </w:rPr>
-        <w:t>[23]</w:t>
+        <w:t>[25]</w:t>
         <w:tab/>
       </w:r>
       <w:r>
@@ -24053,7 +24326,7 @@
         <w:rPr>
           <w:sz w:val="18"/>
         </w:rPr>
-        <w:t>[24]</w:t>
+        <w:t>[26]</w:t>
         <w:tab/>
       </w:r>
       <w:r>
@@ -24089,7 +24362,7 @@
         <w:rPr>
           <w:sz w:val="18"/>
         </w:rPr>
-        <w:t>[25]</w:t>
+        <w:t>[27]</w:t>
         <w:tab/>
       </w:r>
       <w:r>
@@ -24125,7 +24398,7 @@
         <w:rPr>
           <w:sz w:val="18"/>
         </w:rPr>
-        <w:t>[26]</w:t>
+        <w:t>[28]</w:t>
         <w:tab/>
       </w:r>
       <w:r>
@@ -24161,7 +24434,7 @@
         <w:rPr>
           <w:sz w:val="18"/>
         </w:rPr>
-        <w:t>[27]</w:t>
+        <w:t>[29]</w:t>
         <w:tab/>
       </w:r>
       <w:r>
@@ -24169,7 +24442,7 @@
           <w:i w:val="0"/>
           <w:sz w:val="18"/>
         </w:rPr>
-        <w:t>A. N. Angelopoulos, “Conformal risk control for non-monotonic losses,” Philosophical Transactions of the Royal Society A: Mathematical, Physical and Engineering Sciences, vol. 384, no. 2327, Art. no. 20250068, Aug. 2026, doi: 10.1098/rsta.2025.0068.</w:t>
+        <w:t>M. A. Shahbazi, A. Baheri, and N. Azadeh-Fard, “A hierarchical conformal framework for uncertainty-aware length of stay prediction in multi-hospital settings,” Sci Rep, vol. 16, no. 1, Art. no. 6564, Jan. 2026, doi: 10.1038/s41598-026-37450-w.</w:t>
       </w:r>
     </w:p>
     <w:p>
@@ -24197,7 +24470,7 @@
         <w:rPr>
           <w:sz w:val="18"/>
         </w:rPr>
-        <w:t>[28]</w:t>
+        <w:t>[30]</w:t>
         <w:tab/>
       </w:r>
       <w:r>
@@ -24205,7 +24478,7 @@
           <w:i w:val="0"/>
           <w:sz w:val="18"/>
         </w:rPr>
-        <w:t>C. Xu and Y. Xie, “Conformal Prediction for Time Series,” IEEE Trans. Pattern Anal. Mach. Intell., vol. 45, no. 10, pp. 11575–11587, Oct. 2023, doi: 10.1109/tpami.2023.3272339.</w:t>
+        <w:t>S. M. Kerry and J. Martin Bland, “Unequal cluster sizes for trials in English and Welsh general practice: implications for sample size calculations,” Statist. Med., vol. 20, no. 3, pp. 377–390, Feb. 2001, doi: 10.1002/1097-0258(20010215)20:3&lt;377::aid-sim799&gt;3.0.co;2-n.</w:t>
       </w:r>
     </w:p>
     <w:p>
@@ -24233,7 +24506,7 @@
         <w:rPr>
           <w:sz w:val="18"/>
         </w:rPr>
-        <w:t>[29]</w:t>
+        <w:t>[31]</w:t>
         <w:tab/>
       </w:r>
       <w:r>
@@ -24241,7 +24514,7 @@
           <w:i w:val="0"/>
           <w:sz w:val="18"/>
         </w:rPr>
-        <w:t>M. A. Shahbazi, A. Baheri, and N. Azadeh-Fard, “A hierarchical conformal framework for uncertainty-aware length of stay prediction in multi-hospital settings,” Sci Rep, vol. 16, no. 1, Art. no. 6564, Jan. 2026, doi: 10.1038/s41598-026-37450-w.</w:t>
+        <w:t>D. Zhan, L. Xu, Y. Ouyang, R. Sawatzky, and H. Wong, “Methods for dealing with unequal cluster sizes in cluster randomized trials: A scoping review,” PLoS ONE, vol. 16, no. 7, Art. no. e0255389, Jul. 2021, doi: 10.1371/journal.pone.0255389.</w:t>
       </w:r>
     </w:p>
     <w:p>
@@ -24269,7 +24542,7 @@
         <w:rPr>
           <w:sz w:val="18"/>
         </w:rPr>
-        <w:t>[30]</w:t>
+        <w:t>[32]</w:t>
         <w:tab/>
       </w:r>
       <w:r>
@@ -24277,43 +24550,7 @@
           <w:i w:val="0"/>
           <w:sz w:val="18"/>
         </w:rPr>
-        <w:t>S. M. Kerry and J. Martin Bland, “Unequal cluster sizes for trials in English and Welsh general practice: implications for sample size calculations,” Statist. Med., vol. 20, no. 3, pp. 377–390, Feb. 2001, doi: 10.1002/1097-0258(20010215)20:3&lt;377::aid-sim799&gt;3.0.co;2-n.</w:t>
-      </w:r>
-    </w:p>
-    <w:p>
-      <w:pPr>
-        <w:pStyle w:val="BodyText"/>
-        <w:tabs>
-          <w:tab w:pos="440" w:val="left"/>
-        </w:tabs>
-        <w:spacing w:after="40"/>
-        <w:ind w:left="440" w:hanging="440"/>
-        <w:jc w:val="both"/>
-      </w:pPr>
-      <w:r/>
-      <w:r/>
-      <w:r/>
-      <w:r/>
-      <w:r>
-        <w:rPr>
-          <w:i/>
-          <w:iCs/>
-        </w:rPr>
-      </w:r>
-      <w:r/>
-      <w:r>
-        <w:rPr>
-          <w:sz w:val="18"/>
-        </w:rPr>
-        <w:t>[31]</w:t>
-        <w:tab/>
-      </w:r>
-      <w:r>
-        <w:rPr>
-          <w:i w:val="0"/>
-          <w:sz w:val="18"/>
-        </w:rPr>
-        <w:t>D. Zhan, L. Xu, Y. Ouyang, R. Sawatzky, and H. Wong, “Methods for dealing with unequal cluster sizes in cluster randomized trials: A scoping review,” PLoS ONE, vol. 16, no. 7, Art. no. e0255389, Jul. 2021, doi: 10.1371/journal.pone.0255389.</w:t>
+        <w:t>H. Atas Guvenilir and T. Doğan, “How to approach machine learning-based prediction of drug/compound–target interactions,” J. Cheminform., vol. 15, no. 1, Art. no. 16, Feb. 2023, doi: 10.1186/s13321-023-00689-w.</w:t>
       </w:r>
     </w:p>
     <w:p>
@@ -24335,7 +24572,7 @@
         <w:rPr>
           <w:sz w:val="18"/>
         </w:rPr>
-        <w:t>[32]</w:t>
+        <w:t>[33]</w:t>
         <w:tab/>
       </w:r>
       <w:r>
@@ -24373,7 +24610,7 @@
         <w:rPr>
           <w:sz w:val="18"/>
         </w:rPr>
-        <w:t>[33]</w:t>
+        <w:t>[34]</w:t>
         <w:tab/>
       </w:r>
       <w:r>
@@ -24409,7 +24646,7 @@
         <w:rPr>
           <w:sz w:val="18"/>
         </w:rPr>
-        <w:t>[34]</w:t>
+        <w:t>[35]</w:t>
         <w:tab/>
       </w:r>
       <w:r>

</xml_diff>

<commit_message>
Judul final: Block-Level Feasibility of Hierarchical Conformal Prediction on Clinical ECG Data: A Design-Stage Audit
</commit_message>
<xml_diff>
--- a/docs/paper/manuscript-draft.docx
+++ b/docs/paper/manuscript-draft.docx
@@ -8,7 +8,7 @@
         <w:jc w:val="center"/>
       </w:pPr>
       <w:r>
-        <w:t xml:space="preserve">Block-Level Feasibility of Conformal Calibration on Clinical ECG Data: An Empirical Audit</w:t>
+        <w:t xml:space="preserve">Block-Level Feasibility of Hierarchical Conformal Prediction on Clinical ECG Data: A Design-Stage Audit</w:t>
       </w:r>
     </w:p>
     <w:p>
@@ -20,7 +20,7 @@
           <w:i/>
           <w:iCs/>
         </w:rPr>
-        <w:t xml:space="preserve">Working draft for internal review — generated 2026-10-04 from commit a7b41e5.</w:t>
+        <w:t xml:space="preserve">Working draft for internal review — generated 2026-10-04 from commit 3b4f64f.</w:t>
       </w:r>
     </w:p>
     <w:bookmarkStart w:id="9" w:name="abstract"/>

</xml_diff>

<commit_message>
Fig. 7 didesain ulang: panel berbingkai bergaya Fig. 1, nilai ICC dari JSON, sel 2x2 berbingkai, gradien dependensi
</commit_message>
<xml_diff>
--- a/docs/paper/manuscript-draft.docx
+++ b/docs/paper/manuscript-draft.docx
@@ -20,7 +20,7 @@
           <w:i/>
           <w:iCs/>
         </w:rPr>
-        <w:t xml:space="preserve">Working draft for internal review — generated 2026-10-04 from commit 3b4f64f.</w:t>
+        <w:t xml:space="preserve">Working draft for internal review — generated 2026-10-05 from commit 3265dc7.</w:t>
       </w:r>
     </w:p>
     <w:bookmarkStart w:id="9" w:name="abstract"/>
@@ -15213,9 +15213,9 @@
       <w:r>
         <w:drawing>
           <wp:inline>
-            <wp:extent cx="5029200" cy="1207964"/>
+            <wp:extent cx="5029200" cy="1741805"/>
             <wp:effectExtent b="0" l="0" r="0" t="0"/>
-            <wp:docPr descr="Fig. 7. Controls used on MIT-BIH, drawn on four illustrative records (colors mark the original record of each beat). (a) Permutation null. (b) 2×2 factorial design crossing clustering with calibration block-size balance. (c) Dose–response: a growing fraction p of beats reassigned at random." title="" id="47" name="Picture"/>
+            <wp:docPr descr="Fig. 7. Controls used on MIT-BIH, drawn on four illustrative records (colors mark the original record of each beat; ICC values are those observed on DS2). (a) Permutation null. (b) 2×2 factorial design crossing clustering with calibration block-size balance. (c) Dose–response: a growing fraction p of beats reassigned at random." title="" id="47" name="Picture"/>
             <a:graphic>
               <a:graphicData uri="http://schemas.openxmlformats.org/drawingml/2006/picture">
                 <pic:pic>
@@ -15234,7 +15234,7 @@
                   <pic:spPr bwMode="auto">
                     <a:xfrm>
                       <a:off x="0" y="0"/>
-                      <a:ext cx="5029200" cy="1207964"/>
+                      <a:ext cx="5029200" cy="1741805"/>
                     </a:xfrm>
                     <a:prstGeom prst="rect">
                       <a:avLst/>
@@ -15259,7 +15259,7 @@
         <w:jc w:val="both"/>
       </w:pPr>
       <w:r>
-        <w:t xml:space="preserve">Fig. 7. Controls used on MIT-BIH, drawn on four illustrative records (colors mark the original record of each beat). (a) Permutation null. (b) 2×2 factorial design crossing clustering with calibration block-size balance. (c) Dose–response: a growing fraction</w:t>
+        <w:t xml:space="preserve">Fig. 7. Controls used on MIT-BIH, drawn on four illustrative records (colors mark the original record of each beat; ICC values are those observed on DS2). (a) Permutation null. (b) 2×2 factorial design crossing clustering with calibration block-size balance. (c) Dose–response: a growing fraction</w:t>
       </w:r>
       <w:r>
         <w:t xml:space="preserve"> </w:t>

</xml_diff>

<commit_message>
Lampiran A.2: turunan varians dijadikan persamaan bernomor (A.2)
</commit_message>
<xml_diff>
--- a/docs/paper/manuscript-draft.docx
+++ b/docs/paper/manuscript-draft.docx
@@ -20,7 +20,7 @@
           <w:i/>
           <w:iCs/>
         </w:rPr>
-        <w:t xml:space="preserve">Working draft for internal review — generated 2026-10-05 from commit 3265dc7.</w:t>
+        <w:t xml:space="preserve">Working draft for internal review — generated 2026-10-05 from commit caa9e02.</w:t>
       </w:r>
     </w:p>
     <w:bookmarkStart w:id="9" w:name="abstract"/>
@@ -21617,7 +21617,17 @@
         <w:jc w:val="both"/>
       </w:pPr>
       <w:r>
-        <w:t xml:space="preserve">Each block mean</w:t>
+        <w:rPr>
+          <w:i/>
+          <w:iCs/>
+        </w:rPr>
+        <w:t xml:space="preserve">Derivation.</w:t>
+      </w:r>
+      <w:r>
+        <w:t xml:space="preserve"> </w:t>
+      </w:r>
+      <w:r>
+        <w:t xml:space="preserve">Under (A), each block mean</w:t>
       </w:r>
       <w:r>
         <w:t xml:space="preserve"> </w:t>
@@ -21662,301 +21672,415 @@
         <w:t xml:space="preserve"> </w:t>
       </w:r>
       <w:r>
-        <w:t xml:space="preserve">has variance</w:t>
-      </w:r>
-      <w:r>
-        <w:t xml:space="preserve"> </w:t>
-      </w:r>
-      <m:oMath>
-        <m:sSup>
-          <m:e>
-            <m:r>
-              <m:t>σ</m:t>
-            </m:r>
-          </m:e>
-          <m:sup>
-            <m:r>
-              <m:t>2</m:t>
-            </m:r>
-          </m:sup>
-        </m:sSup>
-        <m:r>
-          <m:rPr>
-            <m:sty m:val="p"/>
-          </m:rPr>
-          <m:t>(</m:t>
-        </m:r>
-        <m:r>
-          <m:t>t</m:t>
-        </m:r>
-        <m:r>
-          <m:rPr>
-            <m:sty m:val="p"/>
-          </m:rPr>
-          <m:t>)</m:t>
-        </m:r>
-        <m:r>
-          <m:rPr>
-            <m:sty m:val="p"/>
-          </m:rPr>
-          <m:t>[</m:t>
-        </m:r>
-        <m:r>
-          <m:t>ρ</m:t>
-        </m:r>
-        <m:r>
-          <m:rPr>
-            <m:sty m:val="p"/>
-          </m:rPr>
-          <m:t>(</m:t>
-        </m:r>
-        <m:r>
-          <m:t>t</m:t>
-        </m:r>
-        <m:r>
-          <m:rPr>
-            <m:sty m:val="p"/>
-          </m:rPr>
-          <m:t>)</m:t>
-        </m:r>
-        <m:r>
-          <m:rPr>
-            <m:sty m:val="p"/>
-          </m:rPr>
-          <m:t>+</m:t>
-        </m:r>
-        <m:r>
-          <m:rPr>
-            <m:sty m:val="p"/>
-          </m:rPr>
-          <m:t>{</m:t>
-        </m:r>
-        <m:r>
-          <m:t>1</m:t>
-        </m:r>
-        <m:r>
-          <m:rPr>
-            <m:sty m:val="p"/>
-          </m:rPr>
-          <m:t>−</m:t>
-        </m:r>
-        <m:r>
-          <m:t>ρ</m:t>
-        </m:r>
-        <m:r>
-          <m:rPr>
-            <m:sty m:val="p"/>
-          </m:rPr>
-          <m:t>(</m:t>
-        </m:r>
-        <m:r>
-          <m:t>t</m:t>
-        </m:r>
-        <m:r>
-          <m:rPr>
-            <m:sty m:val="p"/>
-          </m:rPr>
-          <m:t>)</m:t>
-        </m:r>
-        <m:r>
-          <m:rPr>
-            <m:sty m:val="p"/>
-          </m:rPr>
-          <m:t>}</m:t>
-        </m:r>
-        <m:r>
-          <m:rPr>
-            <m:sty m:val="p"/>
-          </m:rPr>
-          <m:t>/</m:t>
-        </m:r>
+        <w:t xml:space="preserve">and the equally weighted</w:t>
+      </w:r>
+      <w:r>
+        <w:t xml:space="preserve"> </w:t>
+      </w:r>
+      <w:r>
+        <w:t xml:space="preserve">average of</w:t>
+      </w:r>
+      <w:r>
+        <w:t xml:space="preserve"> </w:t>
+      </w:r>
+      <m:oMath>
         <m:sSub>
           <m:e>
             <m:r>
-              <m:t>N</m:t>
+              <m:t>K</m:t>
             </m:r>
           </m:e>
           <m:sub>
             <m:r>
-              <m:t>k</m:t>
+              <m:t>1</m:t>
             </m:r>
           </m:sub>
         </m:sSub>
-        <m:r>
-          <m:rPr>
-            <m:sty m:val="p"/>
-          </m:rPr>
-          <m:t>]</m:t>
-        </m:r>
-      </m:oMath>
-      <w:r>
-        <w:t xml:space="preserve">,</w:t>
-      </w:r>
-      <w:r>
-        <w:t xml:space="preserve"> </w:t>
-      </w:r>
-      <w:r>
-        <w:t xml:space="preserve">and averaging</w:t>
-      </w:r>
-      <w:r>
-        <w:t xml:space="preserve"> </w:t>
-      </w:r>
-      <m:oMath>
-        <m:sSub>
-          <m:e>
-            <m:r>
-              <m:t>K</m:t>
-            </m:r>
-          </m:e>
-          <m:sub>
-            <m:r>
-              <m:t>1</m:t>
-            </m:r>
-          </m:sub>
-        </m:sSub>
-      </m:oMath>
-      <w:r>
-        <w:t xml:space="preserve"> </w:t>
-      </w:r>
-      <w:r>
-        <w:t xml:space="preserve">independent blocks with equal weights gives</w:t>
-      </w:r>
-      <w:r>
-        <w:t xml:space="preserve"> </w:t>
-      </w:r>
-      <m:oMath>
-        <m:sSup>
-          <m:e>
-            <m:r>
-              <m:t>σ</m:t>
-            </m:r>
-          </m:e>
-          <m:sup>
-            <m:r>
-              <m:t>2</m:t>
-            </m:r>
-          </m:sup>
-        </m:sSup>
-        <m:r>
-          <m:rPr>
-            <m:sty m:val="p"/>
-          </m:rPr>
-          <m:t>(</m:t>
-        </m:r>
-        <m:r>
-          <m:t>t</m:t>
-        </m:r>
-        <m:r>
-          <m:rPr>
-            <m:sty m:val="p"/>
-          </m:rPr>
-          <m:t>)</m:t>
-        </m:r>
-        <m:r>
-          <m:rPr>
-            <m:sty m:val="p"/>
-          </m:rPr>
-          <m:t>[</m:t>
-        </m:r>
-        <m:r>
-          <m:t>ρ</m:t>
-        </m:r>
-        <m:r>
-          <m:rPr>
-            <m:sty m:val="p"/>
-          </m:rPr>
-          <m:t>(</m:t>
-        </m:r>
-        <m:r>
-          <m:t>t</m:t>
-        </m:r>
-        <m:r>
-          <m:rPr>
-            <m:sty m:val="p"/>
-          </m:rPr>
-          <m:t>)</m:t>
-        </m:r>
-        <m:r>
-          <m:rPr>
-            <m:sty m:val="p"/>
-          </m:rPr>
-          <m:t>+</m:t>
-        </m:r>
-        <m:r>
-          <m:rPr>
-            <m:sty m:val="p"/>
-          </m:rPr>
-          <m:t>{</m:t>
-        </m:r>
-        <m:r>
-          <m:t>1</m:t>
-        </m:r>
-        <m:r>
-          <m:rPr>
-            <m:sty m:val="p"/>
-          </m:rPr>
-          <m:t>−</m:t>
-        </m:r>
-        <m:r>
-          <m:t>ρ</m:t>
-        </m:r>
-        <m:r>
-          <m:rPr>
-            <m:sty m:val="p"/>
-          </m:rPr>
-          <m:t>(</m:t>
-        </m:r>
-        <m:r>
-          <m:t>t</m:t>
-        </m:r>
-        <m:r>
-          <m:rPr>
-            <m:sty m:val="p"/>
-          </m:rPr>
-          <m:t>)</m:t>
-        </m:r>
-        <m:r>
-          <m:rPr>
-            <m:sty m:val="p"/>
-          </m:rPr>
-          <m:t>}</m:t>
-        </m:r>
-        <m:r>
-          <m:rPr>
-            <m:sty m:val="p"/>
-          </m:rPr>
-          <m:t>/</m:t>
-        </m:r>
-        <m:r>
-          <m:t>H</m:t>
-        </m:r>
-        <m:r>
-          <m:rPr>
-            <m:sty m:val="p"/>
-          </m:rPr>
-          <m:t>]</m:t>
-        </m:r>
-        <m:r>
-          <m:rPr>
-            <m:sty m:val="p"/>
-          </m:rPr>
-          <m:t>/</m:t>
-        </m:r>
-        <m:sSub>
-          <m:e>
-            <m:r>
-              <m:t>K</m:t>
-            </m:r>
-          </m:e>
-          <m:sub>
-            <m:r>
-              <m:t>1</m:t>
-            </m:r>
-          </m:sub>
-        </m:sSub>
-      </m:oMath>
-      <w:r>
-        <w:t xml:space="preserve">, which equals (A.1) because</w:t>
+      </m:oMath>
+      <w:r>
+        <w:t xml:space="preserve"> </w:t>
+      </w:r>
+      <w:r>
+        <w:t xml:space="preserve">independent blocks have variances</w:t>
+      </w:r>
+    </w:p>
+    <w:p>
+      <w:pPr>
+        <w:pStyle w:val="BodyText"/>
+      </w:pPr>
+      <m:oMathPara>
+        <m:oMathParaPr>
+          <m:jc m:val="center"/>
+        </m:oMathParaPr>
+        <m:oMath>
+          <m:r>
+            <m:rPr>
+              <m:sty m:val="p"/>
+            </m:rPr>
+            <m:t>Var</m:t>
+          </m:r>
+          <m:d>
+            <m:dPr>
+              <m:begChr m:val="("/>
+              <m:sepChr m:val=""/>
+              <m:endChr m:val=")"/>
+              <m:grow/>
+            </m:dPr>
+            <m:e>
+              <m:sSub>
+                <m:e>
+                  <m:acc>
+                    <m:accPr>
+                      <m:chr m:val="‾"/>
+                    </m:accPr>
+                    <m:e>
+                      <m:r>
+                        <m:t>F</m:t>
+                      </m:r>
+                    </m:e>
+                  </m:acc>
+                </m:e>
+                <m:sub>
+                  <m:r>
+                    <m:t>k</m:t>
+                  </m:r>
+                </m:sub>
+              </m:sSub>
+              <m:r>
+                <m:rPr>
+                  <m:sty m:val="p"/>
+                </m:rPr>
+                <m:t>(</m:t>
+              </m:r>
+              <m:r>
+                <m:t>t</m:t>
+              </m:r>
+              <m:r>
+                <m:rPr>
+                  <m:sty m:val="p"/>
+                </m:rPr>
+                <m:t>)</m:t>
+              </m:r>
+            </m:e>
+          </m:d>
+          <m:r>
+            <m:rPr>
+              <m:sty m:val="p"/>
+            </m:rPr>
+            <m:t>=</m:t>
+          </m:r>
+          <m:sSup>
+            <m:e>
+              <m:r>
+                <m:t>σ</m:t>
+              </m:r>
+            </m:e>
+            <m:sup>
+              <m:r>
+                <m:t>2</m:t>
+              </m:r>
+            </m:sup>
+          </m:sSup>
+          <m:r>
+            <m:rPr>
+              <m:sty m:val="p"/>
+            </m:rPr>
+            <m:t>(</m:t>
+          </m:r>
+          <m:r>
+            <m:t>t</m:t>
+          </m:r>
+          <m:r>
+            <m:rPr>
+              <m:sty m:val="p"/>
+            </m:rPr>
+            <m:t>)</m:t>
+          </m:r>
+          <m:d>
+            <m:dPr>
+              <m:begChr m:val="["/>
+              <m:sepChr m:val=""/>
+              <m:endChr m:val="]"/>
+              <m:grow/>
+            </m:dPr>
+            <m:e>
+              <m:r>
+                <m:t>ρ</m:t>
+              </m:r>
+              <m:r>
+                <m:rPr>
+                  <m:sty m:val="p"/>
+                </m:rPr>
+                <m:t>(</m:t>
+              </m:r>
+              <m:r>
+                <m:t>t</m:t>
+              </m:r>
+              <m:r>
+                <m:rPr>
+                  <m:sty m:val="p"/>
+                </m:rPr>
+                <m:t>)</m:t>
+              </m:r>
+              <m:r>
+                <m:rPr>
+                  <m:sty m:val="p"/>
+                </m:rPr>
+                <m:t>+</m:t>
+              </m:r>
+              <m:f>
+                <m:fPr>
+                  <m:type m:val="bar"/>
+                </m:fPr>
+                <m:num>
+                  <m:r>
+                    <m:t>1</m:t>
+                  </m:r>
+                  <m:r>
+                    <m:rPr>
+                      <m:sty m:val="p"/>
+                    </m:rPr>
+                    <m:t>−</m:t>
+                  </m:r>
+                  <m:r>
+                    <m:t>ρ</m:t>
+                  </m:r>
+                  <m:r>
+                    <m:rPr>
+                      <m:sty m:val="p"/>
+                    </m:rPr>
+                    <m:t>(</m:t>
+                  </m:r>
+                  <m:r>
+                    <m:t>t</m:t>
+                  </m:r>
+                  <m:r>
+                    <m:rPr>
+                      <m:sty m:val="p"/>
+                    </m:rPr>
+                    <m:t>)</m:t>
+                  </m:r>
+                </m:num>
+                <m:den>
+                  <m:sSub>
+                    <m:e>
+                      <m:r>
+                        <m:t>N</m:t>
+                      </m:r>
+                    </m:e>
+                    <m:sub>
+                      <m:r>
+                        <m:t>k</m:t>
+                      </m:r>
+                    </m:sub>
+                  </m:sSub>
+                </m:den>
+              </m:f>
+            </m:e>
+          </m:d>
+          <m:r>
+            <m:rPr>
+              <m:sty m:val="p"/>
+            </m:rPr>
+            <m:t>,</m:t>
+          </m:r>
+          <m:r>
+            <m:t>  </m:t>
+          </m:r>
+          <m:r>
+            <m:rPr>
+              <m:sty m:val="p"/>
+            </m:rPr>
+            <m:t>Var</m:t>
+          </m:r>
+          <m:d>
+            <m:dPr>
+              <m:begChr m:val="("/>
+              <m:sepChr m:val=""/>
+              <m:endChr m:val=")"/>
+              <m:grow/>
+            </m:dPr>
+            <m:e>
+              <m:acc>
+                <m:accPr>
+                  <m:chr m:val="̂"/>
+                </m:accPr>
+                <m:e>
+                  <m:r>
+                    <m:t>G</m:t>
+                  </m:r>
+                </m:e>
+              </m:acc>
+              <m:r>
+                <m:rPr>
+                  <m:sty m:val="p"/>
+                </m:rPr>
+                <m:t>(</m:t>
+              </m:r>
+              <m:r>
+                <m:t>t</m:t>
+              </m:r>
+              <m:r>
+                <m:rPr>
+                  <m:sty m:val="p"/>
+                </m:rPr>
+                <m:t>)</m:t>
+              </m:r>
+            </m:e>
+          </m:d>
+          <m:r>
+            <m:rPr>
+              <m:sty m:val="p"/>
+            </m:rPr>
+            <m:t>=</m:t>
+          </m:r>
+          <m:f>
+            <m:fPr>
+              <m:type m:val="bar"/>
+            </m:fPr>
+            <m:num>
+              <m:sSup>
+                <m:e>
+                  <m:r>
+                    <m:t>σ</m:t>
+                  </m:r>
+                </m:e>
+                <m:sup>
+                  <m:r>
+                    <m:t>2</m:t>
+                  </m:r>
+                </m:sup>
+              </m:sSup>
+              <m:r>
+                <m:rPr>
+                  <m:sty m:val="p"/>
+                </m:rPr>
+                <m:t>(</m:t>
+              </m:r>
+              <m:r>
+                <m:t>t</m:t>
+              </m:r>
+              <m:r>
+                <m:rPr>
+                  <m:sty m:val="p"/>
+                </m:rPr>
+                <m:t>)</m:t>
+              </m:r>
+            </m:num>
+            <m:den>
+              <m:sSub>
+                <m:e>
+                  <m:r>
+                    <m:t>K</m:t>
+                  </m:r>
+                </m:e>
+                <m:sub>
+                  <m:r>
+                    <m:t>1</m:t>
+                  </m:r>
+                </m:sub>
+              </m:sSub>
+            </m:den>
+          </m:f>
+          <m:d>
+            <m:dPr>
+              <m:begChr m:val="["/>
+              <m:sepChr m:val=""/>
+              <m:endChr m:val="]"/>
+              <m:grow/>
+            </m:dPr>
+            <m:e>
+              <m:r>
+                <m:t>ρ</m:t>
+              </m:r>
+              <m:r>
+                <m:rPr>
+                  <m:sty m:val="p"/>
+                </m:rPr>
+                <m:t>(</m:t>
+              </m:r>
+              <m:r>
+                <m:t>t</m:t>
+              </m:r>
+              <m:r>
+                <m:rPr>
+                  <m:sty m:val="p"/>
+                </m:rPr>
+                <m:t>)</m:t>
+              </m:r>
+              <m:r>
+                <m:rPr>
+                  <m:sty m:val="p"/>
+                </m:rPr>
+                <m:t>+</m:t>
+              </m:r>
+              <m:f>
+                <m:fPr>
+                  <m:type m:val="bar"/>
+                </m:fPr>
+                <m:num>
+                  <m:r>
+                    <m:t>1</m:t>
+                  </m:r>
+                  <m:r>
+                    <m:rPr>
+                      <m:sty m:val="p"/>
+                    </m:rPr>
+                    <m:t>−</m:t>
+                  </m:r>
+                  <m:r>
+                    <m:t>ρ</m:t>
+                  </m:r>
+                  <m:r>
+                    <m:rPr>
+                      <m:sty m:val="p"/>
+                    </m:rPr>
+                    <m:t>(</m:t>
+                  </m:r>
+                  <m:r>
+                    <m:t>t</m:t>
+                  </m:r>
+                  <m:r>
+                    <m:rPr>
+                      <m:sty m:val="p"/>
+                    </m:rPr>
+                    <m:t>)</m:t>
+                  </m:r>
+                </m:num>
+                <m:den>
+                  <m:r>
+                    <m:t>H</m:t>
+                  </m:r>
+                </m:den>
+              </m:f>
+            </m:e>
+          </m:d>
+          <m:r>
+            <m:rPr>
+              <m:sty m:val="p"/>
+            </m:rPr>
+            <m:t>,</m:t>
+          </m:r>
+          <m:r>
+            <m:t>  </m:t>
+          </m:r>
+          <m:r>
+            <m:rPr>
+              <m:nor/>
+              <m:sty m:val="p"/>
+            </m:rPr>
+            <m:t>(A.2)</m:t>
+          </m:r>
+        </m:oMath>
+      </m:oMathPara>
+    </w:p>
+    <w:p>
+      <w:pPr>
+        <w:pStyle w:val="FirstParagraph"/>
+        <w:jc w:val="both"/>
+      </w:pPr>
+      <w:r>
+        <w:t xml:space="preserve">and the second form equals (A.1) because</w:t>
       </w:r>
       <w:r>
         <w:t xml:space="preserve"> </w:t>
@@ -22072,10 +22196,7 @@
         </m:r>
       </m:oMath>
       <w:r>
-        <w:t xml:space="preserve"> </w:t>
-      </w:r>
-      <w:r>
-        <w:t xml:space="preserve">this tends to</w:t>
+        <w:t xml:space="preserve">, (A.1) tends to</w:t>
       </w:r>
       <w:r>
         <w:t xml:space="preserve"> </w:t>

</xml_diff>

<commit_message>
Publikasikan URL GitHub pada ketersediaan kode
</commit_message>
<xml_diff>
--- a/docs/paper/manuscript-draft.docx
+++ b/docs/paper/manuscript-draft.docx
@@ -20,7 +20,7 @@
           <w:i/>
           <w:iCs/>
         </w:rPr>
-        <w:t xml:space="preserve">Working draft for internal review — generated 2026-10-05 from commit caa9e02.</w:t>
+        <w:t xml:space="preserve">Working draft for internal review — generated 2026-10-05 from commit d5a240c.</w:t>
       </w:r>
     </w:p>
     <w:bookmarkStart w:id="9" w:name="abstract"/>
@@ -20940,13 +20940,7 @@
         <w:t xml:space="preserve"> </w:t>
       </w:r>
       <w:r>
-        <w:t xml:space="preserve">reported number will be archived under a persistent identifier before</w:t>
-      </w:r>
-      <w:r>
-        <w:t xml:space="preserve"> </w:t>
-      </w:r>
-      <w:r>
-        <w:t xml:space="preserve">publication.</w:t>
+        <w:t xml:space="preserve">reported number are available at https://github.com/darknestt/conformal-ecg.</w:t>
       </w:r>
     </w:p>
     <w:bookmarkEnd w:id="68"/>

</xml_diff>